<commit_message>
Adição Fluxograma - Criar local Visitado, no Documento
</commit_message>
<xml_diff>
--- a/Documentation/Relatório-DSSMV-2025-27_2DB_1250771_1251355.docx
+++ b/Documentation/Relatório-DSSMV-2025-27_2DB_1250771_1251355.docx
@@ -3549,6 +3549,31 @@
       <w:pPr>
         <w:pStyle w:val="heading1"/>
       </w:pPr>
+    </w:p>
+    <w:p>
+      <w:pPr>
+        <w:pStyle w:val="heading1"/>
+      </w:pPr>
+    </w:p>
+    <w:p>
+      <w:pPr>
+        <w:pStyle w:val="heading1"/>
+      </w:pPr>
+    </w:p>
+    <w:p>
+      <w:pPr>
+        <w:pStyle w:val="heading1"/>
+      </w:pPr>
+    </w:p>
+    <w:p>
+      <w:pPr>
+        <w:pStyle w:val="heading1"/>
+      </w:pPr>
+    </w:p>
+    <w:p>
+      <w:pPr>
+        <w:pStyle w:val="heading1"/>
+      </w:pPr>
       <w:r>
         <w:t>5</w:t>
       </w:r>
@@ -3776,6 +3801,7 @@
         <w:pStyle w:val="heading3"/>
       </w:pPr>
       <w:r>
+        <w:lastRenderedPageBreak/>
         <w:t xml:space="preserve">5.1.2   </w:t>
       </w:r>
       <w:proofErr w:type="spellStart"/>
@@ -3786,11 +3812,296 @@
     </w:p>
     <w:p>
       <w:pPr>
+        <w:rPr>
+          <w:noProof/>
+        </w:rPr>
+      </w:pPr>
+      <w:r>
+        <w:t xml:space="preserve">O </w:t>
+      </w:r>
+      <w:proofErr w:type="spellStart"/>
+      <w:r>
+        <w:t>seguinte</w:t>
+      </w:r>
+      <w:proofErr w:type="spellEnd"/>
+      <w:r>
+        <w:t xml:space="preserve"> </w:t>
+      </w:r>
+      <w:proofErr w:type="spellStart"/>
+      <w:r>
+        <w:t>fluxograma</w:t>
+      </w:r>
+      <w:proofErr w:type="spellEnd"/>
+      <w:r>
+        <w:t xml:space="preserve"> </w:t>
+      </w:r>
+      <w:proofErr w:type="spellStart"/>
+      <w:r>
+        <w:t>ilustra</w:t>
+      </w:r>
+      <w:proofErr w:type="spellEnd"/>
+      <w:r>
+        <w:t xml:space="preserve"> a </w:t>
+      </w:r>
+      <w:proofErr w:type="spellStart"/>
+      <w:r>
+        <w:t>sequência</w:t>
+      </w:r>
+      <w:proofErr w:type="spellEnd"/>
+      <w:r>
+        <w:t xml:space="preserve"> das </w:t>
+      </w:r>
+      <w:proofErr w:type="spellStart"/>
+      <w:r>
+        <w:t>interações</w:t>
+      </w:r>
+      <w:proofErr w:type="spellEnd"/>
+      <w:r>
+        <w:t xml:space="preserve"> do </w:t>
+      </w:r>
+      <w:proofErr w:type="spellStart"/>
+      <w:r>
+        <w:t>utilizador</w:t>
+      </w:r>
+      <w:proofErr w:type="spellEnd"/>
+      <w:r>
+        <w:t xml:space="preserve"> </w:t>
+      </w:r>
+      <w:proofErr w:type="spellStart"/>
+      <w:r>
+        <w:t>na</w:t>
+      </w:r>
+      <w:proofErr w:type="spellEnd"/>
+      <w:r>
+        <w:t xml:space="preserve"> </w:t>
+      </w:r>
+      <w:proofErr w:type="spellStart"/>
+      <w:r>
+        <w:t>funcionalidade</w:t>
+      </w:r>
+      <w:proofErr w:type="spellEnd"/>
+      <w:r>
+        <w:t xml:space="preserve"> de </w:t>
+      </w:r>
+      <w:proofErr w:type="spellStart"/>
+      <w:r>
+        <w:t>registo</w:t>
+      </w:r>
+      <w:proofErr w:type="spellEnd"/>
+      <w:r>
+        <w:t xml:space="preserve"> de um novo local </w:t>
+      </w:r>
+      <w:proofErr w:type="spellStart"/>
+      <w:r>
+        <w:t>visitado</w:t>
+      </w:r>
+      <w:proofErr w:type="spellEnd"/>
+      <w:r>
+        <w:t xml:space="preserve">. </w:t>
+      </w:r>
+      <w:proofErr w:type="spellStart"/>
+      <w:r>
+        <w:t>Detalha</w:t>
+      </w:r>
+      <w:proofErr w:type="spellEnd"/>
+      <w:r>
+        <w:t xml:space="preserve"> </w:t>
+      </w:r>
+      <w:proofErr w:type="spellStart"/>
+      <w:r>
+        <w:t>desde</w:t>
+      </w:r>
+      <w:proofErr w:type="spellEnd"/>
+      <w:r>
+        <w:t xml:space="preserve"> </w:t>
+      </w:r>
+      <w:proofErr w:type="gramStart"/>
+      <w:r>
+        <w:t>a</w:t>
+      </w:r>
+      <w:proofErr w:type="gramEnd"/>
+      <w:r>
+        <w:t xml:space="preserve"> </w:t>
+      </w:r>
+      <w:proofErr w:type="spellStart"/>
+      <w:r>
+        <w:t>abertura</w:t>
+      </w:r>
+      <w:proofErr w:type="spellEnd"/>
+      <w:r>
+        <w:t xml:space="preserve"> da </w:t>
+      </w:r>
+      <w:proofErr w:type="spellStart"/>
+      <w:r>
+        <w:t>aplicação</w:t>
+      </w:r>
+      <w:proofErr w:type="spellEnd"/>
+      <w:r>
+        <w:t xml:space="preserve"> </w:t>
+      </w:r>
+      <w:proofErr w:type="spellStart"/>
+      <w:r>
+        <w:t>até</w:t>
+      </w:r>
+      <w:proofErr w:type="spellEnd"/>
+      <w:r>
+        <w:t xml:space="preserve"> </w:t>
+      </w:r>
+      <w:proofErr w:type="spellStart"/>
+      <w:r>
+        <w:t>ao</w:t>
+      </w:r>
+      <w:proofErr w:type="spellEnd"/>
+      <w:r>
+        <w:t xml:space="preserve"> </w:t>
+      </w:r>
+      <w:proofErr w:type="spellStart"/>
+      <w:r>
+        <w:t>último</w:t>
+      </w:r>
+      <w:proofErr w:type="spellEnd"/>
+      <w:r>
+        <w:t xml:space="preserve"> </w:t>
+      </w:r>
+      <w:proofErr w:type="spellStart"/>
+      <w:r>
+        <w:t>passo</w:t>
+      </w:r>
+      <w:proofErr w:type="spellEnd"/>
+      <w:r>
+        <w:t xml:space="preserve"> de </w:t>
+      </w:r>
+      <w:proofErr w:type="spellStart"/>
+      <w:r>
+        <w:t>guardar</w:t>
+      </w:r>
+      <w:proofErr w:type="spellEnd"/>
+      <w:r>
+        <w:t xml:space="preserve"> o local </w:t>
+      </w:r>
+      <w:proofErr w:type="spellStart"/>
+      <w:r>
+        <w:t>desejado</w:t>
+      </w:r>
+      <w:proofErr w:type="spellEnd"/>
+      <w:r>
+        <w:t>.</w:t>
+      </w:r>
+    </w:p>
+    <w:p>
+      <w:pPr>
+        <w:rPr>
+          <w:noProof/>
+        </w:rPr>
+      </w:pPr>
+    </w:p>
+    <w:p>
+      <w:pPr>
+        <w:rPr>
+          <w:noProof/>
+        </w:rPr>
+      </w:pPr>
+    </w:p>
+    <w:p>
+      <w:r>
+        <w:rPr>
+          <w:noProof/>
+        </w:rPr>
+        <w:drawing>
+          <wp:anchor distT="0" distB="0" distL="114300" distR="114300" simplePos="0" relativeHeight="251658240" behindDoc="1" locked="0" layoutInCell="1" allowOverlap="1" wp14:anchorId="50858877" wp14:editId="25CD5379">
+            <wp:simplePos x="0" y="0"/>
+            <wp:positionH relativeFrom="column">
+              <wp:posOffset>1032151</wp:posOffset>
+            </wp:positionH>
+            <wp:positionV relativeFrom="paragraph">
+              <wp:posOffset>12341</wp:posOffset>
+            </wp:positionV>
+            <wp:extent cx="1936750" cy="6949440"/>
+            <wp:effectExtent l="0" t="0" r="6350" b="3810"/>
+            <wp:wrapNone/>
+            <wp:docPr id="2031974231" name="Imagem 3"/>
+            <wp:cNvGraphicFramePr>
+              <a:graphicFrameLocks xmlns:a="http://schemas.openxmlformats.org/drawingml/2006/main" noChangeAspect="1"/>
+            </wp:cNvGraphicFramePr>
+            <a:graphic xmlns:a="http://schemas.openxmlformats.org/drawingml/2006/main">
+              <a:graphicData uri="http://schemas.openxmlformats.org/drawingml/2006/picture">
+                <pic:pic xmlns:pic="http://schemas.openxmlformats.org/drawingml/2006/picture">
+                  <pic:nvPicPr>
+                    <pic:cNvPr id="2031974231" name="Imagem 2031974231"/>
+                    <pic:cNvPicPr/>
+                  </pic:nvPicPr>
+                  <pic:blipFill>
+                    <a:blip r:embed="rId5" cstate="print">
+                      <a:extLst>
+                        <a:ext uri="{28A0092B-C50C-407E-A947-70E740481C1C}">
+                          <a14:useLocalDpi xmlns:a14="http://schemas.microsoft.com/office/drawing/2010/main" val="0"/>
+                        </a:ext>
+                      </a:extLst>
+                    </a:blip>
+                    <a:stretch>
+                      <a:fillRect/>
+                    </a:stretch>
+                  </pic:blipFill>
+                  <pic:spPr>
+                    <a:xfrm>
+                      <a:off x="0" y="0"/>
+                      <a:ext cx="1936750" cy="6949440"/>
+                    </a:xfrm>
+                    <a:prstGeom prst="rect">
+                      <a:avLst/>
+                    </a:prstGeom>
+                  </pic:spPr>
+                </pic:pic>
+              </a:graphicData>
+            </a:graphic>
+          </wp:anchor>
+        </w:drawing>
+      </w:r>
+    </w:p>
+    <w:p/>
+    <w:p/>
+    <w:p/>
+    <w:p/>
+    <w:p/>
+    <w:p/>
+    <w:p/>
+    <w:p/>
+    <w:p/>
+    <w:p/>
+    <w:p>
+      <w:pPr>
         <w:pStyle w:val="heading2"/>
       </w:pPr>
       <w:bookmarkStart w:id="0" w:name="OLE_LINK2"/>
       <w:bookmarkStart w:id="1" w:name="OLE_LINK3"/>
-      <w:r>
+    </w:p>
+    <w:p/>
+    <w:p>
+      <w:pPr>
+        <w:pStyle w:val="heading2"/>
+      </w:pPr>
+    </w:p>
+    <w:p>
+      <w:pPr>
+        <w:pStyle w:val="p1a"/>
+      </w:pPr>
+    </w:p>
+    <w:p/>
+    <w:p/>
+    <w:p/>
+    <w:p/>
+    <w:p/>
+    <w:p/>
+    <w:p/>
+    <w:p/>
+    <w:p/>
+    <w:p/>
+    <w:p>
+      <w:pPr>
+        <w:pStyle w:val="heading2"/>
+      </w:pPr>
+      <w:r>
+        <w:lastRenderedPageBreak/>
         <w:t>5.2</w:t>
       </w:r>
       <w:r>
@@ -3805,10 +4116,12 @@
         <w:t xml:space="preserve"> </w:t>
       </w:r>
       <w:proofErr w:type="spellStart"/>
+      <w:proofErr w:type="gramStart"/>
       <w:r>
         <w:t>não</w:t>
       </w:r>
       <w:proofErr w:type="spellEnd"/>
+      <w:proofErr w:type="gramEnd"/>
       <w:r>
         <w:t xml:space="preserve"> </w:t>
       </w:r>

</xml_diff>

<commit_message>
Adição dos ficheiros Trip e Category Repository
</commit_message>
<xml_diff>
--- a/Documentation/Relatório-DSSMV-2025-27_2DB_1250771_1251355.docx
+++ b/Documentation/Relatório-DSSMV-2025-27_2DB_1250771_1251355.docx
@@ -823,15 +823,7 @@
         <w:rPr>
           <w:lang w:val="pt-BR"/>
         </w:rPr>
-        <w:t>te</w:t>
-      </w:r>
-      <w:bookmarkStart w:id="0" w:name="_GoBack"/>
-      <w:bookmarkEnd w:id="0"/>
-      <w:r>
-        <w:rPr>
-          <w:lang w:val="pt-BR"/>
-        </w:rPr>
-        <w:t>lemóvel</w:t>
+        <w:t>telemóvel</w:t>
       </w:r>
       <w:proofErr w:type="spellEnd"/>
       <w:r>
@@ -1882,25 +1874,7 @@
         <w:rPr>
           <w:lang w:val="pt-BR"/>
         </w:rPr>
-        <w:t xml:space="preserve">O modelo de domínio (Fig. 1) é fundamental para a arquitetura do sistema, servindo como um mapa para organizar as interações entre as entidades </w:t>
-      </w:r>
-      <w:r>
-        <w:rPr>
-          <w:lang w:val="pt-BR"/>
-        </w:rPr>
-        <w:t>da aplicação</w:t>
-      </w:r>
-      <w:r>
-        <w:rPr>
-          <w:lang w:val="pt-BR"/>
-        </w:rPr>
-        <w:t>. Fazer este modelo antes de começar a implementação do código a</w:t>
-      </w:r>
-      <w:r>
-        <w:rPr>
-          <w:lang w:val="pt-BR"/>
-        </w:rPr>
-        <w:t xml:space="preserve">juda a garantir que a lógica </w:t>
+        <w:t xml:space="preserve">O modelo de domínio (Fig. 1) é fundamental para a arquitetura do sistema, servindo como um mapa para organizar as interações entre as entidades da aplicação. Fazer este modelo antes de começar a implementação do código ajuda a garantir que a lógica </w:t>
       </w:r>
       <w:r>
         <w:rPr>
@@ -1911,6 +1885,206 @@
     </w:p>
     <w:p>
       <w:pPr>
+        <w:keepNext/>
+        <w:jc w:val="center"/>
+      </w:pPr>
+      <w:r>
+        <w:rPr>
+          <w:noProof/>
+          <w:lang w:val="pt-PT" w:eastAsia="pt-PT"/>
+        </w:rPr>
+        <w:drawing>
+          <wp:inline distT="0" distB="0" distL="0" distR="0" wp14:anchorId="04F7F78D" wp14:editId="76C0FF2F">
+            <wp:extent cx="4187930" cy="2537460"/>
+            <wp:effectExtent l="0" t="0" r="3175" b="0"/>
+            <wp:docPr id="1" name="Imagem 1"/>
+            <wp:cNvGraphicFramePr>
+              <a:graphicFrameLocks xmlns:a="http://schemas.openxmlformats.org/drawingml/2006/main" noChangeAspect="1"/>
+            </wp:cNvGraphicFramePr>
+            <a:graphic xmlns:a="http://schemas.openxmlformats.org/drawingml/2006/main">
+              <a:graphicData uri="http://schemas.openxmlformats.org/drawingml/2006/picture">
+                <pic:pic xmlns:pic="http://schemas.openxmlformats.org/drawingml/2006/picture">
+                  <pic:nvPicPr>
+                    <pic:cNvPr id="1" name="Diagrama UML de Viagens e Locais.png"/>
+                    <pic:cNvPicPr/>
+                  </pic:nvPicPr>
+                  <pic:blipFill>
+                    <a:blip r:embed="rId5" cstate="print">
+                      <a:extLst>
+                        <a:ext uri="{28A0092B-C50C-407E-A947-70E740481C1C}">
+                          <a14:useLocalDpi xmlns:a14="http://schemas.microsoft.com/office/drawing/2010/main" val="0"/>
+                        </a:ext>
+                      </a:extLst>
+                    </a:blip>
+                    <a:stretch>
+                      <a:fillRect/>
+                    </a:stretch>
+                  </pic:blipFill>
+                  <pic:spPr>
+                    <a:xfrm>
+                      <a:off x="0" y="0"/>
+                      <a:ext cx="4233967" cy="2565354"/>
+                    </a:xfrm>
+                    <a:prstGeom prst="rect">
+                      <a:avLst/>
+                    </a:prstGeom>
+                  </pic:spPr>
+                </pic:pic>
+              </a:graphicData>
+            </a:graphic>
+          </wp:inline>
+        </w:drawing>
+      </w:r>
+    </w:p>
+    <w:p>
+      <w:pPr>
+        <w:pStyle w:val="Legenda"/>
+        <w:rPr>
+          <w:b w:val="0"/>
+          <w:sz w:val="18"/>
+        </w:rPr>
+      </w:pPr>
+      <w:r>
+        <w:rPr>
+          <w:b w:val="0"/>
+          <w:sz w:val="18"/>
+        </w:rPr>
+        <w:t xml:space="preserve">Fig.  </w:t>
+      </w:r>
+      <w:r>
+        <w:rPr>
+          <w:b w:val="0"/>
+          <w:sz w:val="18"/>
+        </w:rPr>
+        <w:fldChar w:fldCharType="begin"/>
+      </w:r>
+      <w:r>
+        <w:rPr>
+          <w:b w:val="0"/>
+          <w:sz w:val="18"/>
+        </w:rPr>
+        <w:instrText xml:space="preserve"> SEQ Figura_ \* ARABIC </w:instrText>
+      </w:r>
+      <w:r>
+        <w:rPr>
+          <w:b w:val="0"/>
+          <w:sz w:val="18"/>
+        </w:rPr>
+        <w:fldChar w:fldCharType="separate"/>
+      </w:r>
+      <w:r>
+        <w:rPr>
+          <w:b w:val="0"/>
+          <w:sz w:val="18"/>
+        </w:rPr>
+        <w:t>1</w:t>
+      </w:r>
+      <w:r>
+        <w:rPr>
+          <w:b w:val="0"/>
+          <w:sz w:val="18"/>
+        </w:rPr>
+        <w:fldChar w:fldCharType="end"/>
+      </w:r>
+      <w:r>
+        <w:rPr>
+          <w:b w:val="0"/>
+          <w:sz w:val="18"/>
+        </w:rPr>
+        <w:t xml:space="preserve">. </w:t>
+      </w:r>
+      <w:proofErr w:type="spellStart"/>
+      <w:r>
+        <w:rPr>
+          <w:b w:val="0"/>
+          <w:sz w:val="18"/>
+        </w:rPr>
+        <w:t>Modelo</w:t>
+      </w:r>
+      <w:proofErr w:type="spellEnd"/>
+      <w:r>
+        <w:rPr>
+          <w:b w:val="0"/>
+          <w:sz w:val="18"/>
+        </w:rPr>
+        <w:t xml:space="preserve"> de </w:t>
+      </w:r>
+      <w:proofErr w:type="spellStart"/>
+      <w:r>
+        <w:rPr>
+          <w:b w:val="0"/>
+          <w:sz w:val="18"/>
+        </w:rPr>
+        <w:t>domínio</w:t>
+      </w:r>
+      <w:proofErr w:type="spellEnd"/>
+      <w:r>
+        <w:rPr>
+          <w:b w:val="0"/>
+          <w:sz w:val="18"/>
+        </w:rPr>
+        <w:t xml:space="preserve"> que </w:t>
+      </w:r>
+      <w:proofErr w:type="spellStart"/>
+      <w:r>
+        <w:rPr>
+          <w:b w:val="0"/>
+          <w:sz w:val="18"/>
+        </w:rPr>
+        <w:t>será</w:t>
+      </w:r>
+      <w:proofErr w:type="spellEnd"/>
+      <w:r>
+        <w:rPr>
+          <w:b w:val="0"/>
+          <w:sz w:val="18"/>
+        </w:rPr>
+        <w:t xml:space="preserve"> </w:t>
+      </w:r>
+      <w:proofErr w:type="spellStart"/>
+      <w:r>
+        <w:rPr>
+          <w:b w:val="0"/>
+          <w:sz w:val="18"/>
+        </w:rPr>
+        <w:t>utilizado</w:t>
+      </w:r>
+      <w:proofErr w:type="spellEnd"/>
+      <w:r>
+        <w:rPr>
+          <w:b w:val="0"/>
+          <w:sz w:val="18"/>
+        </w:rPr>
+        <w:t xml:space="preserve"> no </w:t>
+      </w:r>
+      <w:proofErr w:type="spellStart"/>
+      <w:r>
+        <w:rPr>
+          <w:b w:val="0"/>
+          <w:sz w:val="18"/>
+        </w:rPr>
+        <w:t>desenvolvimento</w:t>
+      </w:r>
+      <w:proofErr w:type="spellEnd"/>
+      <w:r>
+        <w:rPr>
+          <w:b w:val="0"/>
+          <w:sz w:val="18"/>
+        </w:rPr>
+        <w:t xml:space="preserve"> da </w:t>
+      </w:r>
+      <w:proofErr w:type="spellStart"/>
+      <w:r>
+        <w:rPr>
+          <w:b w:val="0"/>
+          <w:sz w:val="18"/>
+        </w:rPr>
+        <w:t>aplicação</w:t>
+      </w:r>
+      <w:proofErr w:type="spellEnd"/>
+    </w:p>
+    <w:p>
+      <w:pPr>
         <w:pStyle w:val="heading1"/>
         <w:rPr>
           <w:lang w:val="pt-BR"/>
@@ -1920,6 +2094,7 @@
         <w:rPr>
           <w:lang w:val="pt-BR"/>
         </w:rPr>
+        <w:lastRenderedPageBreak/>
         <w:t xml:space="preserve">4   Histórias do </w:t>
       </w:r>
       <w:r>
@@ -1928,6 +2103,8 @@
         </w:rPr>
         <w:t>Utilizador</w:t>
       </w:r>
+      <w:bookmarkStart w:id="0" w:name="_GoBack"/>
+      <w:bookmarkEnd w:id="0"/>
     </w:p>
     <w:p>
       <w:pPr>
@@ -2122,9 +2299,15 @@
         <w:rPr>
           <w:lang w:val="pt-BR"/>
         </w:rPr>
-        <w:t>telemóvel.</w:t>
-      </w:r>
-      <w:proofErr w:type="spellEnd"/>
+        <w:t>telemóvel</w:t>
+      </w:r>
+      <w:proofErr w:type="spellEnd"/>
+      <w:r>
+        <w:rPr>
+          <w:lang w:val="pt-BR"/>
+        </w:rPr>
+        <w:t>.</w:t>
+      </w:r>
     </w:p>
     <w:p>
       <w:pPr>
@@ -2221,7 +2404,6 @@
         <w:rPr>
           <w:lang w:val="pt-BR"/>
         </w:rPr>
-        <w:lastRenderedPageBreak/>
         <w:t>A</w:t>
       </w:r>
       <w:r>
@@ -2728,7 +2910,7 @@
       <w:r>
         <w:rPr>
           <w:noProof/>
-          <w:lang w:val="pt-BR" w:eastAsia="pt-PT"/>
+          <w:lang w:val="pt-PT" w:eastAsia="pt-PT"/>
         </w:rPr>
         <w:drawing>
           <wp:anchor distT="0" distB="0" distL="114300" distR="114300" simplePos="0" relativeHeight="251658240" behindDoc="1" locked="0" layoutInCell="1" allowOverlap="1" wp14:anchorId="50858877" wp14:editId="25CD5379">
@@ -2754,7 +2936,7 @@
                     <pic:cNvPicPr/>
                   </pic:nvPicPr>
                   <pic:blipFill>
-                    <a:blip r:embed="rId5" cstate="print">
+                    <a:blip r:embed="rId6" cstate="print">
                       <a:extLst>
                         <a:ext uri="{28A0092B-C50C-407E-A947-70E740481C1C}">
                           <a14:useLocalDpi xmlns:a14="http://schemas.microsoft.com/office/drawing/2010/main" val="0"/>

</xml_diff>

<commit_message>
Adição de UCs no relatório
</commit_message>
<xml_diff>
--- a/Documentation/Relatório-DSSMV-2025-27_2DB_1250771_1251355.docx
+++ b/Documentation/Relatório-DSSMV-2025-27_2DB_1250771_1251355.docx
@@ -804,7 +804,13 @@
         <w:rPr>
           <w:lang w:val="pt-BR"/>
         </w:rPr>
-        <w:t xml:space="preserve">Além disso a aplicação gere despesas com conversão automática de moedas, apresenta informações uteis sobre o país visitado, como fuso horário, moeda e idioma e exibe num mapa todos os pontos visitados na respetiva viagem. A aba </w:t>
+        <w:t xml:space="preserve">Além disso </w:t>
+      </w:r>
+      <w:r>
+        <w:rPr>
+          <w:lang w:val="pt-BR"/>
+        </w:rPr>
+        <w:t xml:space="preserve">exibe num mapa todos os pontos visitados na respetiva viagem. A aba </w:t>
       </w:r>
       <w:r>
         <w:rPr>
@@ -1274,7 +1280,6 @@
               <w:rPr>
                 <w:lang w:val="pt-BR"/>
               </w:rPr>
-              <w:lastRenderedPageBreak/>
               <w:t>Map</w:t>
             </w:r>
             <w:proofErr w:type="spellEnd"/>
@@ -1354,6 +1359,7 @@
               <w:rPr>
                 <w:lang w:val="pt-BR"/>
               </w:rPr>
+              <w:lastRenderedPageBreak/>
               <w:t>Marker</w:t>
             </w:r>
             <w:proofErr w:type="spellEnd"/>
@@ -1887,11 +1893,14 @@
       <w:pPr>
         <w:keepNext/>
         <w:jc w:val="center"/>
+        <w:rPr>
+          <w:lang w:val="pt-BR"/>
+        </w:rPr>
       </w:pPr>
       <w:r>
         <w:rPr>
           <w:noProof/>
-          <w:lang w:val="pt-PT" w:eastAsia="pt-PT"/>
+          <w:lang w:val="pt-BR" w:eastAsia="pt-PT"/>
         </w:rPr>
         <w:drawing>
           <wp:inline distT="0" distB="0" distL="0" distR="0" wp14:anchorId="04F7F78D" wp14:editId="76C0FF2F">
@@ -1939,15 +1948,18 @@
     <w:p>
       <w:pPr>
         <w:pStyle w:val="Legenda"/>
+        <w:jc w:val="center"/>
         <w:rPr>
           <w:b w:val="0"/>
           <w:sz w:val="18"/>
+          <w:lang w:val="pt-BR"/>
         </w:rPr>
       </w:pPr>
       <w:r>
         <w:rPr>
           <w:b w:val="0"/>
           <w:sz w:val="18"/>
+          <w:lang w:val="pt-BR"/>
         </w:rPr>
         <w:t xml:space="preserve">Fig.  </w:t>
       </w:r>
@@ -1955,6 +1967,7 @@
         <w:rPr>
           <w:b w:val="0"/>
           <w:sz w:val="18"/>
+          <w:lang w:val="pt-BR"/>
         </w:rPr>
         <w:fldChar w:fldCharType="begin"/>
       </w:r>
@@ -1962,6 +1975,7 @@
         <w:rPr>
           <w:b w:val="0"/>
           <w:sz w:val="18"/>
+          <w:lang w:val="pt-BR"/>
         </w:rPr>
         <w:instrText xml:space="preserve"> SEQ Figura_ \* ARABIC </w:instrText>
       </w:r>
@@ -1969,6 +1983,7 @@
         <w:rPr>
           <w:b w:val="0"/>
           <w:sz w:val="18"/>
+          <w:lang w:val="pt-BR"/>
         </w:rPr>
         <w:fldChar w:fldCharType="separate"/>
       </w:r>
@@ -1976,6 +1991,7 @@
         <w:rPr>
           <w:b w:val="0"/>
           <w:sz w:val="18"/>
+          <w:lang w:val="pt-BR"/>
         </w:rPr>
         <w:t>1</w:t>
       </w:r>
@@ -1983,6 +1999,7 @@
         <w:rPr>
           <w:b w:val="0"/>
           <w:sz w:val="18"/>
+          <w:lang w:val="pt-BR"/>
         </w:rPr>
         <w:fldChar w:fldCharType="end"/>
       </w:r>
@@ -1990,98 +2007,10 @@
         <w:rPr>
           <w:b w:val="0"/>
           <w:sz w:val="18"/>
-        </w:rPr>
-        <w:t xml:space="preserve">. </w:t>
-      </w:r>
-      <w:proofErr w:type="spellStart"/>
-      <w:r>
-        <w:rPr>
-          <w:b w:val="0"/>
-          <w:sz w:val="18"/>
-        </w:rPr>
-        <w:t>Modelo</w:t>
-      </w:r>
-      <w:proofErr w:type="spellEnd"/>
-      <w:r>
-        <w:rPr>
-          <w:b w:val="0"/>
-          <w:sz w:val="18"/>
-        </w:rPr>
-        <w:t xml:space="preserve"> de </w:t>
-      </w:r>
-      <w:proofErr w:type="spellStart"/>
-      <w:r>
-        <w:rPr>
-          <w:b w:val="0"/>
-          <w:sz w:val="18"/>
-        </w:rPr>
-        <w:t>domínio</w:t>
-      </w:r>
-      <w:proofErr w:type="spellEnd"/>
-      <w:r>
-        <w:rPr>
-          <w:b w:val="0"/>
-          <w:sz w:val="18"/>
-        </w:rPr>
-        <w:t xml:space="preserve"> que </w:t>
-      </w:r>
-      <w:proofErr w:type="spellStart"/>
-      <w:r>
-        <w:rPr>
-          <w:b w:val="0"/>
-          <w:sz w:val="18"/>
-        </w:rPr>
-        <w:t>será</w:t>
-      </w:r>
-      <w:proofErr w:type="spellEnd"/>
-      <w:r>
-        <w:rPr>
-          <w:b w:val="0"/>
-          <w:sz w:val="18"/>
-        </w:rPr>
-        <w:t xml:space="preserve"> </w:t>
-      </w:r>
-      <w:proofErr w:type="spellStart"/>
-      <w:r>
-        <w:rPr>
-          <w:b w:val="0"/>
-          <w:sz w:val="18"/>
-        </w:rPr>
-        <w:t>utilizado</w:t>
-      </w:r>
-      <w:proofErr w:type="spellEnd"/>
-      <w:r>
-        <w:rPr>
-          <w:b w:val="0"/>
-          <w:sz w:val="18"/>
-        </w:rPr>
-        <w:t xml:space="preserve"> no </w:t>
-      </w:r>
-      <w:proofErr w:type="spellStart"/>
-      <w:r>
-        <w:rPr>
-          <w:b w:val="0"/>
-          <w:sz w:val="18"/>
-        </w:rPr>
-        <w:t>desenvolvimento</w:t>
-      </w:r>
-      <w:proofErr w:type="spellEnd"/>
-      <w:r>
-        <w:rPr>
-          <w:b w:val="0"/>
-          <w:sz w:val="18"/>
-        </w:rPr>
-        <w:t xml:space="preserve"> da </w:t>
-      </w:r>
-      <w:proofErr w:type="spellStart"/>
-      <w:r>
-        <w:rPr>
-          <w:b w:val="0"/>
-          <w:sz w:val="18"/>
-        </w:rPr>
-        <w:t>aplicação</w:t>
-      </w:r>
-      <w:proofErr w:type="spellEnd"/>
+          <w:lang w:val="pt-BR"/>
+        </w:rPr>
+        <w:t>. Modelo de domínio que será utilizado no desenvolvimento da aplicação</w:t>
+      </w:r>
     </w:p>
     <w:p>
       <w:pPr>
@@ -2103,8 +2032,6 @@
         </w:rPr>
         <w:t>Utilizador</w:t>
       </w:r>
-      <w:bookmarkStart w:id="0" w:name="_GoBack"/>
-      <w:bookmarkEnd w:id="0"/>
     </w:p>
     <w:p>
       <w:pPr>
@@ -2379,13 +2306,7 @@
         <w:rPr>
           <w:lang w:val="pt-BR"/>
         </w:rPr>
-        <w:t>início</w:t>
-      </w:r>
-      <w:r>
-        <w:rPr>
-          <w:lang w:val="pt-BR"/>
-        </w:rPr>
-        <w:t>;</w:t>
+        <w:t>início;</w:t>
       </w:r>
     </w:p>
     <w:p>
@@ -2494,13 +2415,7 @@
         <w:rPr>
           <w:lang w:val="pt-BR"/>
         </w:rPr>
-        <w:t>Como utilizador, quero ver a lista das minhas viagens, para escolher qual quero</w:t>
-      </w:r>
-      <w:r>
-        <w:rPr>
-          <w:lang w:val="pt-BR"/>
-        </w:rPr>
-        <w:t xml:space="preserve"> abrir.</w:t>
+        <w:t>Como utilizador, quero ver a lista das minhas viagens, para escolher qual quero abrir.</w:t>
       </w:r>
     </w:p>
     <w:p>
@@ -2568,13 +2483,7 @@
         <w:rPr>
           <w:lang w:val="pt-BR"/>
         </w:rPr>
-        <w:t>título</w:t>
-      </w:r>
-      <w:r>
-        <w:rPr>
-          <w:lang w:val="pt-BR"/>
-        </w:rPr>
-        <w:t>, as datas e número de locais;</w:t>
+        <w:t>título, as datas e número de locais;</w:t>
       </w:r>
     </w:p>
     <w:p>
@@ -2643,6 +2552,49 @@
         </w:rPr>
         <w:t>5.1.1   Especificações de Casos de Uso</w:t>
       </w:r>
+    </w:p>
+    <w:p>
+      <w:pPr>
+        <w:pStyle w:val="Legenda"/>
+        <w:jc w:val="center"/>
+        <w:rPr>
+          <w:b w:val="0"/>
+          <w:sz w:val="18"/>
+          <w:szCs w:val="18"/>
+          <w:lang w:val="pt-BR"/>
+        </w:rPr>
+      </w:pPr>
+      <w:proofErr w:type="spellStart"/>
+      <w:r>
+        <w:rPr>
+          <w:b w:val="0"/>
+          <w:sz w:val="18"/>
+          <w:szCs w:val="18"/>
+          <w:lang w:val="pt-BR"/>
+        </w:rPr>
+        <w:t>UC</w:t>
+      </w:r>
+      <w:proofErr w:type="spellEnd"/>
+      <w:r>
+        <w:rPr>
+          <w:b w:val="0"/>
+          <w:sz w:val="18"/>
+          <w:szCs w:val="18"/>
+          <w:lang w:val="pt-BR"/>
+        </w:rPr>
+        <w:t xml:space="preserve"> 1. </w:t>
+      </w:r>
+      <w:proofErr w:type="gramStart"/>
+      <w:r>
+        <w:rPr>
+          <w:b w:val="0"/>
+          <w:sz w:val="18"/>
+          <w:szCs w:val="18"/>
+          <w:lang w:val="pt-BR"/>
+        </w:rPr>
+        <w:t>Registar Utilizador</w:t>
+      </w:r>
+      <w:proofErr w:type="gramEnd"/>
     </w:p>
     <w:tbl>
       <w:tblPr>
@@ -2692,6 +2644,12 @@
                 <w:lang w:val="pt-BR"/>
               </w:rPr>
             </w:pPr>
+            <w:r>
+              <w:rPr>
+                <w:lang w:val="pt-BR"/>
+              </w:rPr>
+              <w:t>Cria uma nova conta na aplicação</w:t>
+            </w:r>
           </w:p>
         </w:tc>
       </w:tr>
@@ -2726,6 +2684,26 @@
                 <w:lang w:val="pt-BR"/>
               </w:rPr>
             </w:pPr>
+            <w:r>
+              <w:rPr>
+                <w:lang w:val="pt-BR"/>
+              </w:rPr>
+              <w:t xml:space="preserve">O </w:t>
+            </w:r>
+            <w:proofErr w:type="spellStart"/>
+            <w:r>
+              <w:rPr>
+                <w:lang w:val="pt-BR"/>
+              </w:rPr>
+              <w:t>email</w:t>
+            </w:r>
+            <w:proofErr w:type="spellEnd"/>
+            <w:r>
+              <w:rPr>
+                <w:lang w:val="pt-BR"/>
+              </w:rPr>
+              <w:t xml:space="preserve"> introduzido não existe no sistema</w:t>
+            </w:r>
           </w:p>
         </w:tc>
       </w:tr>
@@ -2760,6 +2738,12 @@
                 <w:lang w:val="pt-BR"/>
               </w:rPr>
             </w:pPr>
+            <w:r>
+              <w:rPr>
+                <w:lang w:val="pt-BR"/>
+              </w:rPr>
+              <w:t>O utilizador passa a ter uma conta na aplicação e fica com a sessão iniciada</w:t>
+            </w:r>
           </w:p>
         </w:tc>
       </w:tr>
@@ -2790,10 +2774,135 @@
           <w:p>
             <w:pPr>
               <w:pStyle w:val="p1a"/>
-              <w:rPr>
-                <w:lang w:val="pt-BR"/>
-              </w:rPr>
-            </w:pPr>
+              <w:numPr>
+                <w:ilvl w:val="0"/>
+                <w:numId w:val="9"/>
+              </w:numPr>
+              <w:rPr>
+                <w:lang w:val="pt-BR"/>
+              </w:rPr>
+            </w:pPr>
+            <w:r>
+              <w:rPr>
+                <w:lang w:val="pt-BR"/>
+              </w:rPr>
+              <w:t xml:space="preserve">O sistema solicita o nome, </w:t>
+            </w:r>
+            <w:proofErr w:type="spellStart"/>
+            <w:r>
+              <w:rPr>
+                <w:lang w:val="pt-BR"/>
+              </w:rPr>
+              <w:t>email</w:t>
+            </w:r>
+            <w:proofErr w:type="spellEnd"/>
+            <w:r>
+              <w:rPr>
+                <w:lang w:val="pt-BR"/>
+              </w:rPr>
+              <w:t xml:space="preserve"> e palavra-passe;</w:t>
+            </w:r>
+          </w:p>
+          <w:p>
+            <w:pPr>
+              <w:pStyle w:val="PargrafodaLista"/>
+              <w:numPr>
+                <w:ilvl w:val="0"/>
+                <w:numId w:val="9"/>
+              </w:numPr>
+              <w:rPr>
+                <w:lang w:val="pt-BR"/>
+              </w:rPr>
+            </w:pPr>
+            <w:r>
+              <w:rPr>
+                <w:lang w:val="pt-BR"/>
+              </w:rPr>
+              <w:t>O utilizador preenche os dados;</w:t>
+            </w:r>
+          </w:p>
+          <w:p>
+            <w:pPr>
+              <w:pStyle w:val="PargrafodaLista"/>
+              <w:numPr>
+                <w:ilvl w:val="0"/>
+                <w:numId w:val="9"/>
+              </w:numPr>
+              <w:rPr>
+                <w:lang w:val="pt-BR"/>
+              </w:rPr>
+            </w:pPr>
+            <w:r>
+              <w:rPr>
+                <w:lang w:val="pt-BR"/>
+              </w:rPr>
+              <w:t xml:space="preserve">O sistema valida o nome, o </w:t>
+            </w:r>
+            <w:proofErr w:type="spellStart"/>
+            <w:r>
+              <w:rPr>
+                <w:lang w:val="pt-BR"/>
+              </w:rPr>
+              <w:t>email</w:t>
+            </w:r>
+            <w:proofErr w:type="spellEnd"/>
+            <w:r>
+              <w:rPr>
+                <w:lang w:val="pt-BR"/>
+              </w:rPr>
+              <w:t xml:space="preserve"> e a palavra-passe;</w:t>
+            </w:r>
+          </w:p>
+          <w:p>
+            <w:pPr>
+              <w:pStyle w:val="PargrafodaLista"/>
+              <w:numPr>
+                <w:ilvl w:val="0"/>
+                <w:numId w:val="9"/>
+              </w:numPr>
+              <w:rPr>
+                <w:lang w:val="pt-BR"/>
+              </w:rPr>
+            </w:pPr>
+            <w:r>
+              <w:rPr>
+                <w:lang w:val="pt-BR"/>
+              </w:rPr>
+              <w:lastRenderedPageBreak/>
+              <w:t xml:space="preserve">O sistema guarda a palavra-passe como </w:t>
+            </w:r>
+            <w:proofErr w:type="spellStart"/>
+            <w:r>
+              <w:rPr>
+                <w:lang w:val="pt-BR"/>
+              </w:rPr>
+              <w:t>SHA</w:t>
+            </w:r>
+            <w:proofErr w:type="spellEnd"/>
+            <w:r>
+              <w:rPr>
+                <w:lang w:val="pt-BR"/>
+              </w:rPr>
+              <w:t>-256 e regista o novo utilizador no sistema;</w:t>
+            </w:r>
+          </w:p>
+          <w:p>
+            <w:pPr>
+              <w:pStyle w:val="PargrafodaLista"/>
+              <w:numPr>
+                <w:ilvl w:val="0"/>
+                <w:numId w:val="9"/>
+              </w:numPr>
+              <w:rPr>
+                <w:lang w:val="pt-BR"/>
+              </w:rPr>
+            </w:pPr>
+            <w:r>
+              <w:rPr>
+                <w:lang w:val="pt-BR"/>
+              </w:rPr>
+              <w:t>O sistema inicia a sessão e abre a lista de viagens.</w:t>
+            </w:r>
           </w:p>
         </w:tc>
       </w:tr>
@@ -2813,6 +2922,7 @@
               <w:rPr>
                 <w:lang w:val="pt-BR"/>
               </w:rPr>
+              <w:lastRenderedPageBreak/>
               <w:t>Caminho alternativo</w:t>
             </w:r>
           </w:p>
@@ -2824,24 +2934,26 @@
           <w:p>
             <w:pPr>
               <w:pStyle w:val="p1a"/>
-              <w:rPr>
-                <w:lang w:val="pt-BR"/>
-              </w:rPr>
-            </w:pPr>
+              <w:numPr>
+                <w:ilvl w:val="1"/>
+                <w:numId w:val="12"/>
+              </w:numPr>
+              <w:rPr>
+                <w:lang w:val="pt-BR"/>
+              </w:rPr>
+            </w:pPr>
+            <w:r>
+              <w:rPr>
+                <w:lang w:val="pt-BR"/>
+              </w:rPr>
+              <w:t>O utilizador insere dados inválidos: o sistema informa o erro e solicita outros dados.</w:t>
+            </w:r>
           </w:p>
         </w:tc>
       </w:tr>
     </w:tbl>
     <w:p>
       <w:pPr>
-        <w:pStyle w:val="p1a"/>
-        <w:rPr>
-          <w:lang w:val="pt-BR"/>
-        </w:rPr>
-      </w:pPr>
-    </w:p>
-    <w:p>
-      <w:pPr>
         <w:spacing w:after="160" w:line="259" w:lineRule="auto"/>
         <w:ind w:firstLine="0"/>
         <w:jc w:val="left"/>
@@ -2849,12 +2961,907 @@
           <w:lang w:val="pt-BR"/>
         </w:rPr>
       </w:pPr>
-      <w:r>
-        <w:rPr>
-          <w:lang w:val="pt-BR"/>
-        </w:rPr>
-        <w:br w:type="page"/>
-      </w:r>
+    </w:p>
+    <w:p>
+      <w:pPr>
+        <w:pStyle w:val="Legenda"/>
+        <w:jc w:val="center"/>
+        <w:rPr>
+          <w:b w:val="0"/>
+          <w:i/>
+          <w:sz w:val="18"/>
+          <w:szCs w:val="18"/>
+          <w:lang w:val="pt-BR"/>
+        </w:rPr>
+      </w:pPr>
+      <w:proofErr w:type="spellStart"/>
+      <w:r>
+        <w:rPr>
+          <w:b w:val="0"/>
+          <w:sz w:val="18"/>
+          <w:szCs w:val="18"/>
+          <w:lang w:val="pt-BR"/>
+        </w:rPr>
+        <w:t>UC</w:t>
+      </w:r>
+      <w:proofErr w:type="spellEnd"/>
+      <w:r>
+        <w:rPr>
+          <w:b w:val="0"/>
+          <w:sz w:val="18"/>
+          <w:szCs w:val="18"/>
+          <w:lang w:val="pt-BR"/>
+        </w:rPr>
+        <w:t xml:space="preserve"> 2. Iniciar Sessão</w:t>
+      </w:r>
+    </w:p>
+    <w:tbl>
+      <w:tblPr>
+        <w:tblW w:w="0" w:type="auto"/>
+        <w:tblBorders>
+          <w:top w:val="single" w:sz="4" w:space="0" w:color="auto"/>
+          <w:left w:val="single" w:sz="4" w:space="0" w:color="auto"/>
+          <w:bottom w:val="single" w:sz="4" w:space="0" w:color="auto"/>
+          <w:right w:val="single" w:sz="4" w:space="0" w:color="auto"/>
+          <w:insideH w:val="single" w:sz="4" w:space="0" w:color="auto"/>
+          <w:insideV w:val="single" w:sz="4" w:space="0" w:color="auto"/>
+        </w:tblBorders>
+        <w:tblLook w:val="04A0" w:firstRow="1" w:lastRow="0" w:firstColumn="1" w:lastColumn="0" w:noHBand="0" w:noVBand="1"/>
+      </w:tblPr>
+      <w:tblGrid>
+        <w:gridCol w:w="2268"/>
+        <w:gridCol w:w="4536"/>
+      </w:tblGrid>
+      <w:tr>
+        <w:tc>
+          <w:tcPr>
+            <w:tcW w:w="2268" w:type="dxa"/>
+          </w:tcPr>
+          <w:p>
+            <w:pPr>
+              <w:pStyle w:val="p1a"/>
+              <w:rPr>
+                <w:lang w:val="pt-BR"/>
+              </w:rPr>
+            </w:pPr>
+            <w:r>
+              <w:rPr>
+                <w:lang w:val="pt-BR"/>
+              </w:rPr>
+              <w:t>Descrição</w:t>
+            </w:r>
+          </w:p>
+        </w:tc>
+        <w:tc>
+          <w:tcPr>
+            <w:tcW w:w="4536" w:type="dxa"/>
+          </w:tcPr>
+          <w:p>
+            <w:pPr>
+              <w:pStyle w:val="p1a"/>
+              <w:rPr>
+                <w:lang w:val="pt-BR"/>
+              </w:rPr>
+            </w:pPr>
+            <w:r>
+              <w:rPr>
+                <w:lang w:val="pt-BR"/>
+              </w:rPr>
+              <w:t xml:space="preserve">Permite ao utilizador autenticar-se na aplicação </w:t>
+            </w:r>
+          </w:p>
+        </w:tc>
+      </w:tr>
+      <w:tr>
+        <w:tc>
+          <w:tcPr>
+            <w:tcW w:w="2268" w:type="dxa"/>
+          </w:tcPr>
+          <w:p>
+            <w:pPr>
+              <w:pStyle w:val="p1a"/>
+              <w:rPr>
+                <w:lang w:val="pt-BR"/>
+              </w:rPr>
+            </w:pPr>
+            <w:r>
+              <w:rPr>
+                <w:lang w:val="pt-BR"/>
+              </w:rPr>
+              <w:t>Pré-condição</w:t>
+            </w:r>
+          </w:p>
+        </w:tc>
+        <w:tc>
+          <w:tcPr>
+            <w:tcW w:w="4536" w:type="dxa"/>
+          </w:tcPr>
+          <w:p>
+            <w:pPr>
+              <w:pStyle w:val="p1a"/>
+              <w:rPr>
+                <w:lang w:val="pt-BR"/>
+              </w:rPr>
+            </w:pPr>
+            <w:r>
+              <w:rPr>
+                <w:lang w:val="pt-BR"/>
+              </w:rPr>
+              <w:t>Existe um</w:t>
+            </w:r>
+            <w:r>
+              <w:rPr>
+                <w:lang w:val="pt-BR"/>
+              </w:rPr>
+              <w:t xml:space="preserve">a conta com o </w:t>
+            </w:r>
+            <w:proofErr w:type="spellStart"/>
+            <w:r>
+              <w:rPr>
+                <w:lang w:val="pt-BR"/>
+              </w:rPr>
+              <w:t>email</w:t>
+            </w:r>
+            <w:proofErr w:type="spellEnd"/>
+            <w:r>
+              <w:rPr>
+                <w:lang w:val="pt-BR"/>
+              </w:rPr>
+              <w:t xml:space="preserve"> introduzido</w:t>
+            </w:r>
+          </w:p>
+        </w:tc>
+      </w:tr>
+      <w:tr>
+        <w:tc>
+          <w:tcPr>
+            <w:tcW w:w="2268" w:type="dxa"/>
+          </w:tcPr>
+          <w:p>
+            <w:pPr>
+              <w:pStyle w:val="p1a"/>
+              <w:rPr>
+                <w:lang w:val="pt-BR"/>
+              </w:rPr>
+            </w:pPr>
+            <w:r>
+              <w:rPr>
+                <w:lang w:val="pt-BR"/>
+              </w:rPr>
+              <w:t>Pós-condição</w:t>
+            </w:r>
+          </w:p>
+        </w:tc>
+        <w:tc>
+          <w:tcPr>
+            <w:tcW w:w="4536" w:type="dxa"/>
+          </w:tcPr>
+          <w:p>
+            <w:pPr>
+              <w:pStyle w:val="p1a"/>
+              <w:rPr>
+                <w:lang w:val="pt-BR"/>
+              </w:rPr>
+            </w:pPr>
+            <w:r>
+              <w:rPr>
+                <w:lang w:val="pt-BR"/>
+              </w:rPr>
+              <w:t>O utilizador fica com sessã</w:t>
+            </w:r>
+            <w:r>
+              <w:rPr>
+                <w:lang w:val="pt-BR"/>
+              </w:rPr>
+              <w:t>o iniciada e vê as suas viagens</w:t>
+            </w:r>
+          </w:p>
+        </w:tc>
+      </w:tr>
+      <w:tr>
+        <w:tc>
+          <w:tcPr>
+            <w:tcW w:w="2268" w:type="dxa"/>
+          </w:tcPr>
+          <w:p>
+            <w:pPr>
+              <w:pStyle w:val="p1a"/>
+              <w:rPr>
+                <w:lang w:val="pt-BR"/>
+              </w:rPr>
+            </w:pPr>
+            <w:r>
+              <w:rPr>
+                <w:lang w:val="pt-BR"/>
+              </w:rPr>
+              <w:t>Caminho principal</w:t>
+            </w:r>
+          </w:p>
+        </w:tc>
+        <w:tc>
+          <w:tcPr>
+            <w:tcW w:w="4536" w:type="dxa"/>
+          </w:tcPr>
+          <w:p>
+            <w:pPr>
+              <w:pStyle w:val="p1a"/>
+              <w:numPr>
+                <w:ilvl w:val="0"/>
+                <w:numId w:val="13"/>
+              </w:numPr>
+              <w:rPr>
+                <w:lang w:val="pt-BR"/>
+              </w:rPr>
+            </w:pPr>
+            <w:r>
+              <w:rPr>
+                <w:lang w:val="pt-BR"/>
+              </w:rPr>
+              <w:t xml:space="preserve">O sistema solicita o </w:t>
+            </w:r>
+            <w:proofErr w:type="spellStart"/>
+            <w:r>
+              <w:rPr>
+                <w:lang w:val="pt-BR"/>
+              </w:rPr>
+              <w:t>email</w:t>
+            </w:r>
+            <w:proofErr w:type="spellEnd"/>
+            <w:r>
+              <w:rPr>
+                <w:lang w:val="pt-BR"/>
+              </w:rPr>
+              <w:t xml:space="preserve"> e</w:t>
+            </w:r>
+            <w:r>
+              <w:rPr>
+                <w:lang w:val="pt-BR"/>
+              </w:rPr>
+              <w:t xml:space="preserve"> a</w:t>
+            </w:r>
+            <w:r>
+              <w:rPr>
+                <w:lang w:val="pt-BR"/>
+              </w:rPr>
+              <w:t xml:space="preserve"> palavra-passe;</w:t>
+            </w:r>
+          </w:p>
+          <w:p>
+            <w:pPr>
+              <w:pStyle w:val="PargrafodaLista"/>
+              <w:numPr>
+                <w:ilvl w:val="0"/>
+                <w:numId w:val="13"/>
+              </w:numPr>
+              <w:rPr>
+                <w:lang w:val="pt-BR"/>
+              </w:rPr>
+            </w:pPr>
+            <w:r>
+              <w:rPr>
+                <w:lang w:val="pt-BR"/>
+              </w:rPr>
+              <w:t>O utilizador preenche os dados;</w:t>
+            </w:r>
+          </w:p>
+          <w:p>
+            <w:pPr>
+              <w:pStyle w:val="PargrafodaLista"/>
+              <w:numPr>
+                <w:ilvl w:val="0"/>
+                <w:numId w:val="13"/>
+              </w:numPr>
+              <w:rPr>
+                <w:lang w:val="pt-BR"/>
+              </w:rPr>
+            </w:pPr>
+            <w:r>
+              <w:rPr>
+                <w:lang w:val="pt-BR"/>
+              </w:rPr>
+              <w:t xml:space="preserve">O sistema calcula o </w:t>
+            </w:r>
+            <w:proofErr w:type="spellStart"/>
+            <w:r>
+              <w:rPr>
+                <w:lang w:val="pt-BR"/>
+              </w:rPr>
+              <w:t>hash</w:t>
+            </w:r>
+            <w:proofErr w:type="spellEnd"/>
+            <w:r>
+              <w:rPr>
+                <w:lang w:val="pt-BR"/>
+              </w:rPr>
+              <w:t xml:space="preserve"> da palavra-p</w:t>
+            </w:r>
+            <w:r>
+              <w:rPr>
+                <w:lang w:val="pt-BR"/>
+              </w:rPr>
+              <w:t>asse e compara-o com o guardado;</w:t>
+            </w:r>
+          </w:p>
+          <w:p>
+            <w:pPr>
+              <w:pStyle w:val="PargrafodaLista"/>
+              <w:numPr>
+                <w:ilvl w:val="0"/>
+                <w:numId w:val="13"/>
+              </w:numPr>
+              <w:rPr>
+                <w:lang w:val="pt-BR"/>
+              </w:rPr>
+            </w:pPr>
+            <w:r>
+              <w:rPr>
+                <w:lang w:val="pt-BR"/>
+              </w:rPr>
+              <w:t>O sistema inicia a sessão e abre a lista de viagens.</w:t>
+            </w:r>
+          </w:p>
+        </w:tc>
+      </w:tr>
+      <w:tr>
+        <w:tc>
+          <w:tcPr>
+            <w:tcW w:w="2268" w:type="dxa"/>
+          </w:tcPr>
+          <w:p>
+            <w:pPr>
+              <w:pStyle w:val="p1a"/>
+              <w:rPr>
+                <w:lang w:val="pt-BR"/>
+              </w:rPr>
+            </w:pPr>
+            <w:r>
+              <w:rPr>
+                <w:lang w:val="pt-BR"/>
+              </w:rPr>
+              <w:t>Caminho alternativo</w:t>
+            </w:r>
+          </w:p>
+        </w:tc>
+        <w:tc>
+          <w:tcPr>
+            <w:tcW w:w="4536" w:type="dxa"/>
+          </w:tcPr>
+          <w:p>
+            <w:pPr>
+              <w:pStyle w:val="p1a"/>
+              <w:numPr>
+                <w:ilvl w:val="1"/>
+                <w:numId w:val="13"/>
+              </w:numPr>
+              <w:rPr>
+                <w:lang w:val="pt-BR"/>
+              </w:rPr>
+            </w:pPr>
+            <w:r>
+              <w:rPr>
+                <w:lang w:val="pt-BR"/>
+              </w:rPr>
+              <w:t>O utilizador insere dados inválidos: o sistema informa o erro e solicita outros dados.</w:t>
+            </w:r>
+          </w:p>
+        </w:tc>
+      </w:tr>
+    </w:tbl>
+    <w:p>
+      <w:pPr>
+        <w:spacing w:after="160" w:line="259" w:lineRule="auto"/>
+        <w:ind w:firstLine="0"/>
+        <w:jc w:val="left"/>
+        <w:rPr>
+          <w:lang w:val="pt-BR"/>
+        </w:rPr>
+      </w:pPr>
+    </w:p>
+    <w:p>
+      <w:pPr>
+        <w:pStyle w:val="Legenda"/>
+        <w:jc w:val="center"/>
+        <w:rPr>
+          <w:b w:val="0"/>
+          <w:lang w:val="pt-BR"/>
+        </w:rPr>
+      </w:pPr>
+      <w:proofErr w:type="spellStart"/>
+      <w:r>
+        <w:rPr>
+          <w:b w:val="0"/>
+          <w:lang w:val="pt-BR"/>
+        </w:rPr>
+        <w:t>UC</w:t>
+      </w:r>
+      <w:proofErr w:type="spellEnd"/>
+      <w:r>
+        <w:rPr>
+          <w:b w:val="0"/>
+          <w:lang w:val="pt-BR"/>
+        </w:rPr>
+        <w:t xml:space="preserve"> 3. Criar Viagem</w:t>
+      </w:r>
+    </w:p>
+    <w:tbl>
+      <w:tblPr>
+        <w:tblW w:w="0" w:type="auto"/>
+        <w:tblBorders>
+          <w:top w:val="single" w:sz="4" w:space="0" w:color="auto"/>
+          <w:left w:val="single" w:sz="4" w:space="0" w:color="auto"/>
+          <w:bottom w:val="single" w:sz="4" w:space="0" w:color="auto"/>
+          <w:right w:val="single" w:sz="4" w:space="0" w:color="auto"/>
+          <w:insideH w:val="single" w:sz="4" w:space="0" w:color="auto"/>
+          <w:insideV w:val="single" w:sz="4" w:space="0" w:color="auto"/>
+        </w:tblBorders>
+        <w:tblLook w:val="04A0" w:firstRow="1" w:lastRow="0" w:firstColumn="1" w:lastColumn="0" w:noHBand="0" w:noVBand="1"/>
+      </w:tblPr>
+      <w:tblGrid>
+        <w:gridCol w:w="2268"/>
+        <w:gridCol w:w="4536"/>
+      </w:tblGrid>
+      <w:tr>
+        <w:tc>
+          <w:tcPr>
+            <w:tcW w:w="2268" w:type="dxa"/>
+          </w:tcPr>
+          <w:p>
+            <w:pPr>
+              <w:pStyle w:val="p1a"/>
+              <w:rPr>
+                <w:lang w:val="pt-BR"/>
+              </w:rPr>
+            </w:pPr>
+            <w:r>
+              <w:rPr>
+                <w:lang w:val="pt-BR"/>
+              </w:rPr>
+              <w:t>Descrição</w:t>
+            </w:r>
+          </w:p>
+        </w:tc>
+        <w:tc>
+          <w:tcPr>
+            <w:tcW w:w="4536" w:type="dxa"/>
+          </w:tcPr>
+          <w:p>
+            <w:pPr>
+              <w:pStyle w:val="p1a"/>
+              <w:rPr>
+                <w:lang w:val="pt-BR"/>
+              </w:rPr>
+            </w:pPr>
+            <w:r>
+              <w:rPr>
+                <w:lang w:val="pt-BR"/>
+              </w:rPr>
+              <w:t>Regista uma nova v</w:t>
+            </w:r>
+            <w:r>
+              <w:rPr>
+                <w:lang w:val="pt-BR"/>
+              </w:rPr>
+              <w:t>iagem do utilizador autenticado</w:t>
+            </w:r>
+          </w:p>
+        </w:tc>
+      </w:tr>
+      <w:tr>
+        <w:tc>
+          <w:tcPr>
+            <w:tcW w:w="2268" w:type="dxa"/>
+          </w:tcPr>
+          <w:p>
+            <w:pPr>
+              <w:pStyle w:val="p1a"/>
+              <w:rPr>
+                <w:lang w:val="pt-BR"/>
+              </w:rPr>
+            </w:pPr>
+            <w:r>
+              <w:rPr>
+                <w:lang w:val="pt-BR"/>
+              </w:rPr>
+              <w:t>Pré-condição</w:t>
+            </w:r>
+          </w:p>
+        </w:tc>
+        <w:tc>
+          <w:tcPr>
+            <w:tcW w:w="4536" w:type="dxa"/>
+          </w:tcPr>
+          <w:p>
+            <w:pPr>
+              <w:pStyle w:val="p1a"/>
+              <w:rPr>
+                <w:lang w:val="pt-BR"/>
+              </w:rPr>
+            </w:pPr>
+            <w:r>
+              <w:rPr>
+                <w:lang w:val="pt-BR"/>
+              </w:rPr>
+              <w:t>O</w:t>
+            </w:r>
+            <w:r>
+              <w:rPr>
+                <w:lang w:val="pt-BR"/>
+              </w:rPr>
+              <w:t xml:space="preserve"> utilizador tem sessão iniciada</w:t>
+            </w:r>
+          </w:p>
+        </w:tc>
+      </w:tr>
+      <w:tr>
+        <w:tc>
+          <w:tcPr>
+            <w:tcW w:w="2268" w:type="dxa"/>
+          </w:tcPr>
+          <w:p>
+            <w:pPr>
+              <w:pStyle w:val="p1a"/>
+              <w:rPr>
+                <w:lang w:val="pt-BR"/>
+              </w:rPr>
+            </w:pPr>
+            <w:r>
+              <w:rPr>
+                <w:lang w:val="pt-BR"/>
+              </w:rPr>
+              <w:t>Pós-condição</w:t>
+            </w:r>
+          </w:p>
+        </w:tc>
+        <w:tc>
+          <w:tcPr>
+            <w:tcW w:w="4536" w:type="dxa"/>
+          </w:tcPr>
+          <w:p>
+            <w:pPr>
+              <w:pStyle w:val="p1a"/>
+              <w:rPr>
+                <w:lang w:val="pt-BR"/>
+              </w:rPr>
+            </w:pPr>
+            <w:r>
+              <w:rPr>
+                <w:lang w:val="pt-BR"/>
+              </w:rPr>
+              <w:t>A viagem fica guarda</w:t>
+            </w:r>
+            <w:r>
+              <w:rPr>
+                <w:lang w:val="pt-BR"/>
+              </w:rPr>
+              <w:t xml:space="preserve">da no </w:t>
+            </w:r>
+            <w:proofErr w:type="spellStart"/>
+            <w:r>
+              <w:rPr>
+                <w:lang w:val="pt-BR"/>
+              </w:rPr>
+              <w:t>RestDB</w:t>
+            </w:r>
+            <w:proofErr w:type="spellEnd"/>
+            <w:r>
+              <w:rPr>
+                <w:lang w:val="pt-BR"/>
+              </w:rPr>
+              <w:t xml:space="preserve"> e aparece na lista</w:t>
+            </w:r>
+          </w:p>
+        </w:tc>
+      </w:tr>
+      <w:tr>
+        <w:tc>
+          <w:tcPr>
+            <w:tcW w:w="2268" w:type="dxa"/>
+          </w:tcPr>
+          <w:p>
+            <w:pPr>
+              <w:pStyle w:val="p1a"/>
+              <w:rPr>
+                <w:lang w:val="pt-BR"/>
+              </w:rPr>
+            </w:pPr>
+            <w:r>
+              <w:rPr>
+                <w:lang w:val="pt-BR"/>
+              </w:rPr>
+              <w:t>Caminho principal</w:t>
+            </w:r>
+          </w:p>
+        </w:tc>
+        <w:tc>
+          <w:tcPr>
+            <w:tcW w:w="4536" w:type="dxa"/>
+          </w:tcPr>
+          <w:p>
+            <w:pPr>
+              <w:pStyle w:val="p1a"/>
+              <w:numPr>
+                <w:ilvl w:val="0"/>
+                <w:numId w:val="14"/>
+              </w:numPr>
+              <w:rPr>
+                <w:lang w:val="pt-BR"/>
+              </w:rPr>
+            </w:pPr>
+            <w:r>
+              <w:rPr>
+                <w:lang w:val="pt-BR"/>
+              </w:rPr>
+              <w:t xml:space="preserve">O utilizador </w:t>
+            </w:r>
+            <w:r>
+              <w:rPr>
+                <w:lang w:val="pt-BR"/>
+              </w:rPr>
+              <w:t>clica</w:t>
+            </w:r>
+            <w:r>
+              <w:rPr>
+                <w:lang w:val="pt-BR"/>
+              </w:rPr>
+              <w:t xml:space="preserve"> em “Nova viagem”;</w:t>
+            </w:r>
+          </w:p>
+          <w:p>
+            <w:pPr>
+              <w:pStyle w:val="PargrafodaLista"/>
+              <w:numPr>
+                <w:ilvl w:val="0"/>
+                <w:numId w:val="14"/>
+              </w:numPr>
+              <w:rPr>
+                <w:lang w:val="pt-BR"/>
+              </w:rPr>
+            </w:pPr>
+            <w:r>
+              <w:rPr>
+                <w:lang w:val="pt-BR"/>
+              </w:rPr>
+              <w:t>O sistema pede o título, a descrição (opcio</w:t>
+            </w:r>
+            <w:r>
+              <w:rPr>
+                <w:lang w:val="pt-BR"/>
+              </w:rPr>
+              <w:t>nal) e as datas de início e fim</w:t>
+            </w:r>
+            <w:r>
+              <w:rPr>
+                <w:lang w:val="pt-BR"/>
+              </w:rPr>
+              <w:t>;</w:t>
+            </w:r>
+          </w:p>
+          <w:p>
+            <w:pPr>
+              <w:pStyle w:val="PargrafodaLista"/>
+              <w:numPr>
+                <w:ilvl w:val="0"/>
+                <w:numId w:val="14"/>
+              </w:numPr>
+              <w:rPr>
+                <w:lang w:val="pt-BR"/>
+              </w:rPr>
+            </w:pPr>
+            <w:r>
+              <w:rPr>
+                <w:lang w:val="pt-BR"/>
+              </w:rPr>
+              <w:t>O</w:t>
+            </w:r>
+            <w:r>
+              <w:rPr>
+                <w:lang w:val="pt-BR"/>
+              </w:rPr>
+              <w:t xml:space="preserve"> utilizador preenche e confirma;</w:t>
+            </w:r>
+          </w:p>
+          <w:p>
+            <w:pPr>
+              <w:pStyle w:val="PargrafodaLista"/>
+              <w:numPr>
+                <w:ilvl w:val="0"/>
+                <w:numId w:val="14"/>
+              </w:numPr>
+              <w:rPr>
+                <w:lang w:val="pt-BR"/>
+              </w:rPr>
+            </w:pPr>
+            <w:r>
+              <w:rPr>
+                <w:lang w:val="pt-BR"/>
+              </w:rPr>
+              <w:t>O sistema valida se a</w:t>
+            </w:r>
+            <w:r>
+              <w:rPr>
+                <w:lang w:val="pt-BR"/>
+              </w:rPr>
+              <w:t xml:space="preserve"> data de fim</w:t>
+            </w:r>
+            <w:r>
+              <w:rPr>
+                <w:lang w:val="pt-BR"/>
+              </w:rPr>
+              <w:t xml:space="preserve"> igual ou posterior à de início;</w:t>
+            </w:r>
+          </w:p>
+          <w:p>
+            <w:pPr>
+              <w:pStyle w:val="PargrafodaLista"/>
+              <w:numPr>
+                <w:ilvl w:val="0"/>
+                <w:numId w:val="14"/>
+              </w:numPr>
+              <w:rPr>
+                <w:lang w:val="pt-BR"/>
+              </w:rPr>
+            </w:pPr>
+            <w:r>
+              <w:rPr>
+                <w:lang w:val="pt-BR"/>
+              </w:rPr>
+              <w:t xml:space="preserve">O sistema </w:t>
+            </w:r>
+            <w:r>
+              <w:rPr>
+                <w:lang w:val="pt-BR"/>
+              </w:rPr>
+              <w:t xml:space="preserve">cria a </w:t>
+            </w:r>
+            <w:r>
+              <w:rPr>
+                <w:lang w:val="pt-BR"/>
+              </w:rPr>
+              <w:t>viagem</w:t>
+            </w:r>
+            <w:r>
+              <w:rPr>
+                <w:lang w:val="pt-BR"/>
+              </w:rPr>
+              <w:t xml:space="preserve"> com o </w:t>
+            </w:r>
+            <w:r>
+              <w:rPr>
+                <w:lang w:val="pt-BR"/>
+              </w:rPr>
+              <w:t>utilizador</w:t>
+            </w:r>
+            <w:bookmarkStart w:id="0" w:name="_GoBack"/>
+            <w:bookmarkEnd w:id="0"/>
+            <w:r>
+              <w:rPr>
+                <w:lang w:val="pt-BR"/>
+              </w:rPr>
+              <w:t xml:space="preserve"> como </w:t>
+            </w:r>
+            <w:proofErr w:type="spellStart"/>
+            <w:r>
+              <w:rPr>
+                <w:lang w:val="pt-BR"/>
+              </w:rPr>
+              <w:t>OWNER</w:t>
+            </w:r>
+            <w:proofErr w:type="spellEnd"/>
+            <w:r>
+              <w:rPr>
+                <w:lang w:val="pt-BR"/>
+              </w:rPr>
+              <w:t>;</w:t>
+            </w:r>
+          </w:p>
+          <w:p>
+            <w:pPr>
+              <w:pStyle w:val="PargrafodaLista"/>
+              <w:numPr>
+                <w:ilvl w:val="0"/>
+                <w:numId w:val="14"/>
+              </w:numPr>
+              <w:rPr>
+                <w:lang w:val="pt-BR"/>
+              </w:rPr>
+            </w:pPr>
+            <w:r>
+              <w:rPr>
+                <w:lang w:val="pt-BR"/>
+              </w:rPr>
+              <w:t>A lista de viagens é atualizada.</w:t>
+            </w:r>
+          </w:p>
+        </w:tc>
+      </w:tr>
+      <w:tr>
+        <w:tc>
+          <w:tcPr>
+            <w:tcW w:w="2268" w:type="dxa"/>
+          </w:tcPr>
+          <w:p>
+            <w:pPr>
+              <w:pStyle w:val="p1a"/>
+              <w:rPr>
+                <w:lang w:val="pt-BR"/>
+              </w:rPr>
+            </w:pPr>
+            <w:r>
+              <w:rPr>
+                <w:lang w:val="pt-BR"/>
+              </w:rPr>
+              <w:t>Caminho alternativo</w:t>
+            </w:r>
+          </w:p>
+        </w:tc>
+        <w:tc>
+          <w:tcPr>
+            <w:tcW w:w="4536" w:type="dxa"/>
+          </w:tcPr>
+          <w:p>
+            <w:pPr>
+              <w:pStyle w:val="p1a"/>
+              <w:numPr>
+                <w:ilvl w:val="1"/>
+                <w:numId w:val="15"/>
+              </w:numPr>
+              <w:rPr>
+                <w:lang w:val="pt-BR"/>
+              </w:rPr>
+            </w:pPr>
+            <w:r>
+              <w:rPr>
+                <w:lang w:val="pt-BR"/>
+              </w:rPr>
+              <w:t>A d</w:t>
+            </w:r>
+            <w:r>
+              <w:rPr>
+                <w:lang w:val="pt-BR"/>
+              </w:rPr>
+              <w:t>ata de fim</w:t>
+            </w:r>
+            <w:r>
+              <w:rPr>
+                <w:lang w:val="pt-BR"/>
+              </w:rPr>
+              <w:t xml:space="preserve"> é</w:t>
+            </w:r>
+            <w:r>
+              <w:rPr>
+                <w:lang w:val="pt-BR"/>
+              </w:rPr>
+              <w:t xml:space="preserve"> </w:t>
+            </w:r>
+            <w:r>
+              <w:rPr>
+                <w:lang w:val="pt-BR"/>
+              </w:rPr>
+              <w:t>anterior à de início: o sistema informa o erro e solicita uma nova data.</w:t>
+            </w:r>
+          </w:p>
+        </w:tc>
+      </w:tr>
+    </w:tbl>
+    <w:p>
+      <w:pPr>
+        <w:spacing w:after="160" w:line="259" w:lineRule="auto"/>
+        <w:ind w:firstLine="0"/>
+        <w:jc w:val="left"/>
+        <w:rPr>
+          <w:lang w:val="pt-BR"/>
+        </w:rPr>
+      </w:pPr>
+    </w:p>
+    <w:p>
+      <w:pPr>
+        <w:spacing w:after="160" w:line="259" w:lineRule="auto"/>
+        <w:ind w:firstLine="0"/>
+        <w:jc w:val="left"/>
+        <w:rPr>
+          <w:lang w:val="pt-BR"/>
+        </w:rPr>
+      </w:pPr>
     </w:p>
     <w:p>
       <w:pPr>
@@ -2910,7 +3917,7 @@
       <w:r>
         <w:rPr>
           <w:noProof/>
-          <w:lang w:val="pt-PT" w:eastAsia="pt-PT"/>
+          <w:lang w:val="pt-BR" w:eastAsia="pt-PT"/>
         </w:rPr>
         <w:drawing>
           <wp:anchor distT="0" distB="0" distL="114300" distR="114300" simplePos="0" relativeHeight="251658240" behindDoc="1" locked="0" layoutInCell="1" allowOverlap="1" wp14:anchorId="50858877" wp14:editId="25CD5379">
@@ -3565,6 +4572,296 @@
     </w:lvl>
   </w:abstractNum>
   <w:abstractNum w:abstractNumId="4" w15:restartNumberingAfterBreak="0">
+    <w:nsid w:val="135B4645"/>
+    <w:multiLevelType w:val="hybridMultilevel"/>
+    <w:tmpl w:val="FD288880"/>
+    <w:lvl w:ilvl="0" w:tplc="0816000F">
+      <w:start w:val="1"/>
+      <w:numFmt w:val="decimal"/>
+      <w:lvlText w:val="%1."/>
+      <w:lvlJc w:val="left"/>
+      <w:pPr>
+        <w:ind w:left="720" w:hanging="360"/>
+      </w:pPr>
+    </w:lvl>
+    <w:lvl w:ilvl="1" w:tplc="08160019" w:tentative="1">
+      <w:start w:val="1"/>
+      <w:numFmt w:val="lowerLetter"/>
+      <w:lvlText w:val="%2."/>
+      <w:lvlJc w:val="left"/>
+      <w:pPr>
+        <w:ind w:left="1440" w:hanging="360"/>
+      </w:pPr>
+    </w:lvl>
+    <w:lvl w:ilvl="2" w:tplc="0816001B" w:tentative="1">
+      <w:start w:val="1"/>
+      <w:numFmt w:val="lowerRoman"/>
+      <w:lvlText w:val="%3."/>
+      <w:lvlJc w:val="right"/>
+      <w:pPr>
+        <w:ind w:left="2160" w:hanging="180"/>
+      </w:pPr>
+    </w:lvl>
+    <w:lvl w:ilvl="3" w:tplc="0816000F" w:tentative="1">
+      <w:start w:val="1"/>
+      <w:numFmt w:val="decimal"/>
+      <w:lvlText w:val="%4."/>
+      <w:lvlJc w:val="left"/>
+      <w:pPr>
+        <w:ind w:left="2880" w:hanging="360"/>
+      </w:pPr>
+    </w:lvl>
+    <w:lvl w:ilvl="4" w:tplc="08160019" w:tentative="1">
+      <w:start w:val="1"/>
+      <w:numFmt w:val="lowerLetter"/>
+      <w:lvlText w:val="%5."/>
+      <w:lvlJc w:val="left"/>
+      <w:pPr>
+        <w:ind w:left="3600" w:hanging="360"/>
+      </w:pPr>
+    </w:lvl>
+    <w:lvl w:ilvl="5" w:tplc="0816001B" w:tentative="1">
+      <w:start w:val="1"/>
+      <w:numFmt w:val="lowerRoman"/>
+      <w:lvlText w:val="%6."/>
+      <w:lvlJc w:val="right"/>
+      <w:pPr>
+        <w:ind w:left="4320" w:hanging="180"/>
+      </w:pPr>
+    </w:lvl>
+    <w:lvl w:ilvl="6" w:tplc="0816000F" w:tentative="1">
+      <w:start w:val="1"/>
+      <w:numFmt w:val="decimal"/>
+      <w:lvlText w:val="%7."/>
+      <w:lvlJc w:val="left"/>
+      <w:pPr>
+        <w:ind w:left="5040" w:hanging="360"/>
+      </w:pPr>
+    </w:lvl>
+    <w:lvl w:ilvl="7" w:tplc="08160019" w:tentative="1">
+      <w:start w:val="1"/>
+      <w:numFmt w:val="lowerLetter"/>
+      <w:lvlText w:val="%8."/>
+      <w:lvlJc w:val="left"/>
+      <w:pPr>
+        <w:ind w:left="5760" w:hanging="360"/>
+      </w:pPr>
+    </w:lvl>
+    <w:lvl w:ilvl="8" w:tplc="0816001B" w:tentative="1">
+      <w:start w:val="1"/>
+      <w:numFmt w:val="lowerRoman"/>
+      <w:lvlText w:val="%9."/>
+      <w:lvlJc w:val="right"/>
+      <w:pPr>
+        <w:ind w:left="6480" w:hanging="180"/>
+      </w:pPr>
+    </w:lvl>
+  </w:abstractNum>
+  <w:abstractNum w:abstractNumId="5" w15:restartNumberingAfterBreak="0">
+    <w:nsid w:val="15192468"/>
+    <w:multiLevelType w:val="hybridMultilevel"/>
+    <w:tmpl w:val="5DEA3BA0"/>
+    <w:lvl w:ilvl="0" w:tplc="0816000F">
+      <w:start w:val="1"/>
+      <w:numFmt w:val="decimal"/>
+      <w:lvlText w:val="%1."/>
+      <w:lvlJc w:val="left"/>
+      <w:pPr>
+        <w:ind w:left="720" w:hanging="360"/>
+      </w:pPr>
+    </w:lvl>
+    <w:lvl w:ilvl="1" w:tplc="08160019" w:tentative="1">
+      <w:start w:val="1"/>
+      <w:numFmt w:val="lowerLetter"/>
+      <w:lvlText w:val="%2."/>
+      <w:lvlJc w:val="left"/>
+      <w:pPr>
+        <w:ind w:left="1440" w:hanging="360"/>
+      </w:pPr>
+    </w:lvl>
+    <w:lvl w:ilvl="2" w:tplc="0816001B" w:tentative="1">
+      <w:start w:val="1"/>
+      <w:numFmt w:val="lowerRoman"/>
+      <w:lvlText w:val="%3."/>
+      <w:lvlJc w:val="right"/>
+      <w:pPr>
+        <w:ind w:left="2160" w:hanging="180"/>
+      </w:pPr>
+    </w:lvl>
+    <w:lvl w:ilvl="3" w:tplc="0816000F" w:tentative="1">
+      <w:start w:val="1"/>
+      <w:numFmt w:val="decimal"/>
+      <w:lvlText w:val="%4."/>
+      <w:lvlJc w:val="left"/>
+      <w:pPr>
+        <w:ind w:left="2880" w:hanging="360"/>
+      </w:pPr>
+    </w:lvl>
+    <w:lvl w:ilvl="4" w:tplc="08160019" w:tentative="1">
+      <w:start w:val="1"/>
+      <w:numFmt w:val="lowerLetter"/>
+      <w:lvlText w:val="%5."/>
+      <w:lvlJc w:val="left"/>
+      <w:pPr>
+        <w:ind w:left="3600" w:hanging="360"/>
+      </w:pPr>
+    </w:lvl>
+    <w:lvl w:ilvl="5" w:tplc="0816001B" w:tentative="1">
+      <w:start w:val="1"/>
+      <w:numFmt w:val="lowerRoman"/>
+      <w:lvlText w:val="%6."/>
+      <w:lvlJc w:val="right"/>
+      <w:pPr>
+        <w:ind w:left="4320" w:hanging="180"/>
+      </w:pPr>
+    </w:lvl>
+    <w:lvl w:ilvl="6" w:tplc="0816000F" w:tentative="1">
+      <w:start w:val="1"/>
+      <w:numFmt w:val="decimal"/>
+      <w:lvlText w:val="%7."/>
+      <w:lvlJc w:val="left"/>
+      <w:pPr>
+        <w:ind w:left="5040" w:hanging="360"/>
+      </w:pPr>
+    </w:lvl>
+    <w:lvl w:ilvl="7" w:tplc="08160019" w:tentative="1">
+      <w:start w:val="1"/>
+      <w:numFmt w:val="lowerLetter"/>
+      <w:lvlText w:val="%8."/>
+      <w:lvlJc w:val="left"/>
+      <w:pPr>
+        <w:ind w:left="5760" w:hanging="360"/>
+      </w:pPr>
+    </w:lvl>
+    <w:lvl w:ilvl="8" w:tplc="0816001B" w:tentative="1">
+      <w:start w:val="1"/>
+      <w:numFmt w:val="lowerRoman"/>
+      <w:lvlText w:val="%9."/>
+      <w:lvlJc w:val="right"/>
+      <w:pPr>
+        <w:ind w:left="6480" w:hanging="180"/>
+      </w:pPr>
+    </w:lvl>
+  </w:abstractNum>
+  <w:abstractNum w:abstractNumId="6" w15:restartNumberingAfterBreak="0">
+    <w:nsid w:val="1C8A01D4"/>
+    <w:multiLevelType w:val="multilevel"/>
+    <w:tmpl w:val="33FA766A"/>
+    <w:lvl w:ilvl="0">
+      <w:start w:val="1"/>
+      <w:numFmt w:val="decimal"/>
+      <w:lvlText w:val="%1."/>
+      <w:lvlJc w:val="left"/>
+      <w:pPr>
+        <w:ind w:left="720" w:hanging="360"/>
+      </w:pPr>
+    </w:lvl>
+    <w:lvl w:ilvl="1">
+      <w:start w:val="1"/>
+      <w:numFmt w:val="decimal"/>
+      <w:isLgl/>
+      <w:lvlText w:val="%1.%2"/>
+      <w:lvlJc w:val="left"/>
+      <w:pPr>
+        <w:ind w:left="720" w:hanging="360"/>
+      </w:pPr>
+      <w:rPr>
+        <w:rFonts w:hint="default"/>
+      </w:rPr>
+    </w:lvl>
+    <w:lvl w:ilvl="2">
+      <w:start w:val="1"/>
+      <w:numFmt w:val="decimal"/>
+      <w:isLgl/>
+      <w:lvlText w:val="%1.%2.%3"/>
+      <w:lvlJc w:val="left"/>
+      <w:pPr>
+        <w:ind w:left="1080" w:hanging="720"/>
+      </w:pPr>
+      <w:rPr>
+        <w:rFonts w:hint="default"/>
+      </w:rPr>
+    </w:lvl>
+    <w:lvl w:ilvl="3">
+      <w:start w:val="1"/>
+      <w:numFmt w:val="decimal"/>
+      <w:isLgl/>
+      <w:lvlText w:val="%1.%2.%3.%4"/>
+      <w:lvlJc w:val="left"/>
+      <w:pPr>
+        <w:ind w:left="1080" w:hanging="720"/>
+      </w:pPr>
+      <w:rPr>
+        <w:rFonts w:hint="default"/>
+      </w:rPr>
+    </w:lvl>
+    <w:lvl w:ilvl="4">
+      <w:start w:val="1"/>
+      <w:numFmt w:val="decimal"/>
+      <w:isLgl/>
+      <w:lvlText w:val="%1.%2.%3.%4.%5"/>
+      <w:lvlJc w:val="left"/>
+      <w:pPr>
+        <w:ind w:left="1080" w:hanging="720"/>
+      </w:pPr>
+      <w:rPr>
+        <w:rFonts w:hint="default"/>
+      </w:rPr>
+    </w:lvl>
+    <w:lvl w:ilvl="5">
+      <w:start w:val="1"/>
+      <w:numFmt w:val="decimal"/>
+      <w:isLgl/>
+      <w:lvlText w:val="%1.%2.%3.%4.%5.%6"/>
+      <w:lvlJc w:val="left"/>
+      <w:pPr>
+        <w:ind w:left="1440" w:hanging="1080"/>
+      </w:pPr>
+      <w:rPr>
+        <w:rFonts w:hint="default"/>
+      </w:rPr>
+    </w:lvl>
+    <w:lvl w:ilvl="6">
+      <w:start w:val="1"/>
+      <w:numFmt w:val="decimal"/>
+      <w:isLgl/>
+      <w:lvlText w:val="%1.%2.%3.%4.%5.%6.%7"/>
+      <w:lvlJc w:val="left"/>
+      <w:pPr>
+        <w:ind w:left="1440" w:hanging="1080"/>
+      </w:pPr>
+      <w:rPr>
+        <w:rFonts w:hint="default"/>
+      </w:rPr>
+    </w:lvl>
+    <w:lvl w:ilvl="7">
+      <w:start w:val="1"/>
+      <w:numFmt w:val="decimal"/>
+      <w:isLgl/>
+      <w:lvlText w:val="%1.%2.%3.%4.%5.%6.%7.%8"/>
+      <w:lvlJc w:val="left"/>
+      <w:pPr>
+        <w:ind w:left="1800" w:hanging="1440"/>
+      </w:pPr>
+      <w:rPr>
+        <w:rFonts w:hint="default"/>
+      </w:rPr>
+    </w:lvl>
+    <w:lvl w:ilvl="8">
+      <w:start w:val="1"/>
+      <w:numFmt w:val="decimal"/>
+      <w:isLgl/>
+      <w:lvlText w:val="%1.%2.%3.%4.%5.%6.%7.%8.%9"/>
+      <w:lvlJc w:val="left"/>
+      <w:pPr>
+        <w:ind w:left="1800" w:hanging="1440"/>
+      </w:pPr>
+      <w:rPr>
+        <w:rFonts w:hint="default"/>
+      </w:rPr>
+    </w:lvl>
+  </w:abstractNum>
+  <w:abstractNum w:abstractNumId="7" w15:restartNumberingAfterBreak="0">
     <w:nsid w:val="236F0CB4"/>
     <w:multiLevelType w:val="hybridMultilevel"/>
     <w:tmpl w:val="2DD4A172"/>
@@ -3653,7 +4950,7 @@
       </w:pPr>
     </w:lvl>
   </w:abstractNum>
-  <w:abstractNum w:abstractNumId="5" w15:restartNumberingAfterBreak="0">
+  <w:abstractNum w:abstractNumId="8" w15:restartNumberingAfterBreak="0">
     <w:nsid w:val="299A41E7"/>
     <w:multiLevelType w:val="hybridMultilevel"/>
     <w:tmpl w:val="B750E62A"/>
@@ -3742,7 +5039,437 @@
       </w:pPr>
     </w:lvl>
   </w:abstractNum>
-  <w:abstractNum w:abstractNumId="6" w15:restartNumberingAfterBreak="0">
+  <w:abstractNum w:abstractNumId="9" w15:restartNumberingAfterBreak="0">
+    <w:nsid w:val="579B0F2B"/>
+    <w:multiLevelType w:val="multilevel"/>
+    <w:tmpl w:val="2C16CF1E"/>
+    <w:lvl w:ilvl="0">
+      <w:start w:val="3"/>
+      <w:numFmt w:val="decimal"/>
+      <w:lvlText w:val="%1"/>
+      <w:lvlJc w:val="left"/>
+      <w:pPr>
+        <w:ind w:left="360" w:hanging="360"/>
+      </w:pPr>
+      <w:rPr>
+        <w:rFonts w:hint="default"/>
+      </w:rPr>
+    </w:lvl>
+    <w:lvl w:ilvl="1">
+      <w:start w:val="1"/>
+      <w:numFmt w:val="decimal"/>
+      <w:lvlText w:val="%1.%2"/>
+      <w:lvlJc w:val="left"/>
+      <w:pPr>
+        <w:ind w:left="720" w:hanging="360"/>
+      </w:pPr>
+      <w:rPr>
+        <w:rFonts w:hint="default"/>
+      </w:rPr>
+    </w:lvl>
+    <w:lvl w:ilvl="2">
+      <w:start w:val="1"/>
+      <w:numFmt w:val="decimal"/>
+      <w:lvlText w:val="%1.%2.%3"/>
+      <w:lvlJc w:val="left"/>
+      <w:pPr>
+        <w:ind w:left="1440" w:hanging="720"/>
+      </w:pPr>
+      <w:rPr>
+        <w:rFonts w:hint="default"/>
+      </w:rPr>
+    </w:lvl>
+    <w:lvl w:ilvl="3">
+      <w:start w:val="1"/>
+      <w:numFmt w:val="decimal"/>
+      <w:lvlText w:val="%1.%2.%3.%4"/>
+      <w:lvlJc w:val="left"/>
+      <w:pPr>
+        <w:ind w:left="1800" w:hanging="720"/>
+      </w:pPr>
+      <w:rPr>
+        <w:rFonts w:hint="default"/>
+      </w:rPr>
+    </w:lvl>
+    <w:lvl w:ilvl="4">
+      <w:start w:val="1"/>
+      <w:numFmt w:val="decimal"/>
+      <w:lvlText w:val="%1.%2.%3.%4.%5"/>
+      <w:lvlJc w:val="left"/>
+      <w:pPr>
+        <w:ind w:left="2160" w:hanging="720"/>
+      </w:pPr>
+      <w:rPr>
+        <w:rFonts w:hint="default"/>
+      </w:rPr>
+    </w:lvl>
+    <w:lvl w:ilvl="5">
+      <w:start w:val="1"/>
+      <w:numFmt w:val="decimal"/>
+      <w:lvlText w:val="%1.%2.%3.%4.%5.%6"/>
+      <w:lvlJc w:val="left"/>
+      <w:pPr>
+        <w:ind w:left="2880" w:hanging="1080"/>
+      </w:pPr>
+      <w:rPr>
+        <w:rFonts w:hint="default"/>
+      </w:rPr>
+    </w:lvl>
+    <w:lvl w:ilvl="6">
+      <w:start w:val="1"/>
+      <w:numFmt w:val="decimal"/>
+      <w:lvlText w:val="%1.%2.%3.%4.%5.%6.%7"/>
+      <w:lvlJc w:val="left"/>
+      <w:pPr>
+        <w:ind w:left="3240" w:hanging="1080"/>
+      </w:pPr>
+      <w:rPr>
+        <w:rFonts w:hint="default"/>
+      </w:rPr>
+    </w:lvl>
+    <w:lvl w:ilvl="7">
+      <w:start w:val="1"/>
+      <w:numFmt w:val="decimal"/>
+      <w:lvlText w:val="%1.%2.%3.%4.%5.%6.%7.%8"/>
+      <w:lvlJc w:val="left"/>
+      <w:pPr>
+        <w:ind w:left="3960" w:hanging="1440"/>
+      </w:pPr>
+      <w:rPr>
+        <w:rFonts w:hint="default"/>
+      </w:rPr>
+    </w:lvl>
+    <w:lvl w:ilvl="8">
+      <w:start w:val="1"/>
+      <w:numFmt w:val="decimal"/>
+      <w:lvlText w:val="%1.%2.%3.%4.%5.%6.%7.%8.%9"/>
+      <w:lvlJc w:val="left"/>
+      <w:pPr>
+        <w:ind w:left="4320" w:hanging="1440"/>
+      </w:pPr>
+      <w:rPr>
+        <w:rFonts w:hint="default"/>
+      </w:rPr>
+    </w:lvl>
+  </w:abstractNum>
+  <w:abstractNum w:abstractNumId="10" w15:restartNumberingAfterBreak="0">
+    <w:nsid w:val="67212F69"/>
+    <w:multiLevelType w:val="multilevel"/>
+    <w:tmpl w:val="38E62B7E"/>
+    <w:lvl w:ilvl="0">
+      <w:start w:val="4"/>
+      <w:numFmt w:val="decimal"/>
+      <w:lvlText w:val="%1"/>
+      <w:lvlJc w:val="left"/>
+      <w:pPr>
+        <w:ind w:left="360" w:hanging="360"/>
+      </w:pPr>
+      <w:rPr>
+        <w:rFonts w:hint="default"/>
+      </w:rPr>
+    </w:lvl>
+    <w:lvl w:ilvl="1">
+      <w:start w:val="1"/>
+      <w:numFmt w:val="decimal"/>
+      <w:lvlText w:val="%1.%2"/>
+      <w:lvlJc w:val="left"/>
+      <w:pPr>
+        <w:ind w:left="720" w:hanging="360"/>
+      </w:pPr>
+      <w:rPr>
+        <w:rFonts w:hint="default"/>
+      </w:rPr>
+    </w:lvl>
+    <w:lvl w:ilvl="2">
+      <w:start w:val="1"/>
+      <w:numFmt w:val="decimal"/>
+      <w:lvlText w:val="%1.%2.%3"/>
+      <w:lvlJc w:val="left"/>
+      <w:pPr>
+        <w:ind w:left="1440" w:hanging="720"/>
+      </w:pPr>
+      <w:rPr>
+        <w:rFonts w:hint="default"/>
+      </w:rPr>
+    </w:lvl>
+    <w:lvl w:ilvl="3">
+      <w:start w:val="1"/>
+      <w:numFmt w:val="decimal"/>
+      <w:lvlText w:val="%1.%2.%3.%4"/>
+      <w:lvlJc w:val="left"/>
+      <w:pPr>
+        <w:ind w:left="1800" w:hanging="720"/>
+      </w:pPr>
+      <w:rPr>
+        <w:rFonts w:hint="default"/>
+      </w:rPr>
+    </w:lvl>
+    <w:lvl w:ilvl="4">
+      <w:start w:val="1"/>
+      <w:numFmt w:val="decimal"/>
+      <w:lvlText w:val="%1.%2.%3.%4.%5"/>
+      <w:lvlJc w:val="left"/>
+      <w:pPr>
+        <w:ind w:left="2160" w:hanging="720"/>
+      </w:pPr>
+      <w:rPr>
+        <w:rFonts w:hint="default"/>
+      </w:rPr>
+    </w:lvl>
+    <w:lvl w:ilvl="5">
+      <w:start w:val="1"/>
+      <w:numFmt w:val="decimal"/>
+      <w:lvlText w:val="%1.%2.%3.%4.%5.%6"/>
+      <w:lvlJc w:val="left"/>
+      <w:pPr>
+        <w:ind w:left="2880" w:hanging="1080"/>
+      </w:pPr>
+      <w:rPr>
+        <w:rFonts w:hint="default"/>
+      </w:rPr>
+    </w:lvl>
+    <w:lvl w:ilvl="6">
+      <w:start w:val="1"/>
+      <w:numFmt w:val="decimal"/>
+      <w:lvlText w:val="%1.%2.%3.%4.%5.%6.%7"/>
+      <w:lvlJc w:val="left"/>
+      <w:pPr>
+        <w:ind w:left="3240" w:hanging="1080"/>
+      </w:pPr>
+      <w:rPr>
+        <w:rFonts w:hint="default"/>
+      </w:rPr>
+    </w:lvl>
+    <w:lvl w:ilvl="7">
+      <w:start w:val="1"/>
+      <w:numFmt w:val="decimal"/>
+      <w:lvlText w:val="%1.%2.%3.%4.%5.%6.%7.%8"/>
+      <w:lvlJc w:val="left"/>
+      <w:pPr>
+        <w:ind w:left="3960" w:hanging="1440"/>
+      </w:pPr>
+      <w:rPr>
+        <w:rFonts w:hint="default"/>
+      </w:rPr>
+    </w:lvl>
+    <w:lvl w:ilvl="8">
+      <w:start w:val="1"/>
+      <w:numFmt w:val="decimal"/>
+      <w:lvlText w:val="%1.%2.%3.%4.%5.%6.%7.%8.%9"/>
+      <w:lvlJc w:val="left"/>
+      <w:pPr>
+        <w:ind w:left="4320" w:hanging="1440"/>
+      </w:pPr>
+      <w:rPr>
+        <w:rFonts w:hint="default"/>
+      </w:rPr>
+    </w:lvl>
+  </w:abstractNum>
+  <w:abstractNum w:abstractNumId="11" w15:restartNumberingAfterBreak="0">
+    <w:nsid w:val="67A74286"/>
+    <w:multiLevelType w:val="multilevel"/>
+    <w:tmpl w:val="33FA766A"/>
+    <w:lvl w:ilvl="0">
+      <w:start w:val="1"/>
+      <w:numFmt w:val="decimal"/>
+      <w:lvlText w:val="%1."/>
+      <w:lvlJc w:val="left"/>
+      <w:pPr>
+        <w:ind w:left="720" w:hanging="360"/>
+      </w:pPr>
+    </w:lvl>
+    <w:lvl w:ilvl="1">
+      <w:start w:val="1"/>
+      <w:numFmt w:val="decimal"/>
+      <w:isLgl/>
+      <w:lvlText w:val="%1.%2"/>
+      <w:lvlJc w:val="left"/>
+      <w:pPr>
+        <w:ind w:left="720" w:hanging="360"/>
+      </w:pPr>
+      <w:rPr>
+        <w:rFonts w:hint="default"/>
+      </w:rPr>
+    </w:lvl>
+    <w:lvl w:ilvl="2">
+      <w:start w:val="1"/>
+      <w:numFmt w:val="decimal"/>
+      <w:isLgl/>
+      <w:lvlText w:val="%1.%2.%3"/>
+      <w:lvlJc w:val="left"/>
+      <w:pPr>
+        <w:ind w:left="1080" w:hanging="720"/>
+      </w:pPr>
+      <w:rPr>
+        <w:rFonts w:hint="default"/>
+      </w:rPr>
+    </w:lvl>
+    <w:lvl w:ilvl="3">
+      <w:start w:val="1"/>
+      <w:numFmt w:val="decimal"/>
+      <w:isLgl/>
+      <w:lvlText w:val="%1.%2.%3.%4"/>
+      <w:lvlJc w:val="left"/>
+      <w:pPr>
+        <w:ind w:left="1080" w:hanging="720"/>
+      </w:pPr>
+      <w:rPr>
+        <w:rFonts w:hint="default"/>
+      </w:rPr>
+    </w:lvl>
+    <w:lvl w:ilvl="4">
+      <w:start w:val="1"/>
+      <w:numFmt w:val="decimal"/>
+      <w:isLgl/>
+      <w:lvlText w:val="%1.%2.%3.%4.%5"/>
+      <w:lvlJc w:val="left"/>
+      <w:pPr>
+        <w:ind w:left="1080" w:hanging="720"/>
+      </w:pPr>
+      <w:rPr>
+        <w:rFonts w:hint="default"/>
+      </w:rPr>
+    </w:lvl>
+    <w:lvl w:ilvl="5">
+      <w:start w:val="1"/>
+      <w:numFmt w:val="decimal"/>
+      <w:isLgl/>
+      <w:lvlText w:val="%1.%2.%3.%4.%5.%6"/>
+      <w:lvlJc w:val="left"/>
+      <w:pPr>
+        <w:ind w:left="1440" w:hanging="1080"/>
+      </w:pPr>
+      <w:rPr>
+        <w:rFonts w:hint="default"/>
+      </w:rPr>
+    </w:lvl>
+    <w:lvl w:ilvl="6">
+      <w:start w:val="1"/>
+      <w:numFmt w:val="decimal"/>
+      <w:isLgl/>
+      <w:lvlText w:val="%1.%2.%3.%4.%5.%6.%7"/>
+      <w:lvlJc w:val="left"/>
+      <w:pPr>
+        <w:ind w:left="1440" w:hanging="1080"/>
+      </w:pPr>
+      <w:rPr>
+        <w:rFonts w:hint="default"/>
+      </w:rPr>
+    </w:lvl>
+    <w:lvl w:ilvl="7">
+      <w:start w:val="1"/>
+      <w:numFmt w:val="decimal"/>
+      <w:isLgl/>
+      <w:lvlText w:val="%1.%2.%3.%4.%5.%6.%7.%8"/>
+      <w:lvlJc w:val="left"/>
+      <w:pPr>
+        <w:ind w:left="1800" w:hanging="1440"/>
+      </w:pPr>
+      <w:rPr>
+        <w:rFonts w:hint="default"/>
+      </w:rPr>
+    </w:lvl>
+    <w:lvl w:ilvl="8">
+      <w:start w:val="1"/>
+      <w:numFmt w:val="decimal"/>
+      <w:isLgl/>
+      <w:lvlText w:val="%1.%2.%3.%4.%5.%6.%7.%8.%9"/>
+      <w:lvlJc w:val="left"/>
+      <w:pPr>
+        <w:ind w:left="1800" w:hanging="1440"/>
+      </w:pPr>
+      <w:rPr>
+        <w:rFonts w:hint="default"/>
+      </w:rPr>
+    </w:lvl>
+  </w:abstractNum>
+  <w:abstractNum w:abstractNumId="12" w15:restartNumberingAfterBreak="0">
+    <w:nsid w:val="7301321B"/>
+    <w:multiLevelType w:val="multilevel"/>
+    <w:tmpl w:val="0816001F"/>
+    <w:lvl w:ilvl="0">
+      <w:start w:val="1"/>
+      <w:numFmt w:val="decimal"/>
+      <w:lvlText w:val="%1."/>
+      <w:lvlJc w:val="left"/>
+      <w:pPr>
+        <w:ind w:left="360" w:hanging="360"/>
+      </w:pPr>
+    </w:lvl>
+    <w:lvl w:ilvl="1">
+      <w:start w:val="1"/>
+      <w:numFmt w:val="decimal"/>
+      <w:lvlText w:val="%1.%2."/>
+      <w:lvlJc w:val="left"/>
+      <w:pPr>
+        <w:ind w:left="792" w:hanging="432"/>
+      </w:pPr>
+    </w:lvl>
+    <w:lvl w:ilvl="2">
+      <w:start w:val="1"/>
+      <w:numFmt w:val="decimal"/>
+      <w:lvlText w:val="%1.%2.%3."/>
+      <w:lvlJc w:val="left"/>
+      <w:pPr>
+        <w:ind w:left="1224" w:hanging="504"/>
+      </w:pPr>
+    </w:lvl>
+    <w:lvl w:ilvl="3">
+      <w:start w:val="1"/>
+      <w:numFmt w:val="decimal"/>
+      <w:lvlText w:val="%1.%2.%3.%4."/>
+      <w:lvlJc w:val="left"/>
+      <w:pPr>
+        <w:ind w:left="1728" w:hanging="648"/>
+      </w:pPr>
+    </w:lvl>
+    <w:lvl w:ilvl="4">
+      <w:start w:val="1"/>
+      <w:numFmt w:val="decimal"/>
+      <w:lvlText w:val="%1.%2.%3.%4.%5."/>
+      <w:lvlJc w:val="left"/>
+      <w:pPr>
+        <w:ind w:left="2232" w:hanging="792"/>
+      </w:pPr>
+    </w:lvl>
+    <w:lvl w:ilvl="5">
+      <w:start w:val="1"/>
+      <w:numFmt w:val="decimal"/>
+      <w:lvlText w:val="%1.%2.%3.%4.%5.%6."/>
+      <w:lvlJc w:val="left"/>
+      <w:pPr>
+        <w:ind w:left="2736" w:hanging="936"/>
+      </w:pPr>
+    </w:lvl>
+    <w:lvl w:ilvl="6">
+      <w:start w:val="1"/>
+      <w:numFmt w:val="decimal"/>
+      <w:lvlText w:val="%1.%2.%3.%4.%5.%6.%7."/>
+      <w:lvlJc w:val="left"/>
+      <w:pPr>
+        <w:ind w:left="3240" w:hanging="1080"/>
+      </w:pPr>
+    </w:lvl>
+    <w:lvl w:ilvl="7">
+      <w:start w:val="1"/>
+      <w:numFmt w:val="decimal"/>
+      <w:lvlText w:val="%1.%2.%3.%4.%5.%6.%7.%8."/>
+      <w:lvlJc w:val="left"/>
+      <w:pPr>
+        <w:ind w:left="3744" w:hanging="1224"/>
+      </w:pPr>
+    </w:lvl>
+    <w:lvl w:ilvl="8">
+      <w:start w:val="1"/>
+      <w:numFmt w:val="decimal"/>
+      <w:lvlText w:val="%1.%2.%3.%4.%5.%6.%7.%8.%9."/>
+      <w:lvlJc w:val="left"/>
+      <w:pPr>
+        <w:ind w:left="4320" w:hanging="1440"/>
+      </w:pPr>
+    </w:lvl>
+  </w:abstractNum>
+  <w:abstractNum w:abstractNumId="13" w15:restartNumberingAfterBreak="0">
     <w:nsid w:val="798409D0"/>
     <w:multiLevelType w:val="hybridMultilevel"/>
     <w:tmpl w:val="A8484A4A"/>
@@ -3831,7 +5558,7 @@
       </w:pPr>
     </w:lvl>
   </w:abstractNum>
-  <w:abstractNum w:abstractNumId="7" w15:restartNumberingAfterBreak="0">
+  <w:abstractNum w:abstractNumId="14" w15:restartNumberingAfterBreak="0">
     <w:nsid w:val="7EA54D59"/>
     <w:multiLevelType w:val="hybridMultilevel"/>
     <w:tmpl w:val="FBA0BF06"/>
@@ -3921,10 +5648,10 @@
     </w:lvl>
   </w:abstractNum>
   <w:num w:numId="1">
-    <w:abstractNumId w:val="5"/>
+    <w:abstractNumId w:val="8"/>
   </w:num>
   <w:num w:numId="2">
-    <w:abstractNumId w:val="6"/>
+    <w:abstractNumId w:val="13"/>
   </w:num>
   <w:num w:numId="3">
     <w:abstractNumId w:val="2"/>
@@ -3933,16 +5660,37 @@
     <w:abstractNumId w:val="1"/>
   </w:num>
   <w:num w:numId="5">
-    <w:abstractNumId w:val="7"/>
+    <w:abstractNumId w:val="14"/>
   </w:num>
   <w:num w:numId="6">
-    <w:abstractNumId w:val="4"/>
+    <w:abstractNumId w:val="7"/>
   </w:num>
   <w:num w:numId="7">
     <w:abstractNumId w:val="0"/>
   </w:num>
   <w:num w:numId="8">
     <w:abstractNumId w:val="3"/>
+  </w:num>
+  <w:num w:numId="9">
+    <w:abstractNumId w:val="5"/>
+  </w:num>
+  <w:num w:numId="10">
+    <w:abstractNumId w:val="4"/>
+  </w:num>
+  <w:num w:numId="11">
+    <w:abstractNumId w:val="12"/>
+  </w:num>
+  <w:num w:numId="12">
+    <w:abstractNumId w:val="9"/>
+  </w:num>
+  <w:num w:numId="13">
+    <w:abstractNumId w:val="11"/>
+  </w:num>
+  <w:num w:numId="14">
+    <w:abstractNumId w:val="6"/>
+  </w:num>
+  <w:num w:numId="15">
+    <w:abstractNumId w:val="10"/>
   </w:num>
 </w:numbering>
 </file>

</xml_diff>

<commit_message>
Adição do LoginActivity e RegisterActivity
</commit_message>
<xml_diff>
--- a/Documentation/Relatório-DSSMV-2025-27_2DB_1250771_1251355.docx
+++ b/Documentation/Relatório-DSSMV-2025-27_2DB_1250771_1251355.docx
@@ -822,7 +822,21 @@
         <w:rPr>
           <w:lang w:val="pt-BR"/>
         </w:rPr>
-        <w:t xml:space="preserve"> apresenta um resumo da viagem com dados como número de locais visitados, países, despesas, entre outros. A aplicação utiliza recursos nativos do </w:t>
+        <w:t xml:space="preserve"> apresenta um resumo da viagem com dados como número de lo</w:t>
+      </w:r>
+      <w:r>
+        <w:rPr>
+          <w:lang w:val="pt-BR"/>
+        </w:rPr>
+        <w:t>cais visitados, países</w:t>
+      </w:r>
+      <w:bookmarkStart w:id="0" w:name="_GoBack"/>
+      <w:bookmarkEnd w:id="0"/>
+      <w:r>
+        <w:rPr>
+          <w:lang w:val="pt-BR"/>
+        </w:rPr>
+        <w:t xml:space="preserve">, entre outros. A aplicação utiliza recursos nativos do </w:t>
       </w:r>
       <w:proofErr w:type="spellStart"/>
       <w:r>
@@ -1117,7 +1131,7 @@
       </w:tr>
       <w:tr>
         <w:trPr>
-          <w:trHeight w:val="32"/>
+          <w:trHeight w:val="33"/>
           <w:jc w:val="center"/>
         </w:trPr>
         <w:tc>
@@ -1133,14 +1147,12 @@
                 <w:lang w:val="pt-BR"/>
               </w:rPr>
             </w:pPr>
-            <w:proofErr w:type="spellStart"/>
-            <w:r>
-              <w:rPr>
-                <w:lang w:val="pt-BR"/>
-              </w:rPr>
-              <w:t>Geocoding</w:t>
-            </w:r>
-            <w:proofErr w:type="spellEnd"/>
+            <w:r>
+              <w:rPr>
+                <w:lang w:val="pt-BR"/>
+              </w:rPr>
+              <w:t>GPS</w:t>
+            </w:r>
           </w:p>
         </w:tc>
         <w:tc>
@@ -1156,14 +1168,12 @@
                 <w:lang w:val="pt-BR"/>
               </w:rPr>
             </w:pPr>
-            <w:proofErr w:type="spellStart"/>
-            <w:r>
-              <w:rPr>
-                <w:lang w:val="pt-BR"/>
-              </w:rPr>
-              <w:t>Geocodificação</w:t>
-            </w:r>
-            <w:proofErr w:type="spellEnd"/>
+            <w:r>
+              <w:rPr>
+                <w:lang w:val="pt-BR"/>
+              </w:rPr>
+              <w:t>GPS</w:t>
+            </w:r>
           </w:p>
         </w:tc>
         <w:tc>
@@ -1183,7 +1193,7 @@
               <w:rPr>
                 <w:lang w:val="pt-BR"/>
               </w:rPr>
-              <w:t>Processo de conversão entre coordenadas geográficas e um endereço físico legível.</w:t>
+              <w:t>Sistema de posicionamento por satélite que devolve latitude e longitude.</w:t>
             </w:r>
           </w:p>
         </w:tc>
@@ -1206,12 +1216,14 @@
                 <w:lang w:val="pt-BR"/>
               </w:rPr>
             </w:pPr>
-            <w:r>
-              <w:rPr>
-                <w:lang w:val="pt-BR"/>
-              </w:rPr>
-              <w:t>GPS</w:t>
-            </w:r>
+            <w:proofErr w:type="spellStart"/>
+            <w:r>
+              <w:rPr>
+                <w:lang w:val="pt-BR"/>
+              </w:rPr>
+              <w:t>Map</w:t>
+            </w:r>
+            <w:proofErr w:type="spellEnd"/>
           </w:p>
         </w:tc>
         <w:tc>
@@ -1231,7 +1243,7 @@
               <w:rPr>
                 <w:lang w:val="pt-BR"/>
               </w:rPr>
-              <w:t>GPS</w:t>
+              <w:t>Mapa</w:t>
             </w:r>
           </w:p>
         </w:tc>
@@ -1248,11 +1260,19 @@
                 <w:lang w:val="pt-BR"/>
               </w:rPr>
             </w:pPr>
-            <w:r>
-              <w:rPr>
-                <w:lang w:val="pt-BR"/>
-              </w:rPr>
-              <w:t>Sistema de posicionamento por satélite que devolve latitude e longitude.</w:t>
+            <w:proofErr w:type="spellStart"/>
+            <w:r>
+              <w:rPr>
+                <w:lang w:val="pt-BR"/>
+              </w:rPr>
+              <w:t>Ecrã</w:t>
+            </w:r>
+            <w:proofErr w:type="spellEnd"/>
+            <w:r>
+              <w:rPr>
+                <w:lang w:val="pt-BR"/>
+              </w:rPr>
+              <w:t xml:space="preserve"> com os locais da viagem</w:t>
             </w:r>
           </w:p>
         </w:tc>
@@ -1280,7 +1300,7 @@
               <w:rPr>
                 <w:lang w:val="pt-BR"/>
               </w:rPr>
-              <w:t>Map</w:t>
+              <w:t>Marker</w:t>
             </w:r>
             <w:proofErr w:type="spellEnd"/>
           </w:p>
@@ -1302,7 +1322,7 @@
               <w:rPr>
                 <w:lang w:val="pt-BR"/>
               </w:rPr>
-              <w:t>Mapa</w:t>
+              <w:t>Marcador</w:t>
             </w:r>
           </w:p>
         </w:tc>
@@ -1319,19 +1339,11 @@
                 <w:lang w:val="pt-BR"/>
               </w:rPr>
             </w:pPr>
-            <w:proofErr w:type="spellStart"/>
-            <w:r>
-              <w:rPr>
-                <w:lang w:val="pt-BR"/>
-              </w:rPr>
-              <w:t>Ecrã</w:t>
-            </w:r>
-            <w:proofErr w:type="spellEnd"/>
-            <w:r>
-              <w:rPr>
-                <w:lang w:val="pt-BR"/>
-              </w:rPr>
-              <w:t xml:space="preserve"> com os locais da viagem</w:t>
+            <w:r>
+              <w:rPr>
+                <w:lang w:val="pt-BR"/>
+              </w:rPr>
+              <w:t>Pino colocado no mapa, com a cor da categoria do local.</w:t>
             </w:r>
           </w:p>
         </w:tc>
@@ -1359,8 +1371,7 @@
               <w:rPr>
                 <w:lang w:val="pt-BR"/>
               </w:rPr>
-              <w:lastRenderedPageBreak/>
-              <w:t>Marker</w:t>
+              <w:t>Photo</w:t>
             </w:r>
             <w:proofErr w:type="spellEnd"/>
           </w:p>
@@ -1382,7 +1393,7 @@
               <w:rPr>
                 <w:lang w:val="pt-BR"/>
               </w:rPr>
-              <w:t>Marcador</w:t>
+              <w:t>Fotografia</w:t>
             </w:r>
           </w:p>
         </w:tc>
@@ -1403,7 +1414,7 @@
               <w:rPr>
                 <w:lang w:val="pt-BR"/>
               </w:rPr>
-              <w:t>Pino colocado no mapa, com a cor da categoria do local.</w:t>
+              <w:t>Imagem tirada num local</w:t>
             </w:r>
           </w:p>
         </w:tc>
@@ -1431,7 +1442,8 @@
               <w:rPr>
                 <w:lang w:val="pt-BR"/>
               </w:rPr>
-              <w:t>Photo</w:t>
+              <w:lastRenderedPageBreak/>
+              <w:t>Place</w:t>
             </w:r>
             <w:proofErr w:type="spellEnd"/>
           </w:p>
@@ -1453,7 +1465,7 @@
               <w:rPr>
                 <w:lang w:val="pt-BR"/>
               </w:rPr>
-              <w:t>Fotografia</w:t>
+              <w:t>Local</w:t>
             </w:r>
           </w:p>
         </w:tc>
@@ -1474,7 +1486,7 @@
               <w:rPr>
                 <w:lang w:val="pt-BR"/>
               </w:rPr>
-              <w:t>Imagem tirada num local</w:t>
+              <w:t>Ponto de interesse registado dentro de uma viagem.</w:t>
             </w:r>
           </w:p>
         </w:tc>
@@ -1497,14 +1509,12 @@
                 <w:lang w:val="pt-BR"/>
               </w:rPr>
             </w:pPr>
-            <w:proofErr w:type="spellStart"/>
-            <w:r>
-              <w:rPr>
-                <w:lang w:val="pt-BR"/>
-              </w:rPr>
-              <w:t>Place</w:t>
-            </w:r>
-            <w:proofErr w:type="spellEnd"/>
+            <w:r>
+              <w:rPr>
+                <w:lang w:val="pt-BR"/>
+              </w:rPr>
+              <w:t>Rating</w:t>
+            </w:r>
           </w:p>
         </w:tc>
         <w:tc>
@@ -1524,7 +1534,7 @@
               <w:rPr>
                 <w:lang w:val="pt-BR"/>
               </w:rPr>
-              <w:t>Local</w:t>
+              <w:t>Avaliação</w:t>
             </w:r>
           </w:p>
         </w:tc>
@@ -1545,7 +1555,7 @@
               <w:rPr>
                 <w:lang w:val="pt-BR"/>
               </w:rPr>
-              <w:t>Ponto de interesse registado dentro de uma viagem.</w:t>
+              <w:t>Nota de 1 a 5 atribuída a um local.</w:t>
             </w:r>
           </w:p>
         </w:tc>
@@ -1568,12 +1578,14 @@
                 <w:lang w:val="pt-BR"/>
               </w:rPr>
             </w:pPr>
-            <w:r>
-              <w:rPr>
-                <w:lang w:val="pt-BR"/>
-              </w:rPr>
-              <w:t>Rating</w:t>
-            </w:r>
+            <w:proofErr w:type="spellStart"/>
+            <w:r>
+              <w:rPr>
+                <w:lang w:val="pt-BR"/>
+              </w:rPr>
+              <w:t>Trip</w:t>
+            </w:r>
+            <w:proofErr w:type="spellEnd"/>
           </w:p>
         </w:tc>
         <w:tc>
@@ -1593,7 +1605,7 @@
               <w:rPr>
                 <w:lang w:val="pt-BR"/>
               </w:rPr>
-              <w:t>Avaliação</w:t>
+              <w:t>Viagem</w:t>
             </w:r>
           </w:p>
         </w:tc>
@@ -1614,7 +1626,7 @@
               <w:rPr>
                 <w:lang w:val="pt-BR"/>
               </w:rPr>
-              <w:t>Nota de 1 a 5 atribuída a um local.</w:t>
+              <w:t>Conjunto de locais visitados entre uma data de início e uma de fim.</w:t>
             </w:r>
           </w:p>
         </w:tc>
@@ -1645,6 +1657,20 @@
               <w:t>Trip</w:t>
             </w:r>
             <w:proofErr w:type="spellEnd"/>
+            <w:r>
+              <w:rPr>
+                <w:lang w:val="pt-BR"/>
+              </w:rPr>
+              <w:t xml:space="preserve"> </w:t>
+            </w:r>
+            <w:proofErr w:type="spellStart"/>
+            <w:r>
+              <w:rPr>
+                <w:lang w:val="pt-BR"/>
+              </w:rPr>
+              <w:t>Member</w:t>
+            </w:r>
+            <w:proofErr w:type="spellEnd"/>
           </w:p>
         </w:tc>
         <w:tc>
@@ -1664,7 +1690,7 @@
               <w:rPr>
                 <w:lang w:val="pt-BR"/>
               </w:rPr>
-              <w:t>Viagem</w:t>
+              <w:t>Participante</w:t>
             </w:r>
           </w:p>
         </w:tc>
@@ -1685,7 +1711,7 @@
               <w:rPr>
                 <w:lang w:val="pt-BR"/>
               </w:rPr>
-              <w:t>Conjunto de locais visitados entre uma data de início e uma de fim.</w:t>
+              <w:t>Registo que associa um utilizador a uma viagem, determinando o seu papel e nível de acesso.</w:t>
             </w:r>
           </w:p>
         </w:tc>
@@ -1713,21 +1739,7 @@
               <w:rPr>
                 <w:lang w:val="pt-BR"/>
               </w:rPr>
-              <w:t>Trip</w:t>
-            </w:r>
-            <w:proofErr w:type="spellEnd"/>
-            <w:r>
-              <w:rPr>
-                <w:lang w:val="pt-BR"/>
-              </w:rPr>
-              <w:t xml:space="preserve"> </w:t>
-            </w:r>
-            <w:proofErr w:type="spellStart"/>
-            <w:r>
-              <w:rPr>
-                <w:lang w:val="pt-BR"/>
-              </w:rPr>
-              <w:t>Member</w:t>
+              <w:t>User</w:t>
             </w:r>
             <w:proofErr w:type="spellEnd"/>
           </w:p>
@@ -1749,7 +1761,7 @@
               <w:rPr>
                 <w:lang w:val="pt-BR"/>
               </w:rPr>
-              <w:t>Participante</w:t>
+              <w:t>Utilizador</w:t>
             </w:r>
           </w:p>
         </w:tc>
@@ -1770,77 +1782,6 @@
               <w:rPr>
                 <w:lang w:val="pt-BR"/>
               </w:rPr>
-              <w:t>Registo que associa um utilizador a uma viagem, determinando o seu papel e nível de acesso.</w:t>
-            </w:r>
-          </w:p>
-        </w:tc>
-      </w:tr>
-      <w:tr>
-        <w:trPr>
-          <w:trHeight w:val="33"/>
-          <w:jc w:val="center"/>
-        </w:trPr>
-        <w:tc>
-          <w:tcPr>
-            <w:tcW w:w="1438" w:type="dxa"/>
-            <w:vAlign w:val="center"/>
-          </w:tcPr>
-          <w:p>
-            <w:pPr>
-              <w:pStyle w:val="p1a"/>
-              <w:jc w:val="left"/>
-              <w:rPr>
-                <w:lang w:val="pt-BR"/>
-              </w:rPr>
-            </w:pPr>
-            <w:proofErr w:type="spellStart"/>
-            <w:r>
-              <w:rPr>
-                <w:lang w:val="pt-BR"/>
-              </w:rPr>
-              <w:t>User</w:t>
-            </w:r>
-            <w:proofErr w:type="spellEnd"/>
-          </w:p>
-        </w:tc>
-        <w:tc>
-          <w:tcPr>
-            <w:tcW w:w="2204" w:type="dxa"/>
-            <w:vAlign w:val="center"/>
-          </w:tcPr>
-          <w:p>
-            <w:pPr>
-              <w:pStyle w:val="p1a"/>
-              <w:jc w:val="left"/>
-              <w:rPr>
-                <w:lang w:val="pt-BR"/>
-              </w:rPr>
-            </w:pPr>
-            <w:r>
-              <w:rPr>
-                <w:lang w:val="pt-BR"/>
-              </w:rPr>
-              <w:t>Utilizador</w:t>
-            </w:r>
-          </w:p>
-        </w:tc>
-        <w:tc>
-          <w:tcPr>
-            <w:tcW w:w="2908" w:type="dxa"/>
-            <w:vAlign w:val="center"/>
-          </w:tcPr>
-          <w:p>
-            <w:pPr>
-              <w:pStyle w:val="p1a"/>
-              <w:jc w:val="left"/>
-              <w:rPr>
-                <w:lang w:val="pt-BR"/>
-              </w:rPr>
-            </w:pPr>
-            <w:r>
-              <w:rPr>
-                <w:lang w:val="pt-BR"/>
-              </w:rPr>
               <w:t>Pessoa registada na aplicação que cria ou participa em viagens.</w:t>
             </w:r>
           </w:p>
@@ -1900,7 +1841,7 @@
       <w:r>
         <w:rPr>
           <w:noProof/>
-          <w:lang w:val="pt-BR" w:eastAsia="pt-PT"/>
+          <w:lang w:val="pt-PT" w:eastAsia="pt-PT"/>
         </w:rPr>
         <w:drawing>
           <wp:inline distT="0" distB="0" distL="0" distR="0" wp14:anchorId="04F7F78D" wp14:editId="76C0FF2F">
@@ -3087,13 +3028,7 @@
               <w:rPr>
                 <w:lang w:val="pt-BR"/>
               </w:rPr>
-              <w:t>Existe um</w:t>
-            </w:r>
-            <w:r>
-              <w:rPr>
-                <w:lang w:val="pt-BR"/>
-              </w:rPr>
-              <w:t xml:space="preserve">a conta com o </w:t>
+              <w:t xml:space="preserve">Existe uma conta com o </w:t>
             </w:r>
             <w:proofErr w:type="spellStart"/>
             <w:r>
@@ -3147,13 +3082,7 @@
               <w:rPr>
                 <w:lang w:val="pt-BR"/>
               </w:rPr>
-              <w:t>O utilizador fica com sessã</w:t>
-            </w:r>
-            <w:r>
-              <w:rPr>
-                <w:lang w:val="pt-BR"/>
-              </w:rPr>
-              <w:t>o iniciada e vê as suas viagens</w:t>
+              <w:t>O utilizador fica com sessão iniciada e vê as suas viagens</w:t>
             </w:r>
           </w:p>
         </w:tc>
@@ -3211,19 +3140,7 @@
               <w:rPr>
                 <w:lang w:val="pt-BR"/>
               </w:rPr>
-              <w:t xml:space="preserve"> e</w:t>
-            </w:r>
-            <w:r>
-              <w:rPr>
-                <w:lang w:val="pt-BR"/>
-              </w:rPr>
-              <w:t xml:space="preserve"> a</w:t>
-            </w:r>
-            <w:r>
-              <w:rPr>
-                <w:lang w:val="pt-BR"/>
-              </w:rPr>
-              <w:t xml:space="preserve"> palavra-passe;</w:t>
+              <w:t xml:space="preserve"> e a palavra-passe;</w:t>
             </w:r>
           </w:p>
           <w:p>
@@ -3273,13 +3190,7 @@
               <w:rPr>
                 <w:lang w:val="pt-BR"/>
               </w:rPr>
-              <w:t xml:space="preserve"> da palavra-p</w:t>
-            </w:r>
-            <w:r>
-              <w:rPr>
-                <w:lang w:val="pt-BR"/>
-              </w:rPr>
-              <w:t>asse e compara-o com o guardado;</w:t>
+              <w:t xml:space="preserve"> da palavra-passe e compara-o com o guardado;</w:t>
             </w:r>
           </w:p>
           <w:p>
@@ -3435,13 +3346,7 @@
               <w:rPr>
                 <w:lang w:val="pt-BR"/>
               </w:rPr>
-              <w:t>Regista uma nova v</w:t>
-            </w:r>
-            <w:r>
-              <w:rPr>
-                <w:lang w:val="pt-BR"/>
-              </w:rPr>
-              <w:t>iagem do utilizador autenticado</w:t>
+              <w:t>Regista uma nova viagem do utilizador autenticado</w:t>
             </w:r>
           </w:p>
         </w:tc>
@@ -3481,13 +3386,7 @@
               <w:rPr>
                 <w:lang w:val="pt-BR"/>
               </w:rPr>
-              <w:t>O</w:t>
-            </w:r>
-            <w:r>
-              <w:rPr>
-                <w:lang w:val="pt-BR"/>
-              </w:rPr>
-              <w:t xml:space="preserve"> utilizador tem sessão iniciada</w:t>
+              <w:t>O utilizador tem sessão iniciada</w:t>
             </w:r>
           </w:p>
         </w:tc>
@@ -3527,13 +3426,7 @@
               <w:rPr>
                 <w:lang w:val="pt-BR"/>
               </w:rPr>
-              <w:t>A viagem fica guarda</w:t>
-            </w:r>
-            <w:r>
-              <w:rPr>
-                <w:lang w:val="pt-BR"/>
-              </w:rPr>
-              <w:t xml:space="preserve">da no </w:t>
+              <w:t xml:space="preserve">A viagem fica guardada no </w:t>
             </w:r>
             <w:proofErr w:type="spellStart"/>
             <w:r>
@@ -3591,19 +3484,7 @@
               <w:rPr>
                 <w:lang w:val="pt-BR"/>
               </w:rPr>
-              <w:t xml:space="preserve">O utilizador </w:t>
-            </w:r>
-            <w:r>
-              <w:rPr>
-                <w:lang w:val="pt-BR"/>
-              </w:rPr>
-              <w:t>clica</w:t>
-            </w:r>
-            <w:r>
-              <w:rPr>
-                <w:lang w:val="pt-BR"/>
-              </w:rPr>
-              <w:t xml:space="preserve"> em “Nova viagem”;</w:t>
+              <w:t>O utilizador clica em “Nova viagem”;</w:t>
             </w:r>
           </w:p>
           <w:p>
@@ -3621,19 +3502,7 @@
               <w:rPr>
                 <w:lang w:val="pt-BR"/>
               </w:rPr>
-              <w:t>O sistema pede o título, a descrição (opcio</w:t>
-            </w:r>
-            <w:r>
-              <w:rPr>
-                <w:lang w:val="pt-BR"/>
-              </w:rPr>
-              <w:t>nal) e as datas de início e fim</w:t>
-            </w:r>
-            <w:r>
-              <w:rPr>
-                <w:lang w:val="pt-BR"/>
-              </w:rPr>
-              <w:t>;</w:t>
+              <w:t>O sistema pede o título, a descrição (opcional) e as datas de início e fim;</w:t>
             </w:r>
           </w:p>
           <w:p>
@@ -3651,13 +3520,7 @@
               <w:rPr>
                 <w:lang w:val="pt-BR"/>
               </w:rPr>
-              <w:t>O</w:t>
-            </w:r>
-            <w:r>
-              <w:rPr>
-                <w:lang w:val="pt-BR"/>
-              </w:rPr>
-              <w:t xml:space="preserve"> utilizador preenche e confirma;</w:t>
+              <w:t>O utilizador preenche e confirma;</w:t>
             </w:r>
           </w:p>
           <w:p>
@@ -3675,19 +3538,7 @@
               <w:rPr>
                 <w:lang w:val="pt-BR"/>
               </w:rPr>
-              <w:t>O sistema valida se a</w:t>
-            </w:r>
-            <w:r>
-              <w:rPr>
-                <w:lang w:val="pt-BR"/>
-              </w:rPr>
-              <w:t xml:space="preserve"> data de fim</w:t>
-            </w:r>
-            <w:r>
-              <w:rPr>
-                <w:lang w:val="pt-BR"/>
-              </w:rPr>
-              <w:t xml:space="preserve"> igual ou posterior à de início;</w:t>
+              <w:t>O sistema valida se a data de fim igual ou posterior à de início;</w:t>
             </w:r>
           </w:p>
           <w:p>
@@ -3705,13 +3556,7 @@
               <w:rPr>
                 <w:lang w:val="pt-BR"/>
               </w:rPr>
-              <w:t xml:space="preserve">O sistema </w:t>
-            </w:r>
-            <w:r>
-              <w:rPr>
-                <w:lang w:val="pt-BR"/>
-              </w:rPr>
-              <w:t xml:space="preserve">cria a </w:t>
+              <w:t xml:space="preserve">O sistema cria a </w:t>
             </w:r>
             <w:r>
               <w:rPr>
@@ -3731,8 +3576,6 @@
               </w:rPr>
               <w:t>utilizador</w:t>
             </w:r>
-            <w:bookmarkStart w:id="0" w:name="_GoBack"/>
-            <w:bookmarkEnd w:id="0"/>
             <w:r>
               <w:rPr>
                 <w:lang w:val="pt-BR"/>
@@ -3813,31 +3656,7 @@
               <w:rPr>
                 <w:lang w:val="pt-BR"/>
               </w:rPr>
-              <w:t>A d</w:t>
-            </w:r>
-            <w:r>
-              <w:rPr>
-                <w:lang w:val="pt-BR"/>
-              </w:rPr>
-              <w:t>ata de fim</w:t>
-            </w:r>
-            <w:r>
-              <w:rPr>
-                <w:lang w:val="pt-BR"/>
-              </w:rPr>
-              <w:t xml:space="preserve"> é</w:t>
-            </w:r>
-            <w:r>
-              <w:rPr>
-                <w:lang w:val="pt-BR"/>
-              </w:rPr>
-              <w:t xml:space="preserve"> </w:t>
-            </w:r>
-            <w:r>
-              <w:rPr>
-                <w:lang w:val="pt-BR"/>
-              </w:rPr>
-              <w:t>anterior à de início: o sistema informa o erro e solicita uma nova data.</w:t>
+              <w:t>A data de fim é anterior à de início: o sistema informa o erro e solicita uma nova data.</w:t>
             </w:r>
           </w:p>
         </w:tc>
@@ -3917,7 +3736,7 @@
       <w:r>
         <w:rPr>
           <w:noProof/>
-          <w:lang w:val="pt-BR" w:eastAsia="pt-PT"/>
+          <w:lang w:val="pt-PT" w:eastAsia="pt-PT"/>
         </w:rPr>
         <w:drawing>
           <wp:anchor distT="0" distB="0" distL="114300" distR="114300" simplePos="0" relativeHeight="251658240" behindDoc="1" locked="0" layoutInCell="1" allowOverlap="1" wp14:anchorId="50858877" wp14:editId="25CD5379">

</xml_diff>

<commit_message>
Adição de novas User Stories
</commit_message>
<xml_diff>
--- a/Documentation/Relatório-DSSMV-2025-27_2DB_1250771_1251355.docx
+++ b/Documentation/Relatório-DSSMV-2025-27_2DB_1250771_1251355.docx
@@ -2113,14 +2113,6 @@
     </w:p>
     <w:p>
       <w:pPr>
-        <w:ind w:firstLine="0"/>
-        <w:rPr>
-          <w:lang w:val="pt-BR"/>
-        </w:rPr>
-      </w:pPr>
-    </w:p>
-    <w:p>
-      <w:pPr>
         <w:rPr>
           <w:lang w:val="pt-BR"/>
         </w:rPr>
@@ -2443,6 +2435,660 @@
     </w:p>
     <w:p>
       <w:pPr>
+        <w:rPr>
+          <w:lang w:val="pt-BR"/>
+        </w:rPr>
+      </w:pPr>
+    </w:p>
+    <w:p>
+      <w:pPr>
+        <w:pStyle w:val="PargrafodaLista"/>
+        <w:numPr>
+          <w:ilvl w:val="0"/>
+          <w:numId w:val="1"/>
+        </w:numPr>
+        <w:rPr>
+          <w:lang w:val="pt-BR"/>
+        </w:rPr>
+      </w:pPr>
+      <w:r>
+        <w:rPr>
+          <w:lang w:val="pt-BR"/>
+        </w:rPr>
+        <w:t xml:space="preserve">Como utilizador quero adicionar locais as minhas viagens </w:t>
+      </w:r>
+      <w:r>
+        <w:rPr>
+          <w:lang w:val="pt-BR"/>
+        </w:rPr>
+        <w:t>com a minha posição atual</w:t>
+      </w:r>
+      <w:r>
+        <w:rPr>
+          <w:lang w:val="pt-BR"/>
+        </w:rPr>
+        <w:t>.</w:t>
+      </w:r>
+    </w:p>
+    <w:p>
+      <w:pPr>
+        <w:ind w:left="481"/>
+        <w:rPr>
+          <w:u w:val="single"/>
+          <w:lang w:val="pt-BR"/>
+        </w:rPr>
+      </w:pPr>
+      <w:r>
+        <w:rPr>
+          <w:u w:val="single"/>
+          <w:lang w:val="pt-BR"/>
+        </w:rPr>
+        <w:t>Critérios de aceitação:</w:t>
+      </w:r>
+    </w:p>
+    <w:p>
+      <w:pPr>
+        <w:pStyle w:val="PargrafodaLista"/>
+        <w:numPr>
+          <w:ilvl w:val="1"/>
+          <w:numId w:val="1"/>
+        </w:numPr>
+        <w:rPr>
+          <w:u w:val="single"/>
+          <w:lang w:val="pt-BR"/>
+        </w:rPr>
+      </w:pPr>
+      <w:r>
+        <w:rPr>
+          <w:lang w:val="pt-BR"/>
+        </w:rPr>
+        <w:t>O s</w:t>
+      </w:r>
+      <w:r>
+        <w:rPr>
+          <w:lang w:val="pt-BR"/>
+        </w:rPr>
+        <w:t xml:space="preserve">istema deve pedir a permissão para acessar a localização do </w:t>
+      </w:r>
+      <w:r>
+        <w:rPr>
+          <w:lang w:val="pt-BR"/>
+        </w:rPr>
+        <w:t>utilizador</w:t>
+      </w:r>
+      <w:r>
+        <w:rPr>
+          <w:lang w:val="pt-BR"/>
+        </w:rPr>
+        <w:t>;</w:t>
+      </w:r>
+    </w:p>
+    <w:p>
+      <w:pPr>
+        <w:pStyle w:val="PargrafodaLista"/>
+        <w:numPr>
+          <w:ilvl w:val="1"/>
+          <w:numId w:val="1"/>
+        </w:numPr>
+        <w:rPr>
+          <w:u w:val="single"/>
+          <w:lang w:val="pt-BR"/>
+        </w:rPr>
+      </w:pPr>
+      <w:r>
+        <w:rPr>
+          <w:lang w:val="pt-BR"/>
+        </w:rPr>
+        <w:t>O sistema deve validar as coordenadas</w:t>
+      </w:r>
+      <w:r>
+        <w:rPr>
+          <w:lang w:val="pt-BR"/>
+        </w:rPr>
+        <w:t>.</w:t>
+      </w:r>
+    </w:p>
+    <w:p>
+      <w:pPr>
+        <w:rPr>
+          <w:u w:val="single"/>
+          <w:lang w:val="pt-BR"/>
+        </w:rPr>
+      </w:pPr>
+    </w:p>
+    <w:p>
+      <w:pPr>
+        <w:pStyle w:val="PargrafodaLista"/>
+        <w:numPr>
+          <w:ilvl w:val="0"/>
+          <w:numId w:val="1"/>
+        </w:numPr>
+        <w:rPr>
+          <w:u w:val="single"/>
+          <w:lang w:val="pt-BR"/>
+        </w:rPr>
+      </w:pPr>
+      <w:r>
+        <w:rPr>
+          <w:lang w:val="pt-BR"/>
+        </w:rPr>
+        <w:t xml:space="preserve">Como utilizador, </w:t>
+      </w:r>
+      <w:r>
+        <w:rPr>
+          <w:lang w:val="pt-BR"/>
+        </w:rPr>
+        <w:t xml:space="preserve">quero tirar fotografias ao local, para guardar uma imagem da </w:t>
+      </w:r>
+      <w:r>
+        <w:rPr>
+          <w:lang w:val="pt-BR"/>
+        </w:rPr>
+        <w:t xml:space="preserve">minha </w:t>
+      </w:r>
+      <w:r>
+        <w:rPr>
+          <w:lang w:val="pt-BR"/>
+        </w:rPr>
+        <w:t>visita</w:t>
+      </w:r>
+      <w:r>
+        <w:rPr>
+          <w:lang w:val="pt-BR"/>
+        </w:rPr>
+        <w:t>.</w:t>
+      </w:r>
+    </w:p>
+    <w:p>
+      <w:pPr>
+        <w:ind w:left="720" w:firstLine="0"/>
+        <w:rPr>
+          <w:u w:val="single"/>
+          <w:lang w:val="pt-BR"/>
+        </w:rPr>
+      </w:pPr>
+      <w:r>
+        <w:rPr>
+          <w:u w:val="single"/>
+          <w:lang w:val="pt-BR"/>
+        </w:rPr>
+        <w:t>Critérios de aceitação:</w:t>
+      </w:r>
+    </w:p>
+    <w:p>
+      <w:pPr>
+        <w:pStyle w:val="PargrafodaLista"/>
+        <w:numPr>
+          <w:ilvl w:val="0"/>
+          <w:numId w:val="28"/>
+        </w:numPr>
+        <w:rPr>
+          <w:u w:val="single"/>
+          <w:lang w:val="pt-BR"/>
+        </w:rPr>
+      </w:pPr>
+      <w:r>
+        <w:rPr>
+          <w:lang w:val="pt-BR"/>
+        </w:rPr>
+        <w:t>A fotografia deve ser tirada dentro da aplicação</w:t>
+      </w:r>
+      <w:r>
+        <w:rPr>
+          <w:lang w:val="pt-BR"/>
+        </w:rPr>
+        <w:t xml:space="preserve">, com o </w:t>
+      </w:r>
+      <w:proofErr w:type="spellStart"/>
+      <w:r>
+        <w:rPr>
+          <w:lang w:val="pt-BR"/>
+        </w:rPr>
+        <w:t>CameraX</w:t>
+      </w:r>
+      <w:proofErr w:type="spellEnd"/>
+      <w:r>
+        <w:rPr>
+          <w:lang w:val="pt-BR"/>
+        </w:rPr>
+        <w:t>.</w:t>
+      </w:r>
+    </w:p>
+    <w:p>
+      <w:pPr>
+        <w:rPr>
+          <w:u w:val="single"/>
+          <w:lang w:val="pt-BR"/>
+        </w:rPr>
+      </w:pPr>
+    </w:p>
+    <w:p>
+      <w:pPr>
+        <w:pStyle w:val="PargrafodaLista"/>
+        <w:numPr>
+          <w:ilvl w:val="0"/>
+          <w:numId w:val="1"/>
+        </w:numPr>
+        <w:rPr>
+          <w:u w:val="single"/>
+          <w:lang w:val="pt-BR"/>
+        </w:rPr>
+      </w:pPr>
+      <w:r>
+        <w:rPr>
+          <w:lang w:val="pt-BR"/>
+        </w:rPr>
+        <w:t>Como utilizador, quero dar uma avaliação aos locais que visito, para registar a minha opinião.</w:t>
+      </w:r>
+    </w:p>
+    <w:p>
+      <w:pPr>
+        <w:ind w:left="720" w:firstLine="0"/>
+        <w:rPr>
+          <w:u w:val="single"/>
+          <w:lang w:val="pt-BR"/>
+        </w:rPr>
+      </w:pPr>
+      <w:r>
+        <w:rPr>
+          <w:u w:val="single"/>
+          <w:lang w:val="pt-BR"/>
+        </w:rPr>
+        <w:t>Critérios de aceitação:</w:t>
+      </w:r>
+    </w:p>
+    <w:p>
+      <w:pPr>
+        <w:pStyle w:val="PargrafodaLista"/>
+        <w:numPr>
+          <w:ilvl w:val="1"/>
+          <w:numId w:val="1"/>
+        </w:numPr>
+        <w:spacing w:after="40"/>
+        <w:rPr>
+          <w:lang w:val="pt-BR"/>
+        </w:rPr>
+      </w:pPr>
+      <w:r>
+        <w:rPr>
+          <w:lang w:val="pt-BR"/>
+        </w:rPr>
+        <w:t>A a</w:t>
+      </w:r>
+      <w:r>
+        <w:rPr>
+          <w:lang w:val="pt-BR"/>
+        </w:rPr>
+        <w:t>valiação deve estar entre 1 e 5.</w:t>
+      </w:r>
+    </w:p>
+    <w:p>
+      <w:pPr>
+        <w:spacing w:after="40"/>
+        <w:rPr>
+          <w:lang w:val="pt-BR"/>
+        </w:rPr>
+      </w:pPr>
+    </w:p>
+    <w:p>
+      <w:pPr>
+        <w:pStyle w:val="PargrafodaLista"/>
+        <w:numPr>
+          <w:ilvl w:val="0"/>
+          <w:numId w:val="1"/>
+        </w:numPr>
+        <w:spacing w:after="40"/>
+        <w:rPr>
+          <w:lang w:val="pt-BR"/>
+        </w:rPr>
+      </w:pPr>
+      <w:r>
+        <w:rPr>
+          <w:lang w:val="pt-BR"/>
+        </w:rPr>
+        <w:t xml:space="preserve">Como utilizador, </w:t>
+      </w:r>
+      <w:r>
+        <w:rPr>
+          <w:lang w:val="pt-BR"/>
+        </w:rPr>
+        <w:t>quero ver todos os locais da viagem num mapa, para ter noção do percurso</w:t>
+      </w:r>
+      <w:r>
+        <w:rPr>
+          <w:lang w:val="pt-BR"/>
+        </w:rPr>
+        <w:t>.</w:t>
+      </w:r>
+    </w:p>
+    <w:p>
+      <w:pPr>
+        <w:spacing w:after="40"/>
+        <w:ind w:left="720" w:firstLine="0"/>
+        <w:rPr>
+          <w:u w:val="single"/>
+          <w:lang w:val="pt-BR"/>
+        </w:rPr>
+      </w:pPr>
+      <w:r>
+        <w:rPr>
+          <w:u w:val="single"/>
+          <w:lang w:val="pt-BR"/>
+        </w:rPr>
+        <w:t>Critérios de aceitação:</w:t>
+      </w:r>
+    </w:p>
+    <w:p>
+      <w:pPr>
+        <w:pStyle w:val="PargrafodaLista"/>
+        <w:numPr>
+          <w:ilvl w:val="0"/>
+          <w:numId w:val="31"/>
+        </w:numPr>
+        <w:spacing w:after="40"/>
+        <w:rPr>
+          <w:lang w:val="pt-BR"/>
+        </w:rPr>
+      </w:pPr>
+      <w:r>
+        <w:rPr>
+          <w:lang w:val="pt-BR"/>
+        </w:rPr>
+        <w:t>O mapa dev</w:t>
+      </w:r>
+      <w:r>
+        <w:rPr>
+          <w:lang w:val="pt-BR"/>
+        </w:rPr>
+        <w:t>e mostrar um marcador por local;</w:t>
+      </w:r>
+    </w:p>
+    <w:p>
+      <w:pPr>
+        <w:pStyle w:val="PargrafodaLista"/>
+        <w:numPr>
+          <w:ilvl w:val="0"/>
+          <w:numId w:val="31"/>
+        </w:numPr>
+        <w:spacing w:after="40"/>
+        <w:rPr>
+          <w:u w:val="single"/>
+          <w:lang w:val="pt-BR"/>
+        </w:rPr>
+      </w:pPr>
+      <w:r>
+        <w:rPr>
+          <w:lang w:val="pt-BR"/>
+        </w:rPr>
+        <w:t>A cor do marcador deve corresponder à categoria do local</w:t>
+      </w:r>
+      <w:r>
+        <w:rPr>
+          <w:lang w:val="pt-BR"/>
+        </w:rPr>
+        <w:t>;</w:t>
+      </w:r>
+    </w:p>
+    <w:p>
+      <w:pPr>
+        <w:pStyle w:val="PargrafodaLista"/>
+        <w:numPr>
+          <w:ilvl w:val="0"/>
+          <w:numId w:val="31"/>
+        </w:numPr>
+        <w:spacing w:after="40"/>
+        <w:rPr>
+          <w:u w:val="single"/>
+          <w:lang w:val="pt-BR"/>
+        </w:rPr>
+      </w:pPr>
+      <w:r>
+        <w:rPr>
+          <w:lang w:val="pt-BR"/>
+        </w:rPr>
+        <w:t>Tocar num marcador deve abrir o detalhe do local</w:t>
+      </w:r>
+      <w:r>
+        <w:rPr>
+          <w:lang w:val="pt-BR"/>
+        </w:rPr>
+        <w:t>.</w:t>
+      </w:r>
+    </w:p>
+    <w:p>
+      <w:pPr>
+        <w:spacing w:after="40"/>
+        <w:rPr>
+          <w:u w:val="single"/>
+          <w:lang w:val="pt-BR"/>
+        </w:rPr>
+      </w:pPr>
+    </w:p>
+    <w:p>
+      <w:pPr>
+        <w:pStyle w:val="PargrafodaLista"/>
+        <w:numPr>
+          <w:ilvl w:val="0"/>
+          <w:numId w:val="1"/>
+        </w:numPr>
+        <w:spacing w:after="40"/>
+        <w:rPr>
+          <w:lang w:val="pt-BR"/>
+        </w:rPr>
+      </w:pPr>
+      <w:r>
+        <w:rPr>
+          <w:lang w:val="pt-BR"/>
+        </w:rPr>
+        <w:t xml:space="preserve">Como utilizador, </w:t>
+      </w:r>
+      <w:r>
+        <w:rPr>
+          <w:lang w:val="pt-BR"/>
+        </w:rPr>
+        <w:t>quero adicionar participantes à viagem, para partilhar a informação com quem viajou comigo</w:t>
+      </w:r>
+      <w:r>
+        <w:rPr>
+          <w:lang w:val="pt-BR"/>
+        </w:rPr>
+        <w:t>.</w:t>
+      </w:r>
+    </w:p>
+    <w:p>
+      <w:pPr>
+        <w:spacing w:after="40"/>
+        <w:ind w:left="720" w:firstLine="0"/>
+        <w:rPr>
+          <w:u w:val="single"/>
+          <w:lang w:val="pt-BR"/>
+        </w:rPr>
+      </w:pPr>
+      <w:r>
+        <w:rPr>
+          <w:u w:val="single"/>
+          <w:lang w:val="pt-BR"/>
+        </w:rPr>
+        <w:lastRenderedPageBreak/>
+        <w:t>Critérios de aceitação:</w:t>
+      </w:r>
+    </w:p>
+    <w:p>
+      <w:pPr>
+        <w:pStyle w:val="PargrafodaLista"/>
+        <w:numPr>
+          <w:ilvl w:val="1"/>
+          <w:numId w:val="1"/>
+        </w:numPr>
+        <w:spacing w:after="40"/>
+        <w:rPr>
+          <w:u w:val="single"/>
+          <w:lang w:val="pt-BR"/>
+        </w:rPr>
+      </w:pPr>
+      <w:r>
+        <w:rPr>
+          <w:lang w:val="pt-BR"/>
+        </w:rPr>
+        <w:t xml:space="preserve">O convite deve ser feito pelo </w:t>
+      </w:r>
+      <w:proofErr w:type="spellStart"/>
+      <w:r>
+        <w:rPr>
+          <w:lang w:val="pt-BR"/>
+        </w:rPr>
+        <w:t>email</w:t>
+      </w:r>
+      <w:proofErr w:type="spellEnd"/>
+      <w:r>
+        <w:rPr>
+          <w:lang w:val="pt-BR"/>
+        </w:rPr>
+        <w:t xml:space="preserve"> do utilizador</w:t>
+      </w:r>
+      <w:r>
+        <w:rPr>
+          <w:lang w:val="pt-BR"/>
+        </w:rPr>
+        <w:t>;</w:t>
+      </w:r>
+    </w:p>
+    <w:p>
+      <w:pPr>
+        <w:pStyle w:val="PargrafodaLista"/>
+        <w:numPr>
+          <w:ilvl w:val="1"/>
+          <w:numId w:val="1"/>
+        </w:numPr>
+        <w:spacing w:after="40"/>
+        <w:rPr>
+          <w:u w:val="single"/>
+          <w:lang w:val="pt-BR"/>
+        </w:rPr>
+      </w:pPr>
+      <w:r>
+        <w:rPr>
+          <w:lang w:val="pt-BR"/>
+        </w:rPr>
+        <w:t>O sistema deve recusar convidar duas vezes a mesma pessoa</w:t>
+      </w:r>
+      <w:r>
+        <w:rPr>
+          <w:lang w:val="pt-BR"/>
+        </w:rPr>
+        <w:t>.</w:t>
+      </w:r>
+    </w:p>
+    <w:p>
+      <w:pPr>
+        <w:spacing w:after="40"/>
+        <w:rPr>
+          <w:u w:val="single"/>
+          <w:lang w:val="pt-BR"/>
+        </w:rPr>
+      </w:pPr>
+    </w:p>
+    <w:p>
+      <w:pPr>
+        <w:pStyle w:val="PargrafodaLista"/>
+        <w:numPr>
+          <w:ilvl w:val="0"/>
+          <w:numId w:val="1"/>
+        </w:numPr>
+        <w:spacing w:after="40"/>
+        <w:rPr>
+          <w:u w:val="single"/>
+          <w:lang w:val="pt-BR"/>
+        </w:rPr>
+      </w:pPr>
+      <w:r>
+        <w:rPr>
+          <w:lang w:val="pt-BR"/>
+        </w:rPr>
+        <w:t xml:space="preserve">Como </w:t>
+      </w:r>
+      <w:r>
+        <w:rPr>
+          <w:lang w:val="pt-BR"/>
+        </w:rPr>
+        <w:t>utilizador</w:t>
+      </w:r>
+      <w:r>
+        <w:rPr>
+          <w:lang w:val="pt-BR"/>
+        </w:rPr>
+        <w:t xml:space="preserve">, </w:t>
+      </w:r>
+      <w:r>
+        <w:rPr>
+          <w:lang w:val="pt-BR"/>
+        </w:rPr>
+        <w:t>quero consultar o resumo da via</w:t>
+      </w:r>
+      <w:r>
+        <w:rPr>
+          <w:lang w:val="pt-BR"/>
+        </w:rPr>
+        <w:t>gem, para saber as estatísticas da minha viagem.</w:t>
+      </w:r>
+    </w:p>
+    <w:p>
+      <w:pPr>
+        <w:spacing w:after="40"/>
+        <w:ind w:left="720" w:firstLine="0"/>
+        <w:rPr>
+          <w:u w:val="single"/>
+          <w:lang w:val="pt-BR"/>
+        </w:rPr>
+      </w:pPr>
+      <w:r>
+        <w:rPr>
+          <w:u w:val="single"/>
+          <w:lang w:val="pt-BR"/>
+        </w:rPr>
+        <w:t>Critérios de aceitação:</w:t>
+      </w:r>
+    </w:p>
+    <w:p>
+      <w:pPr>
+        <w:pStyle w:val="PargrafodaLista"/>
+        <w:numPr>
+          <w:ilvl w:val="0"/>
+          <w:numId w:val="32"/>
+        </w:numPr>
+        <w:spacing w:after="40"/>
+        <w:rPr>
+          <w:u w:val="single"/>
+          <w:lang w:val="pt-BR"/>
+        </w:rPr>
+      </w:pPr>
+      <w:r>
+        <w:rPr>
+          <w:lang w:val="pt-BR"/>
+        </w:rPr>
+        <w:t>O sistema deve calcular a distância percorrida</w:t>
+      </w:r>
+      <w:r>
+        <w:rPr>
+          <w:lang w:val="pt-BR"/>
+        </w:rPr>
+        <w:t xml:space="preserve"> e o total de locais, d</w:t>
+      </w:r>
+      <w:r>
+        <w:rPr>
+          <w:lang w:val="pt-BR"/>
+        </w:rPr>
+        <w:t xml:space="preserve">eve mostrar também o número de países e a avaliação </w:t>
+      </w:r>
+      <w:r>
+        <w:rPr>
+          <w:lang w:val="pt-BR"/>
+        </w:rPr>
+        <w:t>media.</w:t>
+      </w:r>
+    </w:p>
+    <w:p>
+      <w:pPr>
         <w:pStyle w:val="heading1"/>
         <w:rPr>
           <w:lang w:val="pt-BR"/>
@@ -2454,6 +3100,8 @@
         </w:rPr>
         <w:t>5   Requisitos</w:t>
       </w:r>
+      <w:bookmarkStart w:id="0" w:name="_GoBack"/>
+      <w:bookmarkEnd w:id="0"/>
     </w:p>
     <w:p>
       <w:pPr>
@@ -2584,7 +3232,6 @@
           <w:szCs w:val="18"/>
           <w:lang w:val="pt-BR"/>
         </w:rPr>
-        <w:lastRenderedPageBreak/>
         <w:t>UC</w:t>
       </w:r>
       <w:proofErr w:type="spellEnd"/>
@@ -2881,6 +3528,7 @@
               <w:rPr>
                 <w:lang w:val="pt-BR"/>
               </w:rPr>
+              <w:lastRenderedPageBreak/>
               <w:t xml:space="preserve">O sistema guarda a palavra-passe como </w:t>
             </w:r>
             <w:proofErr w:type="spellStart"/>
@@ -2934,6 +3582,7 @@
               <w:rPr>
                 <w:lang w:val="pt-BR"/>
               </w:rPr>
+              <w:lastRenderedPageBreak/>
               <w:t>Caminho alternativo</w:t>
             </w:r>
           </w:p>
@@ -3695,7 +4344,6 @@
               <w:rPr>
                 <w:lang w:val="pt-BR"/>
               </w:rPr>
-              <w:lastRenderedPageBreak/>
               <w:t>Caminho alternativo</w:t>
             </w:r>
           </w:p>
@@ -3987,6 +4635,7 @@
               <w:rPr>
                 <w:lang w:val="pt-BR"/>
               </w:rPr>
+              <w:lastRenderedPageBreak/>
               <w:t>O sistema lê as viagens do utilizador;</w:t>
             </w:r>
           </w:p>
@@ -4044,6 +4693,7 @@
               <w:rPr>
                 <w:lang w:val="pt-BR"/>
               </w:rPr>
+              <w:lastRenderedPageBreak/>
               <w:t>Caminho alternativo</w:t>
             </w:r>
           </w:p>
@@ -4831,7 +5481,6 @@
               <w:rPr>
                 <w:lang w:val="pt-BR"/>
               </w:rPr>
-              <w:lastRenderedPageBreak/>
               <w:t>Caminho alternativo</w:t>
             </w:r>
           </w:p>
@@ -5137,6 +5786,7 @@
               <w:rPr>
                 <w:lang w:val="pt-BR"/>
               </w:rPr>
+              <w:lastRenderedPageBreak/>
               <w:t xml:space="preserve">O utilizador introduz o </w:t>
             </w:r>
             <w:proofErr w:type="spellStart"/>
@@ -5199,6 +5849,7 @@
               <w:rPr>
                 <w:lang w:val="pt-BR"/>
               </w:rPr>
+              <w:lastRenderedPageBreak/>
               <w:t>Caminho alternativo</w:t>
             </w:r>
           </w:p>
@@ -5686,8 +6337,6 @@
               </w:rPr>
               <w:t>O sistema cria o local.</w:t>
             </w:r>
-            <w:bookmarkStart w:id="0" w:name="_GoBack"/>
-            <w:bookmarkEnd w:id="0"/>
           </w:p>
         </w:tc>
       </w:tr>
@@ -6387,6 +7036,7 @@
           <w:b w:val="0"/>
           <w:lang w:val="pt-BR"/>
         </w:rPr>
+        <w:lastRenderedPageBreak/>
         <w:t>UC</w:t>
       </w:r>
       <w:proofErr w:type="spellEnd"/>
@@ -7695,6 +8345,178 @@
     </w:lvl>
   </w:abstractNum>
   <w:abstractNum w:abstractNumId="2" w15:restartNumberingAfterBreak="0">
+    <w:nsid w:val="0578002F"/>
+    <w:multiLevelType w:val="hybridMultilevel"/>
+    <w:tmpl w:val="61402BF0"/>
+    <w:lvl w:ilvl="0" w:tplc="0816000F">
+      <w:start w:val="1"/>
+      <w:numFmt w:val="decimal"/>
+      <w:lvlText w:val="%1."/>
+      <w:lvlJc w:val="left"/>
+      <w:pPr>
+        <w:ind w:left="1440" w:hanging="360"/>
+      </w:pPr>
+    </w:lvl>
+    <w:lvl w:ilvl="1" w:tplc="08160019" w:tentative="1">
+      <w:start w:val="1"/>
+      <w:numFmt w:val="lowerLetter"/>
+      <w:lvlText w:val="%2."/>
+      <w:lvlJc w:val="left"/>
+      <w:pPr>
+        <w:ind w:left="2160" w:hanging="360"/>
+      </w:pPr>
+    </w:lvl>
+    <w:lvl w:ilvl="2" w:tplc="0816001B" w:tentative="1">
+      <w:start w:val="1"/>
+      <w:numFmt w:val="lowerRoman"/>
+      <w:lvlText w:val="%3."/>
+      <w:lvlJc w:val="right"/>
+      <w:pPr>
+        <w:ind w:left="2880" w:hanging="180"/>
+      </w:pPr>
+    </w:lvl>
+    <w:lvl w:ilvl="3" w:tplc="0816000F" w:tentative="1">
+      <w:start w:val="1"/>
+      <w:numFmt w:val="decimal"/>
+      <w:lvlText w:val="%4."/>
+      <w:lvlJc w:val="left"/>
+      <w:pPr>
+        <w:ind w:left="3600" w:hanging="360"/>
+      </w:pPr>
+    </w:lvl>
+    <w:lvl w:ilvl="4" w:tplc="08160019" w:tentative="1">
+      <w:start w:val="1"/>
+      <w:numFmt w:val="lowerLetter"/>
+      <w:lvlText w:val="%5."/>
+      <w:lvlJc w:val="left"/>
+      <w:pPr>
+        <w:ind w:left="4320" w:hanging="360"/>
+      </w:pPr>
+    </w:lvl>
+    <w:lvl w:ilvl="5" w:tplc="0816001B" w:tentative="1">
+      <w:start w:val="1"/>
+      <w:numFmt w:val="lowerRoman"/>
+      <w:lvlText w:val="%6."/>
+      <w:lvlJc w:val="right"/>
+      <w:pPr>
+        <w:ind w:left="5040" w:hanging="180"/>
+      </w:pPr>
+    </w:lvl>
+    <w:lvl w:ilvl="6" w:tplc="0816000F" w:tentative="1">
+      <w:start w:val="1"/>
+      <w:numFmt w:val="decimal"/>
+      <w:lvlText w:val="%7."/>
+      <w:lvlJc w:val="left"/>
+      <w:pPr>
+        <w:ind w:left="5760" w:hanging="360"/>
+      </w:pPr>
+    </w:lvl>
+    <w:lvl w:ilvl="7" w:tplc="08160019" w:tentative="1">
+      <w:start w:val="1"/>
+      <w:numFmt w:val="lowerLetter"/>
+      <w:lvlText w:val="%8."/>
+      <w:lvlJc w:val="left"/>
+      <w:pPr>
+        <w:ind w:left="6480" w:hanging="360"/>
+      </w:pPr>
+    </w:lvl>
+    <w:lvl w:ilvl="8" w:tplc="0816001B" w:tentative="1">
+      <w:start w:val="1"/>
+      <w:numFmt w:val="lowerRoman"/>
+      <w:lvlText w:val="%9."/>
+      <w:lvlJc w:val="right"/>
+      <w:pPr>
+        <w:ind w:left="7200" w:hanging="180"/>
+      </w:pPr>
+    </w:lvl>
+  </w:abstractNum>
+  <w:abstractNum w:abstractNumId="3" w15:restartNumberingAfterBreak="0">
+    <w:nsid w:val="099F4225"/>
+    <w:multiLevelType w:val="hybridMultilevel"/>
+    <w:tmpl w:val="AAFE75CA"/>
+    <w:lvl w:ilvl="0" w:tplc="0816000F">
+      <w:start w:val="1"/>
+      <w:numFmt w:val="decimal"/>
+      <w:lvlText w:val="%1."/>
+      <w:lvlJc w:val="left"/>
+      <w:pPr>
+        <w:ind w:left="1080" w:hanging="360"/>
+      </w:pPr>
+    </w:lvl>
+    <w:lvl w:ilvl="1" w:tplc="08160019" w:tentative="1">
+      <w:start w:val="1"/>
+      <w:numFmt w:val="lowerLetter"/>
+      <w:lvlText w:val="%2."/>
+      <w:lvlJc w:val="left"/>
+      <w:pPr>
+        <w:ind w:left="1800" w:hanging="360"/>
+      </w:pPr>
+    </w:lvl>
+    <w:lvl w:ilvl="2" w:tplc="0816001B" w:tentative="1">
+      <w:start w:val="1"/>
+      <w:numFmt w:val="lowerRoman"/>
+      <w:lvlText w:val="%3."/>
+      <w:lvlJc w:val="right"/>
+      <w:pPr>
+        <w:ind w:left="2520" w:hanging="180"/>
+      </w:pPr>
+    </w:lvl>
+    <w:lvl w:ilvl="3" w:tplc="0816000F" w:tentative="1">
+      <w:start w:val="1"/>
+      <w:numFmt w:val="decimal"/>
+      <w:lvlText w:val="%4."/>
+      <w:lvlJc w:val="left"/>
+      <w:pPr>
+        <w:ind w:left="3240" w:hanging="360"/>
+      </w:pPr>
+    </w:lvl>
+    <w:lvl w:ilvl="4" w:tplc="08160019" w:tentative="1">
+      <w:start w:val="1"/>
+      <w:numFmt w:val="lowerLetter"/>
+      <w:lvlText w:val="%5."/>
+      <w:lvlJc w:val="left"/>
+      <w:pPr>
+        <w:ind w:left="3960" w:hanging="360"/>
+      </w:pPr>
+    </w:lvl>
+    <w:lvl w:ilvl="5" w:tplc="0816001B" w:tentative="1">
+      <w:start w:val="1"/>
+      <w:numFmt w:val="lowerRoman"/>
+      <w:lvlText w:val="%6."/>
+      <w:lvlJc w:val="right"/>
+      <w:pPr>
+        <w:ind w:left="4680" w:hanging="180"/>
+      </w:pPr>
+    </w:lvl>
+    <w:lvl w:ilvl="6" w:tplc="0816000F" w:tentative="1">
+      <w:start w:val="1"/>
+      <w:numFmt w:val="decimal"/>
+      <w:lvlText w:val="%7."/>
+      <w:lvlJc w:val="left"/>
+      <w:pPr>
+        <w:ind w:left="5400" w:hanging="360"/>
+      </w:pPr>
+    </w:lvl>
+    <w:lvl w:ilvl="7" w:tplc="08160019" w:tentative="1">
+      <w:start w:val="1"/>
+      <w:numFmt w:val="lowerLetter"/>
+      <w:lvlText w:val="%8."/>
+      <w:lvlJc w:val="left"/>
+      <w:pPr>
+        <w:ind w:left="6120" w:hanging="360"/>
+      </w:pPr>
+    </w:lvl>
+    <w:lvl w:ilvl="8" w:tplc="0816001B" w:tentative="1">
+      <w:start w:val="1"/>
+      <w:numFmt w:val="lowerRoman"/>
+      <w:lvlText w:val="%9."/>
+      <w:lvlJc w:val="right"/>
+      <w:pPr>
+        <w:ind w:left="6840" w:hanging="180"/>
+      </w:pPr>
+    </w:lvl>
+  </w:abstractNum>
+  <w:abstractNum w:abstractNumId="4" w15:restartNumberingAfterBreak="0">
     <w:nsid w:val="0AC728BB"/>
     <w:multiLevelType w:val="hybridMultilevel"/>
     <w:tmpl w:val="700ABC6A"/>
@@ -7783,7 +8605,7 @@
       </w:pPr>
     </w:lvl>
   </w:abstractNum>
-  <w:abstractNum w:abstractNumId="3" w15:restartNumberingAfterBreak="0">
+  <w:abstractNum w:abstractNumId="5" w15:restartNumberingAfterBreak="0">
     <w:nsid w:val="0E1C03C7"/>
     <w:multiLevelType w:val="hybridMultilevel"/>
     <w:tmpl w:val="6B8899F6"/>
@@ -7872,12 +8694,12 @@
       </w:pPr>
     </w:lvl>
   </w:abstractNum>
-  <w:abstractNum w:abstractNumId="4" w15:restartNumberingAfterBreak="0">
+  <w:abstractNum w:abstractNumId="6" w15:restartNumberingAfterBreak="0">
     <w:nsid w:val="0E602FAB"/>
     <w:multiLevelType w:val="hybridMultilevel"/>
-    <w:tmpl w:val="F1B0B6A6"/>
-    <w:lvl w:ilvl="0" w:tplc="0816000F">
-      <w:start w:val="1"/>
+    <w:tmpl w:val="66CE71DE"/>
+    <w:lvl w:ilvl="0" w:tplc="9496A73E">
+      <w:start w:val="4"/>
       <w:numFmt w:val="decimal"/>
       <w:lvlText w:val="%1."/>
       <w:lvlJc w:val="left"/>
@@ -7961,7 +8783,7 @@
       </w:pPr>
     </w:lvl>
   </w:abstractNum>
-  <w:abstractNum w:abstractNumId="5" w15:restartNumberingAfterBreak="0">
+  <w:abstractNum w:abstractNumId="7" w15:restartNumberingAfterBreak="0">
     <w:nsid w:val="135B4645"/>
     <w:multiLevelType w:val="hybridMultilevel"/>
     <w:tmpl w:val="FD288880"/>
@@ -8047,7 +8869,7 @@
       </w:pPr>
     </w:lvl>
   </w:abstractNum>
-  <w:abstractNum w:abstractNumId="6" w15:restartNumberingAfterBreak="0">
+  <w:abstractNum w:abstractNumId="8" w15:restartNumberingAfterBreak="0">
     <w:nsid w:val="15192468"/>
     <w:multiLevelType w:val="hybridMultilevel"/>
     <w:tmpl w:val="5DEA3BA0"/>
@@ -8133,7 +8955,93 @@
       </w:pPr>
     </w:lvl>
   </w:abstractNum>
-  <w:abstractNum w:abstractNumId="7" w15:restartNumberingAfterBreak="0">
+  <w:abstractNum w:abstractNumId="9" w15:restartNumberingAfterBreak="0">
+    <w:nsid w:val="18040FDE"/>
+    <w:multiLevelType w:val="hybridMultilevel"/>
+    <w:tmpl w:val="F0243458"/>
+    <w:lvl w:ilvl="0" w:tplc="0816000F">
+      <w:start w:val="1"/>
+      <w:numFmt w:val="decimal"/>
+      <w:lvlText w:val="%1."/>
+      <w:lvlJc w:val="left"/>
+      <w:pPr>
+        <w:ind w:left="1080" w:hanging="360"/>
+      </w:pPr>
+    </w:lvl>
+    <w:lvl w:ilvl="1" w:tplc="08160019" w:tentative="1">
+      <w:start w:val="1"/>
+      <w:numFmt w:val="lowerLetter"/>
+      <w:lvlText w:val="%2."/>
+      <w:lvlJc w:val="left"/>
+      <w:pPr>
+        <w:ind w:left="1800" w:hanging="360"/>
+      </w:pPr>
+    </w:lvl>
+    <w:lvl w:ilvl="2" w:tplc="0816001B" w:tentative="1">
+      <w:start w:val="1"/>
+      <w:numFmt w:val="lowerRoman"/>
+      <w:lvlText w:val="%3."/>
+      <w:lvlJc w:val="right"/>
+      <w:pPr>
+        <w:ind w:left="2520" w:hanging="180"/>
+      </w:pPr>
+    </w:lvl>
+    <w:lvl w:ilvl="3" w:tplc="0816000F" w:tentative="1">
+      <w:start w:val="1"/>
+      <w:numFmt w:val="decimal"/>
+      <w:lvlText w:val="%4."/>
+      <w:lvlJc w:val="left"/>
+      <w:pPr>
+        <w:ind w:left="3240" w:hanging="360"/>
+      </w:pPr>
+    </w:lvl>
+    <w:lvl w:ilvl="4" w:tplc="08160019" w:tentative="1">
+      <w:start w:val="1"/>
+      <w:numFmt w:val="lowerLetter"/>
+      <w:lvlText w:val="%5."/>
+      <w:lvlJc w:val="left"/>
+      <w:pPr>
+        <w:ind w:left="3960" w:hanging="360"/>
+      </w:pPr>
+    </w:lvl>
+    <w:lvl w:ilvl="5" w:tplc="0816001B" w:tentative="1">
+      <w:start w:val="1"/>
+      <w:numFmt w:val="lowerRoman"/>
+      <w:lvlText w:val="%6."/>
+      <w:lvlJc w:val="right"/>
+      <w:pPr>
+        <w:ind w:left="4680" w:hanging="180"/>
+      </w:pPr>
+    </w:lvl>
+    <w:lvl w:ilvl="6" w:tplc="0816000F" w:tentative="1">
+      <w:start w:val="1"/>
+      <w:numFmt w:val="decimal"/>
+      <w:lvlText w:val="%7."/>
+      <w:lvlJc w:val="left"/>
+      <w:pPr>
+        <w:ind w:left="5400" w:hanging="360"/>
+      </w:pPr>
+    </w:lvl>
+    <w:lvl w:ilvl="7" w:tplc="08160019" w:tentative="1">
+      <w:start w:val="1"/>
+      <w:numFmt w:val="lowerLetter"/>
+      <w:lvlText w:val="%8."/>
+      <w:lvlJc w:val="left"/>
+      <w:pPr>
+        <w:ind w:left="6120" w:hanging="360"/>
+      </w:pPr>
+    </w:lvl>
+    <w:lvl w:ilvl="8" w:tplc="0816001B" w:tentative="1">
+      <w:start w:val="1"/>
+      <w:numFmt w:val="lowerRoman"/>
+      <w:lvlText w:val="%9."/>
+      <w:lvlJc w:val="right"/>
+      <w:pPr>
+        <w:ind w:left="6840" w:hanging="180"/>
+      </w:pPr>
+    </w:lvl>
+  </w:abstractNum>
+  <w:abstractNum w:abstractNumId="10" w15:restartNumberingAfterBreak="0">
     <w:nsid w:val="1C8A01D4"/>
     <w:multiLevelType w:val="multilevel"/>
     <w:tmpl w:val="33FA766A"/>
@@ -8251,7 +9159,7 @@
       </w:rPr>
     </w:lvl>
   </w:abstractNum>
-  <w:abstractNum w:abstractNumId="8" w15:restartNumberingAfterBreak="0">
+  <w:abstractNum w:abstractNumId="11" w15:restartNumberingAfterBreak="0">
     <w:nsid w:val="236F0CB4"/>
     <w:multiLevelType w:val="hybridMultilevel"/>
     <w:tmpl w:val="2DD4A172"/>
@@ -8340,10 +9248,10 @@
       </w:pPr>
     </w:lvl>
   </w:abstractNum>
-  <w:abstractNum w:abstractNumId="9" w15:restartNumberingAfterBreak="0">
+  <w:abstractNum w:abstractNumId="12" w15:restartNumberingAfterBreak="0">
     <w:nsid w:val="299A41E7"/>
     <w:multiLevelType w:val="hybridMultilevel"/>
-    <w:tmpl w:val="B750E62A"/>
+    <w:tmpl w:val="619861C4"/>
     <w:lvl w:ilvl="0" w:tplc="0816000F">
       <w:start w:val="1"/>
       <w:numFmt w:val="decimal"/>
@@ -8356,9 +9264,9 @@
         <w:rFonts w:hint="default"/>
       </w:rPr>
     </w:lvl>
-    <w:lvl w:ilvl="1" w:tplc="08160019">
-      <w:start w:val="1"/>
-      <w:numFmt w:val="lowerLetter"/>
+    <w:lvl w:ilvl="1" w:tplc="0816000F">
+      <w:start w:val="1"/>
+      <w:numFmt w:val="decimal"/>
       <w:lvlText w:val="%2."/>
       <w:lvlJc w:val="left"/>
       <w:pPr>
@@ -8429,7 +9337,7 @@
       </w:pPr>
     </w:lvl>
   </w:abstractNum>
-  <w:abstractNum w:abstractNumId="10" w15:restartNumberingAfterBreak="0">
+  <w:abstractNum w:abstractNumId="13" w15:restartNumberingAfterBreak="0">
     <w:nsid w:val="2C84103A"/>
     <w:multiLevelType w:val="multilevel"/>
     <w:tmpl w:val="33FA766A"/>
@@ -8547,7 +9455,7 @@
       </w:rPr>
     </w:lvl>
   </w:abstractNum>
-  <w:abstractNum w:abstractNumId="11" w15:restartNumberingAfterBreak="0">
+  <w:abstractNum w:abstractNumId="14" w15:restartNumberingAfterBreak="0">
     <w:nsid w:val="2FF34A43"/>
     <w:multiLevelType w:val="multilevel"/>
     <w:tmpl w:val="33FA766A"/>
@@ -8665,7 +9573,7 @@
       </w:rPr>
     </w:lvl>
   </w:abstractNum>
-  <w:abstractNum w:abstractNumId="12" w15:restartNumberingAfterBreak="0">
+  <w:abstractNum w:abstractNumId="15" w15:restartNumberingAfterBreak="0">
     <w:nsid w:val="33841D9D"/>
     <w:multiLevelType w:val="multilevel"/>
     <w:tmpl w:val="33FA766A"/>
@@ -8783,7 +9691,7 @@
       </w:rPr>
     </w:lvl>
   </w:abstractNum>
-  <w:abstractNum w:abstractNumId="13" w15:restartNumberingAfterBreak="0">
+  <w:abstractNum w:abstractNumId="16" w15:restartNumberingAfterBreak="0">
     <w:nsid w:val="33F628D5"/>
     <w:multiLevelType w:val="multilevel"/>
     <w:tmpl w:val="33FA766A"/>
@@ -8901,7 +9809,7 @@
       </w:rPr>
     </w:lvl>
   </w:abstractNum>
-  <w:abstractNum w:abstractNumId="14" w15:restartNumberingAfterBreak="0">
+  <w:abstractNum w:abstractNumId="17" w15:restartNumberingAfterBreak="0">
     <w:nsid w:val="36DC4A33"/>
     <w:multiLevelType w:val="multilevel"/>
     <w:tmpl w:val="33FA766A"/>
@@ -9019,7 +9927,7 @@
       </w:rPr>
     </w:lvl>
   </w:abstractNum>
-  <w:abstractNum w:abstractNumId="15" w15:restartNumberingAfterBreak="0">
+  <w:abstractNum w:abstractNumId="18" w15:restartNumberingAfterBreak="0">
     <w:nsid w:val="3B184735"/>
     <w:multiLevelType w:val="multilevel"/>
     <w:tmpl w:val="0986C80A"/>
@@ -9132,7 +10040,179 @@
       </w:rPr>
     </w:lvl>
   </w:abstractNum>
-  <w:abstractNum w:abstractNumId="16" w15:restartNumberingAfterBreak="0">
+  <w:abstractNum w:abstractNumId="19" w15:restartNumberingAfterBreak="0">
+    <w:nsid w:val="431C4292"/>
+    <w:multiLevelType w:val="hybridMultilevel"/>
+    <w:tmpl w:val="07661550"/>
+    <w:lvl w:ilvl="0" w:tplc="0816000F">
+      <w:start w:val="1"/>
+      <w:numFmt w:val="decimal"/>
+      <w:lvlText w:val="%1."/>
+      <w:lvlJc w:val="left"/>
+      <w:pPr>
+        <w:ind w:left="1080" w:hanging="360"/>
+      </w:pPr>
+    </w:lvl>
+    <w:lvl w:ilvl="1" w:tplc="08160019" w:tentative="1">
+      <w:start w:val="1"/>
+      <w:numFmt w:val="lowerLetter"/>
+      <w:lvlText w:val="%2."/>
+      <w:lvlJc w:val="left"/>
+      <w:pPr>
+        <w:ind w:left="1800" w:hanging="360"/>
+      </w:pPr>
+    </w:lvl>
+    <w:lvl w:ilvl="2" w:tplc="0816001B" w:tentative="1">
+      <w:start w:val="1"/>
+      <w:numFmt w:val="lowerRoman"/>
+      <w:lvlText w:val="%3."/>
+      <w:lvlJc w:val="right"/>
+      <w:pPr>
+        <w:ind w:left="2520" w:hanging="180"/>
+      </w:pPr>
+    </w:lvl>
+    <w:lvl w:ilvl="3" w:tplc="0816000F" w:tentative="1">
+      <w:start w:val="1"/>
+      <w:numFmt w:val="decimal"/>
+      <w:lvlText w:val="%4."/>
+      <w:lvlJc w:val="left"/>
+      <w:pPr>
+        <w:ind w:left="3240" w:hanging="360"/>
+      </w:pPr>
+    </w:lvl>
+    <w:lvl w:ilvl="4" w:tplc="08160019" w:tentative="1">
+      <w:start w:val="1"/>
+      <w:numFmt w:val="lowerLetter"/>
+      <w:lvlText w:val="%5."/>
+      <w:lvlJc w:val="left"/>
+      <w:pPr>
+        <w:ind w:left="3960" w:hanging="360"/>
+      </w:pPr>
+    </w:lvl>
+    <w:lvl w:ilvl="5" w:tplc="0816001B" w:tentative="1">
+      <w:start w:val="1"/>
+      <w:numFmt w:val="lowerRoman"/>
+      <w:lvlText w:val="%6."/>
+      <w:lvlJc w:val="right"/>
+      <w:pPr>
+        <w:ind w:left="4680" w:hanging="180"/>
+      </w:pPr>
+    </w:lvl>
+    <w:lvl w:ilvl="6" w:tplc="0816000F" w:tentative="1">
+      <w:start w:val="1"/>
+      <w:numFmt w:val="decimal"/>
+      <w:lvlText w:val="%7."/>
+      <w:lvlJc w:val="left"/>
+      <w:pPr>
+        <w:ind w:left="5400" w:hanging="360"/>
+      </w:pPr>
+    </w:lvl>
+    <w:lvl w:ilvl="7" w:tplc="08160019" w:tentative="1">
+      <w:start w:val="1"/>
+      <w:numFmt w:val="lowerLetter"/>
+      <w:lvlText w:val="%8."/>
+      <w:lvlJc w:val="left"/>
+      <w:pPr>
+        <w:ind w:left="6120" w:hanging="360"/>
+      </w:pPr>
+    </w:lvl>
+    <w:lvl w:ilvl="8" w:tplc="0816001B" w:tentative="1">
+      <w:start w:val="1"/>
+      <w:numFmt w:val="lowerRoman"/>
+      <w:lvlText w:val="%9."/>
+      <w:lvlJc w:val="right"/>
+      <w:pPr>
+        <w:ind w:left="6840" w:hanging="180"/>
+      </w:pPr>
+    </w:lvl>
+  </w:abstractNum>
+  <w:abstractNum w:abstractNumId="20" w15:restartNumberingAfterBreak="0">
+    <w:nsid w:val="43A97ED1"/>
+    <w:multiLevelType w:val="hybridMultilevel"/>
+    <w:tmpl w:val="F796C350"/>
+    <w:lvl w:ilvl="0" w:tplc="0816000F">
+      <w:start w:val="1"/>
+      <w:numFmt w:val="decimal"/>
+      <w:lvlText w:val="%1."/>
+      <w:lvlJc w:val="left"/>
+      <w:pPr>
+        <w:ind w:left="947" w:hanging="360"/>
+      </w:pPr>
+    </w:lvl>
+    <w:lvl w:ilvl="1" w:tplc="08160019" w:tentative="1">
+      <w:start w:val="1"/>
+      <w:numFmt w:val="lowerLetter"/>
+      <w:lvlText w:val="%2."/>
+      <w:lvlJc w:val="left"/>
+      <w:pPr>
+        <w:ind w:left="1667" w:hanging="360"/>
+      </w:pPr>
+    </w:lvl>
+    <w:lvl w:ilvl="2" w:tplc="0816001B" w:tentative="1">
+      <w:start w:val="1"/>
+      <w:numFmt w:val="lowerRoman"/>
+      <w:lvlText w:val="%3."/>
+      <w:lvlJc w:val="right"/>
+      <w:pPr>
+        <w:ind w:left="2387" w:hanging="180"/>
+      </w:pPr>
+    </w:lvl>
+    <w:lvl w:ilvl="3" w:tplc="0816000F" w:tentative="1">
+      <w:start w:val="1"/>
+      <w:numFmt w:val="decimal"/>
+      <w:lvlText w:val="%4."/>
+      <w:lvlJc w:val="left"/>
+      <w:pPr>
+        <w:ind w:left="3107" w:hanging="360"/>
+      </w:pPr>
+    </w:lvl>
+    <w:lvl w:ilvl="4" w:tplc="08160019" w:tentative="1">
+      <w:start w:val="1"/>
+      <w:numFmt w:val="lowerLetter"/>
+      <w:lvlText w:val="%5."/>
+      <w:lvlJc w:val="left"/>
+      <w:pPr>
+        <w:ind w:left="3827" w:hanging="360"/>
+      </w:pPr>
+    </w:lvl>
+    <w:lvl w:ilvl="5" w:tplc="0816001B" w:tentative="1">
+      <w:start w:val="1"/>
+      <w:numFmt w:val="lowerRoman"/>
+      <w:lvlText w:val="%6."/>
+      <w:lvlJc w:val="right"/>
+      <w:pPr>
+        <w:ind w:left="4547" w:hanging="180"/>
+      </w:pPr>
+    </w:lvl>
+    <w:lvl w:ilvl="6" w:tplc="0816000F" w:tentative="1">
+      <w:start w:val="1"/>
+      <w:numFmt w:val="decimal"/>
+      <w:lvlText w:val="%7."/>
+      <w:lvlJc w:val="left"/>
+      <w:pPr>
+        <w:ind w:left="5267" w:hanging="360"/>
+      </w:pPr>
+    </w:lvl>
+    <w:lvl w:ilvl="7" w:tplc="08160019" w:tentative="1">
+      <w:start w:val="1"/>
+      <w:numFmt w:val="lowerLetter"/>
+      <w:lvlText w:val="%8."/>
+      <w:lvlJc w:val="left"/>
+      <w:pPr>
+        <w:ind w:left="5987" w:hanging="360"/>
+      </w:pPr>
+    </w:lvl>
+    <w:lvl w:ilvl="8" w:tplc="0816001B" w:tentative="1">
+      <w:start w:val="1"/>
+      <w:numFmt w:val="lowerRoman"/>
+      <w:lvlText w:val="%9."/>
+      <w:lvlJc w:val="right"/>
+      <w:pPr>
+        <w:ind w:left="6707" w:hanging="180"/>
+      </w:pPr>
+    </w:lvl>
+  </w:abstractNum>
+  <w:abstractNum w:abstractNumId="21" w15:restartNumberingAfterBreak="0">
     <w:nsid w:val="48CC0870"/>
     <w:multiLevelType w:val="multilevel"/>
     <w:tmpl w:val="30244EE8"/>
@@ -9245,7 +10325,7 @@
       </w:rPr>
     </w:lvl>
   </w:abstractNum>
-  <w:abstractNum w:abstractNumId="17" w15:restartNumberingAfterBreak="0">
+  <w:abstractNum w:abstractNumId="22" w15:restartNumberingAfterBreak="0">
     <w:nsid w:val="4B0D7B21"/>
     <w:multiLevelType w:val="multilevel"/>
     <w:tmpl w:val="F278665A"/>
@@ -9358,7 +10438,7 @@
       </w:rPr>
     </w:lvl>
   </w:abstractNum>
-  <w:abstractNum w:abstractNumId="18" w15:restartNumberingAfterBreak="0">
+  <w:abstractNum w:abstractNumId="23" w15:restartNumberingAfterBreak="0">
     <w:nsid w:val="579B0F2B"/>
     <w:multiLevelType w:val="multilevel"/>
     <w:tmpl w:val="2C16CF1E"/>
@@ -9471,7 +10551,7 @@
       </w:rPr>
     </w:lvl>
   </w:abstractNum>
-  <w:abstractNum w:abstractNumId="19" w15:restartNumberingAfterBreak="0">
+  <w:abstractNum w:abstractNumId="24" w15:restartNumberingAfterBreak="0">
     <w:nsid w:val="5AEF5F0E"/>
     <w:multiLevelType w:val="multilevel"/>
     <w:tmpl w:val="33FA766A"/>
@@ -9589,7 +10669,7 @@
       </w:rPr>
     </w:lvl>
   </w:abstractNum>
-  <w:abstractNum w:abstractNumId="20" w15:restartNumberingAfterBreak="0">
+  <w:abstractNum w:abstractNumId="25" w15:restartNumberingAfterBreak="0">
     <w:nsid w:val="67212F69"/>
     <w:multiLevelType w:val="multilevel"/>
     <w:tmpl w:val="30244EE8"/>
@@ -9702,7 +10782,7 @@
       </w:rPr>
     </w:lvl>
   </w:abstractNum>
-  <w:abstractNum w:abstractNumId="21" w15:restartNumberingAfterBreak="0">
+  <w:abstractNum w:abstractNumId="26" w15:restartNumberingAfterBreak="0">
     <w:nsid w:val="67A74286"/>
     <w:multiLevelType w:val="multilevel"/>
     <w:tmpl w:val="33FA766A"/>
@@ -9820,7 +10900,7 @@
       </w:rPr>
     </w:lvl>
   </w:abstractNum>
-  <w:abstractNum w:abstractNumId="22" w15:restartNumberingAfterBreak="0">
+  <w:abstractNum w:abstractNumId="27" w15:restartNumberingAfterBreak="0">
     <w:nsid w:val="6DF658A5"/>
     <w:multiLevelType w:val="multilevel"/>
     <w:tmpl w:val="33FA766A"/>
@@ -9938,7 +11018,7 @@
       </w:rPr>
     </w:lvl>
   </w:abstractNum>
-  <w:abstractNum w:abstractNumId="23" w15:restartNumberingAfterBreak="0">
+  <w:abstractNum w:abstractNumId="28" w15:restartNumberingAfterBreak="0">
     <w:nsid w:val="6E253DD8"/>
     <w:multiLevelType w:val="multilevel"/>
     <w:tmpl w:val="33FA766A"/>
@@ -10056,7 +11136,7 @@
       </w:rPr>
     </w:lvl>
   </w:abstractNum>
-  <w:abstractNum w:abstractNumId="24" w15:restartNumberingAfterBreak="0">
+  <w:abstractNum w:abstractNumId="29" w15:restartNumberingAfterBreak="0">
     <w:nsid w:val="7301321B"/>
     <w:multiLevelType w:val="multilevel"/>
     <w:tmpl w:val="0816001F"/>
@@ -10142,7 +11222,7 @@
       </w:pPr>
     </w:lvl>
   </w:abstractNum>
-  <w:abstractNum w:abstractNumId="25" w15:restartNumberingAfterBreak="0">
+  <w:abstractNum w:abstractNumId="30" w15:restartNumberingAfterBreak="0">
     <w:nsid w:val="798409D0"/>
     <w:multiLevelType w:val="hybridMultilevel"/>
     <w:tmpl w:val="A8484A4A"/>
@@ -10231,7 +11311,7 @@
       </w:pPr>
     </w:lvl>
   </w:abstractNum>
-  <w:abstractNum w:abstractNumId="26" w15:restartNumberingAfterBreak="0">
+  <w:abstractNum w:abstractNumId="31" w15:restartNumberingAfterBreak="0">
     <w:nsid w:val="7EA54D59"/>
     <w:multiLevelType w:val="hybridMultilevel"/>
     <w:tmpl w:val="FBA0BF06"/>
@@ -10321,85 +11401,100 @@
     </w:lvl>
   </w:abstractNum>
   <w:num w:numId="1">
-    <w:abstractNumId w:val="9"/>
+    <w:abstractNumId w:val="12"/>
   </w:num>
   <w:num w:numId="2">
-    <w:abstractNumId w:val="25"/>
+    <w:abstractNumId w:val="30"/>
   </w:num>
   <w:num w:numId="3">
-    <w:abstractNumId w:val="3"/>
+    <w:abstractNumId w:val="5"/>
   </w:num>
   <w:num w:numId="4">
-    <w:abstractNumId w:val="2"/>
+    <w:abstractNumId w:val="4"/>
   </w:num>
   <w:num w:numId="5">
-    <w:abstractNumId w:val="26"/>
+    <w:abstractNumId w:val="31"/>
   </w:num>
   <w:num w:numId="6">
-    <w:abstractNumId w:val="8"/>
+    <w:abstractNumId w:val="11"/>
   </w:num>
   <w:num w:numId="7">
     <w:abstractNumId w:val="0"/>
   </w:num>
   <w:num w:numId="8">
-    <w:abstractNumId w:val="4"/>
+    <w:abstractNumId w:val="6"/>
   </w:num>
   <w:num w:numId="9">
-    <w:abstractNumId w:val="6"/>
+    <w:abstractNumId w:val="8"/>
   </w:num>
   <w:num w:numId="10">
-    <w:abstractNumId w:val="5"/>
+    <w:abstractNumId w:val="7"/>
   </w:num>
   <w:num w:numId="11">
-    <w:abstractNumId w:val="24"/>
+    <w:abstractNumId w:val="29"/>
   </w:num>
   <w:num w:numId="12">
-    <w:abstractNumId w:val="18"/>
+    <w:abstractNumId w:val="23"/>
   </w:num>
   <w:num w:numId="13">
+    <w:abstractNumId w:val="26"/>
+  </w:num>
+  <w:num w:numId="14">
+    <w:abstractNumId w:val="10"/>
+  </w:num>
+  <w:num w:numId="15">
+    <w:abstractNumId w:val="25"/>
+  </w:num>
+  <w:num w:numId="16">
+    <w:abstractNumId w:val="16"/>
+  </w:num>
+  <w:num w:numId="17">
     <w:abstractNumId w:val="21"/>
   </w:num>
-  <w:num w:numId="14">
-    <w:abstractNumId w:val="7"/>
-  </w:num>
-  <w:num w:numId="15">
-    <w:abstractNumId w:val="20"/>
-  </w:num>
-  <w:num w:numId="16">
-    <w:abstractNumId w:val="13"/>
-  </w:num>
-  <w:num w:numId="17">
-    <w:abstractNumId w:val="16"/>
-  </w:num>
   <w:num w:numId="18">
-    <w:abstractNumId w:val="22"/>
+    <w:abstractNumId w:val="27"/>
   </w:num>
   <w:num w:numId="19">
     <w:abstractNumId w:val="1"/>
   </w:num>
   <w:num w:numId="20">
+    <w:abstractNumId w:val="22"/>
+  </w:num>
+  <w:num w:numId="21">
+    <w:abstractNumId w:val="28"/>
+  </w:num>
+  <w:num w:numId="22">
+    <w:abstractNumId w:val="24"/>
+  </w:num>
+  <w:num w:numId="23">
+    <w:abstractNumId w:val="14"/>
+  </w:num>
+  <w:num w:numId="24">
     <w:abstractNumId w:val="17"/>
   </w:num>
-  <w:num w:numId="21">
-    <w:abstractNumId w:val="23"/>
+  <w:num w:numId="25">
+    <w:abstractNumId w:val="13"/>
   </w:num>
-  <w:num w:numId="22">
+  <w:num w:numId="26">
+    <w:abstractNumId w:val="18"/>
+  </w:num>
+  <w:num w:numId="27">
+    <w:abstractNumId w:val="15"/>
+  </w:num>
+  <w:num w:numId="28">
     <w:abstractNumId w:val="19"/>
   </w:num>
-  <w:num w:numId="23">
-    <w:abstractNumId w:val="11"/>
+  <w:num w:numId="29">
+    <w:abstractNumId w:val="2"/>
   </w:num>
-  <w:num w:numId="24">
-    <w:abstractNumId w:val="14"/>
+  <w:num w:numId="30">
+    <w:abstractNumId w:val="20"/>
   </w:num>
-  <w:num w:numId="25">
-    <w:abstractNumId w:val="10"/>
+  <w:num w:numId="31">
+    <w:abstractNumId w:val="3"/>
   </w:num>
-  <w:num w:numId="26">
-    <w:abstractNumId w:val="15"/>
-  </w:num>
-  <w:num w:numId="27">
-    <w:abstractNumId w:val="12"/>
+  <w:num w:numId="32">
+    <w:abstractNumId w:val="9"/>
   </w:num>
 </w:numbering>
 </file>

</xml_diff>

<commit_message>
Atualização Documento - Fluxogramas
</commit_message>
<xml_diff>
--- a/Documentation/Relatório-DSSMV-2025-27_2DB_1250771_1251355.docx
+++ b/Documentation/Relatório-DSSMV-2025-27_2DB_1250771_1251355.docx
@@ -1,6 +1,6 @@
 
 <file path=word/document.xml><?xml version="1.0" encoding="utf-8"?>
-<w:document xmlns:wpc="http://schemas.microsoft.com/office/word/2010/wordprocessingCanvas" xmlns:mc="http://schemas.openxmlformats.org/markup-compatibility/2006" xmlns:o="urn:schemas-microsoft-com:office:office" xmlns:r="http://schemas.openxmlformats.org/officeDocument/2006/relationships" xmlns:m="http://schemas.openxmlformats.org/officeDocument/2006/math" xmlns:v="urn:schemas-microsoft-com:vml" xmlns:wp14="http://schemas.microsoft.com/office/word/2010/wordprocessingDrawing" xmlns:wp="http://schemas.openxmlformats.org/drawingml/2006/wordprocessingDrawing" xmlns:w10="urn:schemas-microsoft-com:office:word" xmlns:w="http://schemas.openxmlformats.org/wordprocessingml/2006/main" xmlns:w14="http://schemas.microsoft.com/office/word/2010/wordml" xmlns:w15="http://schemas.microsoft.com/office/word/2012/wordml" xmlns:wpg="http://schemas.microsoft.com/office/word/2010/wordprocessingGroup" xmlns:wpi="http://schemas.microsoft.com/office/word/2010/wordprocessingInk" xmlns:wne="http://schemas.microsoft.com/office/word/2006/wordml" xmlns:wps="http://schemas.microsoft.com/office/word/2010/wordprocessingShape" mc:Ignorable="w14 w15 wp14">
+<w:document xmlns:wpc="http://schemas.microsoft.com/office/word/2010/wordprocessingCanvas" xmlns:cx="http://schemas.microsoft.com/office/drawing/2014/chartex" xmlns:cx1="http://schemas.microsoft.com/office/drawing/2015/9/8/chartex" xmlns:cx2="http://schemas.microsoft.com/office/drawing/2015/10/21/chartex" xmlns:cx3="http://schemas.microsoft.com/office/drawing/2016/5/9/chartex" xmlns:cx4="http://schemas.microsoft.com/office/drawing/2016/5/10/chartex" xmlns:cx5="http://schemas.microsoft.com/office/drawing/2016/5/11/chartex" xmlns:cx6="http://schemas.microsoft.com/office/drawing/2016/5/12/chartex" xmlns:cx7="http://schemas.microsoft.com/office/drawing/2016/5/13/chartex" xmlns:cx8="http://schemas.microsoft.com/office/drawing/2016/5/14/chartex" xmlns:mc="http://schemas.openxmlformats.org/markup-compatibility/2006" xmlns:aink="http://schemas.microsoft.com/office/drawing/2016/ink" xmlns:am3d="http://schemas.microsoft.com/office/drawing/2017/model3d" xmlns:o="urn:schemas-microsoft-com:office:office" xmlns:oel="http://schemas.microsoft.com/office/2019/extlst" xmlns:r="http://schemas.openxmlformats.org/officeDocument/2006/relationships" xmlns:m="http://schemas.openxmlformats.org/officeDocument/2006/math" xmlns:v="urn:schemas-microsoft-com:vml" xmlns:wp14="http://schemas.microsoft.com/office/word/2010/wordprocessingDrawing" xmlns:wp="http://schemas.openxmlformats.org/drawingml/2006/wordprocessingDrawing" xmlns:w10="urn:schemas-microsoft-com:office:word" xmlns:w="http://schemas.openxmlformats.org/wordprocessingml/2006/main" xmlns:w14="http://schemas.microsoft.com/office/word/2010/wordml" xmlns:w15="http://schemas.microsoft.com/office/word/2012/wordml" xmlns:w16cex="http://schemas.microsoft.com/office/word/2018/wordml/cex" xmlns:w16cid="http://schemas.microsoft.com/office/word/2016/wordml/cid" xmlns:w16="http://schemas.microsoft.com/office/word/2018/wordml" xmlns:w16du="http://schemas.microsoft.com/office/word/2023/wordml/word16du" xmlns:w16sdtdh="http://schemas.microsoft.com/office/word/2020/wordml/sdtdatahash" xmlns:w16sdtfl="http://schemas.microsoft.com/office/word/2024/wordml/sdtformatlock" xmlns:w16se="http://schemas.microsoft.com/office/word/2015/wordml/symex" xmlns:wpg="http://schemas.microsoft.com/office/word/2010/wordprocessingGroup" xmlns:wpi="http://schemas.microsoft.com/office/word/2010/wordprocessingInk" xmlns:wne="http://schemas.microsoft.com/office/word/2006/wordml" xmlns:wps="http://schemas.microsoft.com/office/word/2010/wordprocessingShape" mc:Ignorable="w14 w15 w16se w16cid w16 w16cex w16sdtdh w16sdtfl w16du wp14">
   <w:body>
     <w:p>
       <w:pPr>
@@ -13,16 +13,8 @@
         <w:rPr>
           <w:lang w:val="pt-BR"/>
         </w:rPr>
-        <w:t xml:space="preserve">Relatório Técnico para o Desenvolvimento do </w:t>
-      </w:r>
-      <w:proofErr w:type="spellStart"/>
-      <w:r>
-        <w:rPr>
-          <w:lang w:val="pt-BR"/>
-        </w:rPr>
-        <w:t>TripTrail</w:t>
-      </w:r>
-      <w:proofErr w:type="spellEnd"/>
+        <w:t>Relatório Técnico para o Desenvolvimento do TripTrail</w:t>
+      </w:r>
     </w:p>
     <w:p>
       <w:pPr>
@@ -58,21 +50,7 @@
         <w:rPr>
           <w:lang w:val="pt-BR"/>
         </w:rPr>
-        <w:t xml:space="preserve">Turma </w:t>
-      </w:r>
-      <w:proofErr w:type="spellStart"/>
-      <w:r>
-        <w:rPr>
-          <w:lang w:val="pt-BR"/>
-        </w:rPr>
-        <w:t>2DB</w:t>
-      </w:r>
-      <w:proofErr w:type="spellEnd"/>
-      <w:r>
-        <w:rPr>
-          <w:lang w:val="pt-BR"/>
-        </w:rPr>
-        <w:t xml:space="preserve"> – Grupo 5 </w:t>
+        <w:t xml:space="preserve">Turma 2DB – Grupo 5 </w:t>
       </w:r>
     </w:p>
     <w:p>
@@ -95,515 +73,23 @@
         </w:rPr>
         <w:t xml:space="preserve"> </w:t>
       </w:r>
-      <w:proofErr w:type="spellStart"/>
-      <w:r>
-        <w:rPr>
-          <w:lang w:val="pt-BR"/>
-        </w:rPr>
-        <w:t>TripTrail</w:t>
-      </w:r>
-      <w:proofErr w:type="spellEnd"/>
-      <w:r>
-        <w:rPr>
-          <w:lang w:val="pt-BR"/>
-        </w:rPr>
-        <w:t xml:space="preserve"> </w:t>
-      </w:r>
-      <w:proofErr w:type="spellStart"/>
-      <w:r>
-        <w:rPr>
-          <w:lang w:val="pt-BR"/>
-        </w:rPr>
-        <w:t>is</w:t>
-      </w:r>
-      <w:proofErr w:type="spellEnd"/>
-      <w:r>
-        <w:rPr>
-          <w:lang w:val="pt-BR"/>
-        </w:rPr>
-        <w:t xml:space="preserve"> a </w:t>
-      </w:r>
-      <w:proofErr w:type="spellStart"/>
-      <w:r>
-        <w:rPr>
-          <w:lang w:val="pt-BR"/>
-        </w:rPr>
-        <w:t>java-based</w:t>
-      </w:r>
-      <w:proofErr w:type="spellEnd"/>
-      <w:r>
-        <w:rPr>
-          <w:lang w:val="pt-BR"/>
-        </w:rPr>
-        <w:t xml:space="preserve"> </w:t>
-      </w:r>
-      <w:proofErr w:type="spellStart"/>
-      <w:r>
-        <w:rPr>
-          <w:lang w:val="pt-BR"/>
-        </w:rPr>
-        <w:t>Android</w:t>
-      </w:r>
-      <w:proofErr w:type="spellEnd"/>
-      <w:r>
-        <w:rPr>
-          <w:lang w:val="pt-BR"/>
-        </w:rPr>
-        <w:t xml:space="preserve"> </w:t>
-      </w:r>
-      <w:proofErr w:type="spellStart"/>
-      <w:r>
-        <w:rPr>
-          <w:lang w:val="pt-BR"/>
-        </w:rPr>
-        <w:t>app</w:t>
-      </w:r>
-      <w:proofErr w:type="spellEnd"/>
-      <w:r>
-        <w:rPr>
-          <w:lang w:val="pt-BR"/>
-        </w:rPr>
-        <w:t xml:space="preserve"> </w:t>
-      </w:r>
-      <w:proofErr w:type="spellStart"/>
-      <w:r>
-        <w:rPr>
-          <w:lang w:val="pt-BR"/>
-        </w:rPr>
-        <w:t>that</w:t>
-      </w:r>
-      <w:proofErr w:type="spellEnd"/>
-      <w:r>
-        <w:rPr>
-          <w:lang w:val="pt-BR"/>
-        </w:rPr>
-        <w:t xml:space="preserve"> </w:t>
-      </w:r>
-      <w:proofErr w:type="spellStart"/>
-      <w:r>
-        <w:rPr>
-          <w:lang w:val="pt-BR"/>
-        </w:rPr>
-        <w:t>works</w:t>
-      </w:r>
-      <w:proofErr w:type="spellEnd"/>
-      <w:r>
-        <w:rPr>
-          <w:lang w:val="pt-BR"/>
-        </w:rPr>
-        <w:t xml:space="preserve"> as a </w:t>
-      </w:r>
-      <w:proofErr w:type="spellStart"/>
-      <w:r>
-        <w:rPr>
-          <w:lang w:val="pt-BR"/>
-        </w:rPr>
-        <w:t>travel</w:t>
-      </w:r>
-      <w:proofErr w:type="spellEnd"/>
-      <w:r>
-        <w:rPr>
-          <w:lang w:val="pt-BR"/>
-        </w:rPr>
-        <w:t xml:space="preserve"> </w:t>
-      </w:r>
-      <w:proofErr w:type="spellStart"/>
-      <w:r>
-        <w:rPr>
-          <w:lang w:val="pt-BR"/>
-        </w:rPr>
-        <w:t>journal</w:t>
-      </w:r>
-      <w:proofErr w:type="spellEnd"/>
-      <w:r>
-        <w:rPr>
-          <w:lang w:val="pt-BR"/>
-        </w:rPr>
-        <w:t xml:space="preserve">. </w:t>
-      </w:r>
-      <w:proofErr w:type="spellStart"/>
-      <w:r>
-        <w:rPr>
-          <w:lang w:val="pt-BR"/>
-        </w:rPr>
-        <w:t>User</w:t>
-      </w:r>
-      <w:r>
-        <w:rPr>
-          <w:lang w:val="pt-BR"/>
-        </w:rPr>
-        <w:t>s</w:t>
-      </w:r>
-      <w:proofErr w:type="spellEnd"/>
-      <w:r>
-        <w:rPr>
-          <w:lang w:val="pt-BR"/>
-        </w:rPr>
-        <w:t xml:space="preserve"> </w:t>
-      </w:r>
-      <w:proofErr w:type="spellStart"/>
-      <w:r>
-        <w:rPr>
-          <w:lang w:val="pt-BR"/>
-        </w:rPr>
-        <w:t>can</w:t>
-      </w:r>
-      <w:proofErr w:type="spellEnd"/>
-      <w:r>
-        <w:rPr>
-          <w:lang w:val="pt-BR"/>
-        </w:rPr>
-        <w:t xml:space="preserve"> log </w:t>
-      </w:r>
-      <w:proofErr w:type="spellStart"/>
-      <w:r>
-        <w:rPr>
-          <w:lang w:val="pt-BR"/>
-        </w:rPr>
-        <w:t>their</w:t>
-      </w:r>
-      <w:proofErr w:type="spellEnd"/>
-      <w:r>
-        <w:rPr>
-          <w:lang w:val="pt-BR"/>
-        </w:rPr>
-        <w:t xml:space="preserve"> </w:t>
-      </w:r>
-      <w:proofErr w:type="spellStart"/>
-      <w:r>
-        <w:rPr>
-          <w:lang w:val="pt-BR"/>
-        </w:rPr>
-        <w:t>trips</w:t>
-      </w:r>
-      <w:proofErr w:type="spellEnd"/>
-      <w:r>
-        <w:rPr>
-          <w:lang w:val="pt-BR"/>
-        </w:rPr>
-        <w:t xml:space="preserve"> </w:t>
-      </w:r>
-      <w:proofErr w:type="spellStart"/>
-      <w:r>
-        <w:rPr>
-          <w:lang w:val="pt-BR"/>
-        </w:rPr>
-        <w:t>by</w:t>
-      </w:r>
-      <w:proofErr w:type="spellEnd"/>
-      <w:r>
-        <w:rPr>
-          <w:lang w:val="pt-BR"/>
-        </w:rPr>
-        <w:t xml:space="preserve"> </w:t>
-      </w:r>
-      <w:proofErr w:type="spellStart"/>
-      <w:r>
-        <w:rPr>
-          <w:lang w:val="pt-BR"/>
-        </w:rPr>
-        <w:t>saving</w:t>
-      </w:r>
-      <w:proofErr w:type="spellEnd"/>
-      <w:r>
-        <w:rPr>
-          <w:lang w:val="pt-BR"/>
-        </w:rPr>
-        <w:t xml:space="preserve"> </w:t>
-      </w:r>
-      <w:proofErr w:type="spellStart"/>
-      <w:r>
-        <w:rPr>
-          <w:lang w:val="pt-BR"/>
-        </w:rPr>
-        <w:t>visited</w:t>
-      </w:r>
-      <w:proofErr w:type="spellEnd"/>
-      <w:r>
-        <w:rPr>
-          <w:lang w:val="pt-BR"/>
-        </w:rPr>
-        <w:t xml:space="preserve"> </w:t>
-      </w:r>
-      <w:proofErr w:type="spellStart"/>
-      <w:r>
-        <w:rPr>
-          <w:lang w:val="pt-BR"/>
-        </w:rPr>
-        <w:t>places</w:t>
-      </w:r>
-      <w:proofErr w:type="spellEnd"/>
-      <w:r>
-        <w:rPr>
-          <w:lang w:val="pt-BR"/>
-        </w:rPr>
-        <w:t xml:space="preserve"> </w:t>
-      </w:r>
-      <w:proofErr w:type="spellStart"/>
-      <w:r>
-        <w:rPr>
-          <w:lang w:val="pt-BR"/>
-        </w:rPr>
-        <w:t>with</w:t>
-      </w:r>
-      <w:proofErr w:type="spellEnd"/>
-      <w:r>
-        <w:rPr>
-          <w:lang w:val="pt-BR"/>
-        </w:rPr>
-        <w:t xml:space="preserve"> GPS </w:t>
-      </w:r>
-      <w:proofErr w:type="spellStart"/>
-      <w:r>
-        <w:rPr>
-          <w:lang w:val="pt-BR"/>
-        </w:rPr>
-        <w:t>coordinates</w:t>
-      </w:r>
-      <w:proofErr w:type="spellEnd"/>
-      <w:r>
-        <w:rPr>
-          <w:lang w:val="pt-BR"/>
-        </w:rPr>
-        <w:t xml:space="preserve">, </w:t>
-      </w:r>
-      <w:proofErr w:type="spellStart"/>
-      <w:r>
-        <w:rPr>
-          <w:lang w:val="pt-BR"/>
-        </w:rPr>
-        <w:t>photos</w:t>
-      </w:r>
-      <w:proofErr w:type="spellEnd"/>
-      <w:r>
-        <w:rPr>
-          <w:lang w:val="pt-BR"/>
-        </w:rPr>
-        <w:t xml:space="preserve"> </w:t>
-      </w:r>
-      <w:proofErr w:type="spellStart"/>
-      <w:r>
-        <w:rPr>
-          <w:lang w:val="pt-BR"/>
-        </w:rPr>
-        <w:t>and</w:t>
-      </w:r>
-      <w:proofErr w:type="spellEnd"/>
-      <w:r>
-        <w:rPr>
-          <w:lang w:val="pt-BR"/>
-        </w:rPr>
-        <w:t xml:space="preserve"> ratings (1 – 5 stars). </w:t>
-      </w:r>
-      <w:proofErr w:type="spellStart"/>
-      <w:r>
-        <w:rPr>
-          <w:lang w:val="pt-BR"/>
-        </w:rPr>
-        <w:t>All</w:t>
-      </w:r>
-      <w:proofErr w:type="spellEnd"/>
-      <w:r>
-        <w:rPr>
-          <w:lang w:val="pt-BR"/>
-        </w:rPr>
-        <w:t xml:space="preserve"> data </w:t>
-      </w:r>
-      <w:proofErr w:type="spellStart"/>
-      <w:r>
-        <w:rPr>
-          <w:lang w:val="pt-BR"/>
-        </w:rPr>
-        <w:t>is</w:t>
-      </w:r>
-      <w:proofErr w:type="spellEnd"/>
-      <w:r>
-        <w:rPr>
-          <w:lang w:val="pt-BR"/>
-        </w:rPr>
-        <w:t xml:space="preserve"> </w:t>
-      </w:r>
-      <w:proofErr w:type="spellStart"/>
-      <w:r>
-        <w:rPr>
-          <w:lang w:val="pt-BR"/>
-        </w:rPr>
-        <w:t>stored</w:t>
-      </w:r>
-      <w:proofErr w:type="spellEnd"/>
-      <w:r>
-        <w:rPr>
-          <w:lang w:val="pt-BR"/>
-        </w:rPr>
-        <w:t xml:space="preserve"> in </w:t>
-      </w:r>
-      <w:proofErr w:type="spellStart"/>
-      <w:r>
-        <w:rPr>
-          <w:lang w:val="pt-BR"/>
-        </w:rPr>
-        <w:t>the</w:t>
-      </w:r>
-      <w:proofErr w:type="spellEnd"/>
-      <w:r>
-        <w:rPr>
-          <w:lang w:val="pt-BR"/>
-        </w:rPr>
-        <w:t xml:space="preserve"> </w:t>
-      </w:r>
-      <w:proofErr w:type="spellStart"/>
-      <w:r>
-        <w:rPr>
-          <w:lang w:val="pt-BR"/>
-        </w:rPr>
-        <w:t>cloud</w:t>
-      </w:r>
-      <w:proofErr w:type="spellEnd"/>
-      <w:r>
-        <w:rPr>
-          <w:lang w:val="pt-BR"/>
-        </w:rPr>
-        <w:t xml:space="preserve"> </w:t>
-      </w:r>
-      <w:proofErr w:type="spellStart"/>
-      <w:r>
-        <w:rPr>
-          <w:lang w:val="pt-BR"/>
-        </w:rPr>
-        <w:t>using</w:t>
-      </w:r>
-      <w:proofErr w:type="spellEnd"/>
-      <w:r>
-        <w:rPr>
-          <w:lang w:val="pt-BR"/>
-        </w:rPr>
-        <w:t xml:space="preserve"> a </w:t>
-      </w:r>
-      <w:proofErr w:type="spellStart"/>
-      <w:r>
-        <w:rPr>
-          <w:lang w:val="pt-BR"/>
-        </w:rPr>
-        <w:t>RestDB</w:t>
-      </w:r>
-      <w:proofErr w:type="spellEnd"/>
-      <w:r>
-        <w:rPr>
-          <w:lang w:val="pt-BR"/>
-        </w:rPr>
-        <w:t xml:space="preserve"> </w:t>
-      </w:r>
-      <w:proofErr w:type="spellStart"/>
-      <w:r>
-        <w:rPr>
-          <w:lang w:val="pt-BR"/>
-        </w:rPr>
-        <w:t>REST</w:t>
-      </w:r>
-      <w:proofErr w:type="spellEnd"/>
-      <w:r>
-        <w:rPr>
-          <w:lang w:val="pt-BR"/>
-        </w:rPr>
-        <w:t xml:space="preserve"> API, </w:t>
-      </w:r>
-      <w:proofErr w:type="spellStart"/>
-      <w:r>
-        <w:rPr>
-          <w:lang w:val="pt-BR"/>
-        </w:rPr>
-        <w:t>making</w:t>
-      </w:r>
-      <w:proofErr w:type="spellEnd"/>
-      <w:r>
-        <w:rPr>
-          <w:lang w:val="pt-BR"/>
-        </w:rPr>
-        <w:t xml:space="preserve"> it </w:t>
-      </w:r>
-      <w:proofErr w:type="spellStart"/>
-      <w:r>
-        <w:rPr>
-          <w:lang w:val="pt-BR"/>
-        </w:rPr>
-        <w:t>easy</w:t>
-      </w:r>
-      <w:proofErr w:type="spellEnd"/>
-      <w:r>
-        <w:rPr>
-          <w:lang w:val="pt-BR"/>
-        </w:rPr>
-        <w:t xml:space="preserve"> </w:t>
-      </w:r>
-      <w:proofErr w:type="spellStart"/>
-      <w:r>
-        <w:rPr>
-          <w:lang w:val="pt-BR"/>
-        </w:rPr>
-        <w:t>to</w:t>
-      </w:r>
-      <w:proofErr w:type="spellEnd"/>
-      <w:r>
-        <w:rPr>
-          <w:lang w:val="pt-BR"/>
-        </w:rPr>
-        <w:t xml:space="preserve"> </w:t>
-      </w:r>
-      <w:proofErr w:type="spellStart"/>
-      <w:r>
-        <w:rPr>
-          <w:lang w:val="pt-BR"/>
-        </w:rPr>
-        <w:t>access</w:t>
-      </w:r>
-      <w:proofErr w:type="spellEnd"/>
-      <w:r>
-        <w:rPr>
-          <w:lang w:val="pt-BR"/>
-        </w:rPr>
-        <w:t xml:space="preserve"> </w:t>
-      </w:r>
-      <w:proofErr w:type="spellStart"/>
-      <w:r>
-        <w:rPr>
-          <w:lang w:val="pt-BR"/>
-        </w:rPr>
-        <w:t>and</w:t>
-      </w:r>
-      <w:proofErr w:type="spellEnd"/>
-      <w:r>
-        <w:rPr>
-          <w:lang w:val="pt-BR"/>
-        </w:rPr>
-        <w:t xml:space="preserve"> </w:t>
-      </w:r>
-      <w:proofErr w:type="spellStart"/>
-      <w:r>
-        <w:rPr>
-          <w:lang w:val="pt-BR"/>
-        </w:rPr>
-        <w:t>share</w:t>
-      </w:r>
-      <w:proofErr w:type="spellEnd"/>
-      <w:r>
-        <w:rPr>
-          <w:lang w:val="pt-BR"/>
-        </w:rPr>
-        <w:t xml:space="preserve"> </w:t>
-      </w:r>
-      <w:proofErr w:type="spellStart"/>
-      <w:r>
-        <w:rPr>
-          <w:lang w:val="pt-BR"/>
-        </w:rPr>
-        <w:t>trips</w:t>
-      </w:r>
-      <w:proofErr w:type="spellEnd"/>
-      <w:r>
-        <w:rPr>
-          <w:lang w:val="pt-BR"/>
-        </w:rPr>
-        <w:t xml:space="preserve">. </w:t>
+      <w:r>
+        <w:rPr>
+          <w:lang w:val="pt-BR"/>
+        </w:rPr>
+        <w:t>TripTrail is a java-based Android app that works as a travel journal. User</w:t>
+      </w:r>
+      <w:r>
+        <w:rPr>
+          <w:lang w:val="pt-BR"/>
+        </w:rPr>
+        <w:t xml:space="preserve">s can log their trips by saving </w:t>
+      </w:r>
+      <w:r>
+        <w:rPr>
+          <w:lang w:val="pt-BR"/>
+        </w:rPr>
+        <w:t xml:space="preserve">visited places with GPS coordinates, photos and ratings (1 – 5 stars). All data is stored in the cloud using a RestDB REST API, making it easy to access and share trips. </w:t>
       </w:r>
     </w:p>
     <w:p>
@@ -614,101 +100,19 @@
           <w:lang w:val="pt-BR"/>
         </w:rPr>
       </w:pPr>
-      <w:proofErr w:type="spellStart"/>
       <w:r>
         <w:rPr>
           <w:b/>
           <w:lang w:val="pt-BR"/>
         </w:rPr>
-        <w:t>Keywords</w:t>
-      </w:r>
-      <w:proofErr w:type="spellEnd"/>
-      <w:r>
-        <w:rPr>
-          <w:b/>
-          <w:lang w:val="pt-BR"/>
-        </w:rPr>
-        <w:t xml:space="preserve">: </w:t>
-      </w:r>
-      <w:proofErr w:type="spellStart"/>
+        <w:t xml:space="preserve">Keywords: </w:t>
+      </w:r>
       <w:r>
         <w:rPr>
           <w:bCs/>
           <w:lang w:val="pt-BR"/>
         </w:rPr>
-        <w:t>Android</w:t>
-      </w:r>
-      <w:proofErr w:type="spellEnd"/>
-      <w:r>
-        <w:rPr>
-          <w:bCs/>
-          <w:lang w:val="pt-BR"/>
-        </w:rPr>
-        <w:t xml:space="preserve">, Java, </w:t>
-      </w:r>
-      <w:proofErr w:type="spellStart"/>
-      <w:r>
-        <w:rPr>
-          <w:bCs/>
-          <w:lang w:val="pt-BR"/>
-        </w:rPr>
-        <w:t>Travel</w:t>
-      </w:r>
-      <w:proofErr w:type="spellEnd"/>
-      <w:r>
-        <w:rPr>
-          <w:bCs/>
-          <w:lang w:val="pt-BR"/>
-        </w:rPr>
-        <w:t xml:space="preserve"> </w:t>
-      </w:r>
-      <w:proofErr w:type="spellStart"/>
-      <w:r>
-        <w:rPr>
-          <w:bCs/>
-          <w:lang w:val="pt-BR"/>
-        </w:rPr>
-        <w:t>Journal</w:t>
-      </w:r>
-      <w:proofErr w:type="spellEnd"/>
-      <w:r>
-        <w:rPr>
-          <w:bCs/>
-          <w:lang w:val="pt-BR"/>
-        </w:rPr>
-        <w:t xml:space="preserve">, GPS, </w:t>
-      </w:r>
-      <w:proofErr w:type="spellStart"/>
-      <w:r>
-        <w:rPr>
-          <w:bCs/>
-          <w:lang w:val="pt-BR"/>
-        </w:rPr>
-        <w:t>Camera</w:t>
-      </w:r>
-      <w:proofErr w:type="spellEnd"/>
-      <w:r>
-        <w:rPr>
-          <w:bCs/>
-          <w:lang w:val="pt-BR"/>
-        </w:rPr>
-        <w:t xml:space="preserve">, </w:t>
-      </w:r>
-      <w:proofErr w:type="spellStart"/>
-      <w:r>
-        <w:rPr>
-          <w:bCs/>
-          <w:lang w:val="pt-BR"/>
-        </w:rPr>
-        <w:t>Rest</w:t>
-      </w:r>
-      <w:proofErr w:type="spellEnd"/>
-      <w:r>
-        <w:rPr>
-          <w:bCs/>
-          <w:lang w:val="pt-BR"/>
-        </w:rPr>
-        <w:t xml:space="preserve"> API.</w:t>
+        <w:t>Android, Java, Travel Journal, GPS, Camera, Rest API.</w:t>
       </w:r>
     </w:p>
     <w:p>
@@ -736,69 +140,19 @@
         <w:rPr>
           <w:lang w:val="pt-BR"/>
         </w:rPr>
-        <w:t xml:space="preserve">O objetivo deste projeto é desenvolver o </w:t>
-      </w:r>
-      <w:proofErr w:type="spellStart"/>
-      <w:r>
-        <w:rPr>
-          <w:lang w:val="pt-BR"/>
-        </w:rPr>
-        <w:t>TripTrail</w:t>
-      </w:r>
-      <w:proofErr w:type="spellEnd"/>
-      <w:r>
-        <w:rPr>
-          <w:lang w:val="pt-BR"/>
-        </w:rPr>
-        <w:t xml:space="preserve">, uma aplicação </w:t>
-      </w:r>
-      <w:proofErr w:type="spellStart"/>
-      <w:r>
-        <w:rPr>
-          <w:lang w:val="pt-BR"/>
-        </w:rPr>
-        <w:t>Android</w:t>
-      </w:r>
-      <w:proofErr w:type="spellEnd"/>
-      <w:r>
-        <w:rPr>
-          <w:lang w:val="pt-BR"/>
-        </w:rPr>
-        <w:t xml:space="preserve"> em Java que funciona com um diário de viagens. A </w:t>
-      </w:r>
-      <w:proofErr w:type="spellStart"/>
-      <w:r>
-        <w:rPr>
-          <w:lang w:val="pt-BR"/>
-        </w:rPr>
-        <w:t>app</w:t>
-      </w:r>
-      <w:proofErr w:type="spellEnd"/>
-      <w:r>
-        <w:rPr>
-          <w:lang w:val="pt-BR"/>
-        </w:rPr>
-        <w:t xml:space="preserve"> permite registar locais visitados</w:t>
-      </w:r>
-      <w:r>
-        <w:rPr>
-          <w:lang w:val="pt-BR"/>
-        </w:rPr>
-        <w:t xml:space="preserve"> com coordenadas GPS, fotos e avaliações de 1 a 5 estrelas, guardando todos os dados na nuvem via </w:t>
-      </w:r>
-      <w:proofErr w:type="spellStart"/>
-      <w:r>
-        <w:rPr>
-          <w:lang w:val="pt-BR"/>
-        </w:rPr>
-        <w:t>RestDB</w:t>
-      </w:r>
-      <w:proofErr w:type="spellEnd"/>
-      <w:r>
-        <w:rPr>
-          <w:lang w:val="pt-BR"/>
-        </w:rPr>
-        <w:t xml:space="preserve">, facilitando assim o acesso e partilha entre utilizadores. </w:t>
+        <w:t>O objetivo deste projeto é desenvolver o TripTrail</w:t>
+      </w:r>
+      <w:r>
+        <w:rPr>
+          <w:lang w:val="pt-BR"/>
+        </w:rPr>
+        <w:t>, uma aplicação Android em Java que funciona com um diário de viagens. A app permite registar locais visitados</w:t>
+      </w:r>
+      <w:r>
+        <w:rPr>
+          <w:lang w:val="pt-BR"/>
+        </w:rPr>
+        <w:t xml:space="preserve"> com coordenadas GPS, fotos e avaliações de 1 a 5 estrelas, guardando todos os dados na nuvem via RestDB, facilitando assim o acesso e partilha entre utilizadores. </w:t>
       </w:r>
       <w:r>
         <w:rPr>
@@ -834,21 +188,7 @@
         <w:rPr>
           <w:lang w:val="pt-BR"/>
         </w:rPr>
-        <w:t xml:space="preserve">, entre outros. A aplicação utiliza recursos nativos do </w:t>
-      </w:r>
-      <w:proofErr w:type="spellStart"/>
-      <w:r>
-        <w:rPr>
-          <w:lang w:val="pt-BR"/>
-        </w:rPr>
-        <w:t>telemóvel</w:t>
-      </w:r>
-      <w:proofErr w:type="spellEnd"/>
-      <w:r>
-        <w:rPr>
-          <w:lang w:val="pt-BR"/>
-        </w:rPr>
-        <w:t xml:space="preserve"> como o GPS e câmara.</w:t>
+        <w:t>, entre outros. A aplicação utiliza recursos nativos do telemóvel como o GPS e câmara.</w:t>
       </w:r>
     </w:p>
     <w:p>
@@ -969,47 +309,11 @@
                 <w:lang w:val="pt-BR"/>
               </w:rPr>
             </w:pPr>
-            <w:proofErr w:type="spellStart"/>
-            <w:r>
-              <w:rPr>
-                <w:lang w:val="pt-BR"/>
-              </w:rPr>
-              <w:t>Term</w:t>
-            </w:r>
-            <w:proofErr w:type="spellEnd"/>
-            <w:r>
-              <w:rPr>
-                <w:lang w:val="pt-BR"/>
-              </w:rPr>
-              <w:t xml:space="preserve"> </w:t>
-            </w:r>
-            <w:proofErr w:type="spellStart"/>
-            <w:r>
-              <w:rPr>
-                <w:lang w:val="pt-BR"/>
-              </w:rPr>
-              <w:t>or</w:t>
-            </w:r>
-            <w:proofErr w:type="spellEnd"/>
-            <w:r>
-              <w:rPr>
-                <w:lang w:val="pt-BR"/>
-              </w:rPr>
-              <w:t xml:space="preserve"> Expression (</w:t>
-            </w:r>
-            <w:proofErr w:type="spellStart"/>
-            <w:r>
-              <w:rPr>
-                <w:lang w:val="pt-BR"/>
-              </w:rPr>
-              <w:t>EN</w:t>
-            </w:r>
-            <w:proofErr w:type="spellEnd"/>
-            <w:r>
-              <w:rPr>
-                <w:lang w:val="pt-BR"/>
-              </w:rPr>
-              <w:t>)</w:t>
+            <w:r>
+              <w:rPr>
+                <w:lang w:val="pt-BR"/>
+              </w:rPr>
+              <w:t>Term or Expression (EN)</w:t>
             </w:r>
           </w:p>
         </w:tc>
@@ -1074,14 +378,12 @@
                 <w:lang w:val="pt-BR"/>
               </w:rPr>
             </w:pPr>
-            <w:proofErr w:type="spellStart"/>
             <w:r>
               <w:rPr>
                 <w:lang w:val="pt-BR"/>
               </w:rPr>
               <w:t>Category</w:t>
             </w:r>
-            <w:proofErr w:type="spellEnd"/>
           </w:p>
         </w:tc>
         <w:tc>
@@ -1214,14 +516,12 @@
                 <w:lang w:val="pt-BR"/>
               </w:rPr>
             </w:pPr>
-            <w:proofErr w:type="spellStart"/>
             <w:r>
               <w:rPr>
                 <w:lang w:val="pt-BR"/>
               </w:rPr>
               <w:t>Map</w:t>
             </w:r>
-            <w:proofErr w:type="spellEnd"/>
           </w:p>
         </w:tc>
         <w:tc>
@@ -1258,19 +558,11 @@
                 <w:lang w:val="pt-BR"/>
               </w:rPr>
             </w:pPr>
-            <w:proofErr w:type="spellStart"/>
-            <w:r>
-              <w:rPr>
-                <w:lang w:val="pt-BR"/>
-              </w:rPr>
-              <w:t>Ecrã</w:t>
-            </w:r>
-            <w:proofErr w:type="spellEnd"/>
-            <w:r>
-              <w:rPr>
-                <w:lang w:val="pt-BR"/>
-              </w:rPr>
-              <w:t xml:space="preserve"> com os locais da viagem</w:t>
+            <w:r>
+              <w:rPr>
+                <w:lang w:val="pt-BR"/>
+              </w:rPr>
+              <w:t>Ecrã com os locais da viagem</w:t>
             </w:r>
           </w:p>
         </w:tc>
@@ -1293,14 +585,12 @@
                 <w:lang w:val="pt-BR"/>
               </w:rPr>
             </w:pPr>
-            <w:proofErr w:type="spellStart"/>
             <w:r>
               <w:rPr>
                 <w:lang w:val="pt-BR"/>
               </w:rPr>
               <w:t>Marker</w:t>
             </w:r>
-            <w:proofErr w:type="spellEnd"/>
           </w:p>
         </w:tc>
         <w:tc>
@@ -1364,14 +654,12 @@
                 <w:lang w:val="pt-BR"/>
               </w:rPr>
             </w:pPr>
-            <w:proofErr w:type="spellStart"/>
             <w:r>
               <w:rPr>
                 <w:lang w:val="pt-BR"/>
               </w:rPr>
               <w:t>Photo</w:t>
             </w:r>
-            <w:proofErr w:type="spellEnd"/>
           </w:p>
         </w:tc>
         <w:tc>
@@ -1435,7 +723,6 @@
                 <w:lang w:val="pt-BR"/>
               </w:rPr>
             </w:pPr>
-            <w:proofErr w:type="spellStart"/>
             <w:r>
               <w:rPr>
                 <w:lang w:val="pt-BR"/>
@@ -1443,7 +730,6 @@
               <w:lastRenderedPageBreak/>
               <w:t>Place</w:t>
             </w:r>
-            <w:proofErr w:type="spellEnd"/>
           </w:p>
         </w:tc>
         <w:tc>
@@ -1576,14 +862,12 @@
                 <w:lang w:val="pt-BR"/>
               </w:rPr>
             </w:pPr>
-            <w:proofErr w:type="spellStart"/>
             <w:r>
               <w:rPr>
                 <w:lang w:val="pt-BR"/>
               </w:rPr>
               <w:t>Trip</w:t>
             </w:r>
-            <w:proofErr w:type="spellEnd"/>
           </w:p>
         </w:tc>
         <w:tc>
@@ -1647,28 +931,12 @@
                 <w:lang w:val="pt-BR"/>
               </w:rPr>
             </w:pPr>
-            <w:proofErr w:type="spellStart"/>
-            <w:r>
-              <w:rPr>
-                <w:lang w:val="pt-BR"/>
-              </w:rPr>
-              <w:t>Trip</w:t>
-            </w:r>
-            <w:proofErr w:type="spellEnd"/>
-            <w:r>
-              <w:rPr>
-                <w:lang w:val="pt-BR"/>
-              </w:rPr>
-              <w:t xml:space="preserve"> </w:t>
-            </w:r>
-            <w:proofErr w:type="spellStart"/>
-            <w:r>
-              <w:rPr>
-                <w:lang w:val="pt-BR"/>
-              </w:rPr>
-              <w:t>Member</w:t>
-            </w:r>
-            <w:proofErr w:type="spellEnd"/>
+            <w:r>
+              <w:rPr>
+                <w:lang w:val="pt-BR"/>
+              </w:rPr>
+              <w:t>Trip Member</w:t>
+            </w:r>
           </w:p>
         </w:tc>
         <w:tc>
@@ -1732,14 +1000,12 @@
                 <w:lang w:val="pt-BR"/>
               </w:rPr>
             </w:pPr>
-            <w:proofErr w:type="spellStart"/>
             <w:r>
               <w:rPr>
                 <w:lang w:val="pt-BR"/>
               </w:rPr>
               <w:t>User</w:t>
             </w:r>
-            <w:proofErr w:type="spellEnd"/>
           </w:p>
         </w:tc>
         <w:tc>
@@ -1979,21 +1245,7 @@
         <w:rPr>
           <w:lang w:val="pt-BR"/>
         </w:rPr>
-        <w:t xml:space="preserve">Como utilizador, quero que criar uma conta e iniciar sessão para que as minhas viagens fiquem guardadas e acessíveis em qualquer </w:t>
-      </w:r>
-      <w:proofErr w:type="spellStart"/>
-      <w:r>
-        <w:rPr>
-          <w:lang w:val="pt-BR"/>
-        </w:rPr>
-        <w:t>telemóvel</w:t>
-      </w:r>
-      <w:proofErr w:type="spellEnd"/>
-      <w:r>
-        <w:rPr>
-          <w:lang w:val="pt-BR"/>
-        </w:rPr>
-        <w:t>.</w:t>
+        <w:t>Como utilizador, quero que criar uma conta e iniciar sessão para que as minhas viagens fiquem guardadas e acessíveis em qualquer telemóvel.</w:t>
       </w:r>
     </w:p>
     <w:p>
@@ -2030,27 +1282,13 @@
         <w:rPr>
           <w:lang w:val="pt-BR"/>
         </w:rPr>
-        <w:t xml:space="preserve">O sistema deve pedir o nome, </w:t>
-      </w:r>
-      <w:proofErr w:type="spellStart"/>
-      <w:r>
-        <w:rPr>
-          <w:lang w:val="pt-BR"/>
-        </w:rPr>
-        <w:t>em</w:t>
-      </w:r>
-      <w:r>
-        <w:rPr>
-          <w:lang w:val="pt-BR"/>
-        </w:rPr>
-        <w:t>ail</w:t>
-      </w:r>
-      <w:proofErr w:type="spellEnd"/>
-      <w:r>
-        <w:rPr>
-          <w:lang w:val="pt-BR"/>
-        </w:rPr>
-        <w:t xml:space="preserve"> e palavra-passe no registo;</w:t>
+        <w:t>O sistema deve pedir o nome, em</w:t>
+      </w:r>
+      <w:r>
+        <w:rPr>
+          <w:lang w:val="pt-BR"/>
+        </w:rPr>
+        <w:t>ail e palavra-passe no registo;</w:t>
       </w:r>
     </w:p>
     <w:p>
@@ -2069,21 +1307,7 @@
         <w:rPr>
           <w:lang w:val="pt-BR"/>
         </w:rPr>
-        <w:t xml:space="preserve">O sistema deve recusar </w:t>
-      </w:r>
-      <w:proofErr w:type="spellStart"/>
-      <w:r>
-        <w:rPr>
-          <w:lang w:val="pt-BR"/>
-        </w:rPr>
-        <w:t>emails</w:t>
-      </w:r>
-      <w:proofErr w:type="spellEnd"/>
-      <w:r>
-        <w:rPr>
-          <w:lang w:val="pt-BR"/>
-        </w:rPr>
-        <w:t xml:space="preserve"> inválidos e palavras-passe com menos de</w:t>
+        <w:t>O sistema deve recusar emails inválidos e palavras-passe com menos de</w:t>
       </w:r>
       <w:r>
         <w:rPr>
@@ -2134,21 +1358,7 @@
         <w:rPr>
           <w:lang w:val="pt-BR"/>
         </w:rPr>
-        <w:t xml:space="preserve">Como utilizador, quero que criar uma conta e iniciar sessão para que as minhas viagens fiquem guardadas e acessíveis em qualquer </w:t>
-      </w:r>
-      <w:proofErr w:type="spellStart"/>
-      <w:r>
-        <w:rPr>
-          <w:lang w:val="pt-BR"/>
-        </w:rPr>
-        <w:t>telemóvel</w:t>
-      </w:r>
-      <w:proofErr w:type="spellEnd"/>
-      <w:r>
-        <w:rPr>
-          <w:lang w:val="pt-BR"/>
-        </w:rPr>
-        <w:t>.</w:t>
+        <w:t>Como utilizador, quero que criar uma conta e iniciar sessão para que as minhas viagens fiquem guardadas e acessíveis em qualquer telemóvel.</w:t>
       </w:r>
     </w:p>
     <w:p>
@@ -2264,21 +1474,7 @@
         <w:rPr>
           <w:lang w:val="pt-BR"/>
         </w:rPr>
-        <w:t xml:space="preserve">lista e ficar gravada no </w:t>
-      </w:r>
-      <w:proofErr w:type="spellStart"/>
-      <w:r>
-        <w:rPr>
-          <w:lang w:val="pt-BR"/>
-        </w:rPr>
-        <w:t>RestDB</w:t>
-      </w:r>
-      <w:proofErr w:type="spellEnd"/>
-      <w:r>
-        <w:rPr>
-          <w:lang w:val="pt-BR"/>
-        </w:rPr>
-        <w:t>;</w:t>
+        <w:t>lista e ficar gravada no RestDB;</w:t>
       </w:r>
     </w:p>
     <w:p>
@@ -2297,21 +1493,7 @@
         <w:rPr>
           <w:lang w:val="pt-BR"/>
         </w:rPr>
-        <w:t xml:space="preserve">O criador fica registado como participante com o papel </w:t>
-      </w:r>
-      <w:proofErr w:type="spellStart"/>
-      <w:r>
-        <w:rPr>
-          <w:lang w:val="pt-BR"/>
-        </w:rPr>
-        <w:t>Owner</w:t>
-      </w:r>
-      <w:proofErr w:type="spellEnd"/>
-      <w:r>
-        <w:rPr>
-          <w:lang w:val="pt-BR"/>
-        </w:rPr>
-        <w:t>.</w:t>
+        <w:t>O criador fica registado como participante com o papel Owner.</w:t>
       </w:r>
     </w:p>
     <w:p>
@@ -2455,19 +1637,7 @@
         <w:rPr>
           <w:lang w:val="pt-BR"/>
         </w:rPr>
-        <w:t xml:space="preserve">Como utilizador quero adicionar locais as minhas viagens </w:t>
-      </w:r>
-      <w:r>
-        <w:rPr>
-          <w:lang w:val="pt-BR"/>
-        </w:rPr>
-        <w:t>com a minha posição atual</w:t>
-      </w:r>
-      <w:r>
-        <w:rPr>
-          <w:lang w:val="pt-BR"/>
-        </w:rPr>
-        <w:t>.</w:t>
+        <w:t>Como utilizador quero adicionar locais as minhas viagens com a minha posição atual.</w:t>
       </w:r>
     </w:p>
     <w:p>
@@ -2502,13 +1672,7 @@
         <w:rPr>
           <w:lang w:val="pt-BR"/>
         </w:rPr>
-        <w:t>O s</w:t>
-      </w:r>
-      <w:r>
-        <w:rPr>
-          <w:lang w:val="pt-BR"/>
-        </w:rPr>
-        <w:t xml:space="preserve">istema deve pedir a permissão para acessar a localização do </w:t>
+        <w:t xml:space="preserve">O sistema deve pedir a permissão para acessar a localização do </w:t>
       </w:r>
       <w:r>
         <w:rPr>
@@ -2539,13 +1703,7 @@
         <w:rPr>
           <w:lang w:val="pt-BR"/>
         </w:rPr>
-        <w:t>O sistema deve validar as coordenadas</w:t>
-      </w:r>
-      <w:r>
-        <w:rPr>
-          <w:lang w:val="pt-BR"/>
-        </w:rPr>
-        <w:t>.</w:t>
+        <w:t>O sistema deve validar as coordenadas.</w:t>
       </w:r>
     </w:p>
     <w:p>
@@ -2572,31 +1730,7 @@
         <w:rPr>
           <w:lang w:val="pt-BR"/>
         </w:rPr>
-        <w:t xml:space="preserve">Como utilizador, </w:t>
-      </w:r>
-      <w:r>
-        <w:rPr>
-          <w:lang w:val="pt-BR"/>
-        </w:rPr>
-        <w:t xml:space="preserve">quero tirar fotografias ao local, para guardar uma imagem da </w:t>
-      </w:r>
-      <w:r>
-        <w:rPr>
-          <w:lang w:val="pt-BR"/>
-        </w:rPr>
-        <w:t xml:space="preserve">minha </w:t>
-      </w:r>
-      <w:r>
-        <w:rPr>
-          <w:lang w:val="pt-BR"/>
-        </w:rPr>
-        <w:t>visita</w:t>
-      </w:r>
-      <w:r>
-        <w:rPr>
-          <w:lang w:val="pt-BR"/>
-        </w:rPr>
-        <w:t>.</w:t>
+        <w:t>Como utilizador, quero tirar fotografias ao local, para guardar uma imagem da minha visita.</w:t>
       </w:r>
     </w:p>
     <w:p>
@@ -2637,21 +1771,7 @@
         <w:rPr>
           <w:lang w:val="pt-BR"/>
         </w:rPr>
-        <w:t xml:space="preserve">, com o </w:t>
-      </w:r>
-      <w:proofErr w:type="spellStart"/>
-      <w:r>
-        <w:rPr>
-          <w:lang w:val="pt-BR"/>
-        </w:rPr>
-        <w:t>CameraX</w:t>
-      </w:r>
-      <w:proofErr w:type="spellEnd"/>
-      <w:r>
-        <w:rPr>
-          <w:lang w:val="pt-BR"/>
-        </w:rPr>
-        <w:t>.</w:t>
+        <w:t>, com o CameraX.</w:t>
       </w:r>
     </w:p>
     <w:p>
@@ -2746,19 +1866,7 @@
         <w:rPr>
           <w:lang w:val="pt-BR"/>
         </w:rPr>
-        <w:t xml:space="preserve">Como utilizador, </w:t>
-      </w:r>
-      <w:r>
-        <w:rPr>
-          <w:lang w:val="pt-BR"/>
-        </w:rPr>
-        <w:t>quero ver todos os locais da viagem num mapa, para ter noção do percurso</w:t>
-      </w:r>
-      <w:r>
-        <w:rPr>
-          <w:lang w:val="pt-BR"/>
-        </w:rPr>
-        <w:t>.</w:t>
+        <w:t>Como utilizador, quero ver todos os locais da viagem num mapa, para ter noção do percurso.</w:t>
       </w:r>
     </w:p>
     <w:p>
@@ -2794,13 +1902,7 @@
         <w:rPr>
           <w:lang w:val="pt-BR"/>
         </w:rPr>
-        <w:t>O mapa dev</w:t>
-      </w:r>
-      <w:r>
-        <w:rPr>
-          <w:lang w:val="pt-BR"/>
-        </w:rPr>
-        <w:t>e mostrar um marcador por local;</w:t>
+        <w:t>O mapa deve mostrar um marcador por local;</w:t>
       </w:r>
     </w:p>
     <w:p>
@@ -2820,13 +1922,7 @@
         <w:rPr>
           <w:lang w:val="pt-BR"/>
         </w:rPr>
-        <w:t>A cor do marcador deve corresponder à categoria do local</w:t>
-      </w:r>
-      <w:r>
-        <w:rPr>
-          <w:lang w:val="pt-BR"/>
-        </w:rPr>
-        <w:t>;</w:t>
+        <w:t>A cor do marcador deve corresponder à categoria do local;</w:t>
       </w:r>
     </w:p>
     <w:p>
@@ -2846,13 +1942,7 @@
         <w:rPr>
           <w:lang w:val="pt-BR"/>
         </w:rPr>
-        <w:t>Tocar num marcador deve abrir o detalhe do local</w:t>
-      </w:r>
-      <w:r>
-        <w:rPr>
-          <w:lang w:val="pt-BR"/>
-        </w:rPr>
-        <w:t>.</w:t>
+        <w:t>Tocar num marcador deve abrir o detalhe do local.</w:t>
       </w:r>
     </w:p>
     <w:p>
@@ -2880,19 +1970,7 @@
         <w:rPr>
           <w:lang w:val="pt-BR"/>
         </w:rPr>
-        <w:t xml:space="preserve">Como utilizador, </w:t>
-      </w:r>
-      <w:r>
-        <w:rPr>
-          <w:lang w:val="pt-BR"/>
-        </w:rPr>
-        <w:t>quero adicionar participantes à viagem, para partilhar a informação com quem viajou comigo</w:t>
-      </w:r>
-      <w:r>
-        <w:rPr>
-          <w:lang w:val="pt-BR"/>
-        </w:rPr>
-        <w:t>.</w:t>
+        <w:t>Como utilizador, quero adicionar participantes à viagem, para partilhar a informação com quem viajou comigo.</w:t>
       </w:r>
     </w:p>
     <w:p>
@@ -2930,27 +2008,7 @@
         <w:rPr>
           <w:lang w:val="pt-BR"/>
         </w:rPr>
-        <w:t xml:space="preserve">O convite deve ser feito pelo </w:t>
-      </w:r>
-      <w:proofErr w:type="spellStart"/>
-      <w:r>
-        <w:rPr>
-          <w:lang w:val="pt-BR"/>
-        </w:rPr>
-        <w:t>email</w:t>
-      </w:r>
-      <w:proofErr w:type="spellEnd"/>
-      <w:r>
-        <w:rPr>
-          <w:lang w:val="pt-BR"/>
-        </w:rPr>
-        <w:t xml:space="preserve"> do utilizador</w:t>
-      </w:r>
-      <w:r>
-        <w:rPr>
-          <w:lang w:val="pt-BR"/>
-        </w:rPr>
-        <w:t>;</w:t>
+        <w:t>O convite deve ser feito pelo email do utilizador;</w:t>
       </w:r>
     </w:p>
     <w:p>
@@ -2970,13 +2028,7 @@
         <w:rPr>
           <w:lang w:val="pt-BR"/>
         </w:rPr>
-        <w:t>O sistema deve recusar convidar duas vezes a mesma pessoa</w:t>
-      </w:r>
-      <w:r>
-        <w:rPr>
-          <w:lang w:val="pt-BR"/>
-        </w:rPr>
-        <w:t>.</w:t>
+        <w:t>O sistema deve recusar convidar duas vezes a mesma pessoa.</w:t>
       </w:r>
     </w:p>
     <w:p>
@@ -3017,19 +2069,7 @@
         <w:rPr>
           <w:lang w:val="pt-BR"/>
         </w:rPr>
-        <w:t xml:space="preserve">, </w:t>
-      </w:r>
-      <w:r>
-        <w:rPr>
-          <w:lang w:val="pt-BR"/>
-        </w:rPr>
-        <w:t>quero consultar o resumo da via</w:t>
-      </w:r>
-      <w:r>
-        <w:rPr>
-          <w:lang w:val="pt-BR"/>
-        </w:rPr>
-        <w:t>gem, para saber as estatísticas da minha viagem.</w:t>
+        <w:t>, quero consultar o resumo da viagem, para saber as estatísticas da minha viagem.</w:t>
       </w:r>
     </w:p>
     <w:p>
@@ -3072,19 +2112,7 @@
         <w:rPr>
           <w:lang w:val="pt-BR"/>
         </w:rPr>
-        <w:t xml:space="preserve"> e o total de locais, d</w:t>
-      </w:r>
-      <w:r>
-        <w:rPr>
-          <w:lang w:val="pt-BR"/>
-        </w:rPr>
-        <w:t xml:space="preserve">eve mostrar também o número de países e a avaliação </w:t>
-      </w:r>
-      <w:r>
-        <w:rPr>
-          <w:lang w:val="pt-BR"/>
-        </w:rPr>
-        <w:t>media.</w:t>
+        <w:t xml:space="preserve"> e o total de locais, deve mostrar também o número de países e a avaliação media.</w:t>
       </w:r>
     </w:p>
     <w:p>
@@ -3100,8 +2128,6 @@
         </w:rPr>
         <w:t>5   Requisitos</w:t>
       </w:r>
-      <w:bookmarkStart w:id="0" w:name="_GoBack"/>
-      <w:bookmarkEnd w:id="0"/>
     </w:p>
     <w:p>
       <w:pPr>
@@ -3224,7 +2250,6 @@
           <w:lang w:val="pt-BR"/>
         </w:rPr>
       </w:pPr>
-      <w:proofErr w:type="spellStart"/>
       <w:r>
         <w:rPr>
           <w:b w:val="0"/>
@@ -3232,29 +2257,8 @@
           <w:szCs w:val="18"/>
           <w:lang w:val="pt-BR"/>
         </w:rPr>
-        <w:t>UC</w:t>
-      </w:r>
-      <w:proofErr w:type="spellEnd"/>
-      <w:r>
-        <w:rPr>
-          <w:b w:val="0"/>
-          <w:sz w:val="18"/>
-          <w:szCs w:val="18"/>
-          <w:lang w:val="pt-BR"/>
-        </w:rPr>
-        <w:t xml:space="preserve"> 1. </w:t>
-      </w:r>
-      <w:proofErr w:type="gramStart"/>
-      <w:r>
-        <w:rPr>
-          <w:b w:val="0"/>
-          <w:sz w:val="18"/>
-          <w:szCs w:val="18"/>
-          <w:lang w:val="pt-BR"/>
-        </w:rPr>
-        <w:t>Registar Utilizador</w:t>
-      </w:r>
-      <w:proofErr w:type="gramEnd"/>
+        <w:t>UC 1. Registar Utilizador</w:t>
+      </w:r>
     </w:p>
     <w:tbl>
       <w:tblPr>
@@ -3348,21 +2352,7 @@
               <w:rPr>
                 <w:lang w:val="pt-BR"/>
               </w:rPr>
-              <w:t xml:space="preserve">O </w:t>
-            </w:r>
-            <w:proofErr w:type="spellStart"/>
-            <w:r>
-              <w:rPr>
-                <w:lang w:val="pt-BR"/>
-              </w:rPr>
-              <w:t>email</w:t>
-            </w:r>
-            <w:proofErr w:type="spellEnd"/>
-            <w:r>
-              <w:rPr>
-                <w:lang w:val="pt-BR"/>
-              </w:rPr>
-              <w:t xml:space="preserve"> introduzido não existe no sistema</w:t>
+              <w:t>O email introduzido não existe no sistema</w:t>
             </w:r>
           </w:p>
         </w:tc>
@@ -3446,21 +2436,7 @@
               <w:rPr>
                 <w:lang w:val="pt-BR"/>
               </w:rPr>
-              <w:t xml:space="preserve">O sistema solicita o nome, </w:t>
-            </w:r>
-            <w:proofErr w:type="spellStart"/>
-            <w:r>
-              <w:rPr>
-                <w:lang w:val="pt-BR"/>
-              </w:rPr>
-              <w:t>email</w:t>
-            </w:r>
-            <w:proofErr w:type="spellEnd"/>
-            <w:r>
-              <w:rPr>
-                <w:lang w:val="pt-BR"/>
-              </w:rPr>
-              <w:t xml:space="preserve"> e palavra-passe;</w:t>
+              <w:t>O sistema solicita o nome, email e palavra-passe;</w:t>
             </w:r>
           </w:p>
           <w:p>
@@ -3496,21 +2472,7 @@
               <w:rPr>
                 <w:lang w:val="pt-BR"/>
               </w:rPr>
-              <w:t xml:space="preserve">O sistema valida o nome, o </w:t>
-            </w:r>
-            <w:proofErr w:type="spellStart"/>
-            <w:r>
-              <w:rPr>
-                <w:lang w:val="pt-BR"/>
-              </w:rPr>
-              <w:t>email</w:t>
-            </w:r>
-            <w:proofErr w:type="spellEnd"/>
-            <w:r>
-              <w:rPr>
-                <w:lang w:val="pt-BR"/>
-              </w:rPr>
-              <w:t xml:space="preserve"> e a palavra-passe;</w:t>
+              <w:t>O sistema valida o nome, o email e a palavra-passe;</w:t>
             </w:r>
           </w:p>
           <w:p>
@@ -3529,21 +2491,7 @@
                 <w:lang w:val="pt-BR"/>
               </w:rPr>
               <w:lastRenderedPageBreak/>
-              <w:t xml:space="preserve">O sistema guarda a palavra-passe como </w:t>
-            </w:r>
-            <w:proofErr w:type="spellStart"/>
-            <w:r>
-              <w:rPr>
-                <w:lang w:val="pt-BR"/>
-              </w:rPr>
-              <w:t>SHA</w:t>
-            </w:r>
-            <w:proofErr w:type="spellEnd"/>
-            <w:r>
-              <w:rPr>
-                <w:lang w:val="pt-BR"/>
-              </w:rPr>
-              <w:t>-256 e regista o novo utilizador no sistema;</w:t>
+              <w:t>O sistema guarda a palavra-passe como SHA-256 e regista o novo utilizador no sistema;</w:t>
             </w:r>
           </w:p>
           <w:p>
@@ -3624,7 +2572,6 @@
           <w:lang w:val="pt-BR"/>
         </w:rPr>
       </w:pPr>
-      <w:proofErr w:type="spellStart"/>
       <w:r>
         <w:rPr>
           <w:b w:val="0"/>
@@ -3632,17 +2579,7 @@
           <w:szCs w:val="18"/>
           <w:lang w:val="pt-BR"/>
         </w:rPr>
-        <w:t>UC</w:t>
-      </w:r>
-      <w:proofErr w:type="spellEnd"/>
-      <w:r>
-        <w:rPr>
-          <w:b w:val="0"/>
-          <w:sz w:val="18"/>
-          <w:szCs w:val="18"/>
-          <w:lang w:val="pt-BR"/>
-        </w:rPr>
-        <w:t xml:space="preserve"> 2. Iniciar Sessão</w:t>
+        <w:t>UC 2. Iniciar Sessão</w:t>
       </w:r>
     </w:p>
     <w:tbl>
@@ -3737,21 +2674,7 @@
               <w:rPr>
                 <w:lang w:val="pt-BR"/>
               </w:rPr>
-              <w:t xml:space="preserve">Existe uma conta com o </w:t>
-            </w:r>
-            <w:proofErr w:type="spellStart"/>
-            <w:r>
-              <w:rPr>
-                <w:lang w:val="pt-BR"/>
-              </w:rPr>
-              <w:t>email</w:t>
-            </w:r>
-            <w:proofErr w:type="spellEnd"/>
-            <w:r>
-              <w:rPr>
-                <w:lang w:val="pt-BR"/>
-              </w:rPr>
-              <w:t xml:space="preserve"> introduzido</w:t>
+              <w:t>Existe uma conta com o email introduzido</w:t>
             </w:r>
           </w:p>
         </w:tc>
@@ -3835,21 +2758,7 @@
               <w:rPr>
                 <w:lang w:val="pt-BR"/>
               </w:rPr>
-              <w:t xml:space="preserve">O sistema solicita o </w:t>
-            </w:r>
-            <w:proofErr w:type="spellStart"/>
-            <w:r>
-              <w:rPr>
-                <w:lang w:val="pt-BR"/>
-              </w:rPr>
-              <w:t>email</w:t>
-            </w:r>
-            <w:proofErr w:type="spellEnd"/>
-            <w:r>
-              <w:rPr>
-                <w:lang w:val="pt-BR"/>
-              </w:rPr>
-              <w:t xml:space="preserve"> e a palavra-passe;</w:t>
+              <w:t>O sistema solicita o email e a palavra-passe;</w:t>
             </w:r>
           </w:p>
           <w:p>
@@ -3885,21 +2794,7 @@
               <w:rPr>
                 <w:lang w:val="pt-BR"/>
               </w:rPr>
-              <w:t xml:space="preserve">O sistema calcula o </w:t>
-            </w:r>
-            <w:proofErr w:type="spellStart"/>
-            <w:r>
-              <w:rPr>
-                <w:lang w:val="pt-BR"/>
-              </w:rPr>
-              <w:t>hash</w:t>
-            </w:r>
-            <w:proofErr w:type="spellEnd"/>
-            <w:r>
-              <w:rPr>
-                <w:lang w:val="pt-BR"/>
-              </w:rPr>
-              <w:t xml:space="preserve"> da palavra-passe e compara-o com o guardado;</w:t>
+              <w:t>O sistema calcula o hash da palavra-passe e compara-o com o guardado;</w:t>
             </w:r>
           </w:p>
           <w:p>
@@ -3976,21 +2871,12 @@
           <w:lang w:val="pt-BR"/>
         </w:rPr>
       </w:pPr>
-      <w:proofErr w:type="spellStart"/>
       <w:r>
         <w:rPr>
           <w:b w:val="0"/>
           <w:lang w:val="pt-BR"/>
         </w:rPr>
-        <w:t>UC</w:t>
-      </w:r>
-      <w:proofErr w:type="spellEnd"/>
-      <w:r>
-        <w:rPr>
-          <w:b w:val="0"/>
-          <w:lang w:val="pt-BR"/>
-        </w:rPr>
-        <w:t xml:space="preserve"> 3. Criar Viagem</w:t>
+        <w:t>UC 3. Criar Viagem</w:t>
       </w:r>
     </w:p>
     <w:tbl>
@@ -4125,21 +3011,7 @@
               <w:rPr>
                 <w:lang w:val="pt-BR"/>
               </w:rPr>
-              <w:t xml:space="preserve">A viagem fica guardada no </w:t>
-            </w:r>
-            <w:proofErr w:type="spellStart"/>
-            <w:r>
-              <w:rPr>
-                <w:lang w:val="pt-BR"/>
-              </w:rPr>
-              <w:t>RestDB</w:t>
-            </w:r>
-            <w:proofErr w:type="spellEnd"/>
-            <w:r>
-              <w:rPr>
-                <w:lang w:val="pt-BR"/>
-              </w:rPr>
-              <w:t xml:space="preserve"> e aparece na lista</w:t>
+              <w:t>A viagem fica guardada no RestDB e aparece na lista</w:t>
             </w:r>
           </w:p>
         </w:tc>
@@ -4291,21 +3163,7 @@
               <w:rPr>
                 <w:lang w:val="pt-BR"/>
               </w:rPr>
-              <w:t xml:space="preserve"> como </w:t>
-            </w:r>
-            <w:proofErr w:type="spellStart"/>
-            <w:r>
-              <w:rPr>
-                <w:lang w:val="pt-BR"/>
-              </w:rPr>
-              <w:t>OWNER</w:t>
-            </w:r>
-            <w:proofErr w:type="spellEnd"/>
-            <w:r>
-              <w:rPr>
-                <w:lang w:val="pt-BR"/>
-              </w:rPr>
-              <w:t>;</w:t>
+              <w:t xml:space="preserve"> como OWNER;</w:t>
             </w:r>
           </w:p>
           <w:p>
@@ -4392,35 +3250,12 @@
           <w:lang w:val="pt-BR"/>
         </w:rPr>
       </w:pPr>
-      <w:proofErr w:type="spellStart"/>
       <w:r>
         <w:rPr>
           <w:b w:val="0"/>
           <w:lang w:val="pt-BR"/>
         </w:rPr>
-        <w:t>UC</w:t>
-      </w:r>
-      <w:proofErr w:type="spellEnd"/>
-      <w:r>
-        <w:rPr>
-          <w:b w:val="0"/>
-          <w:lang w:val="pt-BR"/>
-        </w:rPr>
-        <w:t xml:space="preserve"> 4</w:t>
-      </w:r>
-      <w:r>
-        <w:rPr>
-          <w:b w:val="0"/>
-          <w:lang w:val="pt-BR"/>
-        </w:rPr>
-        <w:t xml:space="preserve">. </w:t>
-      </w:r>
-      <w:r>
-        <w:rPr>
-          <w:b w:val="0"/>
-          <w:lang w:val="pt-BR"/>
-        </w:rPr>
-        <w:t>Consultar Lista de Viagens</w:t>
+        <w:t>UC 4. Consultar Lista de Viagens</w:t>
       </w:r>
     </w:p>
     <w:tbl>
@@ -4475,13 +3310,7 @@
               <w:rPr>
                 <w:lang w:val="pt-BR"/>
               </w:rPr>
-              <w:t>Mostra as viagen</w:t>
-            </w:r>
-            <w:r>
-              <w:rPr>
-                <w:lang w:val="pt-BR"/>
-              </w:rPr>
-              <w:t>s em que o utilizador participa</w:t>
+              <w:t>Mostra as viagens em que o utilizador participa</w:t>
             </w:r>
           </w:p>
         </w:tc>
@@ -4561,13 +3390,7 @@
               <w:rPr>
                 <w:lang w:val="pt-BR"/>
               </w:rPr>
-              <w:t>A</w:t>
-            </w:r>
-            <w:r>
-              <w:rPr>
-                <w:lang w:val="pt-BR"/>
-              </w:rPr>
-              <w:t xml:space="preserve"> lista de viagens é apresentada</w:t>
+              <w:t>A lista de viagens é apresentada</w:t>
             </w:r>
           </w:p>
         </w:tc>
@@ -4611,13 +3434,7 @@
               <w:rPr>
                 <w:lang w:val="pt-BR"/>
               </w:rPr>
-              <w:t xml:space="preserve">O </w:t>
-            </w:r>
-            <w:r>
-              <w:rPr>
-                <w:lang w:val="pt-BR"/>
-              </w:rPr>
-              <w:t>utilizador seleciona a opção “Minhas Viagens”;</w:t>
+              <w:t>O utilizador seleciona a opção “Minhas Viagens”;</w:t>
             </w:r>
           </w:p>
           <w:p>
@@ -4654,25 +3471,7 @@
               <w:rPr>
                 <w:lang w:val="pt-BR"/>
               </w:rPr>
-              <w:t>O siste</w:t>
-            </w:r>
-            <w:r>
-              <w:rPr>
-                <w:lang w:val="pt-BR"/>
-              </w:rPr>
-              <w:t>ma apresenta o título, as datas e</w:t>
-            </w:r>
-            <w:r>
-              <w:rPr>
-                <w:lang w:val="pt-BR"/>
-              </w:rPr>
-              <w:t xml:space="preserve"> o número de locais</w:t>
-            </w:r>
-            <w:r>
-              <w:rPr>
-                <w:lang w:val="pt-BR"/>
-              </w:rPr>
-              <w:t xml:space="preserve"> de cada viagem.</w:t>
+              <w:t>O sistema apresenta o título, as datas e o número de locais de cada viagem.</w:t>
             </w:r>
           </w:p>
         </w:tc>
@@ -4742,35 +3541,12 @@
           <w:lang w:val="pt-BR"/>
         </w:rPr>
       </w:pPr>
-      <w:proofErr w:type="spellStart"/>
       <w:r>
         <w:rPr>
           <w:b w:val="0"/>
           <w:lang w:val="pt-BR"/>
         </w:rPr>
-        <w:t>UC</w:t>
-      </w:r>
-      <w:proofErr w:type="spellEnd"/>
-      <w:r>
-        <w:rPr>
-          <w:b w:val="0"/>
-          <w:lang w:val="pt-BR"/>
-        </w:rPr>
-        <w:t xml:space="preserve"> 5</w:t>
-      </w:r>
-      <w:r>
-        <w:rPr>
-          <w:b w:val="0"/>
-          <w:lang w:val="pt-BR"/>
-        </w:rPr>
-        <w:t xml:space="preserve">. </w:t>
-      </w:r>
-      <w:r>
-        <w:rPr>
-          <w:b w:val="0"/>
-          <w:lang w:val="pt-BR"/>
-        </w:rPr>
-        <w:t>Editar Viagem</w:t>
+        <w:t>UC 5. Editar Viagem</w:t>
       </w:r>
     </w:p>
     <w:tbl>
@@ -4865,16 +3641,8 @@
               <w:rPr>
                 <w:lang w:val="pt-BR"/>
               </w:rPr>
-              <w:t xml:space="preserve">A viagem existe e o utilizador é </w:t>
-            </w:r>
-            <w:proofErr w:type="spellStart"/>
-            <w:r>
-              <w:rPr>
-                <w:lang w:val="pt-BR"/>
-              </w:rPr>
-              <w:t>OWNER</w:t>
-            </w:r>
-            <w:proofErr w:type="spellEnd"/>
+              <w:t>A viagem existe e o utilizador é OWNER</w:t>
+            </w:r>
           </w:p>
         </w:tc>
       </w:tr>
@@ -4913,16 +3681,8 @@
               <w:rPr>
                 <w:lang w:val="pt-BR"/>
               </w:rPr>
-              <w:t xml:space="preserve">Os dados atualizados ficam gravados no </w:t>
-            </w:r>
-            <w:proofErr w:type="spellStart"/>
-            <w:r>
-              <w:rPr>
-                <w:lang w:val="pt-BR"/>
-              </w:rPr>
-              <w:t>RestDB</w:t>
-            </w:r>
-            <w:proofErr w:type="spellEnd"/>
+              <w:t>Os dados atualizados ficam gravados no RestDB</w:t>
+            </w:r>
           </w:p>
         </w:tc>
       </w:tr>
@@ -4965,13 +3725,7 @@
               <w:rPr>
                 <w:lang w:val="pt-BR"/>
               </w:rPr>
-              <w:t>O utilizador a</w:t>
-            </w:r>
-            <w:r>
-              <w:rPr>
-                <w:lang w:val="pt-BR"/>
-              </w:rPr>
-              <w:t>bre a viagem e escolhe “Editar”;</w:t>
+              <w:t>O utilizador abre a viagem e escolhe “Editar”;</w:t>
             </w:r>
           </w:p>
           <w:p>
@@ -4989,25 +3743,7 @@
               <w:rPr>
                 <w:lang w:val="pt-BR"/>
               </w:rPr>
-              <w:t xml:space="preserve">A viagem </w:t>
-            </w:r>
-            <w:r>
-              <w:rPr>
-                <w:lang w:val="pt-BR"/>
-              </w:rPr>
-              <w:t>aparece</w:t>
-            </w:r>
-            <w:r>
-              <w:rPr>
-                <w:lang w:val="pt-BR"/>
-              </w:rPr>
-              <w:t xml:space="preserve"> preenchida com os dados atuais</w:t>
-            </w:r>
-            <w:r>
-              <w:rPr>
-                <w:lang w:val="pt-BR"/>
-              </w:rPr>
-              <w:t>;</w:t>
+              <w:t>A viagem aparece preenchida com os dados atuais;</w:t>
             </w:r>
           </w:p>
           <w:p>
@@ -5025,19 +3761,7 @@
               <w:rPr>
                 <w:lang w:val="pt-BR"/>
               </w:rPr>
-              <w:t>O utilizador altera e confirma e</w:t>
-            </w:r>
-            <w:r>
-              <w:rPr>
-                <w:lang w:val="pt-BR"/>
-              </w:rPr>
-              <w:t xml:space="preserve"> o sistema volta a validar o</w:t>
-            </w:r>
-            <w:r>
-              <w:rPr>
-                <w:lang w:val="pt-BR"/>
-              </w:rPr>
-              <w:t>s dados;</w:t>
+              <w:t>O utilizador altera e confirma e o sistema volta a validar os dados;</w:t>
             </w:r>
           </w:p>
           <w:p>
@@ -5055,13 +3779,7 @@
               <w:rPr>
                 <w:lang w:val="pt-BR"/>
               </w:rPr>
-              <w:t>O sistema envia a alteração</w:t>
-            </w:r>
-            <w:r>
-              <w:rPr>
-                <w:lang w:val="pt-BR"/>
-              </w:rPr>
-              <w:t>.</w:t>
+              <w:t>O sistema envia a alteração.</w:t>
             </w:r>
           </w:p>
         </w:tc>
@@ -5108,19 +3826,7 @@
               <w:rPr>
                 <w:lang w:val="pt-BR"/>
               </w:rPr>
-              <w:t>Dados inválidos: mensagem de erro</w:t>
-            </w:r>
-            <w:r>
-              <w:rPr>
-                <w:lang w:val="pt-BR"/>
-              </w:rPr>
-              <w:t>, o sistema volta a pedir os dados e nada é gravado</w:t>
-            </w:r>
-            <w:r>
-              <w:rPr>
-                <w:lang w:val="pt-BR"/>
-              </w:rPr>
-              <w:t>.</w:t>
+              <w:t>Dados inválidos: mensagem de erro, o sistema volta a pedir os dados e nada é gravado.</w:t>
             </w:r>
           </w:p>
         </w:tc>
@@ -5145,42 +3851,12 @@
           <w:lang w:val="pt-BR"/>
         </w:rPr>
       </w:pPr>
-      <w:proofErr w:type="spellStart"/>
       <w:r>
         <w:rPr>
           <w:b w:val="0"/>
           <w:lang w:val="pt-BR"/>
         </w:rPr>
-        <w:t>UC</w:t>
-      </w:r>
-      <w:proofErr w:type="spellEnd"/>
-      <w:r>
-        <w:rPr>
-          <w:b w:val="0"/>
-          <w:lang w:val="pt-BR"/>
-        </w:rPr>
-        <w:t xml:space="preserve"> 6</w:t>
-      </w:r>
-      <w:r>
-        <w:rPr>
-          <w:b w:val="0"/>
-          <w:lang w:val="pt-BR"/>
-        </w:rPr>
-        <w:t xml:space="preserve">. </w:t>
-      </w:r>
-      <w:r>
-        <w:rPr>
-          <w:b w:val="0"/>
-          <w:lang w:val="pt-BR"/>
-        </w:rPr>
-        <w:t>Apagar</w:t>
-      </w:r>
-      <w:r>
-        <w:rPr>
-          <w:b w:val="0"/>
-          <w:lang w:val="pt-BR"/>
-        </w:rPr>
-        <w:t xml:space="preserve"> Viagem</w:t>
+        <w:t>UC 6. Apagar Viagem</w:t>
       </w:r>
     </w:p>
     <w:tbl>
@@ -5235,13 +3911,7 @@
               <w:rPr>
                 <w:lang w:val="pt-BR"/>
               </w:rPr>
-              <w:t xml:space="preserve">Remove uma </w:t>
-            </w:r>
-            <w:r>
-              <w:rPr>
-                <w:lang w:val="pt-BR"/>
-              </w:rPr>
-              <w:t>viagem</w:t>
+              <w:t>Remove uma viagem</w:t>
             </w:r>
           </w:p>
         </w:tc>
@@ -5281,16 +3951,8 @@
               <w:rPr>
                 <w:lang w:val="pt-BR"/>
               </w:rPr>
-              <w:t xml:space="preserve">A viagem existe e o utilizador é </w:t>
-            </w:r>
-            <w:proofErr w:type="spellStart"/>
-            <w:r>
-              <w:rPr>
-                <w:lang w:val="pt-BR"/>
-              </w:rPr>
-              <w:t>OWNER</w:t>
-            </w:r>
-            <w:proofErr w:type="spellEnd"/>
+              <w:t>A viagem existe e o utilizador é OWNER</w:t>
+            </w:r>
           </w:p>
         </w:tc>
       </w:tr>
@@ -5504,13 +4166,7 @@
               <w:rPr>
                 <w:lang w:val="pt-BR"/>
               </w:rPr>
-              <w:t>O utilizador cancela: nada é apagado</w:t>
-            </w:r>
-            <w:r>
-              <w:rPr>
-                <w:lang w:val="pt-BR"/>
-              </w:rPr>
-              <w:t>.</w:t>
+              <w:t>O utilizador cancela: nada é apagado.</w:t>
             </w:r>
           </w:p>
         </w:tc>
@@ -5535,35 +4191,12 @@
           <w:lang w:val="pt-BR"/>
         </w:rPr>
       </w:pPr>
-      <w:proofErr w:type="spellStart"/>
       <w:r>
         <w:rPr>
           <w:b w:val="0"/>
           <w:lang w:val="pt-BR"/>
         </w:rPr>
-        <w:t>UC</w:t>
-      </w:r>
-      <w:proofErr w:type="spellEnd"/>
-      <w:r>
-        <w:rPr>
-          <w:b w:val="0"/>
-          <w:lang w:val="pt-BR"/>
-        </w:rPr>
-        <w:t xml:space="preserve"> 7</w:t>
-      </w:r>
-      <w:r>
-        <w:rPr>
-          <w:b w:val="0"/>
-          <w:lang w:val="pt-BR"/>
-        </w:rPr>
-        <w:t xml:space="preserve">. </w:t>
-      </w:r>
-      <w:r>
-        <w:rPr>
-          <w:b w:val="0"/>
-          <w:lang w:val="pt-BR"/>
-        </w:rPr>
-        <w:t>Gerir Participantes</w:t>
+        <w:t>UC 7. Gerir Participantes</w:t>
       </w:r>
     </w:p>
     <w:tbl>
@@ -5658,16 +4291,8 @@
               <w:rPr>
                 <w:lang w:val="pt-BR"/>
               </w:rPr>
-              <w:t xml:space="preserve">A viagem existe e o utilizador é </w:t>
-            </w:r>
-            <w:proofErr w:type="spellStart"/>
-            <w:r>
-              <w:rPr>
-                <w:lang w:val="pt-BR"/>
-              </w:rPr>
-              <w:t>OWNER</w:t>
-            </w:r>
-            <w:proofErr w:type="spellEnd"/>
+              <w:t>A viagem existe e o utilizador é OWNER</w:t>
+            </w:r>
           </w:p>
         </w:tc>
       </w:tr>
@@ -5706,13 +4331,7 @@
               <w:rPr>
                 <w:lang w:val="pt-BR"/>
               </w:rPr>
-              <w:t xml:space="preserve">O convidado passa a </w:t>
-            </w:r>
-            <w:r>
-              <w:rPr>
-                <w:lang w:val="pt-BR"/>
-              </w:rPr>
-              <w:t>ser um participante daquela viagem</w:t>
+              <w:t>O convidado passa a ser um participante daquela viagem</w:t>
             </w:r>
           </w:p>
         </w:tc>
@@ -5756,19 +4375,7 @@
               <w:rPr>
                 <w:lang w:val="pt-BR"/>
               </w:rPr>
-              <w:t xml:space="preserve">O utilizador </w:t>
-            </w:r>
-            <w:r>
-              <w:rPr>
-                <w:lang w:val="pt-BR"/>
-              </w:rPr>
-              <w:t>seleciona a viagem que quer adicionar um participante</w:t>
-            </w:r>
-            <w:r>
-              <w:rPr>
-                <w:lang w:val="pt-BR"/>
-              </w:rPr>
-              <w:t>;</w:t>
+              <w:t>O utilizador seleciona a viagem que quer adicionar um participante;</w:t>
             </w:r>
           </w:p>
           <w:p>
@@ -5787,21 +4394,7 @@
                 <w:lang w:val="pt-BR"/>
               </w:rPr>
               <w:lastRenderedPageBreak/>
-              <w:t xml:space="preserve">O utilizador introduz o </w:t>
-            </w:r>
-            <w:proofErr w:type="spellStart"/>
-            <w:r>
-              <w:rPr>
-                <w:lang w:val="pt-BR"/>
-              </w:rPr>
-              <w:t>email</w:t>
-            </w:r>
-            <w:proofErr w:type="spellEnd"/>
-            <w:r>
-              <w:rPr>
-                <w:lang w:val="pt-BR"/>
-              </w:rPr>
-              <w:t xml:space="preserve"> do convidado;</w:t>
+              <w:t>O utilizador introduz o email do convidado;</w:t>
             </w:r>
           </w:p>
           <w:p>
@@ -5819,13 +4412,7 @@
               <w:rPr>
                 <w:lang w:val="pt-BR"/>
               </w:rPr>
-              <w:t>A lista de participantes é atualizada</w:t>
-            </w:r>
-            <w:r>
-              <w:rPr>
-                <w:lang w:val="pt-BR"/>
-              </w:rPr>
-              <w:t>.</w:t>
+              <w:t>A lista de participantes é atualizada.</w:t>
             </w:r>
           </w:p>
         </w:tc>
@@ -5873,19 +4460,7 @@
               <w:rPr>
                 <w:lang w:val="pt-BR"/>
               </w:rPr>
-              <w:t>O convidado não existe: o sistema informa q</w:t>
-            </w:r>
-            <w:r>
-              <w:rPr>
-                <w:lang w:val="pt-BR"/>
-              </w:rPr>
-              <w:t>ue a pessoa não tem conta</w:t>
-            </w:r>
-            <w:r>
-              <w:rPr>
-                <w:lang w:val="pt-BR"/>
-              </w:rPr>
-              <w:t>.</w:t>
+              <w:t>O convidado não existe: o sistema informa que a pessoa não tem conta.</w:t>
             </w:r>
           </w:p>
           <w:p>
@@ -5903,13 +4478,7 @@
               <w:rPr>
                 <w:lang w:val="pt-BR"/>
               </w:rPr>
-              <w:t>O convidado já participa: o sistema recusa</w:t>
-            </w:r>
-            <w:r>
-              <w:rPr>
-                <w:lang w:val="pt-BR"/>
-              </w:rPr>
-              <w:t xml:space="preserve"> e indica que a pessoa já é participante daquela viagem.</w:t>
+              <w:t>O convidado já participa: o sistema recusa e indica que a pessoa já é participante daquela viagem.</w:t>
             </w:r>
           </w:p>
         </w:tc>
@@ -5934,35 +4503,12 @@
           <w:lang w:val="pt-BR"/>
         </w:rPr>
       </w:pPr>
-      <w:proofErr w:type="spellStart"/>
       <w:r>
         <w:rPr>
           <w:b w:val="0"/>
           <w:lang w:val="pt-BR"/>
         </w:rPr>
-        <w:t>UC</w:t>
-      </w:r>
-      <w:proofErr w:type="spellEnd"/>
-      <w:r>
-        <w:rPr>
-          <w:b w:val="0"/>
-          <w:lang w:val="pt-BR"/>
-        </w:rPr>
-        <w:t xml:space="preserve"> 8</w:t>
-      </w:r>
-      <w:r>
-        <w:rPr>
-          <w:b w:val="0"/>
-          <w:lang w:val="pt-BR"/>
-        </w:rPr>
-        <w:t xml:space="preserve">. </w:t>
-      </w:r>
-      <w:r>
-        <w:rPr>
-          <w:b w:val="0"/>
-          <w:lang w:val="pt-BR"/>
-        </w:rPr>
-        <w:t>Adicionar Locais</w:t>
+        <w:t>UC 8. Adicionar Locais</w:t>
       </w:r>
     </w:p>
     <w:tbl>
@@ -6017,13 +4563,7 @@
               <w:rPr>
                 <w:lang w:val="pt-BR"/>
               </w:rPr>
-              <w:t>Regist</w:t>
-            </w:r>
-            <w:r>
-              <w:rPr>
-                <w:lang w:val="pt-BR"/>
-              </w:rPr>
-              <w:t>a um local visitado numa viagem</w:t>
+              <w:t>Regista um local visitado numa viagem</w:t>
             </w:r>
           </w:p>
         </w:tc>
@@ -6109,19 +4649,7 @@
               <w:rPr>
                 <w:lang w:val="pt-BR"/>
               </w:rPr>
-              <w:t>O local fica guardado com</w:t>
-            </w:r>
-            <w:r>
-              <w:rPr>
-                <w:lang w:val="pt-BR"/>
-              </w:rPr>
-              <w:t xml:space="preserve"> categoria, avaliação e</w:t>
-            </w:r>
-            <w:r>
-              <w:rPr>
-                <w:lang w:val="pt-BR"/>
-              </w:rPr>
-              <w:t xml:space="preserve"> morada</w:t>
+              <w:t>O local fica guardado com categoria, avaliação e morada</w:t>
             </w:r>
           </w:p>
         </w:tc>
@@ -6165,13 +4693,7 @@
               <w:rPr>
                 <w:lang w:val="pt-BR"/>
               </w:rPr>
-              <w:t xml:space="preserve">O </w:t>
-            </w:r>
-            <w:r>
-              <w:rPr>
-                <w:lang w:val="pt-BR"/>
-              </w:rPr>
-              <w:t>utilizador seleciona a opção</w:t>
+              <w:t>O utilizador seleciona a opção</w:t>
             </w:r>
             <w:r>
               <w:rPr>
@@ -6183,13 +4705,7 @@
               <w:rPr>
                 <w:lang w:val="pt-BR"/>
               </w:rPr>
-              <w:t>ocal”</w:t>
-            </w:r>
-            <w:r>
-              <w:rPr>
-                <w:lang w:val="pt-BR"/>
-              </w:rPr>
-              <w:t>;</w:t>
+              <w:t>ocal”;</w:t>
             </w:r>
           </w:p>
           <w:p>
@@ -6207,21 +4723,7 @@
               <w:rPr>
                 <w:lang w:val="pt-BR"/>
               </w:rPr>
-              <w:t xml:space="preserve">O utilizador introduz o </w:t>
-            </w:r>
-            <w:proofErr w:type="spellStart"/>
-            <w:r>
-              <w:rPr>
-                <w:lang w:val="pt-BR"/>
-              </w:rPr>
-              <w:t>email</w:t>
-            </w:r>
-            <w:proofErr w:type="spellEnd"/>
-            <w:r>
-              <w:rPr>
-                <w:lang w:val="pt-BR"/>
-              </w:rPr>
-              <w:t xml:space="preserve"> do convidado;</w:t>
+              <w:t>O utilizador introduz o email do convidado;</w:t>
             </w:r>
           </w:p>
           <w:p>
@@ -6251,13 +4753,7 @@
               <w:rPr>
                 <w:lang w:val="pt-BR"/>
               </w:rPr>
-              <w:t>a</w:t>
-            </w:r>
-            <w:r>
-              <w:rPr>
-                <w:lang w:val="pt-BR"/>
-              </w:rPr>
-              <w:t xml:space="preserve"> localização</w:t>
+              <w:t>a localização</w:t>
             </w:r>
             <w:r>
               <w:rPr>
@@ -6287,13 +4783,7 @@
               <w:rPr>
                 <w:lang w:val="pt-BR"/>
               </w:rPr>
-              <w:t>O sistema obtém a morada</w:t>
-            </w:r>
-            <w:r>
-              <w:rPr>
-                <w:lang w:val="pt-BR"/>
-              </w:rPr>
-              <w:t>;</w:t>
+              <w:t>O sistema obtém a morada;</w:t>
             </w:r>
           </w:p>
           <w:p>
@@ -6311,13 +4801,7 @@
               <w:rPr>
                 <w:lang w:val="pt-BR"/>
               </w:rPr>
-              <w:t>O utilizador escolhe o nome, a categoria e a avaliação</w:t>
-            </w:r>
-            <w:r>
-              <w:rPr>
-                <w:lang w:val="pt-BR"/>
-              </w:rPr>
-              <w:t>;</w:t>
+              <w:t>O utilizador escolhe o nome, a categoria e a avaliação;</w:t>
             </w:r>
           </w:p>
           <w:p>
@@ -6360,35 +4844,12 @@
           <w:lang w:val="pt-BR"/>
         </w:rPr>
       </w:pPr>
-      <w:proofErr w:type="spellStart"/>
       <w:r>
         <w:rPr>
           <w:b w:val="0"/>
           <w:lang w:val="pt-BR"/>
         </w:rPr>
-        <w:t>UC</w:t>
-      </w:r>
-      <w:proofErr w:type="spellEnd"/>
-      <w:r>
-        <w:rPr>
-          <w:b w:val="0"/>
-          <w:lang w:val="pt-BR"/>
-        </w:rPr>
-        <w:t xml:space="preserve"> 9</w:t>
-      </w:r>
-      <w:r>
-        <w:rPr>
-          <w:b w:val="0"/>
-          <w:lang w:val="pt-BR"/>
-        </w:rPr>
-        <w:t xml:space="preserve">. </w:t>
-      </w:r>
-      <w:r>
-        <w:rPr>
-          <w:b w:val="0"/>
-          <w:lang w:val="pt-BR"/>
-        </w:rPr>
-        <w:t>Tirar e Enviar Fotografia</w:t>
+        <w:t>UC 9. Tirar e Enviar Fotografia</w:t>
       </w:r>
     </w:p>
     <w:tbl>
@@ -6489,13 +4950,7 @@
               <w:rPr>
                 <w:lang w:val="pt-BR"/>
               </w:rPr>
-              <w:t xml:space="preserve">O local </w:t>
-            </w:r>
-            <w:r>
-              <w:rPr>
-                <w:lang w:val="pt-BR"/>
-              </w:rPr>
-              <w:t xml:space="preserve">está criado e existe permissão para </w:t>
+              <w:t xml:space="preserve">O local está criado e existe permissão para </w:t>
             </w:r>
             <w:r>
               <w:rPr>
@@ -6591,13 +5046,7 @@
               <w:rPr>
                 <w:lang w:val="pt-BR"/>
               </w:rPr>
-              <w:t xml:space="preserve">O utilizador </w:t>
-            </w:r>
-            <w:r>
-              <w:rPr>
-                <w:lang w:val="pt-BR"/>
-              </w:rPr>
-              <w:t>seleciona a opção “Tirar Fotografia”</w:t>
+              <w:t>O utilizador seleciona a opção “Tirar Fotografia”</w:t>
             </w:r>
             <w:r>
               <w:rPr>
@@ -6621,21 +5070,7 @@
               <w:rPr>
                 <w:lang w:val="pt-BR"/>
               </w:rPr>
-              <w:t xml:space="preserve">O sistema abre a </w:t>
-            </w:r>
-            <w:proofErr w:type="spellStart"/>
-            <w:r>
-              <w:rPr>
-                <w:lang w:val="pt-BR"/>
-              </w:rPr>
-              <w:t>App</w:t>
-            </w:r>
-            <w:proofErr w:type="spellEnd"/>
-            <w:r>
-              <w:rPr>
-                <w:lang w:val="pt-BR"/>
-              </w:rPr>
-              <w:t xml:space="preserve"> da Câmera</w:t>
+              <w:t>O sistema abre a App da Câmera</w:t>
             </w:r>
             <w:r>
               <w:rPr>
@@ -6702,35 +5137,12 @@
           <w:lang w:val="pt-BR"/>
         </w:rPr>
       </w:pPr>
-      <w:proofErr w:type="spellStart"/>
       <w:r>
         <w:rPr>
           <w:b w:val="0"/>
           <w:lang w:val="pt-BR"/>
         </w:rPr>
-        <w:t>UC</w:t>
-      </w:r>
-      <w:proofErr w:type="spellEnd"/>
-      <w:r>
-        <w:rPr>
-          <w:b w:val="0"/>
-          <w:lang w:val="pt-BR"/>
-        </w:rPr>
-        <w:t xml:space="preserve"> 10</w:t>
-      </w:r>
-      <w:r>
-        <w:rPr>
-          <w:b w:val="0"/>
-          <w:lang w:val="pt-BR"/>
-        </w:rPr>
-        <w:t xml:space="preserve">. </w:t>
-      </w:r>
-      <w:r>
-        <w:rPr>
-          <w:b w:val="0"/>
-          <w:lang w:val="pt-BR"/>
-        </w:rPr>
-        <w:t>Avaliar Local</w:t>
+        <w:t>UC 10. Avaliar Local</w:t>
       </w:r>
     </w:p>
     <w:tbl>
@@ -6785,19 +5197,7 @@
               <w:rPr>
                 <w:lang w:val="pt-BR"/>
               </w:rPr>
-              <w:t xml:space="preserve">Acrescenta </w:t>
-            </w:r>
-            <w:r>
-              <w:rPr>
-                <w:lang w:val="pt-BR"/>
-              </w:rPr>
-              <w:t xml:space="preserve">uma </w:t>
-            </w:r>
-            <w:r>
-              <w:rPr>
-                <w:lang w:val="pt-BR"/>
-              </w:rPr>
-              <w:t>avaliação (1 a 5) a um loc</w:t>
+              <w:t>Acrescenta uma avaliação (1 a 5) a um loc</w:t>
             </w:r>
             <w:r>
               <w:rPr>
@@ -6883,13 +5283,7 @@
               <w:rPr>
                 <w:lang w:val="pt-BR"/>
               </w:rPr>
-              <w:t xml:space="preserve">A </w:t>
-            </w:r>
-            <w:r>
-              <w:rPr>
-                <w:lang w:val="pt-BR"/>
-              </w:rPr>
-              <w:t>avaliação fica guardada</w:t>
+              <w:t>A avaliação fica guardada</w:t>
             </w:r>
           </w:p>
         </w:tc>
@@ -6933,31 +5327,7 @@
               <w:rPr>
                 <w:lang w:val="pt-BR"/>
               </w:rPr>
-              <w:t>O utilizador abre o</w:t>
-            </w:r>
-            <w:r>
-              <w:rPr>
-                <w:lang w:val="pt-BR"/>
-              </w:rPr>
-              <w:t>s</w:t>
-            </w:r>
-            <w:r>
-              <w:rPr>
-                <w:lang w:val="pt-BR"/>
-              </w:rPr>
-              <w:t xml:space="preserve"> detalhe</w:t>
-            </w:r>
-            <w:r>
-              <w:rPr>
-                <w:lang w:val="pt-BR"/>
-              </w:rPr>
-              <w:t>s de um</w:t>
-            </w:r>
-            <w:r>
-              <w:rPr>
-                <w:lang w:val="pt-BR"/>
-              </w:rPr>
-              <w:t xml:space="preserve"> local;</w:t>
+              <w:t>O utilizador abre os detalhes de um local;</w:t>
             </w:r>
           </w:p>
           <w:p>
@@ -7030,36 +5400,13 @@
           <w:lang w:val="pt-BR"/>
         </w:rPr>
       </w:pPr>
-      <w:proofErr w:type="spellStart"/>
       <w:r>
         <w:rPr>
           <w:b w:val="0"/>
           <w:lang w:val="pt-BR"/>
         </w:rPr>
         <w:lastRenderedPageBreak/>
-        <w:t>UC</w:t>
-      </w:r>
-      <w:proofErr w:type="spellEnd"/>
-      <w:r>
-        <w:rPr>
-          <w:b w:val="0"/>
-          <w:lang w:val="pt-BR"/>
-        </w:rPr>
-        <w:t xml:space="preserve"> 11</w:t>
-      </w:r>
-      <w:r>
-        <w:rPr>
-          <w:b w:val="0"/>
-          <w:lang w:val="pt-BR"/>
-        </w:rPr>
-        <w:t xml:space="preserve">. </w:t>
-      </w:r>
-      <w:r>
-        <w:rPr>
-          <w:b w:val="0"/>
-          <w:lang w:val="pt-BR"/>
-        </w:rPr>
-        <w:t>Visualizar Mapa de Viagens</w:t>
+        <w:t>UC 11. Visualizar Mapa de Viagens</w:t>
       </w:r>
     </w:p>
     <w:tbl>
@@ -7114,13 +5461,7 @@
               <w:rPr>
                 <w:lang w:val="pt-BR"/>
               </w:rPr>
-              <w:t>Apresenta to</w:t>
-            </w:r>
-            <w:r>
-              <w:rPr>
-                <w:lang w:val="pt-BR"/>
-              </w:rPr>
-              <w:t>dos os locais da viagem no mapa</w:t>
+              <w:t>Apresenta todos os locais da viagem no mapa</w:t>
             </w:r>
           </w:p>
         </w:tc>
@@ -7244,19 +5585,7 @@
               <w:rPr>
                 <w:lang w:val="pt-BR"/>
               </w:rPr>
-              <w:t>O uti</w:t>
-            </w:r>
-            <w:r>
-              <w:rPr>
-                <w:lang w:val="pt-BR"/>
-              </w:rPr>
-              <w:t>lizador abre o separador “Mapa”</w:t>
-            </w:r>
-            <w:r>
-              <w:rPr>
-                <w:lang w:val="pt-BR"/>
-              </w:rPr>
-              <w:t>;</w:t>
+              <w:t>O utilizador abre o separador “Mapa”;</w:t>
             </w:r>
           </w:p>
           <w:p>
@@ -7292,13 +5621,7 @@
               <w:rPr>
                 <w:lang w:val="pt-BR"/>
               </w:rPr>
-              <w:t>O sistema desenha um marcador por local, com a cor da categoria</w:t>
-            </w:r>
-            <w:r>
-              <w:rPr>
-                <w:lang w:val="pt-BR"/>
-              </w:rPr>
-              <w:t>;</w:t>
+              <w:t>O sistema desenha um marcador por local, com a cor da categoria;</w:t>
             </w:r>
           </w:p>
           <w:p>
@@ -7316,13 +5639,7 @@
               <w:rPr>
                 <w:lang w:val="pt-BR"/>
               </w:rPr>
-              <w:t>O sistema centra o mapa no conjunto dos locais</w:t>
-            </w:r>
-            <w:r>
-              <w:rPr>
-                <w:lang w:val="pt-BR"/>
-              </w:rPr>
-              <w:t>.</w:t>
+              <w:t>O sistema centra o mapa no conjunto dos locais.</w:t>
             </w:r>
           </w:p>
         </w:tc>
@@ -7369,19 +5686,7 @@
               <w:rPr>
                 <w:lang w:val="pt-BR"/>
               </w:rPr>
-              <w:t xml:space="preserve">A viagem não tem locais: é mostrado </w:t>
-            </w:r>
-            <w:r>
-              <w:rPr>
-                <w:lang w:val="pt-BR"/>
-              </w:rPr>
-              <w:t xml:space="preserve">uma mensagem de erro e o mapa </w:t>
-            </w:r>
-            <w:r>
-              <w:rPr>
-                <w:lang w:val="pt-BR"/>
-              </w:rPr>
-              <w:t>vazio.</w:t>
+              <w:t>A viagem não tem locais: é mostrado uma mensagem de erro e o mapa vazio.</w:t>
             </w:r>
           </w:p>
           <w:p>
@@ -7424,35 +5729,12 @@
           <w:lang w:val="pt-BR"/>
         </w:rPr>
       </w:pPr>
-      <w:proofErr w:type="spellStart"/>
       <w:r>
         <w:rPr>
           <w:b w:val="0"/>
           <w:lang w:val="pt-BR"/>
         </w:rPr>
-        <w:t>UC</w:t>
-      </w:r>
-      <w:proofErr w:type="spellEnd"/>
-      <w:r>
-        <w:rPr>
-          <w:b w:val="0"/>
-          <w:lang w:val="pt-BR"/>
-        </w:rPr>
-        <w:t xml:space="preserve"> 12</w:t>
-      </w:r>
-      <w:r>
-        <w:rPr>
-          <w:b w:val="0"/>
-          <w:lang w:val="pt-BR"/>
-        </w:rPr>
-        <w:t xml:space="preserve">. </w:t>
-      </w:r>
-      <w:r>
-        <w:rPr>
-          <w:b w:val="0"/>
-          <w:lang w:val="pt-BR"/>
-        </w:rPr>
-        <w:t>Consultar Estatísticas da Viagem</w:t>
+        <w:t>UC 12. Consultar Estatísticas da Viagem</w:t>
       </w:r>
     </w:p>
     <w:tbl>
@@ -7631,13 +5913,7 @@
               <w:rPr>
                 <w:lang w:val="pt-BR"/>
               </w:rPr>
-              <w:t xml:space="preserve">O utilizador </w:t>
-            </w:r>
-            <w:r>
-              <w:rPr>
-                <w:lang w:val="pt-BR"/>
-              </w:rPr>
-              <w:t>abre o separador “Estatísticas”;</w:t>
+              <w:t>O utilizador abre o separador “Estatísticas”;</w:t>
             </w:r>
           </w:p>
           <w:p>
@@ -7673,25 +5949,7 @@
               <w:rPr>
                 <w:lang w:val="pt-BR"/>
               </w:rPr>
-              <w:t>O sistema m</w:t>
-            </w:r>
-            <w:r>
-              <w:rPr>
-                <w:lang w:val="pt-BR"/>
-              </w:rPr>
-              <w:t>ostra a distância percorrida</w:t>
-            </w:r>
-            <w:r>
-              <w:rPr>
-                <w:lang w:val="pt-BR"/>
-              </w:rPr>
-              <w:t xml:space="preserve">, o total de locais, o número de países e a avaliação </w:t>
-            </w:r>
-            <w:r>
-              <w:rPr>
-                <w:lang w:val="pt-BR"/>
-              </w:rPr>
-              <w:t>media.</w:t>
+              <w:t>O sistema mostra a distância percorrida, o total de locais, o número de países e a avaliação media.</w:t>
             </w:r>
           </w:p>
         </w:tc>
@@ -7778,30 +6036,245 @@
     </w:p>
     <w:p>
       <w:pPr>
-        <w:spacing w:after="160" w:line="259" w:lineRule="auto"/>
+        <w:pStyle w:val="heading3"/>
+        <w:numPr>
+          <w:ilvl w:val="2"/>
+          <w:numId w:val="9"/>
+        </w:numPr>
+        <w:rPr>
+          <w:lang w:val="pt-BR"/>
+        </w:rPr>
+      </w:pPr>
+      <w:r>
+        <w:rPr>
+          <w:lang w:val="pt-BR"/>
+        </w:rPr>
+        <w:lastRenderedPageBreak/>
+        <w:t>Fluxograma</w:t>
+      </w:r>
+    </w:p>
+    <w:p>
+      <w:pPr>
+        <w:pStyle w:val="p1a"/>
+        <w:ind w:left="360" w:firstLine="348"/>
+        <w:rPr>
+          <w:lang w:val="pt-BR"/>
+        </w:rPr>
+      </w:pPr>
+      <w:r>
+        <w:rPr>
+          <w:lang w:val="pt-BR"/>
+        </w:rPr>
+        <w:t>Esta secção apresenta a representação gráfica dos processos de interação com a aplicação. Os fluxogramas seguintes ilustram as decisões e os diferentes fluxos de ações na aplicação.</w:t>
+      </w:r>
+    </w:p>
+    <w:p>
+      <w:pPr>
+        <w:rPr>
+          <w:lang w:val="pt-BR"/>
+        </w:rPr>
+      </w:pPr>
+    </w:p>
+    <w:p>
+      <w:pPr>
+        <w:rPr>
+          <w:lang w:val="pt-BR"/>
+        </w:rPr>
+      </w:pPr>
+    </w:p>
+    <w:p>
+      <w:pPr>
+        <w:pStyle w:val="p1a"/>
+        <w:numPr>
+          <w:ilvl w:val="3"/>
+          <w:numId w:val="9"/>
+        </w:numPr>
+        <w:rPr>
+          <w:b/>
+          <w:bCs/>
+          <w:lang w:val="pt-BR"/>
+        </w:rPr>
+      </w:pPr>
+      <w:r>
+        <w:rPr>
+          <w:b/>
+          <w:bCs/>
+          <w:lang w:val="pt-BR"/>
+        </w:rPr>
+        <w:t xml:space="preserve">Fluxograma </w:t>
+      </w:r>
+      <w:r>
+        <w:rPr>
+          <w:b/>
+          <w:bCs/>
+          <w:lang w:val="pt-BR"/>
+        </w:rPr>
+        <w:t xml:space="preserve">- </w:t>
+      </w:r>
+      <w:r>
+        <w:rPr>
+          <w:b/>
+          <w:bCs/>
+          <w:lang w:val="pt-BR"/>
+        </w:rPr>
+        <w:t xml:space="preserve">Criar Viagem </w:t>
+      </w:r>
+    </w:p>
+    <w:p>
+      <w:pPr>
+        <w:pStyle w:val="p1a"/>
+        <w:ind w:left="360" w:firstLine="348"/>
+        <w:rPr>
+          <w:lang w:val="pt-BR"/>
+        </w:rPr>
+      </w:pPr>
+      <w:r>
+        <w:rPr>
+          <w:lang w:val="pt-BR"/>
+        </w:rPr>
+        <w:t xml:space="preserve">O seguinte fluxograma ilustra a sequencia de interações do utilizador </w:t>
+      </w:r>
+      <w:r>
+        <w:rPr>
+          <w:lang w:val="pt-BR"/>
+        </w:rPr>
+        <w:t xml:space="preserve">para criar uma nova viagem na aplicação. Detalha desde a abertura da mesma até ao </w:t>
+      </w:r>
+      <w:r>
+        <w:rPr>
+          <w:lang w:val="pt-BR"/>
+        </w:rPr>
+        <w:t>ú</w:t>
+      </w:r>
+      <w:r>
+        <w:rPr>
+          <w:lang w:val="pt-BR"/>
+        </w:rPr>
+        <w:t>ltimo passo de guardar a viagem pretendida</w:t>
+      </w:r>
+    </w:p>
+    <w:p>
+      <w:pPr>
+        <w:rPr>
+          <w:lang w:val="pt-BR"/>
+        </w:rPr>
+      </w:pPr>
+    </w:p>
+    <w:p>
+      <w:pPr>
+        <w:rPr>
+          <w:lang w:val="pt-BR"/>
+        </w:rPr>
+      </w:pPr>
+    </w:p>
+    <w:p>
+      <w:pPr>
+        <w:rPr>
+          <w:lang w:val="pt-BR"/>
+        </w:rPr>
+      </w:pPr>
+      <w:r>
+        <w:rPr>
+          <w:noProof/>
+          <w:lang w:val="pt-BR"/>
+        </w:rPr>
+        <w:drawing>
+          <wp:inline distT="0" distB="0" distL="0" distR="0" wp14:anchorId="704B04FA" wp14:editId="6F04E57C">
+            <wp:extent cx="3059703" cy="4827320"/>
+            <wp:effectExtent l="0" t="0" r="7620" b="0"/>
+            <wp:docPr id="900115429" name="Imagem 1"/>
+            <wp:cNvGraphicFramePr>
+              <a:graphicFrameLocks xmlns:a="http://schemas.openxmlformats.org/drawingml/2006/main" noChangeAspect="1"/>
+            </wp:cNvGraphicFramePr>
+            <a:graphic xmlns:a="http://schemas.openxmlformats.org/drawingml/2006/main">
+              <a:graphicData uri="http://schemas.openxmlformats.org/drawingml/2006/picture">
+                <pic:pic xmlns:pic="http://schemas.openxmlformats.org/drawingml/2006/picture">
+                  <pic:nvPicPr>
+                    <pic:cNvPr id="900115429" name="Imagem 900115429"/>
+                    <pic:cNvPicPr/>
+                  </pic:nvPicPr>
+                  <pic:blipFill>
+                    <a:blip r:embed="rId6" cstate="print">
+                      <a:extLst>
+                        <a:ext uri="{28A0092B-C50C-407E-A947-70E740481C1C}">
+                          <a14:useLocalDpi xmlns:a14="http://schemas.microsoft.com/office/drawing/2010/main" val="0"/>
+                        </a:ext>
+                      </a:extLst>
+                    </a:blip>
+                    <a:stretch>
+                      <a:fillRect/>
+                    </a:stretch>
+                  </pic:blipFill>
+                  <pic:spPr>
+                    <a:xfrm>
+                      <a:off x="0" y="0"/>
+                      <a:ext cx="3136248" cy="4948085"/>
+                    </a:xfrm>
+                    <a:prstGeom prst="rect">
+                      <a:avLst/>
+                    </a:prstGeom>
+                  </pic:spPr>
+                </pic:pic>
+              </a:graphicData>
+            </a:graphic>
+          </wp:inline>
+        </w:drawing>
+      </w:r>
+    </w:p>
+    <w:p>
+      <w:pPr>
         <w:ind w:firstLine="0"/>
-        <w:jc w:val="left"/>
-        <w:rPr>
-          <w:lang w:val="pt-BR"/>
-        </w:rPr>
-      </w:pPr>
-    </w:p>
-    <w:p>
-      <w:pPr>
-        <w:pStyle w:val="heading3"/>
-        <w:rPr>
-          <w:lang w:val="pt-BR"/>
-        </w:rPr>
-      </w:pPr>
-      <w:r>
-        <w:rPr>
-          <w:lang w:val="pt-BR"/>
-        </w:rPr>
-        <w:t>5.1.2   Fluxograma</w:t>
-      </w:r>
-    </w:p>
-    <w:p>
-      <w:pPr>
+        <w:rPr>
+          <w:lang w:val="pt-BR"/>
+        </w:rPr>
+      </w:pPr>
+    </w:p>
+    <w:p>
+      <w:pPr>
+        <w:rPr>
+          <w:b/>
+          <w:bCs/>
+          <w:lang w:val="pt-BR"/>
+        </w:rPr>
+      </w:pPr>
+    </w:p>
+    <w:p>
+      <w:pPr>
+        <w:rPr>
+          <w:b/>
+          <w:bCs/>
+          <w:lang w:val="pt-BR"/>
+        </w:rPr>
+      </w:pPr>
+      <w:r>
+        <w:rPr>
+          <w:b/>
+          <w:bCs/>
+          <w:lang w:val="pt-BR"/>
+        </w:rPr>
+        <w:lastRenderedPageBreak/>
+        <w:t xml:space="preserve">5.1.2.2  </w:t>
+      </w:r>
+      <w:r>
+        <w:rPr>
+          <w:b/>
+          <w:bCs/>
+          <w:lang w:val="pt-BR"/>
+        </w:rPr>
+        <w:t xml:space="preserve">    </w:t>
+      </w:r>
+      <w:r>
+        <w:rPr>
+          <w:b/>
+          <w:bCs/>
+          <w:lang w:val="pt-BR"/>
+        </w:rPr>
+        <w:t>Fluxograma - Criar Local Visitado</w:t>
+      </w:r>
+    </w:p>
+    <w:p>
+      <w:pPr>
+        <w:ind w:left="227" w:firstLine="481"/>
         <w:rPr>
           <w:noProof/>
           <w:lang w:val="pt-BR"/>
@@ -7865,7 +6338,7 @@
                     <pic:cNvPicPr/>
                   </pic:nvPicPr>
                   <pic:blipFill>
-                    <a:blip r:embed="rId6" cstate="print">
+                    <a:blip r:embed="rId7" cstate="print">
                       <a:extLst>
                         <a:ext uri="{28A0092B-C50C-407E-A947-70E740481C1C}">
                           <a14:useLocalDpi xmlns:a14="http://schemas.microsoft.com/office/drawing/2010/main" val="0"/>
@@ -7969,8 +6442,8 @@
           <w:lang w:val="pt-BR"/>
         </w:rPr>
       </w:pPr>
-      <w:bookmarkStart w:id="1" w:name="OLE_LINK2"/>
-      <w:bookmarkStart w:id="2" w:name="OLE_LINK3"/>
+      <w:bookmarkStart w:id="0" w:name="OLE_LINK2"/>
+      <w:bookmarkStart w:id="1" w:name="OLE_LINK3"/>
     </w:p>
     <w:p>
       <w:pPr>
@@ -8067,21 +6540,436 @@
     </w:p>
     <w:p>
       <w:pPr>
+        <w:ind w:left="227" w:firstLine="481"/>
+        <w:rPr>
+          <w:lang w:val="pt-BR"/>
+        </w:rPr>
+      </w:pPr>
+      <w:r>
+        <w:rPr>
+          <w:lang w:val="pt-BR"/>
+        </w:rPr>
+        <w:t xml:space="preserve"> </w:t>
+      </w:r>
+      <w:r>
+        <w:rPr>
+          <w:lang w:val="pt-BR"/>
+        </w:rPr>
+        <w:t xml:space="preserve">     </w:t>
+      </w:r>
+    </w:p>
+    <w:p>
+      <w:pPr>
+        <w:ind w:left="227" w:firstLine="481"/>
+        <w:rPr>
+          <w:lang w:val="pt-BR"/>
+        </w:rPr>
+      </w:pPr>
+    </w:p>
+    <w:p>
+      <w:pPr>
+        <w:ind w:left="227" w:firstLine="481"/>
+        <w:rPr>
+          <w:lang w:val="pt-BR"/>
+        </w:rPr>
+      </w:pPr>
+    </w:p>
+    <w:p>
+      <w:pPr>
+        <w:ind w:left="227" w:firstLine="481"/>
+        <w:rPr>
+          <w:lang w:val="pt-BR"/>
+        </w:rPr>
+      </w:pPr>
+    </w:p>
+    <w:p>
+      <w:pPr>
+        <w:ind w:left="227" w:firstLine="481"/>
+        <w:rPr>
+          <w:lang w:val="pt-BR"/>
+        </w:rPr>
+      </w:pPr>
+    </w:p>
+    <w:p>
+      <w:pPr>
+        <w:ind w:left="227" w:firstLine="481"/>
+        <w:rPr>
+          <w:lang w:val="pt-BR"/>
+        </w:rPr>
+      </w:pPr>
+    </w:p>
+    <w:p>
+      <w:pPr>
+        <w:ind w:left="227" w:firstLine="481"/>
+        <w:rPr>
+          <w:lang w:val="pt-BR"/>
+        </w:rPr>
+      </w:pPr>
+    </w:p>
+    <w:p>
+      <w:pPr>
+        <w:ind w:left="227" w:firstLine="481"/>
+        <w:rPr>
+          <w:lang w:val="pt-BR"/>
+        </w:rPr>
+      </w:pPr>
+    </w:p>
+    <w:p>
+      <w:pPr>
+        <w:ind w:left="227" w:firstLine="481"/>
+        <w:rPr>
+          <w:lang w:val="pt-BR"/>
+        </w:rPr>
+      </w:pPr>
+    </w:p>
+    <w:p>
+      <w:pPr>
+        <w:ind w:left="227" w:firstLine="481"/>
+        <w:rPr>
+          <w:lang w:val="pt-BR"/>
+        </w:rPr>
+      </w:pPr>
+    </w:p>
+    <w:p>
+      <w:pPr>
+        <w:rPr>
+          <w:b/>
+          <w:bCs/>
+          <w:lang w:val="pt-BR"/>
+        </w:rPr>
+      </w:pPr>
+      <w:r>
+        <w:rPr>
+          <w:b/>
+          <w:bCs/>
+          <w:lang w:val="pt-BR"/>
+        </w:rPr>
+        <w:lastRenderedPageBreak/>
+        <w:t>5.1.2.</w:t>
+      </w:r>
+      <w:r>
+        <w:rPr>
+          <w:b/>
+          <w:bCs/>
+          <w:lang w:val="pt-BR"/>
+        </w:rPr>
+        <w:t>3</w:t>
+      </w:r>
+      <w:r>
+        <w:rPr>
+          <w:b/>
+          <w:bCs/>
+          <w:lang w:val="pt-BR"/>
+        </w:rPr>
+        <w:t xml:space="preserve">  </w:t>
+      </w:r>
+      <w:r>
+        <w:rPr>
+          <w:b/>
+          <w:bCs/>
+          <w:lang w:val="pt-BR"/>
+        </w:rPr>
+        <w:t xml:space="preserve">    </w:t>
+      </w:r>
+      <w:r>
+        <w:rPr>
+          <w:b/>
+          <w:bCs/>
+          <w:lang w:val="pt-BR"/>
+        </w:rPr>
+        <w:t xml:space="preserve">Fluxograma </w:t>
+      </w:r>
+      <w:r>
+        <w:rPr>
+          <w:b/>
+          <w:bCs/>
+          <w:lang w:val="pt-BR"/>
+        </w:rPr>
+        <w:t>–</w:t>
+      </w:r>
+      <w:r>
+        <w:rPr>
+          <w:b/>
+          <w:bCs/>
+          <w:lang w:val="pt-BR"/>
+        </w:rPr>
+        <w:t xml:space="preserve"> </w:t>
+      </w:r>
+      <w:r>
+        <w:rPr>
+          <w:b/>
+          <w:bCs/>
+          <w:lang w:val="pt-BR"/>
+        </w:rPr>
+        <w:t xml:space="preserve">Consultar Detalhes </w:t>
+      </w:r>
+      <w:r>
+        <w:rPr>
+          <w:b/>
+          <w:bCs/>
+          <w:lang w:val="pt-BR"/>
+        </w:rPr>
+        <w:t>De Uma</w:t>
+      </w:r>
+      <w:r>
+        <w:rPr>
+          <w:b/>
+          <w:bCs/>
+          <w:lang w:val="pt-BR"/>
+        </w:rPr>
+        <w:t xml:space="preserve"> Viagem</w:t>
+      </w:r>
+      <w:r>
+        <w:rPr>
+          <w:b/>
+          <w:bCs/>
+          <w:lang w:val="pt-BR"/>
+        </w:rPr>
+        <w:t xml:space="preserve"> Criada</w:t>
+      </w:r>
+    </w:p>
+    <w:p>
+      <w:pPr>
+        <w:ind w:left="227" w:firstLine="481"/>
+        <w:rPr>
+          <w:noProof/>
+          <w:lang w:val="pt-BR"/>
+        </w:rPr>
+      </w:pPr>
+      <w:r>
+        <w:rPr>
+          <w:lang w:val="pt-BR"/>
+        </w:rPr>
+        <w:t xml:space="preserve">O seguinte fluxograma ilustra a sequência das interações do utilizador </w:t>
+      </w:r>
+      <w:r>
+        <w:rPr>
+          <w:lang w:val="pt-BR"/>
+        </w:rPr>
+        <w:t>para consultar os detalhes de uma viagem já criada</w:t>
+      </w:r>
+      <w:r>
+        <w:rPr>
+          <w:lang w:val="pt-BR"/>
+        </w:rPr>
+        <w:t xml:space="preserve">. </w:t>
+      </w:r>
+      <w:r>
+        <w:t xml:space="preserve">Detalha desde a seleção de uma viagem na lista </w:t>
+      </w:r>
+      <w:r>
+        <w:t>“</w:t>
+      </w:r>
+      <w:r>
+        <w:t>Minhas viagens</w:t>
+      </w:r>
+      <w:r>
+        <w:t>”</w:t>
+      </w:r>
+      <w:r>
+        <w:t xml:space="preserve"> até à consulta da informação da viagem escolhida.</w:t>
+      </w:r>
+      <w:r>
+        <w:rPr>
+          <w:noProof/>
+          <w:lang w:val="pt-BR"/>
+        </w:rPr>
+        <w:t xml:space="preserve"> </w:t>
+      </w:r>
+    </w:p>
+    <w:p>
+      <w:pPr>
+        <w:ind w:left="227" w:firstLine="481"/>
+        <w:rPr>
+          <w:noProof/>
+          <w:lang w:val="pt-BR"/>
+        </w:rPr>
+      </w:pPr>
+    </w:p>
+    <w:p>
+      <w:pPr>
+        <w:ind w:left="227" w:firstLine="481"/>
+        <w:rPr>
+          <w:noProof/>
+          <w:lang w:val="pt-BR"/>
+        </w:rPr>
+      </w:pPr>
+    </w:p>
+    <w:p>
+      <w:pPr>
+        <w:ind w:left="227" w:firstLine="481"/>
+        <w:rPr>
+          <w:noProof/>
+          <w:lang w:val="pt-BR"/>
+        </w:rPr>
+      </w:pPr>
+      <w:r>
+        <w:rPr>
+          <w:noProof/>
+          <w:lang w:val="pt-BR"/>
+        </w:rPr>
+        <w:drawing>
+          <wp:anchor distT="0" distB="0" distL="114300" distR="114300" simplePos="0" relativeHeight="251659264" behindDoc="0" locked="0" layoutInCell="1" allowOverlap="1" wp14:anchorId="255850AB" wp14:editId="25E02BBC">
+            <wp:simplePos x="0" y="0"/>
+            <wp:positionH relativeFrom="column">
+              <wp:posOffset>-97431</wp:posOffset>
+            </wp:positionH>
+            <wp:positionV relativeFrom="paragraph">
+              <wp:posOffset>145994</wp:posOffset>
+            </wp:positionV>
+            <wp:extent cx="5438982" cy="4142629"/>
+            <wp:effectExtent l="0" t="0" r="0" b="0"/>
+            <wp:wrapNone/>
+            <wp:docPr id="1902465306" name="Imagem 2"/>
+            <wp:cNvGraphicFramePr>
+              <a:graphicFrameLocks xmlns:a="http://schemas.openxmlformats.org/drawingml/2006/main" noChangeAspect="1"/>
+            </wp:cNvGraphicFramePr>
+            <a:graphic xmlns:a="http://schemas.openxmlformats.org/drawingml/2006/main">
+              <a:graphicData uri="http://schemas.openxmlformats.org/drawingml/2006/picture">
+                <pic:pic xmlns:pic="http://schemas.openxmlformats.org/drawingml/2006/picture">
+                  <pic:nvPicPr>
+                    <pic:cNvPr id="1902465306" name="Imagem 1902465306"/>
+                    <pic:cNvPicPr/>
+                  </pic:nvPicPr>
+                  <pic:blipFill>
+                    <a:blip r:embed="rId8">
+                      <a:extLst>
+                        <a:ext uri="{28A0092B-C50C-407E-A947-70E740481C1C}">
+                          <a14:useLocalDpi xmlns:a14="http://schemas.microsoft.com/office/drawing/2010/main" val="0"/>
+                        </a:ext>
+                      </a:extLst>
+                    </a:blip>
+                    <a:stretch>
+                      <a:fillRect/>
+                    </a:stretch>
+                  </pic:blipFill>
+                  <pic:spPr>
+                    <a:xfrm>
+                      <a:off x="0" y="0"/>
+                      <a:ext cx="5449176" cy="4150393"/>
+                    </a:xfrm>
+                    <a:prstGeom prst="rect">
+                      <a:avLst/>
+                    </a:prstGeom>
+                  </pic:spPr>
+                </pic:pic>
+              </a:graphicData>
+            </a:graphic>
+            <wp14:sizeRelH relativeFrom="margin">
+              <wp14:pctWidth>0</wp14:pctWidth>
+            </wp14:sizeRelH>
+            <wp14:sizeRelV relativeFrom="margin">
+              <wp14:pctHeight>0</wp14:pctHeight>
+            </wp14:sizeRelV>
+          </wp:anchor>
+        </w:drawing>
+      </w:r>
+    </w:p>
+    <w:p>
+      <w:pPr>
+        <w:ind w:left="227" w:firstLine="481"/>
+        <w:rPr>
+          <w:noProof/>
+          <w:lang w:val="pt-BR"/>
+        </w:rPr>
+      </w:pPr>
+    </w:p>
+    <w:p>
+      <w:pPr>
         <w:pStyle w:val="heading2"/>
         <w:rPr>
           <w:lang w:val="pt-BR"/>
         </w:rPr>
       </w:pPr>
-      <w:r>
-        <w:rPr>
-          <w:lang w:val="pt-BR"/>
-        </w:rPr>
-        <w:lastRenderedPageBreak/>
+    </w:p>
+    <w:p>
+      <w:pPr>
+        <w:pStyle w:val="heading2"/>
+        <w:rPr>
+          <w:lang w:val="pt-BR"/>
+        </w:rPr>
+      </w:pPr>
+    </w:p>
+    <w:p>
+      <w:pPr>
+        <w:pStyle w:val="heading2"/>
+        <w:rPr>
+          <w:lang w:val="pt-BR"/>
+        </w:rPr>
+      </w:pPr>
+    </w:p>
+    <w:p>
+      <w:pPr>
+        <w:pStyle w:val="heading2"/>
+        <w:rPr>
+          <w:lang w:val="pt-BR"/>
+        </w:rPr>
+      </w:pPr>
+    </w:p>
+    <w:p>
+      <w:pPr>
+        <w:pStyle w:val="heading2"/>
+        <w:rPr>
+          <w:lang w:val="pt-BR"/>
+        </w:rPr>
+      </w:pPr>
+    </w:p>
+    <w:p>
+      <w:pPr>
+        <w:pStyle w:val="heading2"/>
+        <w:rPr>
+          <w:lang w:val="pt-BR"/>
+        </w:rPr>
+      </w:pPr>
+    </w:p>
+    <w:p>
+      <w:pPr>
+        <w:pStyle w:val="heading2"/>
+        <w:rPr>
+          <w:lang w:val="pt-BR"/>
+        </w:rPr>
+      </w:pPr>
+    </w:p>
+    <w:p>
+      <w:pPr>
+        <w:pStyle w:val="heading2"/>
+        <w:rPr>
+          <w:lang w:val="pt-BR"/>
+        </w:rPr>
+      </w:pPr>
+    </w:p>
+    <w:p>
+      <w:pPr>
+        <w:ind w:firstLine="0"/>
+        <w:rPr>
+          <w:lang w:val="pt-BR"/>
+        </w:rPr>
+      </w:pPr>
+    </w:p>
+    <w:p>
+      <w:pPr>
+        <w:pStyle w:val="heading2"/>
+        <w:rPr>
+          <w:lang w:val="pt-BR"/>
+        </w:rPr>
+      </w:pPr>
+    </w:p>
+    <w:p>
+      <w:pPr>
+        <w:pStyle w:val="heading2"/>
+        <w:rPr>
+          <w:lang w:val="pt-BR"/>
+        </w:rPr>
+      </w:pPr>
+      <w:r>
+        <w:rPr>
+          <w:lang w:val="pt-BR"/>
+        </w:rPr>
         <w:t>5.2   Requisitos não Funcionais</w:t>
       </w:r>
     </w:p>
+    <w:bookmarkEnd w:id="0"/>
     <w:bookmarkEnd w:id="1"/>
-    <w:bookmarkEnd w:id="2"/>
     <w:p>
       <w:pPr>
         <w:pStyle w:val="heading3"/>
@@ -8136,7 +7024,7 @@
 </file>
 
 <file path=word/numbering.xml><?xml version="1.0" encoding="utf-8"?>
-<w:numbering xmlns:wpc="http://schemas.microsoft.com/office/word/2010/wordprocessingCanvas" xmlns:mc="http://schemas.openxmlformats.org/markup-compatibility/2006" xmlns:o="urn:schemas-microsoft-com:office:office" xmlns:r="http://schemas.openxmlformats.org/officeDocument/2006/relationships" xmlns:m="http://schemas.openxmlformats.org/officeDocument/2006/math" xmlns:v="urn:schemas-microsoft-com:vml" xmlns:wp14="http://schemas.microsoft.com/office/word/2010/wordprocessingDrawing" xmlns:wp="http://schemas.openxmlformats.org/drawingml/2006/wordprocessingDrawing" xmlns:w10="urn:schemas-microsoft-com:office:word" xmlns:w="http://schemas.openxmlformats.org/wordprocessingml/2006/main" xmlns:w14="http://schemas.microsoft.com/office/word/2010/wordml" xmlns:w15="http://schemas.microsoft.com/office/word/2012/wordml" xmlns:wpg="http://schemas.microsoft.com/office/word/2010/wordprocessingGroup" xmlns:wpi="http://schemas.microsoft.com/office/word/2010/wordprocessingInk" xmlns:wne="http://schemas.microsoft.com/office/word/2006/wordml" xmlns:wps="http://schemas.microsoft.com/office/word/2010/wordprocessingShape" mc:Ignorable="w14 w15 wp14">
+<w:numbering xmlns:wpc="http://schemas.microsoft.com/office/word/2010/wordprocessingCanvas" xmlns:cx="http://schemas.microsoft.com/office/drawing/2014/chartex" xmlns:cx1="http://schemas.microsoft.com/office/drawing/2015/9/8/chartex" xmlns:cx2="http://schemas.microsoft.com/office/drawing/2015/10/21/chartex" xmlns:cx3="http://schemas.microsoft.com/office/drawing/2016/5/9/chartex" xmlns:cx4="http://schemas.microsoft.com/office/drawing/2016/5/10/chartex" xmlns:cx5="http://schemas.microsoft.com/office/drawing/2016/5/11/chartex" xmlns:cx6="http://schemas.microsoft.com/office/drawing/2016/5/12/chartex" xmlns:cx7="http://schemas.microsoft.com/office/drawing/2016/5/13/chartex" xmlns:cx8="http://schemas.microsoft.com/office/drawing/2016/5/14/chartex" xmlns:mc="http://schemas.openxmlformats.org/markup-compatibility/2006" xmlns:aink="http://schemas.microsoft.com/office/drawing/2016/ink" xmlns:am3d="http://schemas.microsoft.com/office/drawing/2017/model3d" xmlns:o="urn:schemas-microsoft-com:office:office" xmlns:oel="http://schemas.microsoft.com/office/2019/extlst" xmlns:r="http://schemas.openxmlformats.org/officeDocument/2006/relationships" xmlns:m="http://schemas.openxmlformats.org/officeDocument/2006/math" xmlns:v="urn:schemas-microsoft-com:vml" xmlns:wp14="http://schemas.microsoft.com/office/word/2010/wordprocessingDrawing" xmlns:wp="http://schemas.openxmlformats.org/drawingml/2006/wordprocessingDrawing" xmlns:w10="urn:schemas-microsoft-com:office:word" xmlns:w="http://schemas.openxmlformats.org/wordprocessingml/2006/main" xmlns:w14="http://schemas.microsoft.com/office/word/2010/wordml" xmlns:w15="http://schemas.microsoft.com/office/word/2012/wordml" xmlns:w16cex="http://schemas.microsoft.com/office/word/2018/wordml/cex" xmlns:w16cid="http://schemas.microsoft.com/office/word/2016/wordml/cid" xmlns:w16="http://schemas.microsoft.com/office/word/2018/wordml" xmlns:w16du="http://schemas.microsoft.com/office/word/2023/wordml/word16du" xmlns:w16sdtdh="http://schemas.microsoft.com/office/word/2020/wordml/sdtdatahash" xmlns:w16sdtfl="http://schemas.microsoft.com/office/word/2024/wordml/sdtformatlock" xmlns:w16se="http://schemas.microsoft.com/office/word/2015/wordml/symex" xmlns:wpg="http://schemas.microsoft.com/office/word/2010/wordprocessingGroup" xmlns:wpi="http://schemas.microsoft.com/office/word/2010/wordprocessingInk" xmlns:wne="http://schemas.microsoft.com/office/word/2006/wordml" xmlns:wps="http://schemas.microsoft.com/office/word/2010/wordprocessingShape" mc:Ignorable="w14 w15 w16se w16cid w16 w16cex w16sdtdh w16sdtfl w16du wp14">
   <w:abstractNum w:abstractNumId="0" w15:restartNumberingAfterBreak="0">
     <w:nsid w:val="008F0F0F"/>
     <w:multiLevelType w:val="hybridMultilevel"/>
@@ -8871,9 +7759,9 @@
   </w:abstractNum>
   <w:abstractNum w:abstractNumId="8" w15:restartNumberingAfterBreak="0">
     <w:nsid w:val="15192468"/>
-    <w:multiLevelType w:val="hybridMultilevel"/>
-    <w:tmpl w:val="5DEA3BA0"/>
-    <w:lvl w:ilvl="0" w:tplc="0816000F">
+    <w:multiLevelType w:val="multilevel"/>
+    <w:tmpl w:val="B9463DD8"/>
+    <w:lvl w:ilvl="0">
       <w:start w:val="1"/>
       <w:numFmt w:val="decimal"/>
       <w:lvlText w:val="%1."/>
@@ -8882,77 +7770,109 @@
         <w:ind w:left="720" w:hanging="360"/>
       </w:pPr>
     </w:lvl>
-    <w:lvl w:ilvl="1" w:tplc="08160019" w:tentative="1">
-      <w:start w:val="1"/>
-      <w:numFmt w:val="lowerLetter"/>
-      <w:lvlText w:val="%2."/>
-      <w:lvlJc w:val="left"/>
-      <w:pPr>
-        <w:ind w:left="1440" w:hanging="360"/>
-      </w:pPr>
-    </w:lvl>
-    <w:lvl w:ilvl="2" w:tplc="0816001B" w:tentative="1">
-      <w:start w:val="1"/>
-      <w:numFmt w:val="lowerRoman"/>
-      <w:lvlText w:val="%3."/>
-      <w:lvlJc w:val="right"/>
-      <w:pPr>
-        <w:ind w:left="2160" w:hanging="180"/>
-      </w:pPr>
-    </w:lvl>
-    <w:lvl w:ilvl="3" w:tplc="0816000F" w:tentative="1">
-      <w:start w:val="1"/>
-      <w:numFmt w:val="decimal"/>
-      <w:lvlText w:val="%4."/>
-      <w:lvlJc w:val="left"/>
-      <w:pPr>
-        <w:ind w:left="2880" w:hanging="360"/>
-      </w:pPr>
-    </w:lvl>
-    <w:lvl w:ilvl="4" w:tplc="08160019" w:tentative="1">
-      <w:start w:val="1"/>
-      <w:numFmt w:val="lowerLetter"/>
-      <w:lvlText w:val="%5."/>
-      <w:lvlJc w:val="left"/>
-      <w:pPr>
-        <w:ind w:left="3600" w:hanging="360"/>
-      </w:pPr>
-    </w:lvl>
-    <w:lvl w:ilvl="5" w:tplc="0816001B" w:tentative="1">
-      <w:start w:val="1"/>
-      <w:numFmt w:val="lowerRoman"/>
-      <w:lvlText w:val="%6."/>
-      <w:lvlJc w:val="right"/>
-      <w:pPr>
-        <w:ind w:left="4320" w:hanging="180"/>
-      </w:pPr>
-    </w:lvl>
-    <w:lvl w:ilvl="6" w:tplc="0816000F" w:tentative="1">
-      <w:start w:val="1"/>
-      <w:numFmt w:val="decimal"/>
-      <w:lvlText w:val="%7."/>
-      <w:lvlJc w:val="left"/>
-      <w:pPr>
-        <w:ind w:left="5040" w:hanging="360"/>
-      </w:pPr>
-    </w:lvl>
-    <w:lvl w:ilvl="7" w:tplc="08160019" w:tentative="1">
-      <w:start w:val="1"/>
-      <w:numFmt w:val="lowerLetter"/>
-      <w:lvlText w:val="%8."/>
-      <w:lvlJc w:val="left"/>
-      <w:pPr>
-        <w:ind w:left="5760" w:hanging="360"/>
-      </w:pPr>
-    </w:lvl>
-    <w:lvl w:ilvl="8" w:tplc="0816001B" w:tentative="1">
-      <w:start w:val="1"/>
-      <w:numFmt w:val="lowerRoman"/>
-      <w:lvlText w:val="%9."/>
-      <w:lvlJc w:val="right"/>
-      <w:pPr>
-        <w:ind w:left="6480" w:hanging="180"/>
-      </w:pPr>
+    <w:lvl w:ilvl="1">
+      <w:start w:val="1"/>
+      <w:numFmt w:val="decimal"/>
+      <w:isLgl/>
+      <w:lvlText w:val="%1.%2"/>
+      <w:lvlJc w:val="left"/>
+      <w:pPr>
+        <w:ind w:left="908" w:hanging="548"/>
+      </w:pPr>
+      <w:rPr>
+        <w:rFonts w:hint="default"/>
+      </w:rPr>
+    </w:lvl>
+    <w:lvl w:ilvl="2">
+      <w:start w:val="2"/>
+      <w:numFmt w:val="decimal"/>
+      <w:isLgl/>
+      <w:lvlText w:val="%1.%2.%3"/>
+      <w:lvlJc w:val="left"/>
+      <w:pPr>
+        <w:ind w:left="1080" w:hanging="720"/>
+      </w:pPr>
+      <w:rPr>
+        <w:rFonts w:hint="default"/>
+      </w:rPr>
+    </w:lvl>
+    <w:lvl w:ilvl="3">
+      <w:start w:val="1"/>
+      <w:numFmt w:val="decimal"/>
+      <w:isLgl/>
+      <w:lvlText w:val="%1.%2.%3.%4"/>
+      <w:lvlJc w:val="left"/>
+      <w:pPr>
+        <w:ind w:left="1080" w:hanging="720"/>
+      </w:pPr>
+      <w:rPr>
+        <w:rFonts w:hint="default"/>
+      </w:rPr>
+    </w:lvl>
+    <w:lvl w:ilvl="4">
+      <w:start w:val="1"/>
+      <w:numFmt w:val="decimal"/>
+      <w:isLgl/>
+      <w:lvlText w:val="%1.%2.%3.%4.%5"/>
+      <w:lvlJc w:val="left"/>
+      <w:pPr>
+        <w:ind w:left="1080" w:hanging="720"/>
+      </w:pPr>
+      <w:rPr>
+        <w:rFonts w:hint="default"/>
+      </w:rPr>
+    </w:lvl>
+    <w:lvl w:ilvl="5">
+      <w:start w:val="1"/>
+      <w:numFmt w:val="decimal"/>
+      <w:isLgl/>
+      <w:lvlText w:val="%1.%2.%3.%4.%5.%6"/>
+      <w:lvlJc w:val="left"/>
+      <w:pPr>
+        <w:ind w:left="1440" w:hanging="1080"/>
+      </w:pPr>
+      <w:rPr>
+        <w:rFonts w:hint="default"/>
+      </w:rPr>
+    </w:lvl>
+    <w:lvl w:ilvl="6">
+      <w:start w:val="1"/>
+      <w:numFmt w:val="decimal"/>
+      <w:isLgl/>
+      <w:lvlText w:val="%1.%2.%3.%4.%5.%6.%7"/>
+      <w:lvlJc w:val="left"/>
+      <w:pPr>
+        <w:ind w:left="1440" w:hanging="1080"/>
+      </w:pPr>
+      <w:rPr>
+        <w:rFonts w:hint="default"/>
+      </w:rPr>
+    </w:lvl>
+    <w:lvl w:ilvl="7">
+      <w:start w:val="1"/>
+      <w:numFmt w:val="decimal"/>
+      <w:isLgl/>
+      <w:lvlText w:val="%1.%2.%3.%4.%5.%6.%7.%8"/>
+      <w:lvlJc w:val="left"/>
+      <w:pPr>
+        <w:ind w:left="1800" w:hanging="1440"/>
+      </w:pPr>
+      <w:rPr>
+        <w:rFonts w:hint="default"/>
+      </w:rPr>
+    </w:lvl>
+    <w:lvl w:ilvl="8">
+      <w:start w:val="1"/>
+      <w:numFmt w:val="decimal"/>
+      <w:isLgl/>
+      <w:lvlText w:val="%1.%2.%3.%4.%5.%6.%7.%8.%9"/>
+      <w:lvlJc w:val="left"/>
+      <w:pPr>
+        <w:ind w:left="1800" w:hanging="1440"/>
+      </w:pPr>
+      <w:rPr>
+        <w:rFonts w:hint="default"/>
+      </w:rPr>
     </w:lvl>
   </w:abstractNum>
   <w:abstractNum w:abstractNumId="9" w15:restartNumberingAfterBreak="0">
@@ -10439,6 +9359,119 @@
     </w:lvl>
   </w:abstractNum>
   <w:abstractNum w:abstractNumId="23" w15:restartNumberingAfterBreak="0">
+    <w:nsid w:val="57760775"/>
+    <w:multiLevelType w:val="multilevel"/>
+    <w:tmpl w:val="76446EB6"/>
+    <w:lvl w:ilvl="0">
+      <w:start w:val="5"/>
+      <w:numFmt w:val="decimal"/>
+      <w:lvlText w:val="%1"/>
+      <w:lvlJc w:val="left"/>
+      <w:pPr>
+        <w:ind w:left="570" w:hanging="570"/>
+      </w:pPr>
+      <w:rPr>
+        <w:rFonts w:hint="default"/>
+      </w:rPr>
+    </w:lvl>
+    <w:lvl w:ilvl="1">
+      <w:start w:val="1"/>
+      <w:numFmt w:val="decimal"/>
+      <w:lvlText w:val="%1.%2"/>
+      <w:lvlJc w:val="left"/>
+      <w:pPr>
+        <w:ind w:left="570" w:hanging="570"/>
+      </w:pPr>
+      <w:rPr>
+        <w:rFonts w:hint="default"/>
+      </w:rPr>
+    </w:lvl>
+    <w:lvl w:ilvl="2">
+      <w:start w:val="2"/>
+      <w:numFmt w:val="decimal"/>
+      <w:lvlText w:val="%1.%2.%3"/>
+      <w:lvlJc w:val="left"/>
+      <w:pPr>
+        <w:ind w:left="720" w:hanging="720"/>
+      </w:pPr>
+      <w:rPr>
+        <w:rFonts w:hint="default"/>
+      </w:rPr>
+    </w:lvl>
+    <w:lvl w:ilvl="3">
+      <w:start w:val="3"/>
+      <w:numFmt w:val="decimal"/>
+      <w:lvlText w:val="%1.%2.%3.%4"/>
+      <w:lvlJc w:val="left"/>
+      <w:pPr>
+        <w:ind w:left="720" w:hanging="720"/>
+      </w:pPr>
+      <w:rPr>
+        <w:rFonts w:hint="default"/>
+      </w:rPr>
+    </w:lvl>
+    <w:lvl w:ilvl="4">
+      <w:start w:val="1"/>
+      <w:numFmt w:val="decimal"/>
+      <w:lvlText w:val="%1.%2.%3.%4.%5"/>
+      <w:lvlJc w:val="left"/>
+      <w:pPr>
+        <w:ind w:left="720" w:hanging="720"/>
+      </w:pPr>
+      <w:rPr>
+        <w:rFonts w:hint="default"/>
+      </w:rPr>
+    </w:lvl>
+    <w:lvl w:ilvl="5">
+      <w:start w:val="1"/>
+      <w:numFmt w:val="decimal"/>
+      <w:lvlText w:val="%1.%2.%3.%4.%5.%6"/>
+      <w:lvlJc w:val="left"/>
+      <w:pPr>
+        <w:ind w:left="1080" w:hanging="1080"/>
+      </w:pPr>
+      <w:rPr>
+        <w:rFonts w:hint="default"/>
+      </w:rPr>
+    </w:lvl>
+    <w:lvl w:ilvl="6">
+      <w:start w:val="1"/>
+      <w:numFmt w:val="decimal"/>
+      <w:lvlText w:val="%1.%2.%3.%4.%5.%6.%7"/>
+      <w:lvlJc w:val="left"/>
+      <w:pPr>
+        <w:ind w:left="1080" w:hanging="1080"/>
+      </w:pPr>
+      <w:rPr>
+        <w:rFonts w:hint="default"/>
+      </w:rPr>
+    </w:lvl>
+    <w:lvl w:ilvl="7">
+      <w:start w:val="1"/>
+      <w:numFmt w:val="decimal"/>
+      <w:lvlText w:val="%1.%2.%3.%4.%5.%6.%7.%8"/>
+      <w:lvlJc w:val="left"/>
+      <w:pPr>
+        <w:ind w:left="1440" w:hanging="1440"/>
+      </w:pPr>
+      <w:rPr>
+        <w:rFonts w:hint="default"/>
+      </w:rPr>
+    </w:lvl>
+    <w:lvl w:ilvl="8">
+      <w:start w:val="1"/>
+      <w:numFmt w:val="decimal"/>
+      <w:lvlText w:val="%1.%2.%3.%4.%5.%6.%7.%8.%9"/>
+      <w:lvlJc w:val="left"/>
+      <w:pPr>
+        <w:ind w:left="1440" w:hanging="1440"/>
+      </w:pPr>
+      <w:rPr>
+        <w:rFonts w:hint="default"/>
+      </w:rPr>
+    </w:lvl>
+  </w:abstractNum>
+  <w:abstractNum w:abstractNumId="24" w15:restartNumberingAfterBreak="0">
     <w:nsid w:val="579B0F2B"/>
     <w:multiLevelType w:val="multilevel"/>
     <w:tmpl w:val="2C16CF1E"/>
@@ -10551,7 +9584,7 @@
       </w:rPr>
     </w:lvl>
   </w:abstractNum>
-  <w:abstractNum w:abstractNumId="24" w15:restartNumberingAfterBreak="0">
+  <w:abstractNum w:abstractNumId="25" w15:restartNumberingAfterBreak="0">
     <w:nsid w:val="5AEF5F0E"/>
     <w:multiLevelType w:val="multilevel"/>
     <w:tmpl w:val="33FA766A"/>
@@ -10669,7 +9702,7 @@
       </w:rPr>
     </w:lvl>
   </w:abstractNum>
-  <w:abstractNum w:abstractNumId="25" w15:restartNumberingAfterBreak="0">
+  <w:abstractNum w:abstractNumId="26" w15:restartNumberingAfterBreak="0">
     <w:nsid w:val="67212F69"/>
     <w:multiLevelType w:val="multilevel"/>
     <w:tmpl w:val="30244EE8"/>
@@ -10782,7 +9815,7 @@
       </w:rPr>
     </w:lvl>
   </w:abstractNum>
-  <w:abstractNum w:abstractNumId="26" w15:restartNumberingAfterBreak="0">
+  <w:abstractNum w:abstractNumId="27" w15:restartNumberingAfterBreak="0">
     <w:nsid w:val="67A74286"/>
     <w:multiLevelType w:val="multilevel"/>
     <w:tmpl w:val="33FA766A"/>
@@ -10900,7 +9933,7 @@
       </w:rPr>
     </w:lvl>
   </w:abstractNum>
-  <w:abstractNum w:abstractNumId="27" w15:restartNumberingAfterBreak="0">
+  <w:abstractNum w:abstractNumId="28" w15:restartNumberingAfterBreak="0">
     <w:nsid w:val="6DF658A5"/>
     <w:multiLevelType w:val="multilevel"/>
     <w:tmpl w:val="33FA766A"/>
@@ -11018,7 +10051,7 @@
       </w:rPr>
     </w:lvl>
   </w:abstractNum>
-  <w:abstractNum w:abstractNumId="28" w15:restartNumberingAfterBreak="0">
+  <w:abstractNum w:abstractNumId="29" w15:restartNumberingAfterBreak="0">
     <w:nsid w:val="6E253DD8"/>
     <w:multiLevelType w:val="multilevel"/>
     <w:tmpl w:val="33FA766A"/>
@@ -11136,7 +10169,7 @@
       </w:rPr>
     </w:lvl>
   </w:abstractNum>
-  <w:abstractNum w:abstractNumId="29" w15:restartNumberingAfterBreak="0">
+  <w:abstractNum w:abstractNumId="30" w15:restartNumberingAfterBreak="0">
     <w:nsid w:val="7301321B"/>
     <w:multiLevelType w:val="multilevel"/>
     <w:tmpl w:val="0816001F"/>
@@ -11222,7 +10255,7 @@
       </w:pPr>
     </w:lvl>
   </w:abstractNum>
-  <w:abstractNum w:abstractNumId="30" w15:restartNumberingAfterBreak="0">
+  <w:abstractNum w:abstractNumId="31" w15:restartNumberingAfterBreak="0">
     <w:nsid w:val="798409D0"/>
     <w:multiLevelType w:val="hybridMultilevel"/>
     <w:tmpl w:val="A8484A4A"/>
@@ -11311,7 +10344,7 @@
       </w:pPr>
     </w:lvl>
   </w:abstractNum>
-  <w:abstractNum w:abstractNumId="31" w15:restartNumberingAfterBreak="0">
+  <w:abstractNum w:abstractNumId="32" w15:restartNumberingAfterBreak="0">
     <w:nsid w:val="7EA54D59"/>
     <w:multiLevelType w:val="hybridMultilevel"/>
     <w:tmpl w:val="FBA0BF06"/>
@@ -11400,107 +10433,110 @@
       </w:pPr>
     </w:lvl>
   </w:abstractNum>
-  <w:num w:numId="1">
+  <w:num w:numId="1" w16cid:durableId="26373151">
     <w:abstractNumId w:val="12"/>
   </w:num>
-  <w:num w:numId="2">
+  <w:num w:numId="2" w16cid:durableId="1272979160">
+    <w:abstractNumId w:val="31"/>
+  </w:num>
+  <w:num w:numId="3" w16cid:durableId="1873108158">
+    <w:abstractNumId w:val="5"/>
+  </w:num>
+  <w:num w:numId="4" w16cid:durableId="810829014">
+    <w:abstractNumId w:val="4"/>
+  </w:num>
+  <w:num w:numId="5" w16cid:durableId="81343595">
+    <w:abstractNumId w:val="32"/>
+  </w:num>
+  <w:num w:numId="6" w16cid:durableId="586303159">
+    <w:abstractNumId w:val="11"/>
+  </w:num>
+  <w:num w:numId="7" w16cid:durableId="888420301">
+    <w:abstractNumId w:val="0"/>
+  </w:num>
+  <w:num w:numId="8" w16cid:durableId="863246469">
+    <w:abstractNumId w:val="6"/>
+  </w:num>
+  <w:num w:numId="9" w16cid:durableId="842624272">
+    <w:abstractNumId w:val="8"/>
+  </w:num>
+  <w:num w:numId="10" w16cid:durableId="1169293522">
+    <w:abstractNumId w:val="7"/>
+  </w:num>
+  <w:num w:numId="11" w16cid:durableId="800541037">
     <w:abstractNumId w:val="30"/>
   </w:num>
-  <w:num w:numId="3">
-    <w:abstractNumId w:val="5"/>
+  <w:num w:numId="12" w16cid:durableId="1801024542">
+    <w:abstractNumId w:val="24"/>
   </w:num>
-  <w:num w:numId="4">
-    <w:abstractNumId w:val="4"/>
+  <w:num w:numId="13" w16cid:durableId="2058316540">
+    <w:abstractNumId w:val="27"/>
   </w:num>
-  <w:num w:numId="5">
-    <w:abstractNumId w:val="31"/>
+  <w:num w:numId="14" w16cid:durableId="742795918">
+    <w:abstractNumId w:val="10"/>
   </w:num>
-  <w:num w:numId="6">
-    <w:abstractNumId w:val="11"/>
+  <w:num w:numId="15" w16cid:durableId="538705959">
+    <w:abstractNumId w:val="26"/>
   </w:num>
-  <w:num w:numId="7">
-    <w:abstractNumId w:val="0"/>
+  <w:num w:numId="16" w16cid:durableId="1055006750">
+    <w:abstractNumId w:val="16"/>
   </w:num>
-  <w:num w:numId="8">
-    <w:abstractNumId w:val="6"/>
+  <w:num w:numId="17" w16cid:durableId="334306441">
+    <w:abstractNumId w:val="21"/>
   </w:num>
-  <w:num w:numId="9">
-    <w:abstractNumId w:val="8"/>
+  <w:num w:numId="18" w16cid:durableId="428696525">
+    <w:abstractNumId w:val="28"/>
   </w:num>
-  <w:num w:numId="10">
-    <w:abstractNumId w:val="7"/>
+  <w:num w:numId="19" w16cid:durableId="1193768418">
+    <w:abstractNumId w:val="1"/>
   </w:num>
-  <w:num w:numId="11">
+  <w:num w:numId="20" w16cid:durableId="42288215">
+    <w:abstractNumId w:val="22"/>
+  </w:num>
+  <w:num w:numId="21" w16cid:durableId="1941984767">
     <w:abstractNumId w:val="29"/>
   </w:num>
-  <w:num w:numId="12">
-    <w:abstractNumId w:val="23"/>
-  </w:num>
-  <w:num w:numId="13">
-    <w:abstractNumId w:val="26"/>
-  </w:num>
-  <w:num w:numId="14">
-    <w:abstractNumId w:val="10"/>
-  </w:num>
-  <w:num w:numId="15">
+  <w:num w:numId="22" w16cid:durableId="519048019">
     <w:abstractNumId w:val="25"/>
   </w:num>
-  <w:num w:numId="16">
-    <w:abstractNumId w:val="16"/>
-  </w:num>
-  <w:num w:numId="17">
-    <w:abstractNumId w:val="21"/>
-  </w:num>
-  <w:num w:numId="18">
-    <w:abstractNumId w:val="27"/>
-  </w:num>
-  <w:num w:numId="19">
-    <w:abstractNumId w:val="1"/>
-  </w:num>
-  <w:num w:numId="20">
-    <w:abstractNumId w:val="22"/>
-  </w:num>
-  <w:num w:numId="21">
-    <w:abstractNumId w:val="28"/>
-  </w:num>
-  <w:num w:numId="22">
-    <w:abstractNumId w:val="24"/>
-  </w:num>
-  <w:num w:numId="23">
+  <w:num w:numId="23" w16cid:durableId="1020277472">
     <w:abstractNumId w:val="14"/>
   </w:num>
-  <w:num w:numId="24">
+  <w:num w:numId="24" w16cid:durableId="701981843">
     <w:abstractNumId w:val="17"/>
   </w:num>
-  <w:num w:numId="25">
+  <w:num w:numId="25" w16cid:durableId="642201230">
     <w:abstractNumId w:val="13"/>
   </w:num>
-  <w:num w:numId="26">
+  <w:num w:numId="26" w16cid:durableId="1142238471">
     <w:abstractNumId w:val="18"/>
   </w:num>
-  <w:num w:numId="27">
+  <w:num w:numId="27" w16cid:durableId="373893830">
     <w:abstractNumId w:val="15"/>
   </w:num>
-  <w:num w:numId="28">
+  <w:num w:numId="28" w16cid:durableId="1097411305">
     <w:abstractNumId w:val="19"/>
   </w:num>
-  <w:num w:numId="29">
+  <w:num w:numId="29" w16cid:durableId="1698039966">
     <w:abstractNumId w:val="2"/>
   </w:num>
-  <w:num w:numId="30">
+  <w:num w:numId="30" w16cid:durableId="1106118741">
     <w:abstractNumId w:val="20"/>
   </w:num>
-  <w:num w:numId="31">
+  <w:num w:numId="31" w16cid:durableId="236402622">
     <w:abstractNumId w:val="3"/>
   </w:num>
-  <w:num w:numId="32">
+  <w:num w:numId="32" w16cid:durableId="103619030">
     <w:abstractNumId w:val="9"/>
+  </w:num>
+  <w:num w:numId="33" w16cid:durableId="1820537991">
+    <w:abstractNumId w:val="23"/>
   </w:num>
 </w:numbering>
 </file>
 
 <file path=word/styles.xml><?xml version="1.0" encoding="utf-8"?>
-<w:styles xmlns:mc="http://schemas.openxmlformats.org/markup-compatibility/2006" xmlns:r="http://schemas.openxmlformats.org/officeDocument/2006/relationships" xmlns:w="http://schemas.openxmlformats.org/wordprocessingml/2006/main" xmlns:w14="http://schemas.microsoft.com/office/word/2010/wordml" xmlns:w15="http://schemas.microsoft.com/office/word/2012/wordml" mc:Ignorable="w14 w15">
+<w:styles xmlns:mc="http://schemas.openxmlformats.org/markup-compatibility/2006" xmlns:r="http://schemas.openxmlformats.org/officeDocument/2006/relationships" xmlns:w="http://schemas.openxmlformats.org/wordprocessingml/2006/main" xmlns:w14="http://schemas.microsoft.com/office/word/2010/wordml" xmlns:w15="http://schemas.microsoft.com/office/word/2012/wordml" xmlns:w16cex="http://schemas.microsoft.com/office/word/2018/wordml/cex" xmlns:w16cid="http://schemas.microsoft.com/office/word/2016/wordml/cid" xmlns:w16="http://schemas.microsoft.com/office/word/2018/wordml" xmlns:w16du="http://schemas.microsoft.com/office/word/2023/wordml/word16du" xmlns:w16sdtdh="http://schemas.microsoft.com/office/word/2020/wordml/sdtdatahash" xmlns:w16sdtfl="http://schemas.microsoft.com/office/word/2024/wordml/sdtformatlock" xmlns:w16se="http://schemas.microsoft.com/office/word/2015/wordml/symex" mc:Ignorable="w14 w15 w16se w16cid w16 w16cex w16sdtdh w16sdtfl w16du">
   <w:docDefaults>
     <w:rPrDefault>
       <w:rPr>
@@ -11516,7 +10552,7 @@
       </w:pPr>
     </w:pPrDefault>
   </w:docDefaults>
-  <w:latentStyles w:defLockedState="0" w:defUIPriority="99" w:defSemiHidden="0" w:defUnhideWhenUsed="0" w:defQFormat="0" w:count="371">
+  <w:latentStyles w:defLockedState="0" w:defUIPriority="99" w:defSemiHidden="0" w:defUnhideWhenUsed="0" w:defQFormat="0" w:count="376">
     <w:lsdException w:name="Normal" w:uiPriority="0" w:qFormat="1"/>
     <w:lsdException w:name="heading 1" w:uiPriority="9" w:qFormat="1"/>
     <w:lsdException w:name="heading 2" w:semiHidden="1" w:uiPriority="9" w:unhideWhenUsed="1" w:qFormat="1"/>
@@ -11888,6 +10924,11 @@
     <w:lsdException w:name="List Table 5 Dark Accent 6" w:uiPriority="50"/>
     <w:lsdException w:name="List Table 6 Colorful Accent 6" w:uiPriority="51"/>
     <w:lsdException w:name="List Table 7 Colorful Accent 6" w:uiPriority="52"/>
+    <w:lsdException w:name="Mention" w:semiHidden="1" w:unhideWhenUsed="1"/>
+    <w:lsdException w:name="Smart Hyperlink" w:semiHidden="1" w:unhideWhenUsed="1"/>
+    <w:lsdException w:name="Hashtag" w:semiHidden="1" w:unhideWhenUsed="1"/>
+    <w:lsdException w:name="Unresolved Mention" w:semiHidden="1" w:unhideWhenUsed="1"/>
+    <w:lsdException w:name="Smart Link" w:semiHidden="1" w:unhideWhenUsed="1"/>
   </w:latentStyles>
   <w:style w:type="paragraph" w:default="1" w:styleId="Normal">
     <w:name w:val="Normal"/>
@@ -11905,10 +10946,9 @@
       <w:lang w:val="en-US" w:eastAsia="de-DE"/>
     </w:rPr>
   </w:style>
-  <w:style w:type="character" w:default="1" w:styleId="Fontepargpadro">
+  <w:style w:type="character" w:default="1" w:styleId="Tipodeletrapredefinidodopargrafo">
     <w:name w:val="Default Paragraph Font"/>
     <w:uiPriority w:val="1"/>
-    <w:semiHidden/>
     <w:unhideWhenUsed/>
   </w:style>
   <w:style w:type="table" w:default="1" w:styleId="Tabelanormal">

</xml_diff>

<commit_message>
Atualiazação Relatório - Arquitetura Física
</commit_message>
<xml_diff>
--- a/Documentation/Relatório-DSSMV-2025-27_2DB_1250771_1251355.docx
+++ b/Documentation/Relatório-DSSMV-2025-27_2DB_1250771_1251355.docx
@@ -1,6 +1,6 @@
 
 <file path=word/document.xml><?xml version="1.0" encoding="utf-8"?>
-<w:document xmlns:wpc="http://schemas.microsoft.com/office/word/2010/wordprocessingCanvas" xmlns:mc="http://schemas.openxmlformats.org/markup-compatibility/2006" xmlns:o="urn:schemas-microsoft-com:office:office" xmlns:r="http://schemas.openxmlformats.org/officeDocument/2006/relationships" xmlns:m="http://schemas.openxmlformats.org/officeDocument/2006/math" xmlns:v="urn:schemas-microsoft-com:vml" xmlns:wp14="http://schemas.microsoft.com/office/word/2010/wordprocessingDrawing" xmlns:wp="http://schemas.openxmlformats.org/drawingml/2006/wordprocessingDrawing" xmlns:w10="urn:schemas-microsoft-com:office:word" xmlns:w="http://schemas.openxmlformats.org/wordprocessingml/2006/main" xmlns:w14="http://schemas.microsoft.com/office/word/2010/wordml" xmlns:w15="http://schemas.microsoft.com/office/word/2012/wordml" xmlns:wpg="http://schemas.microsoft.com/office/word/2010/wordprocessingGroup" xmlns:wpi="http://schemas.microsoft.com/office/word/2010/wordprocessingInk" xmlns:wne="http://schemas.microsoft.com/office/word/2006/wordml" xmlns:wps="http://schemas.microsoft.com/office/word/2010/wordprocessingShape" mc:Ignorable="w14 w15 wp14">
+<w:document xmlns:wpc="http://schemas.microsoft.com/office/word/2010/wordprocessingCanvas" xmlns:cx="http://schemas.microsoft.com/office/drawing/2014/chartex" xmlns:cx1="http://schemas.microsoft.com/office/drawing/2015/9/8/chartex" xmlns:cx2="http://schemas.microsoft.com/office/drawing/2015/10/21/chartex" xmlns:cx3="http://schemas.microsoft.com/office/drawing/2016/5/9/chartex" xmlns:cx4="http://schemas.microsoft.com/office/drawing/2016/5/10/chartex" xmlns:cx5="http://schemas.microsoft.com/office/drawing/2016/5/11/chartex" xmlns:cx6="http://schemas.microsoft.com/office/drawing/2016/5/12/chartex" xmlns:cx7="http://schemas.microsoft.com/office/drawing/2016/5/13/chartex" xmlns:cx8="http://schemas.microsoft.com/office/drawing/2016/5/14/chartex" xmlns:mc="http://schemas.openxmlformats.org/markup-compatibility/2006" xmlns:aink="http://schemas.microsoft.com/office/drawing/2016/ink" xmlns:am3d="http://schemas.microsoft.com/office/drawing/2017/model3d" xmlns:o="urn:schemas-microsoft-com:office:office" xmlns:oel="http://schemas.microsoft.com/office/2019/extlst" xmlns:r="http://schemas.openxmlformats.org/officeDocument/2006/relationships" xmlns:m="http://schemas.openxmlformats.org/officeDocument/2006/math" xmlns:v="urn:schemas-microsoft-com:vml" xmlns:wp14="http://schemas.microsoft.com/office/word/2010/wordprocessingDrawing" xmlns:wp="http://schemas.openxmlformats.org/drawingml/2006/wordprocessingDrawing" xmlns:w10="urn:schemas-microsoft-com:office:word" xmlns:w="http://schemas.openxmlformats.org/wordprocessingml/2006/main" xmlns:w14="http://schemas.microsoft.com/office/word/2010/wordml" xmlns:w15="http://schemas.microsoft.com/office/word/2012/wordml" xmlns:w16cex="http://schemas.microsoft.com/office/word/2018/wordml/cex" xmlns:w16cid="http://schemas.microsoft.com/office/word/2016/wordml/cid" xmlns:w16="http://schemas.microsoft.com/office/word/2018/wordml" xmlns:w16du="http://schemas.microsoft.com/office/word/2023/wordml/word16du" xmlns:w16sdtdh="http://schemas.microsoft.com/office/word/2020/wordml/sdtdatahash" xmlns:w16sdtfl="http://schemas.microsoft.com/office/word/2024/wordml/sdtformatlock" xmlns:w16se="http://schemas.microsoft.com/office/word/2015/wordml/symex" xmlns:wpg="http://schemas.microsoft.com/office/word/2010/wordprocessingGroup" xmlns:wpi="http://schemas.microsoft.com/office/word/2010/wordprocessingInk" xmlns:wne="http://schemas.microsoft.com/office/word/2006/wordml" xmlns:wps="http://schemas.microsoft.com/office/word/2010/wordprocessingShape" mc:Ignorable="w14 w15 w16se w16cid w16 w16cex w16sdtdh w16sdtfl w16du wp14">
   <w:body>
     <w:p>
       <w:pPr>
@@ -13,16 +13,8 @@
         <w:rPr>
           <w:lang w:val="pt-BR"/>
         </w:rPr>
-        <w:t xml:space="preserve">Relatório Técnico para o Desenvolvimento do </w:t>
-      </w:r>
-      <w:proofErr w:type="spellStart"/>
-      <w:r>
-        <w:rPr>
-          <w:lang w:val="pt-BR"/>
-        </w:rPr>
-        <w:t>TripTrail</w:t>
-      </w:r>
-      <w:proofErr w:type="spellEnd"/>
+        <w:t>Relatório Técnico para o Desenvolvimento do TripTrail</w:t>
+      </w:r>
     </w:p>
     <w:p>
       <w:pPr>
@@ -58,21 +50,7 @@
         <w:rPr>
           <w:lang w:val="pt-BR"/>
         </w:rPr>
-        <w:t xml:space="preserve">Turma </w:t>
-      </w:r>
-      <w:proofErr w:type="spellStart"/>
-      <w:r>
-        <w:rPr>
-          <w:lang w:val="pt-BR"/>
-        </w:rPr>
-        <w:t>2DB</w:t>
-      </w:r>
-      <w:proofErr w:type="spellEnd"/>
-      <w:r>
-        <w:rPr>
-          <w:lang w:val="pt-BR"/>
-        </w:rPr>
-        <w:t xml:space="preserve"> – Grupo 5 </w:t>
+        <w:t xml:space="preserve">Turma 2DB – Grupo 5 </w:t>
       </w:r>
     </w:p>
     <w:p>
@@ -95,515 +73,23 @@
         </w:rPr>
         <w:t xml:space="preserve"> </w:t>
       </w:r>
-      <w:proofErr w:type="spellStart"/>
-      <w:r>
-        <w:rPr>
-          <w:lang w:val="pt-BR"/>
-        </w:rPr>
-        <w:t>TripTrail</w:t>
-      </w:r>
-      <w:proofErr w:type="spellEnd"/>
-      <w:r>
-        <w:rPr>
-          <w:lang w:val="pt-BR"/>
-        </w:rPr>
-        <w:t xml:space="preserve"> </w:t>
-      </w:r>
-      <w:proofErr w:type="spellStart"/>
-      <w:r>
-        <w:rPr>
-          <w:lang w:val="pt-BR"/>
-        </w:rPr>
-        <w:t>is</w:t>
-      </w:r>
-      <w:proofErr w:type="spellEnd"/>
-      <w:r>
-        <w:rPr>
-          <w:lang w:val="pt-BR"/>
-        </w:rPr>
-        <w:t xml:space="preserve"> a </w:t>
-      </w:r>
-      <w:proofErr w:type="spellStart"/>
-      <w:r>
-        <w:rPr>
-          <w:lang w:val="pt-BR"/>
-        </w:rPr>
-        <w:t>java-based</w:t>
-      </w:r>
-      <w:proofErr w:type="spellEnd"/>
-      <w:r>
-        <w:rPr>
-          <w:lang w:val="pt-BR"/>
-        </w:rPr>
-        <w:t xml:space="preserve"> </w:t>
-      </w:r>
-      <w:proofErr w:type="spellStart"/>
-      <w:r>
-        <w:rPr>
-          <w:lang w:val="pt-BR"/>
-        </w:rPr>
-        <w:t>Android</w:t>
-      </w:r>
-      <w:proofErr w:type="spellEnd"/>
-      <w:r>
-        <w:rPr>
-          <w:lang w:val="pt-BR"/>
-        </w:rPr>
-        <w:t xml:space="preserve"> </w:t>
-      </w:r>
-      <w:proofErr w:type="spellStart"/>
-      <w:r>
-        <w:rPr>
-          <w:lang w:val="pt-BR"/>
-        </w:rPr>
-        <w:t>app</w:t>
-      </w:r>
-      <w:proofErr w:type="spellEnd"/>
-      <w:r>
-        <w:rPr>
-          <w:lang w:val="pt-BR"/>
-        </w:rPr>
-        <w:t xml:space="preserve"> </w:t>
-      </w:r>
-      <w:proofErr w:type="spellStart"/>
-      <w:r>
-        <w:rPr>
-          <w:lang w:val="pt-BR"/>
-        </w:rPr>
-        <w:t>that</w:t>
-      </w:r>
-      <w:proofErr w:type="spellEnd"/>
-      <w:r>
-        <w:rPr>
-          <w:lang w:val="pt-BR"/>
-        </w:rPr>
-        <w:t xml:space="preserve"> </w:t>
-      </w:r>
-      <w:proofErr w:type="spellStart"/>
-      <w:r>
-        <w:rPr>
-          <w:lang w:val="pt-BR"/>
-        </w:rPr>
-        <w:t>works</w:t>
-      </w:r>
-      <w:proofErr w:type="spellEnd"/>
-      <w:r>
-        <w:rPr>
-          <w:lang w:val="pt-BR"/>
-        </w:rPr>
-        <w:t xml:space="preserve"> as a </w:t>
-      </w:r>
-      <w:proofErr w:type="spellStart"/>
-      <w:r>
-        <w:rPr>
-          <w:lang w:val="pt-BR"/>
-        </w:rPr>
-        <w:t>travel</w:t>
-      </w:r>
-      <w:proofErr w:type="spellEnd"/>
-      <w:r>
-        <w:rPr>
-          <w:lang w:val="pt-BR"/>
-        </w:rPr>
-        <w:t xml:space="preserve"> </w:t>
-      </w:r>
-      <w:proofErr w:type="spellStart"/>
-      <w:r>
-        <w:rPr>
-          <w:lang w:val="pt-BR"/>
-        </w:rPr>
-        <w:t>journal</w:t>
-      </w:r>
-      <w:proofErr w:type="spellEnd"/>
-      <w:r>
-        <w:rPr>
-          <w:lang w:val="pt-BR"/>
-        </w:rPr>
-        <w:t xml:space="preserve">. </w:t>
-      </w:r>
-      <w:proofErr w:type="spellStart"/>
-      <w:r>
-        <w:rPr>
-          <w:lang w:val="pt-BR"/>
-        </w:rPr>
-        <w:t>User</w:t>
-      </w:r>
-      <w:r>
-        <w:rPr>
-          <w:lang w:val="pt-BR"/>
-        </w:rPr>
-        <w:t>s</w:t>
-      </w:r>
-      <w:proofErr w:type="spellEnd"/>
-      <w:r>
-        <w:rPr>
-          <w:lang w:val="pt-BR"/>
-        </w:rPr>
-        <w:t xml:space="preserve"> </w:t>
-      </w:r>
-      <w:proofErr w:type="spellStart"/>
-      <w:r>
-        <w:rPr>
-          <w:lang w:val="pt-BR"/>
-        </w:rPr>
-        <w:t>can</w:t>
-      </w:r>
-      <w:proofErr w:type="spellEnd"/>
-      <w:r>
-        <w:rPr>
-          <w:lang w:val="pt-BR"/>
-        </w:rPr>
-        <w:t xml:space="preserve"> log </w:t>
-      </w:r>
-      <w:proofErr w:type="spellStart"/>
-      <w:r>
-        <w:rPr>
-          <w:lang w:val="pt-BR"/>
-        </w:rPr>
-        <w:t>their</w:t>
-      </w:r>
-      <w:proofErr w:type="spellEnd"/>
-      <w:r>
-        <w:rPr>
-          <w:lang w:val="pt-BR"/>
-        </w:rPr>
-        <w:t xml:space="preserve"> </w:t>
-      </w:r>
-      <w:proofErr w:type="spellStart"/>
-      <w:r>
-        <w:rPr>
-          <w:lang w:val="pt-BR"/>
-        </w:rPr>
-        <w:t>trips</w:t>
-      </w:r>
-      <w:proofErr w:type="spellEnd"/>
-      <w:r>
-        <w:rPr>
-          <w:lang w:val="pt-BR"/>
-        </w:rPr>
-        <w:t xml:space="preserve"> </w:t>
-      </w:r>
-      <w:proofErr w:type="spellStart"/>
-      <w:r>
-        <w:rPr>
-          <w:lang w:val="pt-BR"/>
-        </w:rPr>
-        <w:t>by</w:t>
-      </w:r>
-      <w:proofErr w:type="spellEnd"/>
-      <w:r>
-        <w:rPr>
-          <w:lang w:val="pt-BR"/>
-        </w:rPr>
-        <w:t xml:space="preserve"> </w:t>
-      </w:r>
-      <w:proofErr w:type="spellStart"/>
-      <w:r>
-        <w:rPr>
-          <w:lang w:val="pt-BR"/>
-        </w:rPr>
-        <w:t>saving</w:t>
-      </w:r>
-      <w:proofErr w:type="spellEnd"/>
-      <w:r>
-        <w:rPr>
-          <w:lang w:val="pt-BR"/>
-        </w:rPr>
-        <w:t xml:space="preserve"> </w:t>
-      </w:r>
-      <w:proofErr w:type="spellStart"/>
-      <w:r>
-        <w:rPr>
-          <w:lang w:val="pt-BR"/>
-        </w:rPr>
-        <w:t>visited</w:t>
-      </w:r>
-      <w:proofErr w:type="spellEnd"/>
-      <w:r>
-        <w:rPr>
-          <w:lang w:val="pt-BR"/>
-        </w:rPr>
-        <w:t xml:space="preserve"> </w:t>
-      </w:r>
-      <w:proofErr w:type="spellStart"/>
-      <w:r>
-        <w:rPr>
-          <w:lang w:val="pt-BR"/>
-        </w:rPr>
-        <w:t>places</w:t>
-      </w:r>
-      <w:proofErr w:type="spellEnd"/>
-      <w:r>
-        <w:rPr>
-          <w:lang w:val="pt-BR"/>
-        </w:rPr>
-        <w:t xml:space="preserve"> </w:t>
-      </w:r>
-      <w:proofErr w:type="spellStart"/>
-      <w:r>
-        <w:rPr>
-          <w:lang w:val="pt-BR"/>
-        </w:rPr>
-        <w:t>with</w:t>
-      </w:r>
-      <w:proofErr w:type="spellEnd"/>
-      <w:r>
-        <w:rPr>
-          <w:lang w:val="pt-BR"/>
-        </w:rPr>
-        <w:t xml:space="preserve"> GPS </w:t>
-      </w:r>
-      <w:proofErr w:type="spellStart"/>
-      <w:r>
-        <w:rPr>
-          <w:lang w:val="pt-BR"/>
-        </w:rPr>
-        <w:t>coordinates</w:t>
-      </w:r>
-      <w:proofErr w:type="spellEnd"/>
-      <w:r>
-        <w:rPr>
-          <w:lang w:val="pt-BR"/>
-        </w:rPr>
-        <w:t xml:space="preserve">, </w:t>
-      </w:r>
-      <w:proofErr w:type="spellStart"/>
-      <w:r>
-        <w:rPr>
-          <w:lang w:val="pt-BR"/>
-        </w:rPr>
-        <w:t>photos</w:t>
-      </w:r>
-      <w:proofErr w:type="spellEnd"/>
-      <w:r>
-        <w:rPr>
-          <w:lang w:val="pt-BR"/>
-        </w:rPr>
-        <w:t xml:space="preserve"> </w:t>
-      </w:r>
-      <w:proofErr w:type="spellStart"/>
-      <w:r>
-        <w:rPr>
-          <w:lang w:val="pt-BR"/>
-        </w:rPr>
-        <w:t>and</w:t>
-      </w:r>
-      <w:proofErr w:type="spellEnd"/>
-      <w:r>
-        <w:rPr>
-          <w:lang w:val="pt-BR"/>
-        </w:rPr>
-        <w:t xml:space="preserve"> ratings (1 – 5 stars). </w:t>
-      </w:r>
-      <w:proofErr w:type="spellStart"/>
-      <w:r>
-        <w:rPr>
-          <w:lang w:val="pt-BR"/>
-        </w:rPr>
-        <w:t>All</w:t>
-      </w:r>
-      <w:proofErr w:type="spellEnd"/>
-      <w:r>
-        <w:rPr>
-          <w:lang w:val="pt-BR"/>
-        </w:rPr>
-        <w:t xml:space="preserve"> data </w:t>
-      </w:r>
-      <w:proofErr w:type="spellStart"/>
-      <w:r>
-        <w:rPr>
-          <w:lang w:val="pt-BR"/>
-        </w:rPr>
-        <w:t>is</w:t>
-      </w:r>
-      <w:proofErr w:type="spellEnd"/>
-      <w:r>
-        <w:rPr>
-          <w:lang w:val="pt-BR"/>
-        </w:rPr>
-        <w:t xml:space="preserve"> </w:t>
-      </w:r>
-      <w:proofErr w:type="spellStart"/>
-      <w:r>
-        <w:rPr>
-          <w:lang w:val="pt-BR"/>
-        </w:rPr>
-        <w:t>stored</w:t>
-      </w:r>
-      <w:proofErr w:type="spellEnd"/>
-      <w:r>
-        <w:rPr>
-          <w:lang w:val="pt-BR"/>
-        </w:rPr>
-        <w:t xml:space="preserve"> in </w:t>
-      </w:r>
-      <w:proofErr w:type="spellStart"/>
-      <w:r>
-        <w:rPr>
-          <w:lang w:val="pt-BR"/>
-        </w:rPr>
-        <w:t>the</w:t>
-      </w:r>
-      <w:proofErr w:type="spellEnd"/>
-      <w:r>
-        <w:rPr>
-          <w:lang w:val="pt-BR"/>
-        </w:rPr>
-        <w:t xml:space="preserve"> </w:t>
-      </w:r>
-      <w:proofErr w:type="spellStart"/>
-      <w:r>
-        <w:rPr>
-          <w:lang w:val="pt-BR"/>
-        </w:rPr>
-        <w:t>cloud</w:t>
-      </w:r>
-      <w:proofErr w:type="spellEnd"/>
-      <w:r>
-        <w:rPr>
-          <w:lang w:val="pt-BR"/>
-        </w:rPr>
-        <w:t xml:space="preserve"> </w:t>
-      </w:r>
-      <w:proofErr w:type="spellStart"/>
-      <w:r>
-        <w:rPr>
-          <w:lang w:val="pt-BR"/>
-        </w:rPr>
-        <w:t>using</w:t>
-      </w:r>
-      <w:proofErr w:type="spellEnd"/>
-      <w:r>
-        <w:rPr>
-          <w:lang w:val="pt-BR"/>
-        </w:rPr>
-        <w:t xml:space="preserve"> a </w:t>
-      </w:r>
-      <w:proofErr w:type="spellStart"/>
-      <w:r>
-        <w:rPr>
-          <w:lang w:val="pt-BR"/>
-        </w:rPr>
-        <w:t>RestDB</w:t>
-      </w:r>
-      <w:proofErr w:type="spellEnd"/>
-      <w:r>
-        <w:rPr>
-          <w:lang w:val="pt-BR"/>
-        </w:rPr>
-        <w:t xml:space="preserve"> </w:t>
-      </w:r>
-      <w:proofErr w:type="spellStart"/>
-      <w:r>
-        <w:rPr>
-          <w:lang w:val="pt-BR"/>
-        </w:rPr>
-        <w:t>REST</w:t>
-      </w:r>
-      <w:proofErr w:type="spellEnd"/>
-      <w:r>
-        <w:rPr>
-          <w:lang w:val="pt-BR"/>
-        </w:rPr>
-        <w:t xml:space="preserve"> API, </w:t>
-      </w:r>
-      <w:proofErr w:type="spellStart"/>
-      <w:r>
-        <w:rPr>
-          <w:lang w:val="pt-BR"/>
-        </w:rPr>
-        <w:t>making</w:t>
-      </w:r>
-      <w:proofErr w:type="spellEnd"/>
-      <w:r>
-        <w:rPr>
-          <w:lang w:val="pt-BR"/>
-        </w:rPr>
-        <w:t xml:space="preserve"> it </w:t>
-      </w:r>
-      <w:proofErr w:type="spellStart"/>
-      <w:r>
-        <w:rPr>
-          <w:lang w:val="pt-BR"/>
-        </w:rPr>
-        <w:t>easy</w:t>
-      </w:r>
-      <w:proofErr w:type="spellEnd"/>
-      <w:r>
-        <w:rPr>
-          <w:lang w:val="pt-BR"/>
-        </w:rPr>
-        <w:t xml:space="preserve"> </w:t>
-      </w:r>
-      <w:proofErr w:type="spellStart"/>
-      <w:r>
-        <w:rPr>
-          <w:lang w:val="pt-BR"/>
-        </w:rPr>
-        <w:t>to</w:t>
-      </w:r>
-      <w:proofErr w:type="spellEnd"/>
-      <w:r>
-        <w:rPr>
-          <w:lang w:val="pt-BR"/>
-        </w:rPr>
-        <w:t xml:space="preserve"> </w:t>
-      </w:r>
-      <w:proofErr w:type="spellStart"/>
-      <w:r>
-        <w:rPr>
-          <w:lang w:val="pt-BR"/>
-        </w:rPr>
-        <w:t>access</w:t>
-      </w:r>
-      <w:proofErr w:type="spellEnd"/>
-      <w:r>
-        <w:rPr>
-          <w:lang w:val="pt-BR"/>
-        </w:rPr>
-        <w:t xml:space="preserve"> </w:t>
-      </w:r>
-      <w:proofErr w:type="spellStart"/>
-      <w:r>
-        <w:rPr>
-          <w:lang w:val="pt-BR"/>
-        </w:rPr>
-        <w:t>and</w:t>
-      </w:r>
-      <w:proofErr w:type="spellEnd"/>
-      <w:r>
-        <w:rPr>
-          <w:lang w:val="pt-BR"/>
-        </w:rPr>
-        <w:t xml:space="preserve"> </w:t>
-      </w:r>
-      <w:proofErr w:type="spellStart"/>
-      <w:r>
-        <w:rPr>
-          <w:lang w:val="pt-BR"/>
-        </w:rPr>
-        <w:t>share</w:t>
-      </w:r>
-      <w:proofErr w:type="spellEnd"/>
-      <w:r>
-        <w:rPr>
-          <w:lang w:val="pt-BR"/>
-        </w:rPr>
-        <w:t xml:space="preserve"> </w:t>
-      </w:r>
-      <w:proofErr w:type="spellStart"/>
-      <w:r>
-        <w:rPr>
-          <w:lang w:val="pt-BR"/>
-        </w:rPr>
-        <w:t>trips</w:t>
-      </w:r>
-      <w:proofErr w:type="spellEnd"/>
-      <w:r>
-        <w:rPr>
-          <w:lang w:val="pt-BR"/>
-        </w:rPr>
-        <w:t xml:space="preserve">. </w:t>
+      <w:r>
+        <w:rPr>
+          <w:lang w:val="pt-BR"/>
+        </w:rPr>
+        <w:t>TripTrail is a java-based Android app that works as a travel journal. User</w:t>
+      </w:r>
+      <w:r>
+        <w:rPr>
+          <w:lang w:val="pt-BR"/>
+        </w:rPr>
+        <w:t xml:space="preserve">s can log their trips by saving </w:t>
+      </w:r>
+      <w:r>
+        <w:rPr>
+          <w:lang w:val="pt-BR"/>
+        </w:rPr>
+        <w:t xml:space="preserve">visited places with GPS coordinates, photos and ratings (1 – 5 stars). All data is stored in the cloud using a RestDB REST API, making it easy to access and share trips. </w:t>
       </w:r>
     </w:p>
     <w:p>
@@ -614,101 +100,19 @@
           <w:lang w:val="pt-BR"/>
         </w:rPr>
       </w:pPr>
-      <w:proofErr w:type="spellStart"/>
       <w:r>
         <w:rPr>
           <w:b/>
           <w:lang w:val="pt-BR"/>
         </w:rPr>
-        <w:t>Keywords</w:t>
-      </w:r>
-      <w:proofErr w:type="spellEnd"/>
-      <w:r>
-        <w:rPr>
-          <w:b/>
-          <w:lang w:val="pt-BR"/>
-        </w:rPr>
-        <w:t xml:space="preserve">: </w:t>
-      </w:r>
-      <w:proofErr w:type="spellStart"/>
+        <w:t xml:space="preserve">Keywords: </w:t>
+      </w:r>
       <w:r>
         <w:rPr>
           <w:bCs/>
           <w:lang w:val="pt-BR"/>
         </w:rPr>
-        <w:t>Android</w:t>
-      </w:r>
-      <w:proofErr w:type="spellEnd"/>
-      <w:r>
-        <w:rPr>
-          <w:bCs/>
-          <w:lang w:val="pt-BR"/>
-        </w:rPr>
-        <w:t xml:space="preserve">, Java, </w:t>
-      </w:r>
-      <w:proofErr w:type="spellStart"/>
-      <w:r>
-        <w:rPr>
-          <w:bCs/>
-          <w:lang w:val="pt-BR"/>
-        </w:rPr>
-        <w:t>Travel</w:t>
-      </w:r>
-      <w:proofErr w:type="spellEnd"/>
-      <w:r>
-        <w:rPr>
-          <w:bCs/>
-          <w:lang w:val="pt-BR"/>
-        </w:rPr>
-        <w:t xml:space="preserve"> </w:t>
-      </w:r>
-      <w:proofErr w:type="spellStart"/>
-      <w:r>
-        <w:rPr>
-          <w:bCs/>
-          <w:lang w:val="pt-BR"/>
-        </w:rPr>
-        <w:t>Journal</w:t>
-      </w:r>
-      <w:proofErr w:type="spellEnd"/>
-      <w:r>
-        <w:rPr>
-          <w:bCs/>
-          <w:lang w:val="pt-BR"/>
-        </w:rPr>
-        <w:t xml:space="preserve">, GPS, </w:t>
-      </w:r>
-      <w:proofErr w:type="spellStart"/>
-      <w:r>
-        <w:rPr>
-          <w:bCs/>
-          <w:lang w:val="pt-BR"/>
-        </w:rPr>
-        <w:t>Camera</w:t>
-      </w:r>
-      <w:proofErr w:type="spellEnd"/>
-      <w:r>
-        <w:rPr>
-          <w:bCs/>
-          <w:lang w:val="pt-BR"/>
-        </w:rPr>
-        <w:t xml:space="preserve">, </w:t>
-      </w:r>
-      <w:proofErr w:type="spellStart"/>
-      <w:r>
-        <w:rPr>
-          <w:bCs/>
-          <w:lang w:val="pt-BR"/>
-        </w:rPr>
-        <w:t>Rest</w:t>
-      </w:r>
-      <w:proofErr w:type="spellEnd"/>
-      <w:r>
-        <w:rPr>
-          <w:bCs/>
-          <w:lang w:val="pt-BR"/>
-        </w:rPr>
-        <w:t xml:space="preserve"> API.</w:t>
+        <w:t>Android, Java, Travel Journal, GPS, Camera, Rest API.</w:t>
       </w:r>
     </w:p>
     <w:p>
@@ -736,69 +140,19 @@
         <w:rPr>
           <w:lang w:val="pt-BR"/>
         </w:rPr>
-        <w:t xml:space="preserve">O objetivo deste projeto é desenvolver o </w:t>
-      </w:r>
-      <w:proofErr w:type="spellStart"/>
-      <w:r>
-        <w:rPr>
-          <w:lang w:val="pt-BR"/>
-        </w:rPr>
-        <w:t>TripTrail</w:t>
-      </w:r>
-      <w:proofErr w:type="spellEnd"/>
-      <w:r>
-        <w:rPr>
-          <w:lang w:val="pt-BR"/>
-        </w:rPr>
-        <w:t xml:space="preserve">, uma aplicação </w:t>
-      </w:r>
-      <w:proofErr w:type="spellStart"/>
-      <w:r>
-        <w:rPr>
-          <w:lang w:val="pt-BR"/>
-        </w:rPr>
-        <w:t>Android</w:t>
-      </w:r>
-      <w:proofErr w:type="spellEnd"/>
-      <w:r>
-        <w:rPr>
-          <w:lang w:val="pt-BR"/>
-        </w:rPr>
-        <w:t xml:space="preserve"> em Java que funciona com um diário de viagens. A </w:t>
-      </w:r>
-      <w:proofErr w:type="spellStart"/>
-      <w:r>
-        <w:rPr>
-          <w:lang w:val="pt-BR"/>
-        </w:rPr>
-        <w:t>app</w:t>
-      </w:r>
-      <w:proofErr w:type="spellEnd"/>
-      <w:r>
-        <w:rPr>
-          <w:lang w:val="pt-BR"/>
-        </w:rPr>
-        <w:t xml:space="preserve"> permite registar locais visitados</w:t>
-      </w:r>
-      <w:r>
-        <w:rPr>
-          <w:lang w:val="pt-BR"/>
-        </w:rPr>
-        <w:t xml:space="preserve"> com coordenadas GPS, fotos e avaliações de 1 a 5 estrelas, guardando todos os dados na nuvem via </w:t>
-      </w:r>
-      <w:proofErr w:type="spellStart"/>
-      <w:r>
-        <w:rPr>
-          <w:lang w:val="pt-BR"/>
-        </w:rPr>
-        <w:t>RestDB</w:t>
-      </w:r>
-      <w:proofErr w:type="spellEnd"/>
-      <w:r>
-        <w:rPr>
-          <w:lang w:val="pt-BR"/>
-        </w:rPr>
-        <w:t xml:space="preserve">, facilitando assim o acesso e partilha entre utilizadores. </w:t>
+        <w:t>O objetivo deste projeto é desenvolver o TripTrail</w:t>
+      </w:r>
+      <w:r>
+        <w:rPr>
+          <w:lang w:val="pt-BR"/>
+        </w:rPr>
+        <w:t>, uma aplicação Android em Java que funciona com um diário de viagens. A app permite registar locais visitados</w:t>
+      </w:r>
+      <w:r>
+        <w:rPr>
+          <w:lang w:val="pt-BR"/>
+        </w:rPr>
+        <w:t xml:space="preserve"> com coordenadas GPS, fotos e avaliações de 1 a 5 estrelas, guardando todos os dados na nuvem via RestDB, facilitando assim o acesso e partilha entre utilizadores. </w:t>
       </w:r>
       <w:r>
         <w:rPr>
@@ -834,21 +188,7 @@
         <w:rPr>
           <w:lang w:val="pt-BR"/>
         </w:rPr>
-        <w:t xml:space="preserve">, entre outros. A aplicação utiliza recursos nativos do </w:t>
-      </w:r>
-      <w:proofErr w:type="spellStart"/>
-      <w:r>
-        <w:rPr>
-          <w:lang w:val="pt-BR"/>
-        </w:rPr>
-        <w:t>telemóvel</w:t>
-      </w:r>
-      <w:proofErr w:type="spellEnd"/>
-      <w:r>
-        <w:rPr>
-          <w:lang w:val="pt-BR"/>
-        </w:rPr>
-        <w:t xml:space="preserve"> como o GPS e câmara.</w:t>
+        <w:t>, entre outros. A aplicação utiliza recursos nativos do telemóvel como o GPS e câmara.</w:t>
       </w:r>
     </w:p>
     <w:p>
@@ -969,47 +309,11 @@
                 <w:lang w:val="pt-BR"/>
               </w:rPr>
             </w:pPr>
-            <w:proofErr w:type="spellStart"/>
-            <w:r>
-              <w:rPr>
-                <w:lang w:val="pt-BR"/>
-              </w:rPr>
-              <w:t>Term</w:t>
-            </w:r>
-            <w:proofErr w:type="spellEnd"/>
-            <w:r>
-              <w:rPr>
-                <w:lang w:val="pt-BR"/>
-              </w:rPr>
-              <w:t xml:space="preserve"> </w:t>
-            </w:r>
-            <w:proofErr w:type="spellStart"/>
-            <w:r>
-              <w:rPr>
-                <w:lang w:val="pt-BR"/>
-              </w:rPr>
-              <w:t>or</w:t>
-            </w:r>
-            <w:proofErr w:type="spellEnd"/>
-            <w:r>
-              <w:rPr>
-                <w:lang w:val="pt-BR"/>
-              </w:rPr>
-              <w:t xml:space="preserve"> Expression (</w:t>
-            </w:r>
-            <w:proofErr w:type="spellStart"/>
-            <w:r>
-              <w:rPr>
-                <w:lang w:val="pt-BR"/>
-              </w:rPr>
-              <w:t>EN</w:t>
-            </w:r>
-            <w:proofErr w:type="spellEnd"/>
-            <w:r>
-              <w:rPr>
-                <w:lang w:val="pt-BR"/>
-              </w:rPr>
-              <w:t>)</w:t>
+            <w:r>
+              <w:rPr>
+                <w:lang w:val="pt-BR"/>
+              </w:rPr>
+              <w:t>Term or Expression (EN)</w:t>
             </w:r>
           </w:p>
         </w:tc>
@@ -1074,14 +378,12 @@
                 <w:lang w:val="pt-BR"/>
               </w:rPr>
             </w:pPr>
-            <w:proofErr w:type="spellStart"/>
             <w:r>
               <w:rPr>
                 <w:lang w:val="pt-BR"/>
               </w:rPr>
               <w:t>Category</w:t>
             </w:r>
-            <w:proofErr w:type="spellEnd"/>
           </w:p>
         </w:tc>
         <w:tc>
@@ -1214,14 +516,12 @@
                 <w:lang w:val="pt-BR"/>
               </w:rPr>
             </w:pPr>
-            <w:proofErr w:type="spellStart"/>
             <w:r>
               <w:rPr>
                 <w:lang w:val="pt-BR"/>
               </w:rPr>
               <w:t>Map</w:t>
             </w:r>
-            <w:proofErr w:type="spellEnd"/>
           </w:p>
         </w:tc>
         <w:tc>
@@ -1258,19 +558,11 @@
                 <w:lang w:val="pt-BR"/>
               </w:rPr>
             </w:pPr>
-            <w:proofErr w:type="spellStart"/>
-            <w:r>
-              <w:rPr>
-                <w:lang w:val="pt-BR"/>
-              </w:rPr>
-              <w:t>Ecrã</w:t>
-            </w:r>
-            <w:proofErr w:type="spellEnd"/>
-            <w:r>
-              <w:rPr>
-                <w:lang w:val="pt-BR"/>
-              </w:rPr>
-              <w:t xml:space="preserve"> com os locais da viagem</w:t>
+            <w:r>
+              <w:rPr>
+                <w:lang w:val="pt-BR"/>
+              </w:rPr>
+              <w:t>Ecrã com os locais da viagem</w:t>
             </w:r>
           </w:p>
         </w:tc>
@@ -1293,14 +585,12 @@
                 <w:lang w:val="pt-BR"/>
               </w:rPr>
             </w:pPr>
-            <w:proofErr w:type="spellStart"/>
             <w:r>
               <w:rPr>
                 <w:lang w:val="pt-BR"/>
               </w:rPr>
               <w:t>Marker</w:t>
             </w:r>
-            <w:proofErr w:type="spellEnd"/>
           </w:p>
         </w:tc>
         <w:tc>
@@ -1364,14 +654,12 @@
                 <w:lang w:val="pt-BR"/>
               </w:rPr>
             </w:pPr>
-            <w:proofErr w:type="spellStart"/>
             <w:r>
               <w:rPr>
                 <w:lang w:val="pt-BR"/>
               </w:rPr>
               <w:t>Photo</w:t>
             </w:r>
-            <w:proofErr w:type="spellEnd"/>
           </w:p>
         </w:tc>
         <w:tc>
@@ -1435,7 +723,6 @@
                 <w:lang w:val="pt-BR"/>
               </w:rPr>
             </w:pPr>
-            <w:proofErr w:type="spellStart"/>
             <w:r>
               <w:rPr>
                 <w:lang w:val="pt-BR"/>
@@ -1443,7 +730,6 @@
               <w:lastRenderedPageBreak/>
               <w:t>Place</w:t>
             </w:r>
-            <w:proofErr w:type="spellEnd"/>
           </w:p>
         </w:tc>
         <w:tc>
@@ -1576,14 +862,12 @@
                 <w:lang w:val="pt-BR"/>
               </w:rPr>
             </w:pPr>
-            <w:proofErr w:type="spellStart"/>
             <w:r>
               <w:rPr>
                 <w:lang w:val="pt-BR"/>
               </w:rPr>
               <w:t>Trip</w:t>
             </w:r>
-            <w:proofErr w:type="spellEnd"/>
           </w:p>
         </w:tc>
         <w:tc>
@@ -1647,28 +931,12 @@
                 <w:lang w:val="pt-BR"/>
               </w:rPr>
             </w:pPr>
-            <w:proofErr w:type="spellStart"/>
-            <w:r>
-              <w:rPr>
-                <w:lang w:val="pt-BR"/>
-              </w:rPr>
-              <w:t>Trip</w:t>
-            </w:r>
-            <w:proofErr w:type="spellEnd"/>
-            <w:r>
-              <w:rPr>
-                <w:lang w:val="pt-BR"/>
-              </w:rPr>
-              <w:t xml:space="preserve"> </w:t>
-            </w:r>
-            <w:proofErr w:type="spellStart"/>
-            <w:r>
-              <w:rPr>
-                <w:lang w:val="pt-BR"/>
-              </w:rPr>
-              <w:t>Member</w:t>
-            </w:r>
-            <w:proofErr w:type="spellEnd"/>
+            <w:r>
+              <w:rPr>
+                <w:lang w:val="pt-BR"/>
+              </w:rPr>
+              <w:t>Trip Member</w:t>
+            </w:r>
           </w:p>
         </w:tc>
         <w:tc>
@@ -1732,14 +1000,12 @@
                 <w:lang w:val="pt-BR"/>
               </w:rPr>
             </w:pPr>
-            <w:proofErr w:type="spellStart"/>
             <w:r>
               <w:rPr>
                 <w:lang w:val="pt-BR"/>
               </w:rPr>
               <w:t>User</w:t>
             </w:r>
-            <w:proofErr w:type="spellEnd"/>
           </w:p>
         </w:tc>
         <w:tc>
@@ -1999,21 +1265,7 @@
         <w:rPr>
           <w:lang w:val="pt-BR"/>
         </w:rPr>
-        <w:t xml:space="preserve">Como utilizador, quero que criar uma conta e iniciar sessão para que as minhas viagens fiquem guardadas e acessíveis em qualquer </w:t>
-      </w:r>
-      <w:proofErr w:type="spellStart"/>
-      <w:r>
-        <w:rPr>
-          <w:lang w:val="pt-BR"/>
-        </w:rPr>
-        <w:t>telemóvel</w:t>
-      </w:r>
-      <w:proofErr w:type="spellEnd"/>
-      <w:r>
-        <w:rPr>
-          <w:lang w:val="pt-BR"/>
-        </w:rPr>
-        <w:t>.</w:t>
+        <w:t>Como utilizador, quero que criar uma conta e iniciar sessão para que as minhas viagens fiquem guardadas e acessíveis em qualquer telemóvel.</w:t>
       </w:r>
     </w:p>
     <w:p>
@@ -2050,27 +1302,13 @@
         <w:rPr>
           <w:lang w:val="pt-BR"/>
         </w:rPr>
-        <w:t xml:space="preserve">O sistema deve pedir o nome, </w:t>
-      </w:r>
-      <w:proofErr w:type="spellStart"/>
-      <w:r>
-        <w:rPr>
-          <w:lang w:val="pt-BR"/>
-        </w:rPr>
-        <w:t>em</w:t>
-      </w:r>
-      <w:r>
-        <w:rPr>
-          <w:lang w:val="pt-BR"/>
-        </w:rPr>
-        <w:t>ail</w:t>
-      </w:r>
-      <w:proofErr w:type="spellEnd"/>
-      <w:r>
-        <w:rPr>
-          <w:lang w:val="pt-BR"/>
-        </w:rPr>
-        <w:t xml:space="preserve"> e palavra-passe no registo;</w:t>
+        <w:t>O sistema deve pedir o nome, em</w:t>
+      </w:r>
+      <w:r>
+        <w:rPr>
+          <w:lang w:val="pt-BR"/>
+        </w:rPr>
+        <w:t>ail e palavra-passe no registo;</w:t>
       </w:r>
     </w:p>
     <w:p>
@@ -2089,21 +1327,7 @@
         <w:rPr>
           <w:lang w:val="pt-BR"/>
         </w:rPr>
-        <w:t xml:space="preserve">O sistema deve recusar </w:t>
-      </w:r>
-      <w:proofErr w:type="spellStart"/>
-      <w:r>
-        <w:rPr>
-          <w:lang w:val="pt-BR"/>
-        </w:rPr>
-        <w:t>emails</w:t>
-      </w:r>
-      <w:proofErr w:type="spellEnd"/>
-      <w:r>
-        <w:rPr>
-          <w:lang w:val="pt-BR"/>
-        </w:rPr>
-        <w:t xml:space="preserve"> inválidos e palavras-passe com menos de</w:t>
+        <w:t>O sistema deve recusar emails inválidos e palavras-passe com menos de</w:t>
       </w:r>
       <w:r>
         <w:rPr>
@@ -2154,21 +1378,7 @@
         <w:rPr>
           <w:lang w:val="pt-BR"/>
         </w:rPr>
-        <w:t xml:space="preserve">Como utilizador, quero que criar uma conta e iniciar sessão para que as minhas viagens fiquem guardadas e acessíveis em qualquer </w:t>
-      </w:r>
-      <w:proofErr w:type="spellStart"/>
-      <w:r>
-        <w:rPr>
-          <w:lang w:val="pt-BR"/>
-        </w:rPr>
-        <w:t>telemóvel</w:t>
-      </w:r>
-      <w:proofErr w:type="spellEnd"/>
-      <w:r>
-        <w:rPr>
-          <w:lang w:val="pt-BR"/>
-        </w:rPr>
-        <w:t>.</w:t>
+        <w:t>Como utilizador, quero que criar uma conta e iniciar sessão para que as minhas viagens fiquem guardadas e acessíveis em qualquer telemóvel.</w:t>
       </w:r>
     </w:p>
     <w:p>
@@ -2284,21 +1494,7 @@
         <w:rPr>
           <w:lang w:val="pt-BR"/>
         </w:rPr>
-        <w:t xml:space="preserve">lista e ficar gravada no </w:t>
-      </w:r>
-      <w:proofErr w:type="spellStart"/>
-      <w:r>
-        <w:rPr>
-          <w:lang w:val="pt-BR"/>
-        </w:rPr>
-        <w:t>RestDB</w:t>
-      </w:r>
-      <w:proofErr w:type="spellEnd"/>
-      <w:r>
-        <w:rPr>
-          <w:lang w:val="pt-BR"/>
-        </w:rPr>
-        <w:t>;</w:t>
+        <w:t>lista e ficar gravada no RestDB;</w:t>
       </w:r>
     </w:p>
     <w:p>
@@ -2317,21 +1513,7 @@
         <w:rPr>
           <w:lang w:val="pt-BR"/>
         </w:rPr>
-        <w:t xml:space="preserve">O criador fica registado como participante com o papel </w:t>
-      </w:r>
-      <w:proofErr w:type="spellStart"/>
-      <w:r>
-        <w:rPr>
-          <w:lang w:val="pt-BR"/>
-        </w:rPr>
-        <w:t>Owner</w:t>
-      </w:r>
-      <w:proofErr w:type="spellEnd"/>
-      <w:r>
-        <w:rPr>
-          <w:lang w:val="pt-BR"/>
-        </w:rPr>
-        <w:t>.</w:t>
+        <w:t>O criador fica registado como participante com o papel Owner.</w:t>
       </w:r>
     </w:p>
     <w:p>
@@ -2609,21 +1791,7 @@
         <w:rPr>
           <w:lang w:val="pt-BR"/>
         </w:rPr>
-        <w:t xml:space="preserve">, com o </w:t>
-      </w:r>
-      <w:proofErr w:type="spellStart"/>
-      <w:r>
-        <w:rPr>
-          <w:lang w:val="pt-BR"/>
-        </w:rPr>
-        <w:t>CameraX</w:t>
-      </w:r>
-      <w:proofErr w:type="spellEnd"/>
-      <w:r>
-        <w:rPr>
-          <w:lang w:val="pt-BR"/>
-        </w:rPr>
-        <w:t>.</w:t>
+        <w:t>, com o CameraX.</w:t>
       </w:r>
     </w:p>
     <w:p>
@@ -2860,21 +2028,7 @@
         <w:rPr>
           <w:lang w:val="pt-BR"/>
         </w:rPr>
-        <w:t xml:space="preserve">O convite deve ser feito pelo </w:t>
-      </w:r>
-      <w:proofErr w:type="spellStart"/>
-      <w:r>
-        <w:rPr>
-          <w:lang w:val="pt-BR"/>
-        </w:rPr>
-        <w:t>email</w:t>
-      </w:r>
-      <w:proofErr w:type="spellEnd"/>
-      <w:r>
-        <w:rPr>
-          <w:lang w:val="pt-BR"/>
-        </w:rPr>
-        <w:t xml:space="preserve"> do utilizador;</w:t>
+        <w:t>O convite deve ser feito pelo email do utilizador;</w:t>
       </w:r>
     </w:p>
     <w:p>
@@ -3116,7 +2270,6 @@
           <w:lang w:val="pt-BR"/>
         </w:rPr>
       </w:pPr>
-      <w:proofErr w:type="spellStart"/>
       <w:r>
         <w:rPr>
           <w:b w:val="0"/>
@@ -3124,29 +2277,8 @@
           <w:szCs w:val="18"/>
           <w:lang w:val="pt-BR"/>
         </w:rPr>
-        <w:t>UC</w:t>
-      </w:r>
-      <w:proofErr w:type="spellEnd"/>
-      <w:r>
-        <w:rPr>
-          <w:b w:val="0"/>
-          <w:sz w:val="18"/>
-          <w:szCs w:val="18"/>
-          <w:lang w:val="pt-BR"/>
-        </w:rPr>
-        <w:t xml:space="preserve"> 1. </w:t>
-      </w:r>
-      <w:proofErr w:type="gramStart"/>
-      <w:r>
-        <w:rPr>
-          <w:b w:val="0"/>
-          <w:sz w:val="18"/>
-          <w:szCs w:val="18"/>
-          <w:lang w:val="pt-BR"/>
-        </w:rPr>
-        <w:t>Registar Utilizador</w:t>
-      </w:r>
-      <w:proofErr w:type="gramEnd"/>
+        <w:t>UC 1. Registar Utilizador</w:t>
+      </w:r>
     </w:p>
     <w:tbl>
       <w:tblPr>
@@ -3240,21 +2372,7 @@
               <w:rPr>
                 <w:lang w:val="pt-BR"/>
               </w:rPr>
-              <w:t xml:space="preserve">O </w:t>
-            </w:r>
-            <w:proofErr w:type="spellStart"/>
-            <w:r>
-              <w:rPr>
-                <w:lang w:val="pt-BR"/>
-              </w:rPr>
-              <w:t>email</w:t>
-            </w:r>
-            <w:proofErr w:type="spellEnd"/>
-            <w:r>
-              <w:rPr>
-                <w:lang w:val="pt-BR"/>
-              </w:rPr>
-              <w:t xml:space="preserve"> introduzido não existe no sistema</w:t>
+              <w:t>O email introduzido não existe no sistema</w:t>
             </w:r>
           </w:p>
         </w:tc>
@@ -3338,21 +2456,7 @@
               <w:rPr>
                 <w:lang w:val="pt-BR"/>
               </w:rPr>
-              <w:t xml:space="preserve">O sistema solicita o nome, </w:t>
-            </w:r>
-            <w:proofErr w:type="spellStart"/>
-            <w:r>
-              <w:rPr>
-                <w:lang w:val="pt-BR"/>
-              </w:rPr>
-              <w:t>email</w:t>
-            </w:r>
-            <w:proofErr w:type="spellEnd"/>
-            <w:r>
-              <w:rPr>
-                <w:lang w:val="pt-BR"/>
-              </w:rPr>
-              <w:t xml:space="preserve"> e palavra-passe;</w:t>
+              <w:t>O sistema solicita o nome, email e palavra-passe;</w:t>
             </w:r>
           </w:p>
           <w:p>
@@ -3388,21 +2492,7 @@
               <w:rPr>
                 <w:lang w:val="pt-BR"/>
               </w:rPr>
-              <w:t xml:space="preserve">O sistema valida o nome, o </w:t>
-            </w:r>
-            <w:proofErr w:type="spellStart"/>
-            <w:r>
-              <w:rPr>
-                <w:lang w:val="pt-BR"/>
-              </w:rPr>
-              <w:t>email</w:t>
-            </w:r>
-            <w:proofErr w:type="spellEnd"/>
-            <w:r>
-              <w:rPr>
-                <w:lang w:val="pt-BR"/>
-              </w:rPr>
-              <w:t xml:space="preserve"> e a palavra-passe;</w:t>
+              <w:t>O sistema valida o nome, o email e a palavra-passe;</w:t>
             </w:r>
           </w:p>
           <w:p>
@@ -3421,21 +2511,7 @@
                 <w:lang w:val="pt-BR"/>
               </w:rPr>
               <w:lastRenderedPageBreak/>
-              <w:t xml:space="preserve">O sistema guarda a palavra-passe como </w:t>
-            </w:r>
-            <w:proofErr w:type="spellStart"/>
-            <w:r>
-              <w:rPr>
-                <w:lang w:val="pt-BR"/>
-              </w:rPr>
-              <w:t>SHA</w:t>
-            </w:r>
-            <w:proofErr w:type="spellEnd"/>
-            <w:r>
-              <w:rPr>
-                <w:lang w:val="pt-BR"/>
-              </w:rPr>
-              <w:t>-256 e regista o novo utilizador no sistema;</w:t>
+              <w:t>O sistema guarda a palavra-passe como SHA-256 e regista o novo utilizador no sistema;</w:t>
             </w:r>
           </w:p>
           <w:p>
@@ -3516,7 +2592,6 @@
           <w:lang w:val="pt-BR"/>
         </w:rPr>
       </w:pPr>
-      <w:proofErr w:type="spellStart"/>
       <w:r>
         <w:rPr>
           <w:b w:val="0"/>
@@ -3524,17 +2599,7 @@
           <w:szCs w:val="18"/>
           <w:lang w:val="pt-BR"/>
         </w:rPr>
-        <w:t>UC</w:t>
-      </w:r>
-      <w:proofErr w:type="spellEnd"/>
-      <w:r>
-        <w:rPr>
-          <w:b w:val="0"/>
-          <w:sz w:val="18"/>
-          <w:szCs w:val="18"/>
-          <w:lang w:val="pt-BR"/>
-        </w:rPr>
-        <w:t xml:space="preserve"> 2. Iniciar Sessão</w:t>
+        <w:t>UC 2. Iniciar Sessão</w:t>
       </w:r>
     </w:p>
     <w:tbl>
@@ -3629,21 +2694,7 @@
               <w:rPr>
                 <w:lang w:val="pt-BR"/>
               </w:rPr>
-              <w:t xml:space="preserve">Existe uma conta com o </w:t>
-            </w:r>
-            <w:proofErr w:type="spellStart"/>
-            <w:r>
-              <w:rPr>
-                <w:lang w:val="pt-BR"/>
-              </w:rPr>
-              <w:t>email</w:t>
-            </w:r>
-            <w:proofErr w:type="spellEnd"/>
-            <w:r>
-              <w:rPr>
-                <w:lang w:val="pt-BR"/>
-              </w:rPr>
-              <w:t xml:space="preserve"> introduzido</w:t>
+              <w:t>Existe uma conta com o email introduzido</w:t>
             </w:r>
           </w:p>
         </w:tc>
@@ -3727,21 +2778,7 @@
               <w:rPr>
                 <w:lang w:val="pt-BR"/>
               </w:rPr>
-              <w:t xml:space="preserve">O sistema solicita o </w:t>
-            </w:r>
-            <w:proofErr w:type="spellStart"/>
-            <w:r>
-              <w:rPr>
-                <w:lang w:val="pt-BR"/>
-              </w:rPr>
-              <w:t>email</w:t>
-            </w:r>
-            <w:proofErr w:type="spellEnd"/>
-            <w:r>
-              <w:rPr>
-                <w:lang w:val="pt-BR"/>
-              </w:rPr>
-              <w:t xml:space="preserve"> e a palavra-passe;</w:t>
+              <w:t>O sistema solicita o email e a palavra-passe;</w:t>
             </w:r>
           </w:p>
           <w:p>
@@ -3777,21 +2814,7 @@
               <w:rPr>
                 <w:lang w:val="pt-BR"/>
               </w:rPr>
-              <w:t xml:space="preserve">O sistema calcula o </w:t>
-            </w:r>
-            <w:proofErr w:type="spellStart"/>
-            <w:r>
-              <w:rPr>
-                <w:lang w:val="pt-BR"/>
-              </w:rPr>
-              <w:t>hash</w:t>
-            </w:r>
-            <w:proofErr w:type="spellEnd"/>
-            <w:r>
-              <w:rPr>
-                <w:lang w:val="pt-BR"/>
-              </w:rPr>
-              <w:t xml:space="preserve"> da palavra-passe e compara-o com o guardado;</w:t>
+              <w:t>O sistema calcula o hash da palavra-passe e compara-o com o guardado;</w:t>
             </w:r>
           </w:p>
           <w:p>
@@ -3868,21 +2891,12 @@
           <w:lang w:val="pt-BR"/>
         </w:rPr>
       </w:pPr>
-      <w:proofErr w:type="spellStart"/>
       <w:r>
         <w:rPr>
           <w:b w:val="0"/>
           <w:lang w:val="pt-BR"/>
         </w:rPr>
-        <w:t>UC</w:t>
-      </w:r>
-      <w:proofErr w:type="spellEnd"/>
-      <w:r>
-        <w:rPr>
-          <w:b w:val="0"/>
-          <w:lang w:val="pt-BR"/>
-        </w:rPr>
-        <w:t xml:space="preserve"> 3. Criar Viagem</w:t>
+        <w:t>UC 3. Criar Viagem</w:t>
       </w:r>
     </w:p>
     <w:tbl>
@@ -4017,21 +3031,7 @@
               <w:rPr>
                 <w:lang w:val="pt-BR"/>
               </w:rPr>
-              <w:t xml:space="preserve">A viagem fica guardada no </w:t>
-            </w:r>
-            <w:proofErr w:type="spellStart"/>
-            <w:r>
-              <w:rPr>
-                <w:lang w:val="pt-BR"/>
-              </w:rPr>
-              <w:t>RestDB</w:t>
-            </w:r>
-            <w:proofErr w:type="spellEnd"/>
-            <w:r>
-              <w:rPr>
-                <w:lang w:val="pt-BR"/>
-              </w:rPr>
-              <w:t xml:space="preserve"> e aparece na lista</w:t>
+              <w:t>A viagem fica guardada no RestDB e aparece na lista</w:t>
             </w:r>
           </w:p>
         </w:tc>
@@ -4183,21 +3183,7 @@
               <w:rPr>
                 <w:lang w:val="pt-BR"/>
               </w:rPr>
-              <w:t xml:space="preserve"> como </w:t>
-            </w:r>
-            <w:proofErr w:type="spellStart"/>
-            <w:r>
-              <w:rPr>
-                <w:lang w:val="pt-BR"/>
-              </w:rPr>
-              <w:t>OWNER</w:t>
-            </w:r>
-            <w:proofErr w:type="spellEnd"/>
-            <w:r>
-              <w:rPr>
-                <w:lang w:val="pt-BR"/>
-              </w:rPr>
-              <w:t>;</w:t>
+              <w:t xml:space="preserve"> como OWNER;</w:t>
             </w:r>
           </w:p>
           <w:p>
@@ -4284,21 +3270,12 @@
           <w:lang w:val="pt-BR"/>
         </w:rPr>
       </w:pPr>
-      <w:proofErr w:type="spellStart"/>
       <w:r>
         <w:rPr>
           <w:b w:val="0"/>
           <w:lang w:val="pt-BR"/>
         </w:rPr>
-        <w:t>UC</w:t>
-      </w:r>
-      <w:proofErr w:type="spellEnd"/>
-      <w:r>
-        <w:rPr>
-          <w:b w:val="0"/>
-          <w:lang w:val="pt-BR"/>
-        </w:rPr>
-        <w:t xml:space="preserve"> 4. Consultar Lista de Viagens</w:t>
+        <w:t>UC 4. Consultar Lista de Viagens</w:t>
       </w:r>
     </w:p>
     <w:tbl>
@@ -4584,21 +3561,12 @@
           <w:lang w:val="pt-BR"/>
         </w:rPr>
       </w:pPr>
-      <w:proofErr w:type="spellStart"/>
       <w:r>
         <w:rPr>
           <w:b w:val="0"/>
           <w:lang w:val="pt-BR"/>
         </w:rPr>
-        <w:t>UC</w:t>
-      </w:r>
-      <w:proofErr w:type="spellEnd"/>
-      <w:r>
-        <w:rPr>
-          <w:b w:val="0"/>
-          <w:lang w:val="pt-BR"/>
-        </w:rPr>
-        <w:t xml:space="preserve"> 5. Editar Viagem</w:t>
+        <w:t>UC 5. Editar Viagem</w:t>
       </w:r>
     </w:p>
     <w:tbl>
@@ -4693,16 +3661,8 @@
               <w:rPr>
                 <w:lang w:val="pt-BR"/>
               </w:rPr>
-              <w:t xml:space="preserve">A viagem existe e o utilizador é </w:t>
-            </w:r>
-            <w:proofErr w:type="spellStart"/>
-            <w:r>
-              <w:rPr>
-                <w:lang w:val="pt-BR"/>
-              </w:rPr>
-              <w:t>OWNER</w:t>
-            </w:r>
-            <w:proofErr w:type="spellEnd"/>
+              <w:t>A viagem existe e o utilizador é OWNER</w:t>
+            </w:r>
           </w:p>
         </w:tc>
       </w:tr>
@@ -4741,16 +3701,8 @@
               <w:rPr>
                 <w:lang w:val="pt-BR"/>
               </w:rPr>
-              <w:t xml:space="preserve">Os dados atualizados ficam gravados no </w:t>
-            </w:r>
-            <w:proofErr w:type="spellStart"/>
-            <w:r>
-              <w:rPr>
-                <w:lang w:val="pt-BR"/>
-              </w:rPr>
-              <w:t>RestDB</w:t>
-            </w:r>
-            <w:proofErr w:type="spellEnd"/>
+              <w:t>Os dados atualizados ficam gravados no RestDB</w:t>
+            </w:r>
           </w:p>
         </w:tc>
       </w:tr>
@@ -4919,21 +3871,12 @@
           <w:lang w:val="pt-BR"/>
         </w:rPr>
       </w:pPr>
-      <w:proofErr w:type="spellStart"/>
       <w:r>
         <w:rPr>
           <w:b w:val="0"/>
           <w:lang w:val="pt-BR"/>
         </w:rPr>
-        <w:t>UC</w:t>
-      </w:r>
-      <w:proofErr w:type="spellEnd"/>
-      <w:r>
-        <w:rPr>
-          <w:b w:val="0"/>
-          <w:lang w:val="pt-BR"/>
-        </w:rPr>
-        <w:t xml:space="preserve"> 6. Apagar Viagem</w:t>
+        <w:t>UC 6. Apagar Viagem</w:t>
       </w:r>
     </w:p>
     <w:tbl>
@@ -5028,16 +3971,8 @@
               <w:rPr>
                 <w:lang w:val="pt-BR"/>
               </w:rPr>
-              <w:t xml:space="preserve">A viagem existe e o utilizador é </w:t>
-            </w:r>
-            <w:proofErr w:type="spellStart"/>
-            <w:r>
-              <w:rPr>
-                <w:lang w:val="pt-BR"/>
-              </w:rPr>
-              <w:t>OWNER</w:t>
-            </w:r>
-            <w:proofErr w:type="spellEnd"/>
+              <w:t>A viagem existe e o utilizador é OWNER</w:t>
+            </w:r>
           </w:p>
         </w:tc>
       </w:tr>
@@ -5276,21 +4211,12 @@
           <w:lang w:val="pt-BR"/>
         </w:rPr>
       </w:pPr>
-      <w:proofErr w:type="spellStart"/>
       <w:r>
         <w:rPr>
           <w:b w:val="0"/>
           <w:lang w:val="pt-BR"/>
         </w:rPr>
-        <w:t>UC</w:t>
-      </w:r>
-      <w:proofErr w:type="spellEnd"/>
-      <w:r>
-        <w:rPr>
-          <w:b w:val="0"/>
-          <w:lang w:val="pt-BR"/>
-        </w:rPr>
-        <w:t xml:space="preserve"> 7. Gerir Participantes</w:t>
+        <w:t>UC 7. Gerir Participantes</w:t>
       </w:r>
     </w:p>
     <w:tbl>
@@ -5385,16 +4311,8 @@
               <w:rPr>
                 <w:lang w:val="pt-BR"/>
               </w:rPr>
-              <w:t xml:space="preserve">A viagem existe e o utilizador é </w:t>
-            </w:r>
-            <w:proofErr w:type="spellStart"/>
-            <w:r>
-              <w:rPr>
-                <w:lang w:val="pt-BR"/>
-              </w:rPr>
-              <w:t>OWNER</w:t>
-            </w:r>
-            <w:proofErr w:type="spellEnd"/>
+              <w:t>A viagem existe e o utilizador é OWNER</w:t>
+            </w:r>
           </w:p>
         </w:tc>
       </w:tr>
@@ -5496,21 +4414,7 @@
                 <w:lang w:val="pt-BR"/>
               </w:rPr>
               <w:lastRenderedPageBreak/>
-              <w:t xml:space="preserve">O utilizador introduz o </w:t>
-            </w:r>
-            <w:proofErr w:type="spellStart"/>
-            <w:r>
-              <w:rPr>
-                <w:lang w:val="pt-BR"/>
-              </w:rPr>
-              <w:t>email</w:t>
-            </w:r>
-            <w:proofErr w:type="spellEnd"/>
-            <w:r>
-              <w:rPr>
-                <w:lang w:val="pt-BR"/>
-              </w:rPr>
-              <w:t xml:space="preserve"> do convidado;</w:t>
+              <w:t>O utilizador introduz o email do convidado;</w:t>
             </w:r>
           </w:p>
           <w:p>
@@ -5619,21 +4523,12 @@
           <w:lang w:val="pt-BR"/>
         </w:rPr>
       </w:pPr>
-      <w:proofErr w:type="spellStart"/>
       <w:r>
         <w:rPr>
           <w:b w:val="0"/>
           <w:lang w:val="pt-BR"/>
         </w:rPr>
-        <w:t>UC</w:t>
-      </w:r>
-      <w:proofErr w:type="spellEnd"/>
-      <w:r>
-        <w:rPr>
-          <w:b w:val="0"/>
-          <w:lang w:val="pt-BR"/>
-        </w:rPr>
-        <w:t xml:space="preserve"> 8. Adicionar Locais</w:t>
+        <w:t>UC 8. Adicionar Locais</w:t>
       </w:r>
     </w:p>
     <w:tbl>
@@ -5848,21 +4743,7 @@
               <w:rPr>
                 <w:lang w:val="pt-BR"/>
               </w:rPr>
-              <w:t xml:space="preserve">O utilizador introduz o </w:t>
-            </w:r>
-            <w:proofErr w:type="spellStart"/>
-            <w:r>
-              <w:rPr>
-                <w:lang w:val="pt-BR"/>
-              </w:rPr>
-              <w:t>email</w:t>
-            </w:r>
-            <w:proofErr w:type="spellEnd"/>
-            <w:r>
-              <w:rPr>
-                <w:lang w:val="pt-BR"/>
-              </w:rPr>
-              <w:t xml:space="preserve"> do convidado;</w:t>
+              <w:t>O utilizador introduz o email do convidado;</w:t>
             </w:r>
           </w:p>
           <w:p>
@@ -5983,21 +4864,12 @@
           <w:lang w:val="pt-BR"/>
         </w:rPr>
       </w:pPr>
-      <w:proofErr w:type="spellStart"/>
       <w:r>
         <w:rPr>
           <w:b w:val="0"/>
           <w:lang w:val="pt-BR"/>
         </w:rPr>
-        <w:t>UC</w:t>
-      </w:r>
-      <w:proofErr w:type="spellEnd"/>
-      <w:r>
-        <w:rPr>
-          <w:b w:val="0"/>
-          <w:lang w:val="pt-BR"/>
-        </w:rPr>
-        <w:t xml:space="preserve"> 9. Tirar e Enviar Fotografia</w:t>
+        <w:t>UC 9. Tirar e Enviar Fotografia</w:t>
       </w:r>
     </w:p>
     <w:tbl>
@@ -6218,21 +5090,7 @@
               <w:rPr>
                 <w:lang w:val="pt-BR"/>
               </w:rPr>
-              <w:t xml:space="preserve">O sistema abre a </w:t>
-            </w:r>
-            <w:proofErr w:type="spellStart"/>
-            <w:r>
-              <w:rPr>
-                <w:lang w:val="pt-BR"/>
-              </w:rPr>
-              <w:t>App</w:t>
-            </w:r>
-            <w:proofErr w:type="spellEnd"/>
-            <w:r>
-              <w:rPr>
-                <w:lang w:val="pt-BR"/>
-              </w:rPr>
-              <w:t xml:space="preserve"> da Câmera</w:t>
+              <w:t>O sistema abre a App da Câmera</w:t>
             </w:r>
             <w:r>
               <w:rPr>
@@ -6299,21 +5157,12 @@
           <w:lang w:val="pt-BR"/>
         </w:rPr>
       </w:pPr>
-      <w:proofErr w:type="spellStart"/>
       <w:r>
         <w:rPr>
           <w:b w:val="0"/>
           <w:lang w:val="pt-BR"/>
         </w:rPr>
-        <w:t>UC</w:t>
-      </w:r>
-      <w:proofErr w:type="spellEnd"/>
-      <w:r>
-        <w:rPr>
-          <w:b w:val="0"/>
-          <w:lang w:val="pt-BR"/>
-        </w:rPr>
-        <w:t xml:space="preserve"> 10. Avaliar Local</w:t>
+        <w:t>UC 10. Avaliar Local</w:t>
       </w:r>
     </w:p>
     <w:tbl>
@@ -6571,22 +5420,13 @@
           <w:lang w:val="pt-BR"/>
         </w:rPr>
       </w:pPr>
-      <w:proofErr w:type="spellStart"/>
       <w:r>
         <w:rPr>
           <w:b w:val="0"/>
           <w:lang w:val="pt-BR"/>
         </w:rPr>
         <w:lastRenderedPageBreak/>
-        <w:t>UC</w:t>
-      </w:r>
-      <w:proofErr w:type="spellEnd"/>
-      <w:r>
-        <w:rPr>
-          <w:b w:val="0"/>
-          <w:lang w:val="pt-BR"/>
-        </w:rPr>
-        <w:t xml:space="preserve"> 11. Visualizar Mapa de Viagens</w:t>
+        <w:t>UC 11. Visualizar Mapa de Viagens</w:t>
       </w:r>
     </w:p>
     <w:tbl>
@@ -6909,21 +5749,12 @@
           <w:lang w:val="pt-BR"/>
         </w:rPr>
       </w:pPr>
-      <w:proofErr w:type="spellStart"/>
       <w:r>
         <w:rPr>
           <w:b w:val="0"/>
           <w:lang w:val="pt-BR"/>
         </w:rPr>
-        <w:t>UC</w:t>
-      </w:r>
-      <w:proofErr w:type="spellEnd"/>
-      <w:r>
-        <w:rPr>
-          <w:b w:val="0"/>
-          <w:lang w:val="pt-BR"/>
-        </w:rPr>
-        <w:t xml:space="preserve"> 12. Consultar Estatísticas da Viagem</w:t>
+        <w:t>UC 12. Consultar Estatísticas da Viagem</w:t>
       </w:r>
     </w:p>
     <w:tbl>
@@ -8027,7 +6858,25 @@
                                 <w:sz w:val="18"/>
                                 <w:szCs w:val="18"/>
                               </w:rPr>
-                              <w:t xml:space="preserve"> que </w:t>
+                              <w:t xml:space="preserve"> </w:t>
+                            </w:r>
+                            <w:proofErr w:type="spellStart"/>
+                            <w:r>
+                              <w:rPr>
+                                <w:b w:val="0"/>
+                                <w:sz w:val="18"/>
+                                <w:szCs w:val="18"/>
+                              </w:rPr>
+                              <w:t>que</w:t>
+                            </w:r>
+                            <w:proofErr w:type="spellEnd"/>
+                            <w:r>
+                              <w:rPr>
+                                <w:b w:val="0"/>
+                                <w:sz w:val="18"/>
+                                <w:szCs w:val="18"/>
+                              </w:rPr>
+                              <w:t xml:space="preserve"> </w:t>
                             </w:r>
                             <w:proofErr w:type="spellStart"/>
                             <w:r>
@@ -8607,7 +7456,25 @@
                                 <w:sz w:val="18"/>
                                 <w:szCs w:val="18"/>
                               </w:rPr>
-                              <w:t xml:space="preserve"> que </w:t>
+                              <w:t xml:space="preserve"> </w:t>
+                            </w:r>
+                            <w:proofErr w:type="spellStart"/>
+                            <w:r>
+                              <w:rPr>
+                                <w:b w:val="0"/>
+                                <w:sz w:val="18"/>
+                                <w:szCs w:val="18"/>
+                              </w:rPr>
+                              <w:t>que</w:t>
+                            </w:r>
+                            <w:proofErr w:type="spellEnd"/>
+                            <w:r>
+                              <w:rPr>
+                                <w:b w:val="0"/>
+                                <w:sz w:val="18"/>
+                                <w:szCs w:val="18"/>
+                              </w:rPr>
+                              <w:t xml:space="preserve"> </w:t>
                             </w:r>
                             <w:proofErr w:type="spellStart"/>
                             <w:r>
@@ -8670,15 +7537,7 @@
                                 <w:sz w:val="18"/>
                                 <w:szCs w:val="18"/>
                               </w:rPr>
-                              <w:t>apli</w:t>
-                            </w:r>
-                            <w:r>
-                              <w:rPr>
-                                <w:b w:val="0"/>
-                                <w:sz w:val="18"/>
-                                <w:szCs w:val="18"/>
-                              </w:rPr>
-                              <w:t>cação</w:t>
+                              <w:t>aplicação</w:t>
                             </w:r>
                             <w:proofErr w:type="spellEnd"/>
                             <w:r>
@@ -9228,16 +8087,8 @@
         <w:rPr>
           <w:lang w:val="pt-BR"/>
         </w:rPr>
-        <w:t xml:space="preserve">Requisitos </w:t>
-      </w:r>
-      <w:proofErr w:type="gramStart"/>
-      <w:r>
-        <w:rPr>
-          <w:lang w:val="pt-BR"/>
-        </w:rPr>
-        <w:t>não Funcionais</w:t>
-      </w:r>
-      <w:proofErr w:type="gramEnd"/>
+        <w:t>Requisitos não Funcionais</w:t>
+      </w:r>
     </w:p>
     <w:p>
       <w:pPr>
@@ -9251,13 +8102,7 @@
         <w:rPr>
           <w:lang w:val="pt-BR"/>
         </w:rPr>
-        <w:t>Especificam propriedades do sistema ou restrições que melhoram a sua funcionalidade</w:t>
-      </w:r>
-      <w:r>
-        <w:rPr>
-          <w:lang w:val="pt-BR"/>
-        </w:rPr>
-        <w:t>.</w:t>
+        <w:t>Especificam propriedades do sistema ou restrições que melhoram a sua funcionalidade.</w:t>
       </w:r>
       <w:bookmarkEnd w:id="0"/>
       <w:bookmarkEnd w:id="1"/>
@@ -9488,27 +8333,35 @@
       </w:r>
       <w:proofErr w:type="spellEnd"/>
       <w:r>
-        <w:t xml:space="preserve"> e a </w:t>
+        <w:t xml:space="preserve"> e a consulta de </w:t>
       </w:r>
       <w:proofErr w:type="spellStart"/>
       <w:r>
-        <w:t>consulta</w:t>
+        <w:t>estatísticas</w:t>
       </w:r>
       <w:proofErr w:type="spellEnd"/>
       <w:r>
-        <w:t xml:space="preserve"> de </w:t>
+        <w:t xml:space="preserve">. </w:t>
+      </w:r>
+      <w:proofErr w:type="gramStart"/>
+      <w:r>
+        <w:t>A</w:t>
+      </w:r>
+      <w:proofErr w:type="gramEnd"/>
+      <w:r>
+        <w:t xml:space="preserve"> </w:t>
       </w:r>
       <w:proofErr w:type="spellStart"/>
       <w:r>
-        <w:t>estatísticas</w:t>
+        <w:t>aplicação</w:t>
       </w:r>
       <w:proofErr w:type="spellEnd"/>
       <w:r>
-        <w:t xml:space="preserve">. A </w:t>
+        <w:t xml:space="preserve"> </w:t>
       </w:r>
       <w:proofErr w:type="spellStart"/>
       <w:r>
-        <w:t>aplicação</w:t>
+        <w:t>deve</w:t>
       </w:r>
       <w:proofErr w:type="spellEnd"/>
       <w:r>
@@ -9516,7 +8369,7 @@
       </w:r>
       <w:proofErr w:type="spellStart"/>
       <w:r>
-        <w:t>deve</w:t>
+        <w:t>apresentar</w:t>
       </w:r>
       <w:proofErr w:type="spellEnd"/>
       <w:r>
@@ -9524,7 +8377,7 @@
       </w:r>
       <w:proofErr w:type="spellStart"/>
       <w:r>
-        <w:t>apresentar</w:t>
+        <w:t>mensagens</w:t>
       </w:r>
       <w:proofErr w:type="spellEnd"/>
       <w:r>
@@ -9532,25 +8385,31 @@
       </w:r>
       <w:proofErr w:type="spellStart"/>
       <w:r>
-        <w:t>mensagens</w:t>
+        <w:t>claras</w:t>
       </w:r>
       <w:proofErr w:type="spellEnd"/>
       <w:r>
+        <w:t xml:space="preserve"> para </w:t>
+      </w:r>
+      <w:proofErr w:type="spellStart"/>
+      <w:r>
+        <w:t>informar</w:t>
+      </w:r>
+      <w:proofErr w:type="spellEnd"/>
+      <w:r>
         <w:t xml:space="preserve"> </w:t>
       </w:r>
       <w:proofErr w:type="spellStart"/>
-      <w:proofErr w:type="gramStart"/>
-      <w:r>
-        <w:t>claras</w:t>
+      <w:r>
+        <w:t>os</w:t>
       </w:r>
       <w:proofErr w:type="spellEnd"/>
-      <w:proofErr w:type="gramEnd"/>
-      <w:r>
-        <w:t xml:space="preserve"> para </w:t>
+      <w:r>
+        <w:t xml:space="preserve"> </w:t>
       </w:r>
       <w:proofErr w:type="spellStart"/>
       <w:r>
-        <w:t>informar</w:t>
+        <w:t>utilizadores</w:t>
       </w:r>
       <w:proofErr w:type="spellEnd"/>
       <w:r>
@@ -9558,6 +8417,30 @@
       </w:r>
       <w:proofErr w:type="spellStart"/>
       <w:r>
+        <w:t>sobre</w:t>
+      </w:r>
+      <w:proofErr w:type="spellEnd"/>
+      <w:r>
+        <w:t xml:space="preserve"> as </w:t>
+      </w:r>
+      <w:proofErr w:type="spellStart"/>
+      <w:r>
+        <w:t>ações</w:t>
+      </w:r>
+      <w:proofErr w:type="spellEnd"/>
+      <w:r>
+        <w:t xml:space="preserve"> </w:t>
+      </w:r>
+      <w:proofErr w:type="spellStart"/>
+      <w:r>
+        <w:t>realizadas</w:t>
+      </w:r>
+      <w:proofErr w:type="spellEnd"/>
+      <w:r>
+        <w:t xml:space="preserve"> e </w:t>
+      </w:r>
+      <w:proofErr w:type="spellStart"/>
+      <w:r>
         <w:t>os</w:t>
       </w:r>
       <w:proofErr w:type="spellEnd"/>
@@ -9566,7 +8449,7 @@
       </w:r>
       <w:proofErr w:type="spellStart"/>
       <w:r>
-        <w:t>utilizadores</w:t>
+        <w:t>erros</w:t>
       </w:r>
       <w:proofErr w:type="spellEnd"/>
       <w:r>
@@ -9574,50 +8457,10 @@
       </w:r>
       <w:proofErr w:type="spellStart"/>
       <w:r>
-        <w:t>sobre</w:t>
+        <w:t>detetados</w:t>
       </w:r>
       <w:proofErr w:type="spellEnd"/>
       <w:r>
-        <w:t xml:space="preserve"> as </w:t>
-      </w:r>
-      <w:proofErr w:type="spellStart"/>
-      <w:r>
-        <w:t>ações</w:t>
-      </w:r>
-      <w:proofErr w:type="spellEnd"/>
-      <w:r>
-        <w:t xml:space="preserve"> </w:t>
-      </w:r>
-      <w:proofErr w:type="spellStart"/>
-      <w:r>
-        <w:t>realizadas</w:t>
-      </w:r>
-      <w:proofErr w:type="spellEnd"/>
-      <w:r>
-        <w:t xml:space="preserve"> e </w:t>
-      </w:r>
-      <w:proofErr w:type="spellStart"/>
-      <w:r>
-        <w:t>os</w:t>
-      </w:r>
-      <w:proofErr w:type="spellEnd"/>
-      <w:r>
-        <w:t xml:space="preserve"> </w:t>
-      </w:r>
-      <w:proofErr w:type="spellStart"/>
-      <w:r>
-        <w:t>erros</w:t>
-      </w:r>
-      <w:proofErr w:type="spellEnd"/>
-      <w:r>
-        <w:t xml:space="preserve"> </w:t>
-      </w:r>
-      <w:proofErr w:type="spellStart"/>
-      <w:r>
-        <w:t>detetados</w:t>
-      </w:r>
-      <w:proofErr w:type="spellEnd"/>
-      <w:r>
         <w:t>.</w:t>
       </w:r>
     </w:p>
@@ -9628,14 +8471,138 @@
           <w:lang w:val="pt-BR"/>
         </w:rPr>
       </w:pPr>
-      <w:r>
-        <w:rPr>
-          <w:lang w:val="pt-BR"/>
-        </w:rPr>
-        <w:t>6   Conclusão</w:t>
-      </w:r>
-      <w:bookmarkStart w:id="2" w:name="_GoBack"/>
-      <w:bookmarkEnd w:id="2"/>
+    </w:p>
+    <w:p>
+      <w:pPr>
+        <w:pStyle w:val="heading1"/>
+        <w:rPr>
+          <w:lang w:val="pt-BR"/>
+        </w:rPr>
+      </w:pPr>
+      <w:r>
+        <w:rPr>
+          <w:lang w:val="pt-BR"/>
+        </w:rPr>
+        <w:t xml:space="preserve">6   </w:t>
+      </w:r>
+      <w:r>
+        <w:rPr>
+          <w:lang w:val="pt-BR"/>
+        </w:rPr>
+        <w:t>Arquitetura Física</w:t>
+      </w:r>
+    </w:p>
+    <w:p>
+      <w:pPr>
+        <w:pStyle w:val="p1a"/>
+        <w:rPr>
+          <w:lang w:val="pt-BR"/>
+        </w:rPr>
+      </w:pPr>
+      <w:r>
+        <w:rPr>
+          <w:lang w:val="pt-BR"/>
+        </w:rPr>
+        <w:t>A arquitetura física (Fig 5) descreve o hardware e os servidores necessários à execução do sistema. Neste caso, a aplicação é executada num telemóvel Android, o qual se comunica com os servidores remotos, que neste caso são o servidor RestDB, o PositionStack e o OpenStreetMap.</w:t>
+      </w:r>
+    </w:p>
+    <w:p>
+      <w:pPr>
+        <w:rPr>
+          <w:lang w:val="pt-BR"/>
+        </w:rPr>
+      </w:pPr>
+    </w:p>
+    <w:p>
+      <w:pPr>
+        <w:rPr>
+          <w:lang w:val="pt-BR"/>
+        </w:rPr>
+      </w:pPr>
+    </w:p>
+    <w:p>
+      <w:pPr>
+        <w:rPr>
+          <w:lang w:val="pt-BR"/>
+        </w:rPr>
+      </w:pPr>
+    </w:p>
+    <w:p>
+      <w:pPr>
+        <w:rPr>
+          <w:lang w:val="pt-BR"/>
+        </w:rPr>
+      </w:pPr>
+    </w:p>
+    <w:p>
+      <w:pPr>
+        <w:rPr>
+          <w:lang w:val="pt-BR"/>
+        </w:rPr>
+      </w:pPr>
+      <w:r>
+        <w:rPr>
+          <w:noProof/>
+          <w:lang w:val="pt-BR"/>
+        </w:rPr>
+        <w:drawing>
+          <wp:inline distT="0" distB="0" distL="0" distR="0" wp14:anchorId="308D82EB" wp14:editId="132EAE6D">
+            <wp:extent cx="4567204" cy="3282286"/>
+            <wp:effectExtent l="0" t="0" r="5080" b="0"/>
+            <wp:docPr id="2121297331" name="Imagem 3"/>
+            <wp:cNvGraphicFramePr>
+              <a:graphicFrameLocks xmlns:a="http://schemas.openxmlformats.org/drawingml/2006/main" noChangeAspect="1"/>
+            </wp:cNvGraphicFramePr>
+            <a:graphic xmlns:a="http://schemas.openxmlformats.org/drawingml/2006/main">
+              <a:graphicData uri="http://schemas.openxmlformats.org/drawingml/2006/picture">
+                <pic:pic xmlns:pic="http://schemas.openxmlformats.org/drawingml/2006/picture">
+                  <pic:nvPicPr>
+                    <pic:cNvPr id="2121297331" name="Imagem 2121297331"/>
+                    <pic:cNvPicPr/>
+                  </pic:nvPicPr>
+                  <pic:blipFill>
+                    <a:blip r:embed="rId9">
+                      <a:extLst>
+                        <a:ext uri="{28A0092B-C50C-407E-A947-70E740481C1C}">
+                          <a14:useLocalDpi xmlns:a14="http://schemas.microsoft.com/office/drawing/2010/main" val="0"/>
+                        </a:ext>
+                      </a:extLst>
+                    </a:blip>
+                    <a:stretch>
+                      <a:fillRect/>
+                    </a:stretch>
+                  </pic:blipFill>
+                  <pic:spPr>
+                    <a:xfrm>
+                      <a:off x="0" y="0"/>
+                      <a:ext cx="4594198" cy="3301686"/>
+                    </a:xfrm>
+                    <a:prstGeom prst="rect">
+                      <a:avLst/>
+                    </a:prstGeom>
+                  </pic:spPr>
+                </pic:pic>
+              </a:graphicData>
+            </a:graphic>
+          </wp:inline>
+        </w:drawing>
+      </w:r>
+    </w:p>
+    <w:p>
+      <w:pPr>
+        <w:pStyle w:val="p1a"/>
+        <w:ind w:firstLine="708"/>
+        <w:rPr>
+          <w:lang w:val="pt-BR"/>
+        </w:rPr>
+      </w:pPr>
+    </w:p>
+    <w:p>
+      <w:pPr>
+        <w:rPr>
+          <w:lang w:val="pt-BR"/>
+        </w:rPr>
+      </w:pPr>
     </w:p>
     <w:sectPr>
       <w:pgSz w:w="11907" w:h="16840" w:code="9"/>
@@ -9649,7 +8616,7 @@
 </file>
 
 <file path=word/numbering.xml><?xml version="1.0" encoding="utf-8"?>
-<w:numbering xmlns:wpc="http://schemas.microsoft.com/office/word/2010/wordprocessingCanvas" xmlns:mc="http://schemas.openxmlformats.org/markup-compatibility/2006" xmlns:o="urn:schemas-microsoft-com:office:office" xmlns:r="http://schemas.openxmlformats.org/officeDocument/2006/relationships" xmlns:m="http://schemas.openxmlformats.org/officeDocument/2006/math" xmlns:v="urn:schemas-microsoft-com:vml" xmlns:wp14="http://schemas.microsoft.com/office/word/2010/wordprocessingDrawing" xmlns:wp="http://schemas.openxmlformats.org/drawingml/2006/wordprocessingDrawing" xmlns:w10="urn:schemas-microsoft-com:office:word" xmlns:w="http://schemas.openxmlformats.org/wordprocessingml/2006/main" xmlns:w14="http://schemas.microsoft.com/office/word/2010/wordml" xmlns:w15="http://schemas.microsoft.com/office/word/2012/wordml" xmlns:wpg="http://schemas.microsoft.com/office/word/2010/wordprocessingGroup" xmlns:wpi="http://schemas.microsoft.com/office/word/2010/wordprocessingInk" xmlns:wne="http://schemas.microsoft.com/office/word/2006/wordml" xmlns:wps="http://schemas.microsoft.com/office/word/2010/wordprocessingShape" mc:Ignorable="w14 w15 wp14">
+<w:numbering xmlns:wpc="http://schemas.microsoft.com/office/word/2010/wordprocessingCanvas" xmlns:cx="http://schemas.microsoft.com/office/drawing/2014/chartex" xmlns:cx1="http://schemas.microsoft.com/office/drawing/2015/9/8/chartex" xmlns:cx2="http://schemas.microsoft.com/office/drawing/2015/10/21/chartex" xmlns:cx3="http://schemas.microsoft.com/office/drawing/2016/5/9/chartex" xmlns:cx4="http://schemas.microsoft.com/office/drawing/2016/5/10/chartex" xmlns:cx5="http://schemas.microsoft.com/office/drawing/2016/5/11/chartex" xmlns:cx6="http://schemas.microsoft.com/office/drawing/2016/5/12/chartex" xmlns:cx7="http://schemas.microsoft.com/office/drawing/2016/5/13/chartex" xmlns:cx8="http://schemas.microsoft.com/office/drawing/2016/5/14/chartex" xmlns:mc="http://schemas.openxmlformats.org/markup-compatibility/2006" xmlns:aink="http://schemas.microsoft.com/office/drawing/2016/ink" xmlns:am3d="http://schemas.microsoft.com/office/drawing/2017/model3d" xmlns:o="urn:schemas-microsoft-com:office:office" xmlns:oel="http://schemas.microsoft.com/office/2019/extlst" xmlns:r="http://schemas.openxmlformats.org/officeDocument/2006/relationships" xmlns:m="http://schemas.openxmlformats.org/officeDocument/2006/math" xmlns:v="urn:schemas-microsoft-com:vml" xmlns:wp14="http://schemas.microsoft.com/office/word/2010/wordprocessingDrawing" xmlns:wp="http://schemas.openxmlformats.org/drawingml/2006/wordprocessingDrawing" xmlns:w10="urn:schemas-microsoft-com:office:word" xmlns:w="http://schemas.openxmlformats.org/wordprocessingml/2006/main" xmlns:w14="http://schemas.microsoft.com/office/word/2010/wordml" xmlns:w15="http://schemas.microsoft.com/office/word/2012/wordml" xmlns:w16cex="http://schemas.microsoft.com/office/word/2018/wordml/cex" xmlns:w16cid="http://schemas.microsoft.com/office/word/2016/wordml/cid" xmlns:w16="http://schemas.microsoft.com/office/word/2018/wordml" xmlns:w16du="http://schemas.microsoft.com/office/word/2023/wordml/word16du" xmlns:w16sdtdh="http://schemas.microsoft.com/office/word/2020/wordml/sdtdatahash" xmlns:w16sdtfl="http://schemas.microsoft.com/office/word/2024/wordml/sdtformatlock" xmlns:w16se="http://schemas.microsoft.com/office/word/2015/wordml/symex" xmlns:wpg="http://schemas.microsoft.com/office/word/2010/wordprocessingGroup" xmlns:wpi="http://schemas.microsoft.com/office/word/2010/wordprocessingInk" xmlns:wne="http://schemas.microsoft.com/office/word/2006/wordml" xmlns:wps="http://schemas.microsoft.com/office/word/2010/wordprocessingShape" mc:Ignorable="w14 w15 w16se w16cid w16 w16cex w16sdtdh w16sdtfl w16du wp14">
   <w:abstractNum w:abstractNumId="0" w15:restartNumberingAfterBreak="0">
     <w:nsid w:val="008F0F0F"/>
     <w:multiLevelType w:val="hybridMultilevel"/>
@@ -13058,110 +12025,110 @@
       </w:pPr>
     </w:lvl>
   </w:abstractNum>
-  <w:num w:numId="1">
+  <w:num w:numId="1" w16cid:durableId="1483737360">
     <w:abstractNumId w:val="12"/>
   </w:num>
-  <w:num w:numId="2">
+  <w:num w:numId="2" w16cid:durableId="1785493417">
     <w:abstractNumId w:val="31"/>
   </w:num>
-  <w:num w:numId="3">
+  <w:num w:numId="3" w16cid:durableId="1841503381">
     <w:abstractNumId w:val="5"/>
   </w:num>
-  <w:num w:numId="4">
+  <w:num w:numId="4" w16cid:durableId="2110276064">
     <w:abstractNumId w:val="4"/>
   </w:num>
-  <w:num w:numId="5">
+  <w:num w:numId="5" w16cid:durableId="315960834">
     <w:abstractNumId w:val="32"/>
   </w:num>
-  <w:num w:numId="6">
+  <w:num w:numId="6" w16cid:durableId="1940596308">
     <w:abstractNumId w:val="11"/>
   </w:num>
-  <w:num w:numId="7">
+  <w:num w:numId="7" w16cid:durableId="297302676">
     <w:abstractNumId w:val="0"/>
   </w:num>
-  <w:num w:numId="8">
+  <w:num w:numId="8" w16cid:durableId="752774085">
     <w:abstractNumId w:val="6"/>
   </w:num>
-  <w:num w:numId="9">
+  <w:num w:numId="9" w16cid:durableId="344720834">
     <w:abstractNumId w:val="8"/>
   </w:num>
-  <w:num w:numId="10">
+  <w:num w:numId="10" w16cid:durableId="952177586">
     <w:abstractNumId w:val="7"/>
   </w:num>
-  <w:num w:numId="11">
+  <w:num w:numId="11" w16cid:durableId="917062412">
     <w:abstractNumId w:val="30"/>
   </w:num>
-  <w:num w:numId="12">
+  <w:num w:numId="12" w16cid:durableId="1848867801">
     <w:abstractNumId w:val="24"/>
   </w:num>
-  <w:num w:numId="13">
+  <w:num w:numId="13" w16cid:durableId="2092660504">
     <w:abstractNumId w:val="27"/>
   </w:num>
-  <w:num w:numId="14">
+  <w:num w:numId="14" w16cid:durableId="2066640647">
     <w:abstractNumId w:val="10"/>
   </w:num>
-  <w:num w:numId="15">
+  <w:num w:numId="15" w16cid:durableId="134765909">
     <w:abstractNumId w:val="26"/>
   </w:num>
-  <w:num w:numId="16">
+  <w:num w:numId="16" w16cid:durableId="1562902638">
     <w:abstractNumId w:val="16"/>
   </w:num>
-  <w:num w:numId="17">
+  <w:num w:numId="17" w16cid:durableId="1797411218">
     <w:abstractNumId w:val="21"/>
   </w:num>
-  <w:num w:numId="18">
+  <w:num w:numId="18" w16cid:durableId="885531616">
     <w:abstractNumId w:val="28"/>
   </w:num>
-  <w:num w:numId="19">
+  <w:num w:numId="19" w16cid:durableId="671682715">
     <w:abstractNumId w:val="1"/>
   </w:num>
-  <w:num w:numId="20">
+  <w:num w:numId="20" w16cid:durableId="1322588564">
     <w:abstractNumId w:val="22"/>
   </w:num>
-  <w:num w:numId="21">
+  <w:num w:numId="21" w16cid:durableId="303705459">
     <w:abstractNumId w:val="29"/>
   </w:num>
-  <w:num w:numId="22">
+  <w:num w:numId="22" w16cid:durableId="504052742">
     <w:abstractNumId w:val="25"/>
   </w:num>
-  <w:num w:numId="23">
+  <w:num w:numId="23" w16cid:durableId="1576670325">
     <w:abstractNumId w:val="14"/>
   </w:num>
-  <w:num w:numId="24">
+  <w:num w:numId="24" w16cid:durableId="114638344">
     <w:abstractNumId w:val="17"/>
   </w:num>
-  <w:num w:numId="25">
+  <w:num w:numId="25" w16cid:durableId="891770543">
     <w:abstractNumId w:val="13"/>
   </w:num>
-  <w:num w:numId="26">
+  <w:num w:numId="26" w16cid:durableId="127624197">
     <w:abstractNumId w:val="18"/>
   </w:num>
-  <w:num w:numId="27">
+  <w:num w:numId="27" w16cid:durableId="1084112297">
     <w:abstractNumId w:val="15"/>
   </w:num>
-  <w:num w:numId="28">
+  <w:num w:numId="28" w16cid:durableId="545727463">
     <w:abstractNumId w:val="19"/>
   </w:num>
-  <w:num w:numId="29">
+  <w:num w:numId="29" w16cid:durableId="168719472">
     <w:abstractNumId w:val="2"/>
   </w:num>
-  <w:num w:numId="30">
+  <w:num w:numId="30" w16cid:durableId="1138229620">
     <w:abstractNumId w:val="20"/>
   </w:num>
-  <w:num w:numId="31">
+  <w:num w:numId="31" w16cid:durableId="606158194">
     <w:abstractNumId w:val="3"/>
   </w:num>
-  <w:num w:numId="32">
+  <w:num w:numId="32" w16cid:durableId="1959989572">
     <w:abstractNumId w:val="9"/>
   </w:num>
-  <w:num w:numId="33">
+  <w:num w:numId="33" w16cid:durableId="1045526228">
     <w:abstractNumId w:val="23"/>
   </w:num>
 </w:numbering>
 </file>
 
 <file path=word/styles.xml><?xml version="1.0" encoding="utf-8"?>
-<w:styles xmlns:mc="http://schemas.openxmlformats.org/markup-compatibility/2006" xmlns:r="http://schemas.openxmlformats.org/officeDocument/2006/relationships" xmlns:w="http://schemas.openxmlformats.org/wordprocessingml/2006/main" xmlns:w14="http://schemas.microsoft.com/office/word/2010/wordml" xmlns:w15="http://schemas.microsoft.com/office/word/2012/wordml" mc:Ignorable="w14 w15">
+<w:styles xmlns:mc="http://schemas.openxmlformats.org/markup-compatibility/2006" xmlns:r="http://schemas.openxmlformats.org/officeDocument/2006/relationships" xmlns:w="http://schemas.openxmlformats.org/wordprocessingml/2006/main" xmlns:w14="http://schemas.microsoft.com/office/word/2010/wordml" xmlns:w15="http://schemas.microsoft.com/office/word/2012/wordml" xmlns:w16cex="http://schemas.microsoft.com/office/word/2018/wordml/cex" xmlns:w16cid="http://schemas.microsoft.com/office/word/2016/wordml/cid" xmlns:w16="http://schemas.microsoft.com/office/word/2018/wordml" xmlns:w16du="http://schemas.microsoft.com/office/word/2023/wordml/word16du" xmlns:w16sdtdh="http://schemas.microsoft.com/office/word/2020/wordml/sdtdatahash" xmlns:w16sdtfl="http://schemas.microsoft.com/office/word/2024/wordml/sdtformatlock" xmlns:w16se="http://schemas.microsoft.com/office/word/2015/wordml/symex" mc:Ignorable="w14 w15 w16se w16cid w16 w16cex w16sdtdh w16sdtfl w16du">
   <w:docDefaults>
     <w:rPrDefault>
       <w:rPr>
@@ -13177,7 +12144,7 @@
       </w:pPr>
     </w:pPrDefault>
   </w:docDefaults>
-  <w:latentStyles w:defLockedState="0" w:defUIPriority="99" w:defSemiHidden="0" w:defUnhideWhenUsed="0" w:defQFormat="0" w:count="371">
+  <w:latentStyles w:defLockedState="0" w:defUIPriority="99" w:defSemiHidden="0" w:defUnhideWhenUsed="0" w:defQFormat="0" w:count="376">
     <w:lsdException w:name="Normal" w:uiPriority="0" w:qFormat="1"/>
     <w:lsdException w:name="heading 1" w:uiPriority="9" w:qFormat="1"/>
     <w:lsdException w:name="heading 2" w:semiHidden="1" w:uiPriority="9" w:unhideWhenUsed="1" w:qFormat="1"/>
@@ -13549,6 +12516,11 @@
     <w:lsdException w:name="List Table 5 Dark Accent 6" w:uiPriority="50"/>
     <w:lsdException w:name="List Table 6 Colorful Accent 6" w:uiPriority="51"/>
     <w:lsdException w:name="List Table 7 Colorful Accent 6" w:uiPriority="52"/>
+    <w:lsdException w:name="Mention" w:semiHidden="1" w:unhideWhenUsed="1"/>
+    <w:lsdException w:name="Smart Hyperlink" w:semiHidden="1" w:unhideWhenUsed="1"/>
+    <w:lsdException w:name="Hashtag" w:semiHidden="1" w:unhideWhenUsed="1"/>
+    <w:lsdException w:name="Unresolved Mention" w:semiHidden="1" w:unhideWhenUsed="1"/>
+    <w:lsdException w:name="Smart Link" w:semiHidden="1" w:unhideWhenUsed="1"/>
   </w:latentStyles>
   <w:style w:type="paragraph" w:default="1" w:styleId="Normal">
     <w:name w:val="Normal"/>
@@ -13566,7 +12538,7 @@
       <w:lang w:val="en-US" w:eastAsia="de-DE"/>
     </w:rPr>
   </w:style>
-  <w:style w:type="character" w:default="1" w:styleId="Fontepargpadro">
+  <w:style w:type="character" w:default="1" w:styleId="Tipodeletrapredefinidodopargrafo">
     <w:name w:val="Default Paragraph Font"/>
     <w:uiPriority w:val="1"/>
     <w:semiHidden/>

</xml_diff>

<commit_message>
Atualização Relatório - Arquitetura Lógica
</commit_message>
<xml_diff>
--- a/Documentation/Relatório-DSSMV-2025-27_2DB_1250771_1251355.docx
+++ b/Documentation/Relatório-DSSMV-2025-27_2DB_1250771_1251355.docx
@@ -6930,16 +6930,7 @@
                                 <w:sz w:val="18"/>
                                 <w:szCs w:val="18"/>
                               </w:rPr>
-                              <w:t xml:space="preserve"> da </w:t>
-                            </w:r>
-                            <w:proofErr w:type="spellStart"/>
-                            <w:r>
-                              <w:rPr>
-                                <w:b w:val="0"/>
-                                <w:sz w:val="18"/>
-                                <w:szCs w:val="18"/>
-                              </w:rPr>
-                              <w:t>apli</w:t>
+                              <w:t xml:space="preserve"> da apli</w:t>
                             </w:r>
                             <w:r>
                               <w:rPr>
@@ -6947,16 +6938,7 @@
                                 <w:sz w:val="18"/>
                                 <w:szCs w:val="18"/>
                               </w:rPr>
-                              <w:t>cação</w:t>
-                            </w:r>
-                            <w:proofErr w:type="spellEnd"/>
-                            <w:r>
-                              <w:rPr>
-                                <w:b w:val="0"/>
-                                <w:sz w:val="18"/>
-                                <w:szCs w:val="18"/>
-                              </w:rPr>
-                              <w:t xml:space="preserve"> para </w:t>
+                              <w:t xml:space="preserve">cação para </w:t>
                             </w:r>
                             <w:proofErr w:type="spellStart"/>
                             <w:r>
@@ -7528,25 +7510,7 @@
                                 <w:sz w:val="18"/>
                                 <w:szCs w:val="18"/>
                               </w:rPr>
-                              <w:t xml:space="preserve"> da </w:t>
-                            </w:r>
-                            <w:proofErr w:type="spellStart"/>
-                            <w:r>
-                              <w:rPr>
-                                <w:b w:val="0"/>
-                                <w:sz w:val="18"/>
-                                <w:szCs w:val="18"/>
-                              </w:rPr>
-                              <w:t>aplicação</w:t>
-                            </w:r>
-                            <w:proofErr w:type="spellEnd"/>
-                            <w:r>
-                              <w:rPr>
-                                <w:b w:val="0"/>
-                                <w:sz w:val="18"/>
-                                <w:szCs w:val="18"/>
-                              </w:rPr>
-                              <w:t xml:space="preserve"> para </w:t>
+                              <w:t xml:space="preserve"> da aplicação para </w:t>
                             </w:r>
                             <w:proofErr w:type="spellStart"/>
                             <w:r>
@@ -8141,11 +8105,19 @@
       </w:r>
       <w:proofErr w:type="gramEnd"/>
       <w:r>
+        <w:t xml:space="preserve"> aplicação </w:t>
+      </w:r>
+      <w:proofErr w:type="spellStart"/>
+      <w:r>
+        <w:t>deve</w:t>
+      </w:r>
+      <w:proofErr w:type="spellEnd"/>
+      <w:r>
         <w:t xml:space="preserve"> </w:t>
       </w:r>
       <w:proofErr w:type="spellStart"/>
       <w:r>
-        <w:t>aplicação</w:t>
+        <w:t>possir</w:t>
       </w:r>
       <w:proofErr w:type="spellEnd"/>
       <w:r>
@@ -8153,6 +8125,190 @@
       </w:r>
       <w:proofErr w:type="spellStart"/>
       <w:r>
+        <w:t>uma</w:t>
+      </w:r>
+      <w:proofErr w:type="spellEnd"/>
+      <w:r>
+        <w:t xml:space="preserve"> interface simples e </w:t>
+      </w:r>
+      <w:proofErr w:type="spellStart"/>
+      <w:r>
+        <w:t>intuitiva</w:t>
+      </w:r>
+      <w:proofErr w:type="spellEnd"/>
+      <w:r>
+        <w:t xml:space="preserve">, </w:t>
+      </w:r>
+      <w:proofErr w:type="spellStart"/>
+      <w:r>
+        <w:t>permitindo</w:t>
+      </w:r>
+      <w:proofErr w:type="spellEnd"/>
+      <w:r>
+        <w:t xml:space="preserve"> </w:t>
+      </w:r>
+      <w:proofErr w:type="spellStart"/>
+      <w:r>
+        <w:t>aos</w:t>
+      </w:r>
+      <w:proofErr w:type="spellEnd"/>
+      <w:r>
+        <w:t xml:space="preserve"> </w:t>
+      </w:r>
+      <w:proofErr w:type="spellStart"/>
+      <w:r>
+        <w:t>utilizadores</w:t>
+      </w:r>
+      <w:proofErr w:type="spellEnd"/>
+      <w:r>
+        <w:t xml:space="preserve"> </w:t>
+      </w:r>
+      <w:proofErr w:type="spellStart"/>
+      <w:r>
+        <w:t>navegar</w:t>
+      </w:r>
+      <w:proofErr w:type="spellEnd"/>
+      <w:r>
+        <w:t xml:space="preserve"> </w:t>
+      </w:r>
+      <w:proofErr w:type="spellStart"/>
+      <w:r>
+        <w:t>facilmente</w:t>
+      </w:r>
+      <w:proofErr w:type="spellEnd"/>
+      <w:r>
+        <w:t xml:space="preserve"> </w:t>
+      </w:r>
+      <w:proofErr w:type="spellStart"/>
+      <w:r>
+        <w:t>pelas</w:t>
+      </w:r>
+      <w:proofErr w:type="spellEnd"/>
+      <w:r>
+        <w:t xml:space="preserve"> </w:t>
+      </w:r>
+      <w:proofErr w:type="spellStart"/>
+      <w:r>
+        <w:t>suas</w:t>
+      </w:r>
+      <w:proofErr w:type="spellEnd"/>
+      <w:r>
+        <w:t xml:space="preserve"> </w:t>
+      </w:r>
+      <w:proofErr w:type="spellStart"/>
+      <w:r>
+        <w:t>principais</w:t>
+      </w:r>
+      <w:proofErr w:type="spellEnd"/>
+      <w:r>
+        <w:t xml:space="preserve"> </w:t>
+      </w:r>
+      <w:proofErr w:type="spellStart"/>
+      <w:r>
+        <w:t>funcionalidades</w:t>
+      </w:r>
+      <w:proofErr w:type="spellEnd"/>
+      <w:r>
+        <w:t xml:space="preserve">, </w:t>
+      </w:r>
+      <w:proofErr w:type="spellStart"/>
+      <w:r>
+        <w:t>incluindo</w:t>
+      </w:r>
+      <w:proofErr w:type="spellEnd"/>
+      <w:r>
+        <w:t xml:space="preserve"> a </w:t>
+      </w:r>
+      <w:proofErr w:type="spellStart"/>
+      <w:r>
+        <w:t>gestão</w:t>
+      </w:r>
+      <w:proofErr w:type="spellEnd"/>
+      <w:r>
+        <w:t xml:space="preserve"> de </w:t>
+      </w:r>
+      <w:proofErr w:type="spellStart"/>
+      <w:r>
+        <w:t>viagens</w:t>
+      </w:r>
+      <w:proofErr w:type="spellEnd"/>
+      <w:r>
+        <w:t xml:space="preserve">, o </w:t>
+      </w:r>
+      <w:proofErr w:type="spellStart"/>
+      <w:r>
+        <w:t>registo</w:t>
+      </w:r>
+      <w:proofErr w:type="spellEnd"/>
+      <w:r>
+        <w:t xml:space="preserve"> de </w:t>
+      </w:r>
+      <w:proofErr w:type="spellStart"/>
+      <w:r>
+        <w:t>locais</w:t>
+      </w:r>
+      <w:proofErr w:type="spellEnd"/>
+      <w:r>
+        <w:t xml:space="preserve"> </w:t>
+      </w:r>
+      <w:proofErr w:type="spellStart"/>
+      <w:r>
+        <w:t>visitados</w:t>
+      </w:r>
+      <w:proofErr w:type="spellEnd"/>
+      <w:r>
+        <w:t xml:space="preserve">, a </w:t>
+      </w:r>
+      <w:proofErr w:type="spellStart"/>
+      <w:r>
+        <w:t>captura</w:t>
+      </w:r>
+      <w:proofErr w:type="spellEnd"/>
+      <w:r>
+        <w:t xml:space="preserve"> de </w:t>
+      </w:r>
+      <w:proofErr w:type="spellStart"/>
+      <w:r>
+        <w:t>fotografias</w:t>
+      </w:r>
+      <w:proofErr w:type="spellEnd"/>
+      <w:r>
+        <w:t xml:space="preserve">, a </w:t>
+      </w:r>
+      <w:proofErr w:type="spellStart"/>
+      <w:r>
+        <w:t>visualização</w:t>
+      </w:r>
+      <w:proofErr w:type="spellEnd"/>
+      <w:r>
+        <w:t xml:space="preserve"> de </w:t>
+      </w:r>
+      <w:proofErr w:type="spellStart"/>
+      <w:r>
+        <w:t>mapas</w:t>
+      </w:r>
+      <w:proofErr w:type="spellEnd"/>
+      <w:r>
+        <w:t xml:space="preserve"> e a consulta de </w:t>
+      </w:r>
+      <w:proofErr w:type="spellStart"/>
+      <w:r>
+        <w:t>estatísticas</w:t>
+      </w:r>
+      <w:proofErr w:type="spellEnd"/>
+      <w:r>
+        <w:t xml:space="preserve">. </w:t>
+      </w:r>
+      <w:proofErr w:type="gramStart"/>
+      <w:r>
+        <w:t>A</w:t>
+      </w:r>
+      <w:proofErr w:type="gramEnd"/>
+      <w:r>
+        <w:t xml:space="preserve"> aplicação </w:t>
+      </w:r>
+      <w:proofErr w:type="spellStart"/>
+      <w:r>
         <w:t>deve</w:t>
       </w:r>
       <w:proofErr w:type="spellEnd"/>
@@ -8161,7 +8317,7 @@
       </w:r>
       <w:proofErr w:type="spellStart"/>
       <w:r>
-        <w:t>possir</w:t>
+        <w:t>apresentar</w:t>
       </w:r>
       <w:proofErr w:type="spellEnd"/>
       <w:r>
@@ -8169,23 +8325,23 @@
       </w:r>
       <w:proofErr w:type="spellStart"/>
       <w:r>
-        <w:t>uma</w:t>
+        <w:t>mensagens</w:t>
       </w:r>
       <w:proofErr w:type="spellEnd"/>
       <w:r>
-        <w:t xml:space="preserve"> interface simples e </w:t>
+        <w:t xml:space="preserve"> </w:t>
       </w:r>
       <w:proofErr w:type="spellStart"/>
       <w:r>
-        <w:t>intuitiva</w:t>
+        <w:t>claras</w:t>
       </w:r>
       <w:proofErr w:type="spellEnd"/>
       <w:r>
-        <w:t xml:space="preserve">, </w:t>
+        <w:t xml:space="preserve"> para </w:t>
       </w:r>
       <w:proofErr w:type="spellStart"/>
       <w:r>
-        <w:t>permitindo</w:t>
+        <w:t>informar</w:t>
       </w:r>
       <w:proofErr w:type="spellEnd"/>
       <w:r>
@@ -8193,7 +8349,7 @@
       </w:r>
       <w:proofErr w:type="spellStart"/>
       <w:r>
-        <w:t>aos</w:t>
+        <w:t>os</w:t>
       </w:r>
       <w:proofErr w:type="spellEnd"/>
       <w:r>
@@ -8209,23 +8365,39 @@
       </w:r>
       <w:proofErr w:type="spellStart"/>
       <w:r>
-        <w:t>navegar</w:t>
+        <w:t>sobre</w:t>
       </w:r>
       <w:proofErr w:type="spellEnd"/>
       <w:r>
+        <w:t xml:space="preserve"> as </w:t>
+      </w:r>
+      <w:proofErr w:type="spellStart"/>
+      <w:r>
+        <w:t>ações</w:t>
+      </w:r>
+      <w:proofErr w:type="spellEnd"/>
+      <w:r>
         <w:t xml:space="preserve"> </w:t>
       </w:r>
       <w:proofErr w:type="spellStart"/>
       <w:r>
-        <w:t>facilmente</w:t>
+        <w:t>realizadas</w:t>
       </w:r>
       <w:proofErr w:type="spellEnd"/>
       <w:r>
+        <w:t xml:space="preserve"> e </w:t>
+      </w:r>
+      <w:proofErr w:type="spellStart"/>
+      <w:r>
+        <w:t>os</w:t>
+      </w:r>
+      <w:proofErr w:type="spellEnd"/>
+      <w:r>
         <w:t xml:space="preserve"> </w:t>
       </w:r>
       <w:proofErr w:type="spellStart"/>
       <w:r>
-        <w:t>pelas</w:t>
+        <w:t>erros</w:t>
       </w:r>
       <w:proofErr w:type="spellEnd"/>
       <w:r>
@@ -8233,234 +8405,10 @@
       </w:r>
       <w:proofErr w:type="spellStart"/>
       <w:r>
-        <w:t>suas</w:t>
+        <w:t>detetados</w:t>
       </w:r>
       <w:proofErr w:type="spellEnd"/>
       <w:r>
-        <w:t xml:space="preserve"> </w:t>
-      </w:r>
-      <w:proofErr w:type="spellStart"/>
-      <w:r>
-        <w:t>principais</w:t>
-      </w:r>
-      <w:proofErr w:type="spellEnd"/>
-      <w:r>
-        <w:t xml:space="preserve"> </w:t>
-      </w:r>
-      <w:proofErr w:type="spellStart"/>
-      <w:r>
-        <w:t>funcionalidades</w:t>
-      </w:r>
-      <w:proofErr w:type="spellEnd"/>
-      <w:r>
-        <w:t xml:space="preserve">, </w:t>
-      </w:r>
-      <w:proofErr w:type="spellStart"/>
-      <w:r>
-        <w:t>incluindo</w:t>
-      </w:r>
-      <w:proofErr w:type="spellEnd"/>
-      <w:r>
-        <w:t xml:space="preserve"> a </w:t>
-      </w:r>
-      <w:proofErr w:type="spellStart"/>
-      <w:r>
-        <w:t>gestão</w:t>
-      </w:r>
-      <w:proofErr w:type="spellEnd"/>
-      <w:r>
-        <w:t xml:space="preserve"> de </w:t>
-      </w:r>
-      <w:proofErr w:type="spellStart"/>
-      <w:r>
-        <w:t>viagens</w:t>
-      </w:r>
-      <w:proofErr w:type="spellEnd"/>
-      <w:r>
-        <w:t xml:space="preserve">, o </w:t>
-      </w:r>
-      <w:proofErr w:type="spellStart"/>
-      <w:r>
-        <w:t>registo</w:t>
-      </w:r>
-      <w:proofErr w:type="spellEnd"/>
-      <w:r>
-        <w:t xml:space="preserve"> de </w:t>
-      </w:r>
-      <w:proofErr w:type="spellStart"/>
-      <w:r>
-        <w:t>locais</w:t>
-      </w:r>
-      <w:proofErr w:type="spellEnd"/>
-      <w:r>
-        <w:t xml:space="preserve"> </w:t>
-      </w:r>
-      <w:proofErr w:type="spellStart"/>
-      <w:r>
-        <w:t>visitados</w:t>
-      </w:r>
-      <w:proofErr w:type="spellEnd"/>
-      <w:r>
-        <w:t xml:space="preserve">, a </w:t>
-      </w:r>
-      <w:proofErr w:type="spellStart"/>
-      <w:r>
-        <w:t>captura</w:t>
-      </w:r>
-      <w:proofErr w:type="spellEnd"/>
-      <w:r>
-        <w:t xml:space="preserve"> de </w:t>
-      </w:r>
-      <w:proofErr w:type="spellStart"/>
-      <w:r>
-        <w:t>fotografias</w:t>
-      </w:r>
-      <w:proofErr w:type="spellEnd"/>
-      <w:r>
-        <w:t xml:space="preserve">, a </w:t>
-      </w:r>
-      <w:proofErr w:type="spellStart"/>
-      <w:r>
-        <w:t>visualização</w:t>
-      </w:r>
-      <w:proofErr w:type="spellEnd"/>
-      <w:r>
-        <w:t xml:space="preserve"> de </w:t>
-      </w:r>
-      <w:proofErr w:type="spellStart"/>
-      <w:r>
-        <w:t>mapas</w:t>
-      </w:r>
-      <w:proofErr w:type="spellEnd"/>
-      <w:r>
-        <w:t xml:space="preserve"> e a consulta de </w:t>
-      </w:r>
-      <w:proofErr w:type="spellStart"/>
-      <w:r>
-        <w:t>estatísticas</w:t>
-      </w:r>
-      <w:proofErr w:type="spellEnd"/>
-      <w:r>
-        <w:t xml:space="preserve">. </w:t>
-      </w:r>
-      <w:proofErr w:type="gramStart"/>
-      <w:r>
-        <w:t>A</w:t>
-      </w:r>
-      <w:proofErr w:type="gramEnd"/>
-      <w:r>
-        <w:t xml:space="preserve"> </w:t>
-      </w:r>
-      <w:proofErr w:type="spellStart"/>
-      <w:r>
-        <w:t>aplicação</w:t>
-      </w:r>
-      <w:proofErr w:type="spellEnd"/>
-      <w:r>
-        <w:t xml:space="preserve"> </w:t>
-      </w:r>
-      <w:proofErr w:type="spellStart"/>
-      <w:r>
-        <w:t>deve</w:t>
-      </w:r>
-      <w:proofErr w:type="spellEnd"/>
-      <w:r>
-        <w:t xml:space="preserve"> </w:t>
-      </w:r>
-      <w:proofErr w:type="spellStart"/>
-      <w:r>
-        <w:t>apresentar</w:t>
-      </w:r>
-      <w:proofErr w:type="spellEnd"/>
-      <w:r>
-        <w:t xml:space="preserve"> </w:t>
-      </w:r>
-      <w:proofErr w:type="spellStart"/>
-      <w:r>
-        <w:t>mensagens</w:t>
-      </w:r>
-      <w:proofErr w:type="spellEnd"/>
-      <w:r>
-        <w:t xml:space="preserve"> </w:t>
-      </w:r>
-      <w:proofErr w:type="spellStart"/>
-      <w:r>
-        <w:t>claras</w:t>
-      </w:r>
-      <w:proofErr w:type="spellEnd"/>
-      <w:r>
-        <w:t xml:space="preserve"> para </w:t>
-      </w:r>
-      <w:proofErr w:type="spellStart"/>
-      <w:r>
-        <w:t>informar</w:t>
-      </w:r>
-      <w:proofErr w:type="spellEnd"/>
-      <w:r>
-        <w:t xml:space="preserve"> </w:t>
-      </w:r>
-      <w:proofErr w:type="spellStart"/>
-      <w:r>
-        <w:t>os</w:t>
-      </w:r>
-      <w:proofErr w:type="spellEnd"/>
-      <w:r>
-        <w:t xml:space="preserve"> </w:t>
-      </w:r>
-      <w:proofErr w:type="spellStart"/>
-      <w:r>
-        <w:t>utilizadores</w:t>
-      </w:r>
-      <w:proofErr w:type="spellEnd"/>
-      <w:r>
-        <w:t xml:space="preserve"> </w:t>
-      </w:r>
-      <w:proofErr w:type="spellStart"/>
-      <w:r>
-        <w:t>sobre</w:t>
-      </w:r>
-      <w:proofErr w:type="spellEnd"/>
-      <w:r>
-        <w:t xml:space="preserve"> as </w:t>
-      </w:r>
-      <w:proofErr w:type="spellStart"/>
-      <w:r>
-        <w:t>ações</w:t>
-      </w:r>
-      <w:proofErr w:type="spellEnd"/>
-      <w:r>
-        <w:t xml:space="preserve"> </w:t>
-      </w:r>
-      <w:proofErr w:type="spellStart"/>
-      <w:r>
-        <w:t>realizadas</w:t>
-      </w:r>
-      <w:proofErr w:type="spellEnd"/>
-      <w:r>
-        <w:t xml:space="preserve"> e </w:t>
-      </w:r>
-      <w:proofErr w:type="spellStart"/>
-      <w:r>
-        <w:t>os</w:t>
-      </w:r>
-      <w:proofErr w:type="spellEnd"/>
-      <w:r>
-        <w:t xml:space="preserve"> </w:t>
-      </w:r>
-      <w:proofErr w:type="spellStart"/>
-      <w:r>
-        <w:t>erros</w:t>
-      </w:r>
-      <w:proofErr w:type="spellEnd"/>
-      <w:r>
-        <w:t xml:space="preserve"> </w:t>
-      </w:r>
-      <w:proofErr w:type="spellStart"/>
-      <w:r>
-        <w:t>detetados</w:t>
-      </w:r>
-      <w:proofErr w:type="spellEnd"/>
-      <w:r>
         <w:t>.</w:t>
       </w:r>
     </w:p>
@@ -8546,9 +8494,9 @@
           <w:lang w:val="pt-BR"/>
         </w:rPr>
         <w:drawing>
-          <wp:inline distT="0" distB="0" distL="0" distR="0" wp14:anchorId="308D82EB" wp14:editId="132EAE6D">
-            <wp:extent cx="4567204" cy="3282286"/>
-            <wp:effectExtent l="0" t="0" r="5080" b="0"/>
+          <wp:inline distT="0" distB="0" distL="0" distR="0" wp14:anchorId="308D82EB" wp14:editId="320D646C">
+            <wp:extent cx="4462818" cy="3207268"/>
+            <wp:effectExtent l="0" t="0" r="0" b="0"/>
             <wp:docPr id="2121297331" name="Imagem 3"/>
             <wp:cNvGraphicFramePr>
               <a:graphicFrameLocks xmlns:a="http://schemas.openxmlformats.org/drawingml/2006/main" noChangeAspect="1"/>
@@ -8575,7 +8523,7 @@
                   <pic:spPr>
                     <a:xfrm>
                       <a:off x="0" y="0"/>
-                      <a:ext cx="4594198" cy="3301686"/>
+                      <a:ext cx="4512934" cy="3243285"/>
                     </a:xfrm>
                     <a:prstGeom prst="rect">
                       <a:avLst/>
@@ -8599,10 +8547,176 @@
     </w:p>
     <w:p>
       <w:pPr>
-        <w:rPr>
-          <w:lang w:val="pt-BR"/>
-        </w:rPr>
-      </w:pPr>
+        <w:pStyle w:val="Legenda"/>
+        <w:jc w:val="center"/>
+        <w:rPr>
+          <w:noProof/>
+          <w:sz w:val="18"/>
+          <w:szCs w:val="18"/>
+          <w:lang w:val="pt-BR"/>
+        </w:rPr>
+      </w:pPr>
+      <w:r>
+        <w:rPr>
+          <w:b w:val="0"/>
+          <w:sz w:val="18"/>
+          <w:szCs w:val="18"/>
+        </w:rPr>
+        <w:t xml:space="preserve">Fig.  </w:t>
+      </w:r>
+      <w:r>
+        <w:rPr>
+          <w:b w:val="0"/>
+          <w:sz w:val="18"/>
+          <w:szCs w:val="18"/>
+        </w:rPr>
+        <w:t>5</w:t>
+      </w:r>
+      <w:r>
+        <w:rPr>
+          <w:b w:val="0"/>
+          <w:sz w:val="18"/>
+          <w:szCs w:val="18"/>
+        </w:rPr>
+        <w:t>.</w:t>
+      </w:r>
+      <w:r>
+        <w:rPr>
+          <w:sz w:val="18"/>
+          <w:szCs w:val="18"/>
+        </w:rPr>
+        <w:t xml:space="preserve"> </w:t>
+      </w:r>
+      <w:r>
+        <w:rPr>
+          <w:b w:val="0"/>
+          <w:sz w:val="18"/>
+          <w:szCs w:val="18"/>
+        </w:rPr>
+        <w:t>Arquitetura fisica da aplicação</w:t>
+      </w:r>
+    </w:p>
+    <w:p>
+      <w:pPr>
+        <w:pStyle w:val="heading1"/>
+        <w:rPr>
+          <w:lang w:val="pt-BR"/>
+        </w:rPr>
+      </w:pPr>
+      <w:r>
+        <w:rPr>
+          <w:lang w:val="pt-BR"/>
+        </w:rPr>
+        <w:lastRenderedPageBreak/>
+        <w:t>7</w:t>
+      </w:r>
+      <w:r>
+        <w:rPr>
+          <w:lang w:val="pt-BR"/>
+        </w:rPr>
+        <w:t xml:space="preserve">   </w:t>
+      </w:r>
+      <w:r>
+        <w:rPr>
+          <w:lang w:val="pt-BR"/>
+        </w:rPr>
+        <w:t xml:space="preserve">Arquitetura </w:t>
+      </w:r>
+      <w:r>
+        <w:rPr>
+          <w:lang w:val="pt-BR"/>
+        </w:rPr>
+        <w:t>Lógica</w:t>
+      </w:r>
+    </w:p>
+    <w:p>
+      <w:pPr>
+        <w:pStyle w:val="p1a"/>
+        <w:rPr>
+          <w:lang w:val="pt-BR"/>
+        </w:rPr>
+      </w:pPr>
+      <w:r>
+        <w:rPr>
+          <w:lang w:val="pt-BR"/>
+        </w:rPr>
+        <w:t>A arquitetura lógica (Fig. 6) representa a forma como os diferentes componentes de software da aplicação se organizam e se relacionam entre sí.</w:t>
+      </w:r>
+    </w:p>
+    <w:p>
+      <w:pPr>
+        <w:rPr>
+          <w:lang w:val="pt-BR"/>
+        </w:rPr>
+      </w:pPr>
+    </w:p>
+    <w:p>
+      <w:pPr>
+        <w:rPr>
+          <w:lang w:val="pt-BR"/>
+        </w:rPr>
+      </w:pPr>
+    </w:p>
+    <w:p>
+      <w:pPr>
+        <w:rPr>
+          <w:lang w:val="pt-BR"/>
+        </w:rPr>
+      </w:pPr>
+    </w:p>
+    <w:p>
+      <w:pPr>
+        <w:rPr>
+          <w:lang w:val="pt-BR"/>
+        </w:rPr>
+      </w:pPr>
+      <w:r>
+        <w:rPr>
+          <w:noProof/>
+          <w:lang w:val="pt-BR"/>
+        </w:rPr>
+        <w:drawing>
+          <wp:inline distT="0" distB="0" distL="0" distR="0" wp14:anchorId="421E7C4E" wp14:editId="348F053E">
+            <wp:extent cx="5282530" cy="1932167"/>
+            <wp:effectExtent l="0" t="0" r="0" b="0"/>
+            <wp:docPr id="1674645888" name="Imagem 4"/>
+            <wp:cNvGraphicFramePr>
+              <a:graphicFrameLocks xmlns:a="http://schemas.openxmlformats.org/drawingml/2006/main" noChangeAspect="1"/>
+            </wp:cNvGraphicFramePr>
+            <a:graphic xmlns:a="http://schemas.openxmlformats.org/drawingml/2006/main">
+              <a:graphicData uri="http://schemas.openxmlformats.org/drawingml/2006/picture">
+                <pic:pic xmlns:pic="http://schemas.openxmlformats.org/drawingml/2006/picture">
+                  <pic:nvPicPr>
+                    <pic:cNvPr id="1674645888" name="Imagem 1674645888"/>
+                    <pic:cNvPicPr/>
+                  </pic:nvPicPr>
+                  <pic:blipFill>
+                    <a:blip r:embed="rId10">
+                      <a:extLst>
+                        <a:ext uri="{28A0092B-C50C-407E-A947-70E740481C1C}">
+                          <a14:useLocalDpi xmlns:a14="http://schemas.microsoft.com/office/drawing/2010/main" val="0"/>
+                        </a:ext>
+                      </a:extLst>
+                    </a:blip>
+                    <a:stretch>
+                      <a:fillRect/>
+                    </a:stretch>
+                  </pic:blipFill>
+                  <pic:spPr>
+                    <a:xfrm>
+                      <a:off x="0" y="0"/>
+                      <a:ext cx="5325746" cy="1947974"/>
+                    </a:xfrm>
+                    <a:prstGeom prst="rect">
+                      <a:avLst/>
+                    </a:prstGeom>
+                  </pic:spPr>
+                </pic:pic>
+              </a:graphicData>
+            </a:graphic>
+          </wp:inline>
+        </w:drawing>
+      </w:r>
     </w:p>
     <w:sectPr>
       <w:pgSz w:w="11907" w:h="16840" w:code="9"/>

</xml_diff>

<commit_message>
Atualização Relatório - Diagrama Organizacao Codigo
</commit_message>
<xml_diff>
--- a/Documentation/Relatório-DSSMV-2025-27_2DB_1250771_1251355.docx
+++ b/Documentation/Relatório-DSSMV-2025-27_2DB_1250771_1251355.docx
@@ -8663,21 +8663,14 @@
           <w:lang w:val="pt-BR"/>
         </w:rPr>
       </w:pPr>
-    </w:p>
-    <w:p>
-      <w:pPr>
-        <w:rPr>
-          <w:lang w:val="pt-BR"/>
-        </w:rPr>
-      </w:pPr>
       <w:r>
         <w:rPr>
           <w:noProof/>
           <w:lang w:val="pt-BR"/>
         </w:rPr>
         <w:drawing>
-          <wp:inline distT="0" distB="0" distL="0" distR="0" wp14:anchorId="421E7C4E" wp14:editId="348F053E">
-            <wp:extent cx="5282530" cy="1932167"/>
+          <wp:inline distT="0" distB="0" distL="0" distR="0" wp14:anchorId="421E7C4E" wp14:editId="2F6AF615">
+            <wp:extent cx="4953000" cy="1811636"/>
             <wp:effectExtent l="0" t="0" r="0" b="0"/>
             <wp:docPr id="1674645888" name="Imagem 4"/>
             <wp:cNvGraphicFramePr>
@@ -8705,7 +8698,7 @@
                   <pic:spPr>
                     <a:xfrm>
                       <a:off x="0" y="0"/>
-                      <a:ext cx="5325746" cy="1947974"/>
+                      <a:ext cx="5009241" cy="1832207"/>
                     </a:xfrm>
                     <a:prstGeom prst="rect">
                       <a:avLst/>
@@ -8717,6 +8710,285 @@
           </wp:inline>
         </w:drawing>
       </w:r>
+    </w:p>
+    <w:p>
+      <w:pPr>
+        <w:rPr>
+          <w:lang w:val="pt-BR"/>
+        </w:rPr>
+      </w:pPr>
+    </w:p>
+    <w:p>
+      <w:pPr>
+        <w:pStyle w:val="Legenda"/>
+        <w:jc w:val="center"/>
+        <w:rPr>
+          <w:noProof/>
+          <w:sz w:val="18"/>
+          <w:szCs w:val="18"/>
+          <w:lang w:val="pt-BR"/>
+        </w:rPr>
+      </w:pPr>
+      <w:r>
+        <w:rPr>
+          <w:b w:val="0"/>
+          <w:sz w:val="18"/>
+          <w:szCs w:val="18"/>
+        </w:rPr>
+        <w:t xml:space="preserve">Fig.  </w:t>
+      </w:r>
+      <w:r>
+        <w:rPr>
+          <w:b w:val="0"/>
+          <w:sz w:val="18"/>
+          <w:szCs w:val="18"/>
+        </w:rPr>
+        <w:t>6</w:t>
+      </w:r>
+      <w:r>
+        <w:rPr>
+          <w:b w:val="0"/>
+          <w:sz w:val="18"/>
+          <w:szCs w:val="18"/>
+        </w:rPr>
+        <w:t>.</w:t>
+      </w:r>
+      <w:r>
+        <w:rPr>
+          <w:sz w:val="18"/>
+          <w:szCs w:val="18"/>
+        </w:rPr>
+        <w:t xml:space="preserve"> </w:t>
+      </w:r>
+      <w:r>
+        <w:rPr>
+          <w:b w:val="0"/>
+          <w:sz w:val="18"/>
+          <w:szCs w:val="18"/>
+        </w:rPr>
+        <w:t xml:space="preserve">Arquitetura </w:t>
+      </w:r>
+      <w:proofErr w:type="spellStart"/>
+      <w:r>
+        <w:rPr>
+          <w:b w:val="0"/>
+          <w:sz w:val="18"/>
+          <w:szCs w:val="18"/>
+        </w:rPr>
+        <w:t>lógica</w:t>
+      </w:r>
+      <w:proofErr w:type="spellEnd"/>
+      <w:r>
+        <w:rPr>
+          <w:b w:val="0"/>
+          <w:sz w:val="18"/>
+          <w:szCs w:val="18"/>
+        </w:rPr>
+        <w:t xml:space="preserve"> da aplicação</w:t>
+      </w:r>
+    </w:p>
+    <w:p>
+      <w:pPr>
+        <w:rPr>
+          <w:lang w:val="pt-BR"/>
+        </w:rPr>
+      </w:pPr>
+    </w:p>
+    <w:p>
+      <w:pPr>
+        <w:pStyle w:val="heading1"/>
+        <w:rPr>
+          <w:lang w:val="pt-BR"/>
+        </w:rPr>
+      </w:pPr>
+      <w:r>
+        <w:rPr>
+          <w:lang w:val="pt-BR"/>
+        </w:rPr>
+        <w:t>8</w:t>
+      </w:r>
+      <w:r>
+        <w:rPr>
+          <w:lang w:val="pt-BR"/>
+        </w:rPr>
+        <w:t xml:space="preserve">   </w:t>
+      </w:r>
+      <w:r>
+        <w:rPr>
+          <w:lang w:val="pt-BR"/>
+        </w:rPr>
+        <w:t>Organização do Código</w:t>
+      </w:r>
+    </w:p>
+    <w:p>
+      <w:pPr>
+        <w:ind w:firstLine="0"/>
+        <w:rPr>
+          <w:lang w:val="pt-BR"/>
+        </w:rPr>
+      </w:pPr>
+      <w:r>
+        <w:rPr>
+          <w:lang w:val="pt-BR"/>
+        </w:rPr>
+        <w:t>De forma a complementar a arquitetura lógica apresentada anteriormente, a Fig. 7 mostra como o código da aplicação está organizado.</w:t>
+      </w:r>
+    </w:p>
+    <w:p>
+      <w:pPr>
+        <w:ind w:firstLine="0"/>
+        <w:rPr>
+          <w:lang w:val="pt-BR"/>
+        </w:rPr>
+      </w:pPr>
+    </w:p>
+    <w:p>
+      <w:pPr>
+        <w:ind w:firstLine="0"/>
+        <w:rPr>
+          <w:lang w:val="pt-BR"/>
+        </w:rPr>
+      </w:pPr>
+      <w:r>
+        <w:rPr>
+          <w:noProof/>
+          <w:lang w:val="pt-BR"/>
+        </w:rPr>
+        <w:drawing>
+          <wp:inline distT="0" distB="0" distL="0" distR="0" wp14:anchorId="2F6B5A4F" wp14:editId="1078CDC8">
+            <wp:extent cx="4857750" cy="2088615"/>
+            <wp:effectExtent l="0" t="0" r="0" b="6985"/>
+            <wp:docPr id="1049521688" name="Imagem 5"/>
+            <wp:cNvGraphicFramePr>
+              <a:graphicFrameLocks xmlns:a="http://schemas.openxmlformats.org/drawingml/2006/main" noChangeAspect="1"/>
+            </wp:cNvGraphicFramePr>
+            <a:graphic xmlns:a="http://schemas.openxmlformats.org/drawingml/2006/main">
+              <a:graphicData uri="http://schemas.openxmlformats.org/drawingml/2006/picture">
+                <pic:pic xmlns:pic="http://schemas.openxmlformats.org/drawingml/2006/picture">
+                  <pic:nvPicPr>
+                    <pic:cNvPr id="1049521688" name="Imagem 1049521688"/>
+                    <pic:cNvPicPr/>
+                  </pic:nvPicPr>
+                  <pic:blipFill>
+                    <a:blip r:embed="rId11">
+                      <a:extLst>
+                        <a:ext uri="{28A0092B-C50C-407E-A947-70E740481C1C}">
+                          <a14:useLocalDpi xmlns:a14="http://schemas.microsoft.com/office/drawing/2010/main" val="0"/>
+                        </a:ext>
+                      </a:extLst>
+                    </a:blip>
+                    <a:stretch>
+                      <a:fillRect/>
+                    </a:stretch>
+                  </pic:blipFill>
+                  <pic:spPr>
+                    <a:xfrm>
+                      <a:off x="0" y="0"/>
+                      <a:ext cx="4877709" cy="2097196"/>
+                    </a:xfrm>
+                    <a:prstGeom prst="rect">
+                      <a:avLst/>
+                    </a:prstGeom>
+                  </pic:spPr>
+                </pic:pic>
+              </a:graphicData>
+            </a:graphic>
+          </wp:inline>
+        </w:drawing>
+      </w:r>
+    </w:p>
+    <w:p>
+      <w:pPr>
+        <w:rPr>
+          <w:lang w:val="pt-BR"/>
+        </w:rPr>
+      </w:pPr>
+    </w:p>
+    <w:p>
+      <w:pPr>
+        <w:pStyle w:val="Legenda"/>
+        <w:jc w:val="center"/>
+        <w:rPr>
+          <w:noProof/>
+          <w:sz w:val="18"/>
+          <w:szCs w:val="18"/>
+          <w:lang w:val="pt-BR"/>
+        </w:rPr>
+      </w:pPr>
+      <w:r>
+        <w:rPr>
+          <w:b w:val="0"/>
+          <w:sz w:val="18"/>
+          <w:szCs w:val="18"/>
+        </w:rPr>
+        <w:t xml:space="preserve">Fig.  </w:t>
+      </w:r>
+      <w:r>
+        <w:rPr>
+          <w:b w:val="0"/>
+          <w:sz w:val="18"/>
+          <w:szCs w:val="18"/>
+        </w:rPr>
+        <w:t>7</w:t>
+      </w:r>
+      <w:r>
+        <w:rPr>
+          <w:b w:val="0"/>
+          <w:sz w:val="18"/>
+          <w:szCs w:val="18"/>
+        </w:rPr>
+        <w:t>.</w:t>
+      </w:r>
+      <w:r>
+        <w:rPr>
+          <w:sz w:val="18"/>
+          <w:szCs w:val="18"/>
+        </w:rPr>
+        <w:t xml:space="preserve"> </w:t>
+      </w:r>
+      <w:proofErr w:type="spellStart"/>
+      <w:r>
+        <w:rPr>
+          <w:b w:val="0"/>
+          <w:sz w:val="18"/>
+          <w:szCs w:val="18"/>
+        </w:rPr>
+        <w:t>Organização</w:t>
+      </w:r>
+      <w:proofErr w:type="spellEnd"/>
+      <w:r>
+        <w:rPr>
+          <w:b w:val="0"/>
+          <w:sz w:val="18"/>
+          <w:szCs w:val="18"/>
+        </w:rPr>
+        <w:t xml:space="preserve"> do </w:t>
+      </w:r>
+      <w:proofErr w:type="spellStart"/>
+      <w:r>
+        <w:rPr>
+          <w:b w:val="0"/>
+          <w:sz w:val="18"/>
+          <w:szCs w:val="18"/>
+        </w:rPr>
+        <w:t>código</w:t>
+      </w:r>
+      <w:proofErr w:type="spellEnd"/>
+      <w:r>
+        <w:rPr>
+          <w:b w:val="0"/>
+          <w:sz w:val="18"/>
+          <w:szCs w:val="18"/>
+        </w:rPr>
+        <w:t xml:space="preserve"> da aplicação</w:t>
+      </w:r>
+    </w:p>
+    <w:p>
+      <w:pPr>
+        <w:rPr>
+          <w:lang w:val="pt-BR"/>
+        </w:rPr>
+      </w:pPr>
     </w:p>
     <w:sectPr>
       <w:pgSz w:w="11907" w:h="16840" w:code="9"/>

</xml_diff>

<commit_message>
Atualização Relatório - Diagrama de classes de modelo
</commit_message>
<xml_diff>
--- a/Documentation/Relatório-DSSMV-2025-27_2DB_1250771_1251355.docx
+++ b/Documentation/Relatório-DSSMV-2025-27_2DB_1250771_1251355.docx
@@ -8572,6 +8572,7 @@
         </w:rPr>
         <w:t>5</w:t>
       </w:r>
+      <w:proofErr w:type="gramStart"/>
       <w:r>
         <w:rPr>
           <w:b w:val="0"/>
@@ -8589,11 +8590,27 @@
       </w:r>
       <w:r>
         <w:rPr>
+          <w:sz w:val="18"/>
+          <w:szCs w:val="18"/>
+        </w:rPr>
+        <w:t xml:space="preserve"> </w:t>
+      </w:r>
+      <w:r>
+        <w:rPr>
           <w:b w:val="0"/>
           <w:sz w:val="18"/>
           <w:szCs w:val="18"/>
         </w:rPr>
-        <w:t>Arquitetura fisica da aplicação</w:t>
+        <w:t>Arquitetura</w:t>
+      </w:r>
+      <w:proofErr w:type="gramEnd"/>
+      <w:r>
+        <w:rPr>
+          <w:b w:val="0"/>
+          <w:sz w:val="18"/>
+          <w:szCs w:val="18"/>
+        </w:rPr>
+        <w:t xml:space="preserve"> fisica da aplicação</w:t>
       </w:r>
     </w:p>
     <w:p>
@@ -8762,6 +8779,13 @@
       </w:r>
       <w:r>
         <w:rPr>
+          <w:sz w:val="18"/>
+          <w:szCs w:val="18"/>
+        </w:rPr>
+        <w:t xml:space="preserve"> </w:t>
+      </w:r>
+      <w:r>
+        <w:rPr>
           <w:b w:val="0"/>
           <w:sz w:val="18"/>
           <w:szCs w:val="18"/>
@@ -8946,6 +8970,13 @@
         </w:rPr>
         <w:t xml:space="preserve"> </w:t>
       </w:r>
+      <w:r>
+        <w:rPr>
+          <w:sz w:val="18"/>
+          <w:szCs w:val="18"/>
+        </w:rPr>
+        <w:t xml:space="preserve"> </w:t>
+      </w:r>
       <w:proofErr w:type="spellStart"/>
       <w:r>
         <w:rPr>
@@ -8982,6 +9013,222 @@
         </w:rPr>
         <w:t xml:space="preserve"> da aplicação</w:t>
       </w:r>
+    </w:p>
+    <w:p>
+      <w:pPr>
+        <w:pStyle w:val="heading1"/>
+        <w:rPr>
+          <w:lang w:val="pt-BR"/>
+        </w:rPr>
+      </w:pPr>
+      <w:r>
+        <w:rPr>
+          <w:lang w:val="pt-BR"/>
+        </w:rPr>
+        <w:lastRenderedPageBreak/>
+        <w:t>9</w:t>
+      </w:r>
+      <w:r>
+        <w:rPr>
+          <w:lang w:val="pt-BR"/>
+        </w:rPr>
+        <w:t xml:space="preserve">   </w:t>
+      </w:r>
+      <w:r>
+        <w:rPr>
+          <w:lang w:val="pt-BR"/>
+        </w:rPr>
+        <w:t>Diagrama de Classes de Modelo</w:t>
+      </w:r>
+    </w:p>
+    <w:p>
+      <w:pPr>
+        <w:pStyle w:val="p1a"/>
+        <w:rPr>
+          <w:lang w:val="pt-BR"/>
+        </w:rPr>
+      </w:pPr>
+      <w:r>
+        <w:rPr>
+          <w:lang w:val="pt-BR"/>
+        </w:rPr>
+        <w:t>O diagrama de classes (Fig . 8) de modelo representa as principais entidades do domínio da aplicação e a forma como se relacionam entre sí.</w:t>
+      </w:r>
+    </w:p>
+    <w:p>
+      <w:pPr>
+        <w:rPr>
+          <w:lang w:val="pt-BR"/>
+        </w:rPr>
+      </w:pPr>
+    </w:p>
+    <w:p>
+      <w:pPr>
+        <w:rPr>
+          <w:lang w:val="pt-BR"/>
+        </w:rPr>
+      </w:pPr>
+    </w:p>
+    <w:p>
+      <w:pPr>
+        <w:rPr>
+          <w:lang w:val="pt-BR"/>
+        </w:rPr>
+      </w:pPr>
+    </w:p>
+    <w:p>
+      <w:pPr>
+        <w:rPr>
+          <w:lang w:val="pt-BR"/>
+        </w:rPr>
+      </w:pPr>
+      <w:r>
+        <w:rPr>
+          <w:noProof/>
+          <w:lang w:val="pt-BR"/>
+        </w:rPr>
+        <w:drawing>
+          <wp:inline distT="0" distB="0" distL="0" distR="0" wp14:anchorId="25CE13DC" wp14:editId="6DA62238">
+            <wp:extent cx="4916006" cy="2530851"/>
+            <wp:effectExtent l="0" t="0" r="0" b="3175"/>
+            <wp:docPr id="325080530" name="Imagem 6"/>
+            <wp:cNvGraphicFramePr>
+              <a:graphicFrameLocks xmlns:a="http://schemas.openxmlformats.org/drawingml/2006/main" noChangeAspect="1"/>
+            </wp:cNvGraphicFramePr>
+            <a:graphic xmlns:a="http://schemas.openxmlformats.org/drawingml/2006/main">
+              <a:graphicData uri="http://schemas.openxmlformats.org/drawingml/2006/picture">
+                <pic:pic xmlns:pic="http://schemas.openxmlformats.org/drawingml/2006/picture">
+                  <pic:nvPicPr>
+                    <pic:cNvPr id="325080530" name="Imagem 325080530"/>
+                    <pic:cNvPicPr/>
+                  </pic:nvPicPr>
+                  <pic:blipFill>
+                    <a:blip r:embed="rId12">
+                      <a:extLst>
+                        <a:ext uri="{28A0092B-C50C-407E-A947-70E740481C1C}">
+                          <a14:useLocalDpi xmlns:a14="http://schemas.microsoft.com/office/drawing/2010/main" val="0"/>
+                        </a:ext>
+                      </a:extLst>
+                    </a:blip>
+                    <a:stretch>
+                      <a:fillRect/>
+                    </a:stretch>
+                  </pic:blipFill>
+                  <pic:spPr>
+                    <a:xfrm>
+                      <a:off x="0" y="0"/>
+                      <a:ext cx="4927015" cy="2536519"/>
+                    </a:xfrm>
+                    <a:prstGeom prst="rect">
+                      <a:avLst/>
+                    </a:prstGeom>
+                  </pic:spPr>
+                </pic:pic>
+              </a:graphicData>
+            </a:graphic>
+          </wp:inline>
+        </w:drawing>
+      </w:r>
+    </w:p>
+    <w:p>
+      <w:pPr>
+        <w:rPr>
+          <w:lang w:val="pt-BR"/>
+        </w:rPr>
+      </w:pPr>
+    </w:p>
+    <w:p>
+      <w:pPr>
+        <w:pStyle w:val="Legenda"/>
+        <w:jc w:val="center"/>
+        <w:rPr>
+          <w:b w:val="0"/>
+          <w:sz w:val="18"/>
+          <w:szCs w:val="18"/>
+        </w:rPr>
+      </w:pPr>
+      <w:r>
+        <w:rPr>
+          <w:b w:val="0"/>
+          <w:sz w:val="18"/>
+          <w:szCs w:val="18"/>
+        </w:rPr>
+        <w:t xml:space="preserve">Fig.  </w:t>
+      </w:r>
+      <w:r>
+        <w:rPr>
+          <w:b w:val="0"/>
+          <w:sz w:val="18"/>
+          <w:szCs w:val="18"/>
+        </w:rPr>
+        <w:t>8</w:t>
+      </w:r>
+      <w:proofErr w:type="gramStart"/>
+      <w:r>
+        <w:rPr>
+          <w:b w:val="0"/>
+          <w:sz w:val="18"/>
+          <w:szCs w:val="18"/>
+        </w:rPr>
+        <w:t>.</w:t>
+      </w:r>
+      <w:r>
+        <w:rPr>
+          <w:sz w:val="18"/>
+          <w:szCs w:val="18"/>
+        </w:rPr>
+        <w:t xml:space="preserve"> </w:t>
+      </w:r>
+      <w:r>
+        <w:rPr>
+          <w:sz w:val="18"/>
+          <w:szCs w:val="18"/>
+        </w:rPr>
+        <w:t xml:space="preserve"> </w:t>
+      </w:r>
+      <w:proofErr w:type="spellStart"/>
+      <w:r>
+        <w:rPr>
+          <w:b w:val="0"/>
+          <w:sz w:val="18"/>
+          <w:szCs w:val="18"/>
+        </w:rPr>
+        <w:t>Diagrama</w:t>
+      </w:r>
+      <w:proofErr w:type="spellEnd"/>
+      <w:proofErr w:type="gramEnd"/>
+      <w:r>
+        <w:rPr>
+          <w:b w:val="0"/>
+          <w:sz w:val="18"/>
+          <w:szCs w:val="18"/>
+        </w:rPr>
+        <w:t xml:space="preserve"> de classes de </w:t>
+      </w:r>
+      <w:proofErr w:type="spellStart"/>
+      <w:r>
+        <w:rPr>
+          <w:b w:val="0"/>
+          <w:sz w:val="18"/>
+          <w:szCs w:val="18"/>
+        </w:rPr>
+        <w:t>modelo</w:t>
+      </w:r>
+      <w:proofErr w:type="spellEnd"/>
+    </w:p>
+    <w:p>
+      <w:pPr>
+        <w:rPr>
+          <w:lang w:val="pt-BR"/>
+        </w:rPr>
+      </w:pPr>
+    </w:p>
+    <w:p>
+      <w:pPr>
+        <w:rPr>
+          <w:lang w:val="pt-BR"/>
+        </w:rPr>
+      </w:pPr>
     </w:p>
     <w:p>
       <w:pPr>

</xml_diff>